<commit_message>
định dạng: cập nhật quy chuẩn trình bày báo cáo word giãn dòng 1.5 và căn lề 3-2-3-3cm
</commit_message>
<xml_diff>
--- a/reports/final_report/Nhom12_BaoCao.docx
+++ b/reports/final_report/Nhom12_BaoCao.docx
@@ -260,7 +260,7 @@
       <w:pPr>
         <w:sectPr>
           <w:pgSz w:w="12240" w:h="15840"/>
-          <w:pgMar w:top="1134" w:right="1134" w:bottom="1134" w:left="1701" w:header="720" w:footer="720" w:gutter="0"/>
+          <w:pgMar w:top="1701" w:right="1134" w:bottom="1701" w:left="1701" w:header="720" w:footer="720" w:gutter="0"/>
           <w:pgBorders w:offsetFrom="page">
             <w:top w:val="single" w:sz="24" w:space="24" w:color="1B365D"/>
             <w:left w:val="single" w:sz="24" w:space="24" w:color="1B365D"/>
@@ -280,10 +280,11 @@
         <w:rPr>
           <w:rFonts w:ascii="Times New Roman" w:hAnsi="Times New Roman" w:cs="Times New Roman" w:eastAsia="Times New Roman"/>
           <w:b/>
+          <w:i w:val="0"/>
           <w:color w:val="1B365D"/>
           <w:sz w:val="30"/>
         </w:rPr>
-        <w:t>Tóm tắt</w:t>
+        <w:t>TÓM TẮT</w:t>
       </w:r>
     </w:p>
     <w:p>
@@ -342,10 +343,11 @@
         <w:rPr>
           <w:rFonts w:ascii="Times New Roman" w:hAnsi="Times New Roman" w:cs="Times New Roman" w:eastAsia="Times New Roman"/>
           <w:b/>
+          <w:i w:val="0"/>
           <w:color w:val="1B365D"/>
           <w:sz w:val="30"/>
         </w:rPr>
-        <w:t>Mục lục</w:t>
+        <w:t>MỤC LỤC</w:t>
       </w:r>
     </w:p>
     <w:p>
@@ -370,10 +372,11 @@
         <w:rPr>
           <w:rFonts w:ascii="Times New Roman" w:hAnsi="Times New Roman" w:cs="Times New Roman" w:eastAsia="Times New Roman"/>
           <w:b/>
+          <w:i w:val="0"/>
           <w:color w:val="1B365D"/>
           <w:sz w:val="30"/>
         </w:rPr>
-        <w:t>Chương 1: Tổng quan đề tài và cơ sở lý thuyết</w:t>
+        <w:t>CHƯƠNG 1: TỔNG QUAN ĐỀ TÀI VÀ CƠ SỞ LÝ THUYẾT</w:t>
       </w:r>
     </w:p>
     <w:p>
@@ -384,6 +387,7 @@
         <w:rPr>
           <w:rFonts w:ascii="Times New Roman" w:hAnsi="Times New Roman" w:cs="Times New Roman" w:eastAsia="Times New Roman"/>
           <w:b/>
+          <w:i w:val="0"/>
           <w:color w:val="000000"/>
           <w:sz w:val="27"/>
         </w:rPr>
@@ -422,6 +426,7 @@
         <w:rPr>
           <w:rFonts w:ascii="Times New Roman" w:hAnsi="Times New Roman" w:cs="Times New Roman" w:eastAsia="Times New Roman"/>
           <w:b/>
+          <w:i w:val="0"/>
           <w:color w:val="000000"/>
           <w:sz w:val="27"/>
         </w:rPr>
@@ -496,6 +501,7 @@
         <w:rPr>
           <w:rFonts w:ascii="Times New Roman" w:hAnsi="Times New Roman" w:cs="Times New Roman" w:eastAsia="Times New Roman"/>
           <w:b/>
+          <w:i w:val="0"/>
           <w:color w:val="000000"/>
           <w:sz w:val="27"/>
         </w:rPr>
@@ -550,6 +556,7 @@
         <w:rPr>
           <w:rFonts w:ascii="Times New Roman" w:hAnsi="Times New Roman" w:cs="Times New Roman" w:eastAsia="Times New Roman"/>
           <w:b/>
+          <w:i w:val="0"/>
           <w:color w:val="000000"/>
           <w:sz w:val="27"/>
         </w:rPr>
@@ -580,6 +587,7 @@
         <w:rPr>
           <w:rFonts w:ascii="Times New Roman" w:hAnsi="Times New Roman" w:cs="Times New Roman" w:eastAsia="Times New Roman"/>
           <w:b/>
+          <w:i w:val="0"/>
           <w:color w:val="000000"/>
           <w:sz w:val="27"/>
         </w:rPr>
@@ -622,6 +630,7 @@
         <w:rPr>
           <w:rFonts w:ascii="Times New Roman" w:hAnsi="Times New Roman" w:cs="Times New Roman" w:eastAsia="Times New Roman"/>
           <w:b/>
+          <w:i w:val="0"/>
           <w:color w:val="000000"/>
           <w:sz w:val="27"/>
         </w:rPr>
@@ -1428,6 +1437,7 @@
         <w:rPr>
           <w:rFonts w:ascii="Times New Roman" w:hAnsi="Times New Roman" w:cs="Times New Roman" w:eastAsia="Times New Roman"/>
           <w:b/>
+          <w:i w:val="0"/>
           <w:color w:val="000000"/>
           <w:sz w:val="27"/>
         </w:rPr>
@@ -1526,6 +1536,7 @@
         <w:rPr>
           <w:rFonts w:ascii="Times New Roman" w:hAnsi="Times New Roman" w:cs="Times New Roman" w:eastAsia="Times New Roman"/>
           <w:b/>
+          <w:i w:val="0"/>
           <w:color w:val="000000"/>
           <w:sz w:val="27"/>
         </w:rPr>
@@ -2579,10 +2590,11 @@
         <w:rPr>
           <w:rFonts w:ascii="Times New Roman" w:hAnsi="Times New Roman" w:cs="Times New Roman" w:eastAsia="Times New Roman"/>
           <w:b/>
+          <w:i w:val="0"/>
           <w:color w:val="1B365D"/>
           <w:sz w:val="30"/>
         </w:rPr>
-        <w:t>Chương 2: Thu thập dữ liệu và khám phá EDA</w:t>
+        <w:t>CHƯƠNG 2: THU THẬP DỮ LIỆU VÀ KHÁM PHÁ EDA</w:t>
       </w:r>
     </w:p>
     <w:p>
@@ -2593,6 +2605,7 @@
         <w:rPr>
           <w:rFonts w:ascii="Times New Roman" w:hAnsi="Times New Roman" w:cs="Times New Roman" w:eastAsia="Times New Roman"/>
           <w:b/>
+          <w:i w:val="0"/>
           <w:color w:val="000000"/>
           <w:sz w:val="27"/>
         </w:rPr>
@@ -3285,6 +3298,7 @@
         <w:rPr>
           <w:rFonts w:ascii="Times New Roman" w:hAnsi="Times New Roman" w:cs="Times New Roman" w:eastAsia="Times New Roman"/>
           <w:b/>
+          <w:i w:val="0"/>
           <w:color w:val="000000"/>
           <w:sz w:val="27"/>
         </w:rPr>
@@ -3531,6 +3545,7 @@
         <w:rPr>
           <w:rFonts w:ascii="Times New Roman" w:hAnsi="Times New Roman" w:cs="Times New Roman" w:eastAsia="Times New Roman"/>
           <w:b/>
+          <w:i w:val="0"/>
           <w:color w:val="000000"/>
           <w:sz w:val="27"/>
         </w:rPr>
@@ -3597,6 +3612,7 @@
         <w:rPr>
           <w:rFonts w:ascii="Times New Roman" w:hAnsi="Times New Roman" w:cs="Times New Roman" w:eastAsia="Times New Roman"/>
           <w:b/>
+          <w:i w:val="0"/>
           <w:color w:val="000000"/>
           <w:sz w:val="27"/>
         </w:rPr>
@@ -3771,6 +3787,7 @@
         <w:rPr>
           <w:rFonts w:ascii="Times New Roman" w:hAnsi="Times New Roman" w:cs="Times New Roman" w:eastAsia="Times New Roman"/>
           <w:b/>
+          <w:i w:val="0"/>
           <w:color w:val="000000"/>
           <w:sz w:val="27"/>
         </w:rPr>
@@ -3901,6 +3918,7 @@
         <w:rPr>
           <w:rFonts w:ascii="Times New Roman" w:hAnsi="Times New Roman" w:cs="Times New Roman" w:eastAsia="Times New Roman"/>
           <w:b/>
+          <w:i w:val="0"/>
           <w:color w:val="000000"/>
           <w:sz w:val="27"/>
         </w:rPr>
@@ -4022,6 +4040,7 @@
         <w:rPr>
           <w:rFonts w:ascii="Times New Roman" w:hAnsi="Times New Roman" w:cs="Times New Roman" w:eastAsia="Times New Roman"/>
           <w:b/>
+          <w:i w:val="0"/>
           <w:color w:val="000000"/>
           <w:sz w:val="27"/>
         </w:rPr>
@@ -4119,6 +4138,7 @@
         <w:rPr>
           <w:rFonts w:ascii="Times New Roman" w:hAnsi="Times New Roman" w:cs="Times New Roman" w:eastAsia="Times New Roman"/>
           <w:b/>
+          <w:i w:val="0"/>
           <w:color w:val="000000"/>
           <w:sz w:val="27"/>
         </w:rPr>
@@ -4204,6 +4224,7 @@
         <w:rPr>
           <w:rFonts w:ascii="Times New Roman" w:hAnsi="Times New Roman" w:cs="Times New Roman" w:eastAsia="Times New Roman"/>
           <w:b/>
+          <w:i w:val="0"/>
           <w:color w:val="000000"/>
           <w:sz w:val="27"/>
         </w:rPr>
@@ -4226,10 +4247,11 @@
         <w:rPr>
           <w:rFonts w:ascii="Times New Roman" w:hAnsi="Times New Roman" w:cs="Times New Roman" w:eastAsia="Times New Roman"/>
           <w:b/>
+          <w:i w:val="0"/>
           <w:color w:val="1B365D"/>
           <w:sz w:val="30"/>
         </w:rPr>
-        <w:t>Chương 3: Phương pháp luận và thử nghiệm mô hình</w:t>
+        <w:t>CHƯƠNG 3: PHƯƠNG PHÁP LUẬN VÀ THỬ NGHIỆM MÔ HÌNH</w:t>
       </w:r>
     </w:p>
     <w:p>
@@ -4240,6 +4262,7 @@
         <w:rPr>
           <w:rFonts w:ascii="Times New Roman" w:hAnsi="Times New Roman" w:cs="Times New Roman" w:eastAsia="Times New Roman"/>
           <w:b/>
+          <w:i w:val="0"/>
           <w:color w:val="000000"/>
           <w:sz w:val="27"/>
         </w:rPr>
@@ -4262,6 +4285,7 @@
         <w:rPr>
           <w:rFonts w:ascii="Times New Roman" w:hAnsi="Times New Roman" w:cs="Times New Roman" w:eastAsia="Times New Roman"/>
           <w:b/>
+          <w:i w:val="0"/>
           <w:color w:val="000000"/>
           <w:sz w:val="27"/>
         </w:rPr>
@@ -5216,6 +5240,7 @@
         <w:rPr>
           <w:rFonts w:ascii="Times New Roman" w:hAnsi="Times New Roman" w:cs="Times New Roman" w:eastAsia="Times New Roman"/>
           <w:b/>
+          <w:i w:val="0"/>
           <w:color w:val="000000"/>
           <w:sz w:val="27"/>
         </w:rPr>
@@ -5302,6 +5327,7 @@
         <w:rPr>
           <w:rFonts w:ascii="Times New Roman" w:hAnsi="Times New Roman" w:cs="Times New Roman" w:eastAsia="Times New Roman"/>
           <w:b/>
+          <w:i w:val="0"/>
           <w:color w:val="000000"/>
           <w:sz w:val="27"/>
         </w:rPr>
@@ -5368,6 +5394,7 @@
         <w:rPr>
           <w:rFonts w:ascii="Times New Roman" w:hAnsi="Times New Roman" w:cs="Times New Roman" w:eastAsia="Times New Roman"/>
           <w:b/>
+          <w:i w:val="0"/>
           <w:color w:val="000000"/>
           <w:sz w:val="27"/>
         </w:rPr>
@@ -6053,6 +6080,7 @@
         <w:rPr>
           <w:rFonts w:ascii="Times New Roman" w:hAnsi="Times New Roman" w:cs="Times New Roman" w:eastAsia="Times New Roman"/>
           <w:b/>
+          <w:i w:val="0"/>
           <w:color w:val="000000"/>
           <w:sz w:val="27"/>
         </w:rPr>
@@ -6147,6 +6175,7 @@
         <w:rPr>
           <w:rFonts w:ascii="Times New Roman" w:hAnsi="Times New Roman" w:cs="Times New Roman" w:eastAsia="Times New Roman"/>
           <w:b/>
+          <w:i w:val="0"/>
           <w:color w:val="000000"/>
           <w:sz w:val="27"/>
         </w:rPr>
@@ -6847,6 +6876,7 @@
         <w:rPr>
           <w:rFonts w:ascii="Times New Roman" w:hAnsi="Times New Roman" w:cs="Times New Roman" w:eastAsia="Times New Roman"/>
           <w:b/>
+          <w:i w:val="0"/>
           <w:color w:val="000000"/>
           <w:sz w:val="27"/>
         </w:rPr>
@@ -8883,6 +8913,7 @@
         <w:rPr>
           <w:rFonts w:ascii="Times New Roman" w:hAnsi="Times New Roman" w:cs="Times New Roman" w:eastAsia="Times New Roman"/>
           <w:b/>
+          <w:i w:val="0"/>
           <w:color w:val="000000"/>
           <w:sz w:val="27"/>
         </w:rPr>
@@ -8917,10 +8948,11 @@
         <w:rPr>
           <w:rFonts w:ascii="Times New Roman" w:hAnsi="Times New Roman" w:cs="Times New Roman" w:eastAsia="Times New Roman"/>
           <w:b/>
+          <w:i w:val="0"/>
           <w:color w:val="1B365D"/>
           <w:sz w:val="30"/>
         </w:rPr>
-        <w:t>Chương 4: Kết quả thực nghiệm và diễn giải tri thức</w:t>
+        <w:t>CHƯƠNG 4: KẾT QUẢ THỰC NGHIỆM VÀ DIỄN GIẢI TRI THỨC</w:t>
       </w:r>
     </w:p>
     <w:p>
@@ -8931,6 +8963,7 @@
         <w:rPr>
           <w:rFonts w:ascii="Times New Roman" w:hAnsi="Times New Roman" w:cs="Times New Roman" w:eastAsia="Times New Roman"/>
           <w:b/>
+          <w:i w:val="0"/>
           <w:color w:val="000000"/>
           <w:sz w:val="27"/>
         </w:rPr>
@@ -9752,6 +9785,7 @@
         <w:rPr>
           <w:rFonts w:ascii="Times New Roman" w:hAnsi="Times New Roman" w:cs="Times New Roman" w:eastAsia="Times New Roman"/>
           <w:b/>
+          <w:i w:val="0"/>
           <w:color w:val="000000"/>
           <w:sz w:val="27"/>
         </w:rPr>
@@ -10573,6 +10607,7 @@
         <w:rPr>
           <w:rFonts w:ascii="Times New Roman" w:hAnsi="Times New Roman" w:cs="Times New Roman" w:eastAsia="Times New Roman"/>
           <w:b/>
+          <w:i w:val="0"/>
           <w:color w:val="000000"/>
           <w:sz w:val="27"/>
         </w:rPr>
@@ -12084,6 +12119,7 @@
         <w:rPr>
           <w:rFonts w:ascii="Times New Roman" w:hAnsi="Times New Roman" w:cs="Times New Roman" w:eastAsia="Times New Roman"/>
           <w:b/>
+          <w:i w:val="0"/>
           <w:color w:val="000000"/>
           <w:sz w:val="27"/>
         </w:rPr>
@@ -12855,6 +12891,7 @@
         <w:rPr>
           <w:rFonts w:ascii="Times New Roman" w:hAnsi="Times New Roman" w:cs="Times New Roman" w:eastAsia="Times New Roman"/>
           <w:b/>
+          <w:i w:val="0"/>
           <w:color w:val="000000"/>
           <w:sz w:val="27"/>
         </w:rPr>
@@ -14509,6 +14546,7 @@
         <w:rPr>
           <w:rFonts w:ascii="Times New Roman" w:hAnsi="Times New Roman" w:cs="Times New Roman" w:eastAsia="Times New Roman"/>
           <w:b/>
+          <w:i w:val="0"/>
           <w:color w:val="000000"/>
           <w:sz w:val="27"/>
         </w:rPr>
@@ -16208,6 +16246,7 @@
         <w:rPr>
           <w:rFonts w:ascii="Times New Roman" w:hAnsi="Times New Roman" w:cs="Times New Roman" w:eastAsia="Times New Roman"/>
           <w:b/>
+          <w:i w:val="0"/>
           <w:color w:val="000000"/>
           <w:sz w:val="27"/>
         </w:rPr>
@@ -16844,6 +16883,7 @@
         <w:rPr>
           <w:rFonts w:ascii="Times New Roman" w:hAnsi="Times New Roman" w:cs="Times New Roman" w:eastAsia="Times New Roman"/>
           <w:b/>
+          <w:i w:val="0"/>
           <w:color w:val="000000"/>
           <w:sz w:val="27"/>
         </w:rPr>
@@ -16984,6 +17024,7 @@
         <w:rPr>
           <w:rFonts w:ascii="Times New Roman" w:hAnsi="Times New Roman" w:cs="Times New Roman" w:eastAsia="Times New Roman"/>
           <w:b/>
+          <w:i w:val="0"/>
           <w:color w:val="000000"/>
           <w:sz w:val="27"/>
         </w:rPr>
@@ -17006,10 +17047,11 @@
         <w:rPr>
           <w:rFonts w:ascii="Times New Roman" w:hAnsi="Times New Roman" w:cs="Times New Roman" w:eastAsia="Times New Roman"/>
           <w:b/>
+          <w:i w:val="0"/>
           <w:color w:val="1B365D"/>
           <w:sz w:val="30"/>
         </w:rPr>
-        <w:t>Chương 5: Ứng dụng demo, kết luận và hướng phát triển</w:t>
+        <w:t>CHƯƠNG 5: ỨNG DỤNG DEMO, KẾT LUẬN VÀ HƯỚNG PHÁT TRIỂN</w:t>
       </w:r>
     </w:p>
     <w:p>
@@ -17020,6 +17062,7 @@
         <w:rPr>
           <w:rFonts w:ascii="Times New Roman" w:hAnsi="Times New Roman" w:cs="Times New Roman" w:eastAsia="Times New Roman"/>
           <w:b/>
+          <w:i w:val="0"/>
           <w:color w:val="000000"/>
           <w:sz w:val="27"/>
         </w:rPr>
@@ -17197,6 +17240,7 @@
         <w:rPr>
           <w:rFonts w:ascii="Times New Roman" w:hAnsi="Times New Roman" w:cs="Times New Roman" w:eastAsia="Times New Roman"/>
           <w:b/>
+          <w:i w:val="0"/>
           <w:color w:val="000000"/>
           <w:sz w:val="27"/>
         </w:rPr>
@@ -17263,6 +17307,7 @@
         <w:rPr>
           <w:rFonts w:ascii="Times New Roman" w:hAnsi="Times New Roman" w:cs="Times New Roman" w:eastAsia="Times New Roman"/>
           <w:b/>
+          <w:i w:val="0"/>
           <w:color w:val="000000"/>
           <w:sz w:val="27"/>
         </w:rPr>
@@ -17332,6 +17377,7 @@
         <w:rPr>
           <w:rFonts w:ascii="Times New Roman" w:hAnsi="Times New Roman" w:cs="Times New Roman" w:eastAsia="Times New Roman"/>
           <w:b/>
+          <w:i w:val="0"/>
           <w:color w:val="000000"/>
           <w:sz w:val="27"/>
         </w:rPr>
@@ -17370,6 +17416,7 @@
         <w:rPr>
           <w:rFonts w:ascii="Times New Roman" w:hAnsi="Times New Roman" w:cs="Times New Roman" w:eastAsia="Times New Roman"/>
           <w:b/>
+          <w:i w:val="0"/>
           <w:color w:val="000000"/>
           <w:sz w:val="27"/>
         </w:rPr>
@@ -17439,6 +17486,7 @@
         <w:rPr>
           <w:rFonts w:ascii="Times New Roman" w:hAnsi="Times New Roman" w:cs="Times New Roman" w:eastAsia="Times New Roman"/>
           <w:b/>
+          <w:i w:val="0"/>
           <w:color w:val="000000"/>
           <w:sz w:val="27"/>
         </w:rPr>
@@ -17461,10 +17509,11 @@
         <w:rPr>
           <w:rFonts w:ascii="Times New Roman" w:hAnsi="Times New Roman" w:cs="Times New Roman" w:eastAsia="Times New Roman"/>
           <w:b/>
+          <w:i w:val="0"/>
           <w:color w:val="1B365D"/>
           <w:sz w:val="30"/>
         </w:rPr>
-        <w:t>Tài liệu tham khảo</w:t>
+        <w:t>TÀI LIỆU THAM KHẢO</w:t>
       </w:r>
     </w:p>
     <w:p>
@@ -17575,10 +17624,11 @@
         <w:rPr>
           <w:rFonts w:ascii="Times New Roman" w:hAnsi="Times New Roman" w:cs="Times New Roman" w:eastAsia="Times New Roman"/>
           <w:b/>
+          <w:i w:val="0"/>
           <w:color w:val="1B365D"/>
           <w:sz w:val="30"/>
         </w:rPr>
-        <w:t>Phụ lục A: Bảng khảo sát số cụm năm 2019</w:t>
+        <w:t>PHỤ LỤC A: BẢNG KHẢO SÁT SỐ CỤM NĂM 2019</w:t>
       </w:r>
     </w:p>
     <w:p>
@@ -18380,10 +18430,11 @@
         <w:rPr>
           <w:rFonts w:ascii="Times New Roman" w:hAnsi="Times New Roman" w:cs="Times New Roman" w:eastAsia="Times New Roman"/>
           <w:b/>
+          <w:i w:val="0"/>
           <w:color w:val="1B365D"/>
           <w:sz w:val="30"/>
         </w:rPr>
-        <w:t>Phụ lục B: Kết quả quét tham số DBSCAN năm 2019</w:t>
+        <w:t>PHỤ LỤC B: KẾT QUẢ QUÉT THAM SỐ DBSCAN NĂM 2019</w:t>
       </w:r>
     </w:p>
     <w:p>
@@ -20298,7 +20349,7 @@
       <w:headerReference w:type="default" r:id="rId9"/>
       <w:footerReference w:type="default" r:id="rId10"/>
       <w:pgSz w:w="12240" w:h="15840"/>
-      <w:pgMar w:top="1134" w:right="1134" w:bottom="1134" w:left="1701" w:header="720" w:footer="720" w:gutter="0"/>
+      <w:pgMar w:top="1701" w:right="1134" w:bottom="1701" w:left="1701" w:header="720" w:footer="720" w:gutter="0"/>
       <w:pgBorders w:offsetFrom="page">
         <w:top w:val="single" w:sz="24" w:space="24" w:color="1B365D"/>
         <w:left w:val="single" w:sz="24" w:space="24" w:color="1B365D"/>
@@ -20725,7 +20776,7 @@
     <w:qFormat/>
     <w:rsid w:val="00FC693F"/>
     <w:pPr>
-      <w:spacing w:line="312" w:lineRule="auto" w:after="80" w:before="0"/>
+      <w:spacing w:line="360" w:lineRule="auto" w:after="80" w:before="0"/>
       <w:jc w:val="both"/>
     </w:pPr>
     <w:rPr>
@@ -20843,7 +20894,7 @@
     </w:pPr>
     <w:rPr>
       <w:rFonts w:ascii="Times New Roman" w:hAnsi="Times New Roman" w:cs="Times New Roman" w:eastAsia="Times New Roman"/>
-      <w:b/>
+      <w:b w:val="0"/>
       <w:bCs/>
       <w:i/>
       <w:color w:val="000000"/>
@@ -21263,7 +21314,7 @@
       <w:numPr>
         <w:numId w:val="1"/>
       </w:numPr>
-      <w:spacing w:after="40"/>
+      <w:spacing w:line="360" w:lineRule="auto" w:after="40"/>
       <w:contextualSpacing/>
     </w:pPr>
     <w:rPr>
@@ -21307,7 +21358,7 @@
       <w:numPr>
         <w:numId w:val="5"/>
       </w:numPr>
-      <w:spacing w:after="40"/>
+      <w:spacing w:line="360" w:lineRule="auto" w:after="40"/>
       <w:contextualSpacing/>
     </w:pPr>
     <w:rPr>

</xml_diff>

<commit_message>
báo cáo: loại bỏ hình phân bố pca 2019 trùng lặp tại mục 5.1 và đồng bộ lại danh mục hình ảnh, mục lục
</commit_message>
<xml_diff>
--- a/reports/final_report/Nhom12_BaoCao.docx
+++ b/reports/final_report/Nhom12_BaoCao.docx
@@ -243,7 +243,7 @@
       <w:pPr>
         <w:pStyle w:val="Heading1"/>
       </w:pPr>
-      <w:bookmarkStart w:id="0" w:name="_Toc243609317"/>
+      <w:bookmarkStart w:id="0" w:name="_Toc243610406"/>
       <w:r>
         <w:lastRenderedPageBreak/>
         <w:t>LỜI MỞ ĐẦU</w:t>
@@ -301,7 +301,7 @@
       <w:pPr>
         <w:pStyle w:val="Heading1"/>
       </w:pPr>
-      <w:bookmarkStart w:id="1" w:name="_Toc243609318"/>
+      <w:bookmarkStart w:id="1" w:name="_Toc243610407"/>
       <w:r>
         <w:lastRenderedPageBreak/>
         <w:t>TÓM TẮT</w:t>
@@ -342,26 +342,16 @@
       <w:pPr>
         <w:pStyle w:val="Heading1"/>
       </w:pPr>
-      <w:bookmarkStart w:id="2" w:name="_Toc243609319"/>
+      <w:bookmarkStart w:id="2" w:name="_Toc243610408"/>
       <w:r>
         <w:t>BẢNG PHÂN CÔNG NHIỆM VỤ</w:t>
       </w:r>
       <w:bookmarkEnd w:id="2"/>
-    </w:p>
-    <w:p>
-      <w:r>
-        <w:t>Bảng dưới đây thống kê chi tiết phần việc phụ trách chính, phần việc hỗ trợ và tỷ lệ đóng góp của từng thành viên trong quá trình thực hiện đồ án và thuyết trình video báo cáo:</w:t>
-      </w:r>
     </w:p>
     <w:tbl>
       <w:tblPr>
+        <w:tblStyle w:val="TableGrid"/>
         <w:tblW w:w="0" w:type="auto"/>
-        <w:jc w:val="center"/>
-        <w:tblBorders>
-          <w:top w:val="single" w:sz="6" w:space="0" w:color="CCCCCC"/>
-          <w:bottom w:val="single" w:sz="6" w:space="0" w:color="CCCCCC"/>
-          <w:insideH w:val="single" w:sz="4" w:space="0" w:color="E0E0E0"/>
-        </w:tblBorders>
         <w:tblLook w:val="04A0" w:firstRow="1" w:lastRow="0" w:firstColumn="1" w:lastColumn="0" w:noHBand="0" w:noVBand="1"/>
       </w:tblPr>
       <w:tblGrid>
@@ -371,16 +361,9 @@
         <w:gridCol w:w="850"/>
       </w:tblGrid>
       <w:tr>
-        <w:trPr>
-          <w:cantSplit/>
-          <w:tblHeader/>
-          <w:jc w:val="center"/>
-        </w:trPr>
         <w:tc>
           <w:tcPr>
             <w:tcW w:w="1814" w:type="dxa"/>
-            <w:shd w:val="clear" w:color="auto" w:fill="F2F2F2"/>
-            <w:vAlign w:val="center"/>
           </w:tcPr>
           <w:p>
             <w:pPr>
@@ -399,8 +382,6 @@
         <w:tc>
           <w:tcPr>
             <w:tcW w:w="3859" w:type="dxa"/>
-            <w:shd w:val="clear" w:color="auto" w:fill="F2F2F2"/>
-            <w:vAlign w:val="center"/>
           </w:tcPr>
           <w:p>
             <w:pPr>
@@ -412,15 +393,13 @@
                 <w:b/>
                 <w:sz w:val="21"/>
               </w:rPr>
-              <w:t>Công việc chính (bao gồm phần thuyết trình video)</w:t>
+              <w:t>Công việc chính</w:t>
             </w:r>
           </w:p>
         </w:tc>
         <w:tc>
           <w:tcPr>
             <w:tcW w:w="2549" w:type="dxa"/>
-            <w:shd w:val="clear" w:color="auto" w:fill="F2F2F2"/>
-            <w:vAlign w:val="center"/>
           </w:tcPr>
           <w:p>
             <w:pPr>
@@ -439,8 +418,6 @@
         <w:tc>
           <w:tcPr>
             <w:tcW w:w="850" w:type="dxa"/>
-            <w:shd w:val="clear" w:color="auto" w:fill="F2F2F2"/>
-            <w:vAlign w:val="center"/>
           </w:tcPr>
           <w:p>
             <w:pPr>
@@ -458,10 +435,6 @@
         </w:tc>
       </w:tr>
       <w:tr>
-        <w:trPr>
-          <w:cantSplit/>
-          <w:jc w:val="center"/>
-        </w:trPr>
         <w:tc>
           <w:tcPr>
             <w:tcW w:w="1814" w:type="dxa"/>
@@ -470,10 +443,13 @@
             <w:pPr>
               <w:spacing w:before="40" w:after="40" w:line="276" w:lineRule="auto"/>
               <w:jc w:val="center"/>
-            </w:pPr>
-            <w:r>
-              <w:rPr>
-                <w:b/>
+              <w:rPr>
+                <w:bCs/>
+              </w:rPr>
+            </w:pPr>
+            <w:r>
+              <w:rPr>
+                <w:bCs/>
                 <w:sz w:val="19"/>
               </w:rPr>
               <w:t>Hà Mạnh Trường</w:t>
@@ -483,9 +459,13 @@
             <w:pPr>
               <w:spacing w:before="20" w:after="20" w:line="276" w:lineRule="auto"/>
               <w:jc w:val="center"/>
-            </w:pPr>
-            <w:r>
-              <w:rPr>
+              <w:rPr>
+                <w:bCs/>
+              </w:rPr>
+            </w:pPr>
+            <w:r>
+              <w:rPr>
+                <w:bCs/>
                 <w:sz w:val="19"/>
               </w:rPr>
               <w:t>MSSV: 2045240326</w:t>
@@ -495,9 +475,13 @@
             <w:pPr>
               <w:spacing w:before="20" w:after="20" w:line="276" w:lineRule="auto"/>
               <w:jc w:val="center"/>
-            </w:pPr>
-            <w:r>
-              <w:rPr>
+              <w:rPr>
+                <w:bCs/>
+              </w:rPr>
+            </w:pPr>
+            <w:r>
+              <w:rPr>
+                <w:bCs/>
                 <w:sz w:val="19"/>
               </w:rPr>
               <w:t>(Nhóm trưởng)</w:t>
@@ -512,36 +496,62 @@
             <w:pPr>
               <w:spacing w:before="40" w:after="40" w:line="276" w:lineRule="auto"/>
               <w:jc w:val="left"/>
-            </w:pPr>
-            <w:r>
-              <w:rPr>
+              <w:rPr>
+                <w:bCs/>
+              </w:rPr>
+            </w:pPr>
+            <w:r>
+              <w:rPr>
+                <w:bCs/>
                 <w:sz w:val="19"/>
               </w:rPr>
-              <w:t>• Thu thập và tiền xử lý dữ liệu 5 năm (2015–2019), xử lý khuyết thiếu UAE 2018, đồng bộ tên quốc gia và mã ISO-3 xuất bản data/interim/happiness_merged.csv 781 dòng sạch.</w:t>
+              <w:t>Thu thập và tiền xử lý dữ liệu 5 năm (2015–2019), xử lý khuyết thiếu UAE 2018, đồng bộ tên quốc gia và mã ISO-3 xuất bản data/interim/happiness_merged.csv 781 dòng sạch.</w:t>
             </w:r>
           </w:p>
           <w:p>
             <w:pPr>
               <w:spacing w:before="20" w:after="20" w:line="276" w:lineRule="auto"/>
               <w:jc w:val="left"/>
-            </w:pPr>
-            <w:r>
-              <w:rPr>
+              <w:rPr>
+                <w:bCs/>
+              </w:rPr>
+            </w:pPr>
+            <w:r>
+              <w:rPr>
+                <w:bCs/>
                 <w:sz w:val="19"/>
               </w:rPr>
-              <w:t>• Điều phối tiến độ 11 bước, kiểm soát môi trường chạy lại và biên soạn Chương 1, Chương 2 Báo cáo Word.</w:t>
+              <w:t>Điều phối tiến độ 11 bước, kiểm soát môi trường chạy lại và biên soạn Chương 1, Chương 2 Báo cáo Word.</w:t>
             </w:r>
           </w:p>
           <w:p>
             <w:pPr>
               <w:spacing w:before="20" w:after="20" w:line="276" w:lineRule="auto"/>
               <w:jc w:val="left"/>
-            </w:pPr>
-            <w:r>
-              <w:rPr>
+              <w:rPr>
+                <w:bCs/>
+              </w:rPr>
+            </w:pPr>
+            <w:r>
+              <w:rPr>
+                <w:bCs/>
                 <w:sz w:val="19"/>
               </w:rPr>
-              <w:t>• Thuyết trình Phần 1 video báo cáo (Tổng quan &amp; Tiền xử lý dữ liệu, Slide 1–4, ~3.5 phút).</w:t>
+              <w:t xml:space="preserve">Thuyết trình Phần 1 video báo cáo (Tổng quan </w:t>
+            </w:r>
+            <w:r>
+              <w:rPr>
+                <w:bCs/>
+                <w:sz w:val="19"/>
+              </w:rPr>
+              <w:t>và</w:t>
+            </w:r>
+            <w:r>
+              <w:rPr>
+                <w:bCs/>
+                <w:sz w:val="19"/>
+              </w:rPr>
+              <w:t xml:space="preserve"> Tiền xử lý dữ liệu).</w:t>
             </w:r>
           </w:p>
         </w:tc>
@@ -553,36 +563,48 @@
             <w:pPr>
               <w:spacing w:before="40" w:after="40" w:line="276" w:lineRule="auto"/>
               <w:jc w:val="left"/>
-            </w:pPr>
-            <w:r>
-              <w:rPr>
+              <w:rPr>
+                <w:bCs/>
+              </w:rPr>
+            </w:pPr>
+            <w:r>
+              <w:rPr>
+                <w:bCs/>
                 <w:sz w:val="19"/>
               </w:rPr>
-              <w:t>• Rà soát phần thuật toán gom cụm from-scratch.</w:t>
+              <w:t>Rà soát phần thuật toán gom cụm from-scratch.</w:t>
             </w:r>
           </w:p>
           <w:p>
             <w:pPr>
               <w:spacing w:before="20" w:after="20" w:line="276" w:lineRule="auto"/>
               <w:jc w:val="left"/>
-            </w:pPr>
-            <w:r>
-              <w:rPr>
+              <w:rPr>
+                <w:bCs/>
+              </w:rPr>
+            </w:pPr>
+            <w:r>
+              <w:rPr>
+                <w:bCs/>
                 <w:sz w:val="19"/>
               </w:rPr>
-              <w:t>• Đối chiếu tính nhất quán số liệu giữa báo cáo và các file CSV.</w:t>
+              <w:t>Đối chiếu tính nhất quán số liệu giữa báo cáo và các file CSV.</w:t>
             </w:r>
           </w:p>
           <w:p>
             <w:pPr>
               <w:spacing w:before="20" w:after="20" w:line="276" w:lineRule="auto"/>
               <w:jc w:val="left"/>
-            </w:pPr>
-            <w:r>
-              <w:rPr>
+              <w:rPr>
+                <w:bCs/>
+              </w:rPr>
+            </w:pPr>
+            <w:r>
+              <w:rPr>
+                <w:bCs/>
                 <w:sz w:val="19"/>
               </w:rPr>
-              <w:t>• Hỗ trợ nạp dữ liệu cho demo Streamlit.</w:t>
+              <w:t>Hỗ trợ nạp dữ liệu cho demo Streamlit.</w:t>
             </w:r>
           </w:p>
         </w:tc>
@@ -594,10 +616,13 @@
             <w:pPr>
               <w:spacing w:before="40" w:after="40" w:line="276" w:lineRule="auto"/>
               <w:jc w:val="center"/>
-            </w:pPr>
-            <w:r>
-              <w:rPr>
-                <w:b/>
+              <w:rPr>
+                <w:bCs/>
+              </w:rPr>
+            </w:pPr>
+            <w:r>
+              <w:rPr>
+                <w:bCs/>
                 <w:sz w:val="19"/>
               </w:rPr>
               <w:t>34%</w:t>
@@ -606,10 +631,6 @@
         </w:tc>
       </w:tr>
       <w:tr>
-        <w:trPr>
-          <w:cantSplit/>
-          <w:jc w:val="center"/>
-        </w:trPr>
         <w:tc>
           <w:tcPr>
             <w:tcW w:w="1814" w:type="dxa"/>
@@ -618,10 +639,13 @@
             <w:pPr>
               <w:spacing w:before="40" w:after="40" w:line="276" w:lineRule="auto"/>
               <w:jc w:val="center"/>
-            </w:pPr>
-            <w:r>
-              <w:rPr>
-                <w:b/>
+              <w:rPr>
+                <w:bCs/>
+              </w:rPr>
+            </w:pPr>
+            <w:r>
+              <w:rPr>
+                <w:bCs/>
                 <w:sz w:val="19"/>
               </w:rPr>
               <w:t>Huỳnh Tâm Trí</w:t>
@@ -631,9 +655,13 @@
             <w:pPr>
               <w:spacing w:before="20" w:after="20" w:line="276" w:lineRule="auto"/>
               <w:jc w:val="center"/>
-            </w:pPr>
-            <w:r>
-              <w:rPr>
+              <w:rPr>
+                <w:bCs/>
+              </w:rPr>
+            </w:pPr>
+            <w:r>
+              <w:rPr>
+                <w:bCs/>
                 <w:sz w:val="19"/>
               </w:rPr>
               <w:t>MSSV: 2045240315</w:t>
@@ -643,9 +671,13 @@
             <w:pPr>
               <w:spacing w:before="20" w:after="20" w:line="276" w:lineRule="auto"/>
               <w:jc w:val="center"/>
-            </w:pPr>
-            <w:r>
-              <w:rPr>
+              <w:rPr>
+                <w:bCs/>
+              </w:rPr>
+            </w:pPr>
+            <w:r>
+              <w:rPr>
+                <w:bCs/>
                 <w:sz w:val="19"/>
               </w:rPr>
               <w:t>(Thành viên)</w:t>
@@ -660,48 +692,78 @@
             <w:pPr>
               <w:spacing w:before="40" w:after="40" w:line="276" w:lineRule="auto"/>
               <w:jc w:val="left"/>
-            </w:pPr>
-            <w:r>
-              <w:rPr>
+              <w:rPr>
+                <w:bCs/>
+              </w:rPr>
+            </w:pPr>
+            <w:r>
+              <w:rPr>
+                <w:bCs/>
                 <w:sz w:val="19"/>
               </w:rPr>
-              <w:t>• Tự cài đặt thuật toán from-scratch (K-Means++, Hierarchical Ward, DBSCAN) và các độ đo đánh giá (Silhouette, DB, CH, ARI) không dùng thư viện.</w:t>
+              <w:t>Tự cài đặt thuật toán from-scratch (K-Means++, Hierarchical Ward, DBSCAN) và các độ đo đánh giá (Silhouette, DB, CH, ARI) không dùng thư viện.</w:t>
             </w:r>
           </w:p>
           <w:p>
             <w:pPr>
               <w:spacing w:before="20" w:after="20" w:line="276" w:lineRule="auto"/>
               <w:jc w:val="left"/>
-            </w:pPr>
-            <w:r>
-              <w:rPr>
+              <w:rPr>
+                <w:bCs/>
+              </w:rPr>
+            </w:pPr>
+            <w:r>
+              <w:rPr>
+                <w:bCs/>
                 <w:sz w:val="19"/>
               </w:rPr>
-              <w:t>• Thực nghiệm quét k từ 2 đến 9 thẩm định số cụm tối ưu k* = 3 cho cả 5 năm; so sánh đối chứng 5 cấu hình và đánh giá độ ổn định qua 10 seed.</w:t>
+              <w:t>Thực nghiệm quét k từ 2 đến 9 thẩm định số cụm tối ưu k* = 3 cho cả 5 năm; so sánh đối chứng 5 cấu hình và đánh giá độ ổn định qua 10 seed.</w:t>
             </w:r>
           </w:p>
           <w:p>
             <w:pPr>
               <w:spacing w:before="20" w:after="20" w:line="276" w:lineRule="auto"/>
               <w:jc w:val="left"/>
-            </w:pPr>
-            <w:r>
-              <w:rPr>
+              <w:rPr>
+                <w:bCs/>
+              </w:rPr>
+            </w:pPr>
+            <w:r>
+              <w:rPr>
+                <w:bCs/>
                 <w:sz w:val="19"/>
               </w:rPr>
-              <w:t>• Biên soạn Chương 3 và phần thực nghiệm Chương 4 Báo cáo Word.</w:t>
+              <w:t>Biên soạn Chương 3 và phần thực nghiệm Chương 4 Báo cáo Word.</w:t>
             </w:r>
           </w:p>
           <w:p>
             <w:pPr>
               <w:spacing w:before="20" w:after="20" w:line="276" w:lineRule="auto"/>
               <w:jc w:val="left"/>
-            </w:pPr>
-            <w:r>
-              <w:rPr>
+              <w:rPr>
+                <w:bCs/>
+              </w:rPr>
+            </w:pPr>
+            <w:r>
+              <w:rPr>
+                <w:bCs/>
                 <w:sz w:val="19"/>
               </w:rPr>
-              <w:t>• Thuyết trình Phần 2 video báo cáo (Thuật toán from-scratch &amp; Thực nghiệm, Slide 5–9, ~4.0 phút).</w:t>
+              <w:t xml:space="preserve">Thuyết trình Phần 2 video báo cáo (Thuật toán from-scratch </w:t>
+            </w:r>
+            <w:r>
+              <w:rPr>
+                <w:bCs/>
+                <w:sz w:val="19"/>
+              </w:rPr>
+              <w:t>và</w:t>
+            </w:r>
+            <w:r>
+              <w:rPr>
+                <w:bCs/>
+                <w:sz w:val="19"/>
+              </w:rPr>
+              <w:t xml:space="preserve"> Thực nghiệm).</w:t>
             </w:r>
           </w:p>
         </w:tc>
@@ -713,36 +775,48 @@
             <w:pPr>
               <w:spacing w:before="40" w:after="40" w:line="276" w:lineRule="auto"/>
               <w:jc w:val="left"/>
-            </w:pPr>
-            <w:r>
-              <w:rPr>
+              <w:rPr>
+                <w:bCs/>
+              </w:rPr>
+            </w:pPr>
+            <w:r>
+              <w:rPr>
+                <w:bCs/>
                 <w:sz w:val="19"/>
               </w:rPr>
-              <w:t>• Rà soát module nạp dữ liệu data_loader.py.</w:t>
+              <w:t>Rà soát module nạp dữ liệu data_loader.py.</w:t>
             </w:r>
           </w:p>
           <w:p>
             <w:pPr>
               <w:spacing w:before="20" w:after="20" w:line="276" w:lineRule="auto"/>
               <w:jc w:val="left"/>
-            </w:pPr>
-            <w:r>
-              <w:rPr>
+              <w:rPr>
+                <w:bCs/>
+              </w:rPr>
+            </w:pPr>
+            <w:r>
+              <w:rPr>
+                <w:bCs/>
                 <w:sz w:val="19"/>
               </w:rPr>
-              <w:t>• Xây dựng bộ test đối chứng thuật toán với scikit-learn/scipy.</w:t>
+              <w:t>Xây dựng bộ test đối chứng thuật toán với scikit-learn/scipy.</w:t>
             </w:r>
           </w:p>
           <w:p>
             <w:pPr>
               <w:spacing w:before="20" w:after="20" w:line="276" w:lineRule="auto"/>
               <w:jc w:val="left"/>
-            </w:pPr>
-            <w:r>
-              <w:rPr>
+              <w:rPr>
+                <w:bCs/>
+              </w:rPr>
+            </w:pPr>
+            <w:r>
+              <w:rPr>
+                <w:bCs/>
                 <w:sz w:val="19"/>
               </w:rPr>
-              <w:t>• Rà soát logic nạp mô hình của ứng dụng Streamlit.</w:t>
+              <w:t>Rà soát logic nạp mô hình của ứng dụng Streamlit.</w:t>
             </w:r>
           </w:p>
         </w:tc>
@@ -754,10 +828,13 @@
             <w:pPr>
               <w:spacing w:before="40" w:after="40" w:line="276" w:lineRule="auto"/>
               <w:jc w:val="center"/>
-            </w:pPr>
-            <w:r>
-              <w:rPr>
-                <w:b/>
+              <w:rPr>
+                <w:bCs/>
+              </w:rPr>
+            </w:pPr>
+            <w:r>
+              <w:rPr>
+                <w:bCs/>
                 <w:sz w:val="19"/>
               </w:rPr>
               <w:t>33%</w:t>
@@ -766,10 +843,6 @@
         </w:tc>
       </w:tr>
       <w:tr>
-        <w:trPr>
-          <w:cantSplit/>
-          <w:jc w:val="center"/>
-        </w:trPr>
         <w:tc>
           <w:tcPr>
             <w:tcW w:w="1814" w:type="dxa"/>
@@ -778,10 +851,13 @@
             <w:pPr>
               <w:spacing w:before="40" w:after="40" w:line="276" w:lineRule="auto"/>
               <w:jc w:val="center"/>
-            </w:pPr>
-            <w:r>
-              <w:rPr>
-                <w:b/>
+              <w:rPr>
+                <w:bCs/>
+              </w:rPr>
+            </w:pPr>
+            <w:r>
+              <w:rPr>
+                <w:bCs/>
                 <w:sz w:val="19"/>
               </w:rPr>
               <w:t>Ngô Quang Trung</w:t>
@@ -791,9 +867,13 @@
             <w:pPr>
               <w:spacing w:before="20" w:after="20" w:line="276" w:lineRule="auto"/>
               <w:jc w:val="center"/>
-            </w:pPr>
-            <w:r>
-              <w:rPr>
+              <w:rPr>
+                <w:bCs/>
+              </w:rPr>
+            </w:pPr>
+            <w:r>
+              <w:rPr>
+                <w:bCs/>
                 <w:sz w:val="19"/>
               </w:rPr>
               <w:t>MSSV: 2045240325</w:t>
@@ -803,9 +883,13 @@
             <w:pPr>
               <w:spacing w:before="20" w:after="20" w:line="276" w:lineRule="auto"/>
               <w:jc w:val="center"/>
-            </w:pPr>
-            <w:r>
-              <w:rPr>
+              <w:rPr>
+                <w:bCs/>
+              </w:rPr>
+            </w:pPr>
+            <w:r>
+              <w:rPr>
+                <w:bCs/>
                 <w:sz w:val="19"/>
               </w:rPr>
               <w:t>(Thành viên)</w:t>
@@ -820,48 +904,64 @@
             <w:pPr>
               <w:spacing w:before="40" w:after="40" w:line="276" w:lineRule="auto"/>
               <w:jc w:val="left"/>
-            </w:pPr>
-            <w:r>
-              <w:rPr>
+              <w:rPr>
+                <w:bCs/>
+              </w:rPr>
+            </w:pPr>
+            <w:r>
+              <w:rPr>
+                <w:bCs/>
                 <w:sz w:val="19"/>
               </w:rPr>
-              <w:t>• Phân tích khám phá dữ liệu (EDA), phân bố và ma trận tương quan; xây dựng chân dung kinh tế – xã hội 3 cụm tự nhiên.</w:t>
+              <w:t>Phân tích khám phá dữ liệu (EDA), phân bố và ma trận tương quan; xây dựng chân dung kinh tế – xã hội 3 cụm tự nhiên.</w:t>
             </w:r>
           </w:p>
           <w:p>
             <w:pPr>
               <w:spacing w:before="20" w:after="20" w:line="276" w:lineRule="auto"/>
               <w:jc w:val="left"/>
-            </w:pPr>
-            <w:r>
-              <w:rPr>
+              <w:rPr>
+                <w:bCs/>
+              </w:rPr>
+            </w:pPr>
+            <w:r>
+              <w:rPr>
+                <w:bCs/>
                 <w:sz w:val="19"/>
               </w:rPr>
-              <w:t>• Thực hiện hậu kiểm độc lập ANOVA điểm hạnh phúc; xây dựng thuật toán ghép cụm và lập bảng dịch chuyển cụm 156 quốc gia qua 5 năm.</w:t>
+              <w:t>Thực hiện hậu kiểm độc lập ANOVA điểm hạnh phúc; xây dựng thuật toán ghép cụm và lập bảng dịch chuyển cụm 156 quốc gia qua 5 năm.</w:t>
             </w:r>
           </w:p>
           <w:p>
             <w:pPr>
               <w:spacing w:before="20" w:after="20" w:line="276" w:lineRule="auto"/>
               <w:jc w:val="left"/>
-            </w:pPr>
-            <w:r>
-              <w:rPr>
+              <w:rPr>
+                <w:bCs/>
+              </w:rPr>
+            </w:pPr>
+            <w:r>
+              <w:rPr>
+                <w:bCs/>
                 <w:sz w:val="19"/>
               </w:rPr>
-              <w:t>• Xây dựng toàn diện ứng dụng tương tác Demo Streamlit 4 tab; biên soạn phần diễn giải Chương 4, Chương 5 và thiết kế slide thuyết trình.</w:t>
+              <w:t>Xây dựng toàn diện ứng dụng tương tác Demo Streamlit 4 tab; biên soạn phần diễn giải Chương 4, Chương 5 và thiết kế slide thuyết trình.</w:t>
             </w:r>
           </w:p>
           <w:p>
             <w:pPr>
               <w:spacing w:before="20" w:after="20" w:line="276" w:lineRule="auto"/>
               <w:jc w:val="left"/>
-            </w:pPr>
-            <w:r>
-              <w:rPr>
+              <w:rPr>
+                <w:bCs/>
+              </w:rPr>
+            </w:pPr>
+            <w:r>
+              <w:rPr>
+                <w:bCs/>
                 <w:sz w:val="19"/>
               </w:rPr>
-              <w:t>• Thuyết trình Phần 3 video báo cáo (Diễn giải tri thức, Dịch chuyển cụm, Demo &amp; Kết luận, Slide 10–15, ~4.5 phút).</w:t>
+              <w:t>Thuyết trình Phần 3 video báo cáo (Diễn giải tri thức, Dịch chuyển cụm, Demo &amp; Kết luận).</w:t>
             </w:r>
           </w:p>
         </w:tc>
@@ -873,36 +973,48 @@
             <w:pPr>
               <w:spacing w:before="40" w:after="40" w:line="276" w:lineRule="auto"/>
               <w:jc w:val="left"/>
-            </w:pPr>
-            <w:r>
-              <w:rPr>
+              <w:rPr>
+                <w:bCs/>
+              </w:rPr>
+            </w:pPr>
+            <w:r>
+              <w:rPr>
+                <w:bCs/>
                 <w:sz w:val="19"/>
               </w:rPr>
-              <w:t>• Rà soát notebook 01 và chất lượng dữ liệu interim.</w:t>
+              <w:t>Rà soát notebook 01 và chất lượng dữ liệu interim.</w:t>
             </w:r>
           </w:p>
           <w:p>
             <w:pPr>
               <w:spacing w:before="20" w:after="20" w:line="276" w:lineRule="auto"/>
               <w:jc w:val="left"/>
-            </w:pPr>
-            <w:r>
-              <w:rPr>
+              <w:rPr>
+                <w:bCs/>
+              </w:rPr>
+            </w:pPr>
+            <w:r>
+              <w:rPr>
+                <w:bCs/>
                 <w:sz w:val="19"/>
               </w:rPr>
-              <w:t>• Kiểm tra tính chính xác của bản đồ ISO-3.</w:t>
+              <w:t>Kiểm tra tính chính xác của bản đồ ISO-3.</w:t>
             </w:r>
           </w:p>
           <w:p>
             <w:pPr>
               <w:spacing w:before="20" w:after="20" w:line="276" w:lineRule="auto"/>
               <w:jc w:val="left"/>
-            </w:pPr>
-            <w:r>
-              <w:rPr>
+              <w:rPr>
+                <w:bCs/>
+              </w:rPr>
+            </w:pPr>
+            <w:r>
+              <w:rPr>
+                <w:bCs/>
                 <w:sz w:val="19"/>
               </w:rPr>
-              <w:t>• Điều hành tổng duyệt rehearsal và kiểm soát thời lượng video &lt;= 12 phút.</w:t>
+              <w:t>Điều hành tổng duyệt rehearsal và kiểm soát thời lượng video &lt;= 12 phút.</w:t>
             </w:r>
           </w:p>
         </w:tc>
@@ -914,10 +1026,13 @@
             <w:pPr>
               <w:spacing w:before="40" w:after="40" w:line="276" w:lineRule="auto"/>
               <w:jc w:val="center"/>
-            </w:pPr>
-            <w:r>
-              <w:rPr>
-                <w:b/>
+              <w:rPr>
+                <w:bCs/>
+              </w:rPr>
+            </w:pPr>
+            <w:r>
+              <w:rPr>
+                <w:bCs/>
                 <w:sz w:val="19"/>
               </w:rPr>
               <w:t>33%</w:t>
@@ -928,26 +1043,9 @@
     </w:tbl>
     <w:p>
       <w:pPr>
-        <w:spacing w:before="80" w:after="120"/>
-      </w:pPr>
-      <w:r>
-        <w:rPr>
-          <w:i/>
-          <w:sz w:val="20"/>
-        </w:rPr>
-        <w:t>Ghi chú: Nhóm cam kết cả 3 thành viên đều tham gia đầy đủ, bình đẳng và nắm vững toàn bộ pipeline 11 bước từ tiền xử lý đến thực nghiệm và diễn giải tri thức. Tổng tỷ lệ đóng góp: 100%.</w:t>
-      </w:r>
-    </w:p>
-    <w:p>
-      <w:r>
-        <w:br w:type="page"/>
-      </w:r>
-    </w:p>
-    <w:p>
-      <w:pPr>
         <w:pStyle w:val="Heading1"/>
       </w:pPr>
-      <w:bookmarkStart w:id="3" w:name="_Toc243609320"/>
+      <w:bookmarkStart w:id="3" w:name="_Toc243610409"/>
       <w:r>
         <w:t>MỤC LỤC</w:t>
       </w:r>
@@ -977,7 +1075,7 @@
       <w:r>
         <w:fldChar w:fldCharType="separate"/>
       </w:r>
-      <w:hyperlink w:anchor="_Toc243609317" w:history="1">
+      <w:hyperlink w:anchor="_Toc243610406" w:history="1">
         <w:r>
           <w:rPr>
             <w:rStyle w:val="Hyperlink"/>
@@ -1004,7 +1102,7 @@
             <w:noProof/>
             <w:webHidden/>
           </w:rPr>
-          <w:instrText xml:space="preserve"> PAGEREF _Toc243609317 \h </w:instrText>
+          <w:instrText xml:space="preserve"> PAGEREF _Toc243610406 \h </w:instrText>
         </w:r>
         <w:r>
           <w:rPr>
@@ -1050,7 +1148,7 @@
           <w14:ligatures w14:val="standardContextual"/>
         </w:rPr>
       </w:pPr>
-      <w:hyperlink w:anchor="_Toc243609318" w:history="1">
+      <w:hyperlink w:anchor="_Toc243610407" w:history="1">
         <w:r>
           <w:rPr>
             <w:rStyle w:val="Hyperlink"/>
@@ -1077,7 +1175,7 @@
             <w:noProof/>
             <w:webHidden/>
           </w:rPr>
-          <w:instrText xml:space="preserve"> PAGEREF _Toc243609318 \h </w:instrText>
+          <w:instrText xml:space="preserve"> PAGEREF _Toc243610407 \h </w:instrText>
         </w:r>
         <w:r>
           <w:rPr>
@@ -1123,7 +1221,7 @@
           <w14:ligatures w14:val="standardContextual"/>
         </w:rPr>
       </w:pPr>
-      <w:hyperlink w:anchor="_Toc243609319" w:history="1">
+      <w:hyperlink w:anchor="_Toc243610408" w:history="1">
         <w:r>
           <w:rPr>
             <w:rStyle w:val="Hyperlink"/>
@@ -1150,7 +1248,7 @@
             <w:noProof/>
             <w:webHidden/>
           </w:rPr>
-          <w:instrText xml:space="preserve"> PAGEREF _Toc243609319 \h </w:instrText>
+          <w:instrText xml:space="preserve"> PAGEREF _Toc243610408 \h </w:instrText>
         </w:r>
         <w:r>
           <w:rPr>
@@ -1196,7 +1294,7 @@
           <w14:ligatures w14:val="standardContextual"/>
         </w:rPr>
       </w:pPr>
-      <w:hyperlink w:anchor="_Toc243609320" w:history="1">
+      <w:hyperlink w:anchor="_Toc243610409" w:history="1">
         <w:r>
           <w:rPr>
             <w:rStyle w:val="Hyperlink"/>
@@ -1223,7 +1321,7 @@
             <w:noProof/>
             <w:webHidden/>
           </w:rPr>
-          <w:instrText xml:space="preserve"> PAGEREF _Toc243609320 \h </w:instrText>
+          <w:instrText xml:space="preserve"> PAGEREF _Toc243610409 \h </w:instrText>
         </w:r>
         <w:r>
           <w:rPr>
@@ -1243,7 +1341,7 @@
             <w:noProof/>
             <w:webHidden/>
           </w:rPr>
-          <w:t>5</w:t>
+          <w:t>4</w:t>
         </w:r>
         <w:r>
           <w:rPr>
@@ -1269,7 +1367,7 @@
           <w14:ligatures w14:val="standardContextual"/>
         </w:rPr>
       </w:pPr>
-      <w:hyperlink w:anchor="_Toc243609321" w:history="1">
+      <w:hyperlink w:anchor="_Toc243610410" w:history="1">
         <w:r>
           <w:rPr>
             <w:rStyle w:val="Hyperlink"/>
@@ -1296,7 +1394,7 @@
             <w:noProof/>
             <w:webHidden/>
           </w:rPr>
-          <w:instrText xml:space="preserve"> PAGEREF _Toc243609321 \h </w:instrText>
+          <w:instrText xml:space="preserve"> PAGEREF _Toc243610410 \h </w:instrText>
         </w:r>
         <w:r>
           <w:rPr>
@@ -1316,7 +1414,7 @@
             <w:noProof/>
             <w:webHidden/>
           </w:rPr>
-          <w:t>8</w:t>
+          <w:t>7</w:t>
         </w:r>
         <w:r>
           <w:rPr>
@@ -1342,7 +1440,7 @@
           <w14:ligatures w14:val="standardContextual"/>
         </w:rPr>
       </w:pPr>
-      <w:hyperlink w:anchor="_Toc243609322" w:history="1">
+      <w:hyperlink w:anchor="_Toc243610411" w:history="1">
         <w:r>
           <w:rPr>
             <w:rStyle w:val="Hyperlink"/>
@@ -1369,7 +1467,7 @@
             <w:noProof/>
             <w:webHidden/>
           </w:rPr>
-          <w:instrText xml:space="preserve"> PAGEREF _Toc243609322 \h </w:instrText>
+          <w:instrText xml:space="preserve"> PAGEREF _Toc243610411 \h </w:instrText>
         </w:r>
         <w:r>
           <w:rPr>
@@ -1389,7 +1487,7 @@
             <w:noProof/>
             <w:webHidden/>
           </w:rPr>
-          <w:t>9</w:t>
+          <w:t>8</w:t>
         </w:r>
         <w:r>
           <w:rPr>
@@ -1415,7 +1513,7 @@
           <w14:ligatures w14:val="standardContextual"/>
         </w:rPr>
       </w:pPr>
-      <w:hyperlink w:anchor="_Toc243609323" w:history="1">
+      <w:hyperlink w:anchor="_Toc243610412" w:history="1">
         <w:r>
           <w:rPr>
             <w:rStyle w:val="Hyperlink"/>
@@ -1442,7 +1540,7 @@
             <w:noProof/>
             <w:webHidden/>
           </w:rPr>
-          <w:instrText xml:space="preserve"> PAGEREF _Toc243609323 \h </w:instrText>
+          <w:instrText xml:space="preserve"> PAGEREF _Toc243610412 \h </w:instrText>
         </w:r>
         <w:r>
           <w:rPr>
@@ -1462,7 +1560,7 @@
             <w:noProof/>
             <w:webHidden/>
           </w:rPr>
-          <w:t>10</w:t>
+          <w:t>9</w:t>
         </w:r>
         <w:r>
           <w:rPr>
@@ -1488,7 +1586,7 @@
           <w14:ligatures w14:val="standardContextual"/>
         </w:rPr>
       </w:pPr>
-      <w:hyperlink w:anchor="_Toc243609324" w:history="1">
+      <w:hyperlink w:anchor="_Toc243610413" w:history="1">
         <w:r>
           <w:rPr>
             <w:rStyle w:val="Hyperlink"/>
@@ -1515,7 +1613,7 @@
             <w:noProof/>
             <w:webHidden/>
           </w:rPr>
-          <w:instrText xml:space="preserve"> PAGEREF _Toc243609324 \h </w:instrText>
+          <w:instrText xml:space="preserve"> PAGEREF _Toc243610413 \h </w:instrText>
         </w:r>
         <w:r>
           <w:rPr>
@@ -1535,7 +1633,7 @@
             <w:noProof/>
             <w:webHidden/>
           </w:rPr>
-          <w:t>10</w:t>
+          <w:t>9</w:t>
         </w:r>
         <w:r>
           <w:rPr>
@@ -1561,7 +1659,7 @@
           <w14:ligatures w14:val="standardContextual"/>
         </w:rPr>
       </w:pPr>
-      <w:hyperlink w:anchor="_Toc243609325" w:history="1">
+      <w:hyperlink w:anchor="_Toc243610414" w:history="1">
         <w:r>
           <w:rPr>
             <w:rStyle w:val="Hyperlink"/>
@@ -1588,7 +1686,7 @@
             <w:noProof/>
             <w:webHidden/>
           </w:rPr>
-          <w:instrText xml:space="preserve"> PAGEREF _Toc243609325 \h </w:instrText>
+          <w:instrText xml:space="preserve"> PAGEREF _Toc243610414 \h </w:instrText>
         </w:r>
         <w:r>
           <w:rPr>
@@ -1608,7 +1706,7 @@
             <w:noProof/>
             <w:webHidden/>
           </w:rPr>
-          <w:t>10</w:t>
+          <w:t>9</w:t>
         </w:r>
         <w:r>
           <w:rPr>
@@ -1634,7 +1732,7 @@
           <w14:ligatures w14:val="standardContextual"/>
         </w:rPr>
       </w:pPr>
-      <w:hyperlink w:anchor="_Toc243609326" w:history="1">
+      <w:hyperlink w:anchor="_Toc243610415" w:history="1">
         <w:r>
           <w:rPr>
             <w:rStyle w:val="Hyperlink"/>
@@ -1661,7 +1759,7 @@
             <w:noProof/>
             <w:webHidden/>
           </w:rPr>
-          <w:instrText xml:space="preserve"> PAGEREF _Toc243609326 \h </w:instrText>
+          <w:instrText xml:space="preserve"> PAGEREF _Toc243610415 \h </w:instrText>
         </w:r>
         <w:r>
           <w:rPr>
@@ -1681,7 +1779,7 @@
             <w:noProof/>
             <w:webHidden/>
           </w:rPr>
-          <w:t>11</w:t>
+          <w:t>10</w:t>
         </w:r>
         <w:r>
           <w:rPr>
@@ -1707,7 +1805,7 @@
           <w14:ligatures w14:val="standardContextual"/>
         </w:rPr>
       </w:pPr>
-      <w:hyperlink w:anchor="_Toc243609327" w:history="1">
+      <w:hyperlink w:anchor="_Toc243610416" w:history="1">
         <w:r>
           <w:rPr>
             <w:rStyle w:val="Hyperlink"/>
@@ -1734,7 +1832,7 @@
             <w:noProof/>
             <w:webHidden/>
           </w:rPr>
-          <w:instrText xml:space="preserve"> PAGEREF _Toc243609327 \h </w:instrText>
+          <w:instrText xml:space="preserve"> PAGEREF _Toc243610416 \h </w:instrText>
         </w:r>
         <w:r>
           <w:rPr>
@@ -1754,7 +1852,7 @@
             <w:noProof/>
             <w:webHidden/>
           </w:rPr>
-          <w:t>11</w:t>
+          <w:t>10</w:t>
         </w:r>
         <w:r>
           <w:rPr>
@@ -1780,7 +1878,7 @@
           <w14:ligatures w14:val="standardContextual"/>
         </w:rPr>
       </w:pPr>
-      <w:hyperlink w:anchor="_Toc243609328" w:history="1">
+      <w:hyperlink w:anchor="_Toc243610417" w:history="1">
         <w:r>
           <w:rPr>
             <w:rStyle w:val="Hyperlink"/>
@@ -1807,7 +1905,7 @@
             <w:noProof/>
             <w:webHidden/>
           </w:rPr>
-          <w:instrText xml:space="preserve"> PAGEREF _Toc243609328 \h </w:instrText>
+          <w:instrText xml:space="preserve"> PAGEREF _Toc243610417 \h </w:instrText>
         </w:r>
         <w:r>
           <w:rPr>
@@ -1827,7 +1925,7 @@
             <w:noProof/>
             <w:webHidden/>
           </w:rPr>
-          <w:t>11</w:t>
+          <w:t>10</w:t>
         </w:r>
         <w:r>
           <w:rPr>
@@ -1853,7 +1951,7 @@
           <w14:ligatures w14:val="standardContextual"/>
         </w:rPr>
       </w:pPr>
-      <w:hyperlink w:anchor="_Toc243609329" w:history="1">
+      <w:hyperlink w:anchor="_Toc243610418" w:history="1">
         <w:r>
           <w:rPr>
             <w:rStyle w:val="Hyperlink"/>
@@ -1880,7 +1978,7 @@
             <w:noProof/>
             <w:webHidden/>
           </w:rPr>
-          <w:instrText xml:space="preserve"> PAGEREF _Toc243609329 \h </w:instrText>
+          <w:instrText xml:space="preserve"> PAGEREF _Toc243610418 \h </w:instrText>
         </w:r>
         <w:r>
           <w:rPr>
@@ -1900,7 +1998,7 @@
             <w:noProof/>
             <w:webHidden/>
           </w:rPr>
-          <w:t>12</w:t>
+          <w:t>11</w:t>
         </w:r>
         <w:r>
           <w:rPr>
@@ -1926,7 +2024,7 @@
           <w14:ligatures w14:val="standardContextual"/>
         </w:rPr>
       </w:pPr>
-      <w:hyperlink w:anchor="_Toc243609330" w:history="1">
+      <w:hyperlink w:anchor="_Toc243610419" w:history="1">
         <w:r>
           <w:rPr>
             <w:rStyle w:val="Hyperlink"/>
@@ -1953,7 +2051,7 @@
             <w:noProof/>
             <w:webHidden/>
           </w:rPr>
-          <w:instrText xml:space="preserve"> PAGEREF _Toc243609330 \h </w:instrText>
+          <w:instrText xml:space="preserve"> PAGEREF _Toc243610419 \h </w:instrText>
         </w:r>
         <w:r>
           <w:rPr>
@@ -1973,7 +2071,7 @@
             <w:noProof/>
             <w:webHidden/>
           </w:rPr>
-          <w:t>13</w:t>
+          <w:t>12</w:t>
         </w:r>
         <w:r>
           <w:rPr>
@@ -1999,7 +2097,7 @@
           <w14:ligatures w14:val="standardContextual"/>
         </w:rPr>
       </w:pPr>
-      <w:hyperlink w:anchor="_Toc243609331" w:history="1">
+      <w:hyperlink w:anchor="_Toc243610420" w:history="1">
         <w:r>
           <w:rPr>
             <w:rStyle w:val="Hyperlink"/>
@@ -2026,7 +2124,7 @@
             <w:noProof/>
             <w:webHidden/>
           </w:rPr>
-          <w:instrText xml:space="preserve"> PAGEREF _Toc243609331 \h </w:instrText>
+          <w:instrText xml:space="preserve"> PAGEREF _Toc243610420 \h </w:instrText>
         </w:r>
         <w:r>
           <w:rPr>
@@ -2046,7 +2144,7 @@
             <w:noProof/>
             <w:webHidden/>
           </w:rPr>
-          <w:t>15</w:t>
+          <w:t>14</w:t>
         </w:r>
         <w:r>
           <w:rPr>
@@ -2072,7 +2170,7 @@
           <w14:ligatures w14:val="standardContextual"/>
         </w:rPr>
       </w:pPr>
-      <w:hyperlink w:anchor="_Toc243609332" w:history="1">
+      <w:hyperlink w:anchor="_Toc243610421" w:history="1">
         <w:r>
           <w:rPr>
             <w:rStyle w:val="Hyperlink"/>
@@ -2099,7 +2197,7 @@
             <w:noProof/>
             <w:webHidden/>
           </w:rPr>
-          <w:instrText xml:space="preserve"> PAGEREF _Toc243609332 \h </w:instrText>
+          <w:instrText xml:space="preserve"> PAGEREF _Toc243610421 \h </w:instrText>
         </w:r>
         <w:r>
           <w:rPr>
@@ -2119,7 +2217,7 @@
             <w:noProof/>
             <w:webHidden/>
           </w:rPr>
-          <w:t>16</w:t>
+          <w:t>15</w:t>
         </w:r>
         <w:r>
           <w:rPr>
@@ -2145,7 +2243,7 @@
           <w14:ligatures w14:val="standardContextual"/>
         </w:rPr>
       </w:pPr>
-      <w:hyperlink w:anchor="_Toc243609333" w:history="1">
+      <w:hyperlink w:anchor="_Toc243610422" w:history="1">
         <w:r>
           <w:rPr>
             <w:rStyle w:val="Hyperlink"/>
@@ -2172,7 +2270,7 @@
             <w:noProof/>
             <w:webHidden/>
           </w:rPr>
-          <w:instrText xml:space="preserve"> PAGEREF _Toc243609333 \h </w:instrText>
+          <w:instrText xml:space="preserve"> PAGEREF _Toc243610422 \h </w:instrText>
         </w:r>
         <w:r>
           <w:rPr>
@@ -2192,7 +2290,7 @@
             <w:noProof/>
             <w:webHidden/>
           </w:rPr>
-          <w:t>16</w:t>
+          <w:t>15</w:t>
         </w:r>
         <w:r>
           <w:rPr>
@@ -2218,7 +2316,7 @@
           <w14:ligatures w14:val="standardContextual"/>
         </w:rPr>
       </w:pPr>
-      <w:hyperlink w:anchor="_Toc243609334" w:history="1">
+      <w:hyperlink w:anchor="_Toc243610423" w:history="1">
         <w:r>
           <w:rPr>
             <w:rStyle w:val="Hyperlink"/>
@@ -2245,7 +2343,7 @@
             <w:noProof/>
             <w:webHidden/>
           </w:rPr>
-          <w:instrText xml:space="preserve"> PAGEREF _Toc243609334 \h </w:instrText>
+          <w:instrText xml:space="preserve"> PAGEREF _Toc243610423 \h </w:instrText>
         </w:r>
         <w:r>
           <w:rPr>
@@ -2265,7 +2363,7 @@
             <w:noProof/>
             <w:webHidden/>
           </w:rPr>
-          <w:t>16</w:t>
+          <w:t>15</w:t>
         </w:r>
         <w:r>
           <w:rPr>
@@ -2291,7 +2389,7 @@
           <w14:ligatures w14:val="standardContextual"/>
         </w:rPr>
       </w:pPr>
-      <w:hyperlink w:anchor="_Toc243609335" w:history="1">
+      <w:hyperlink w:anchor="_Toc243610424" w:history="1">
         <w:r>
           <w:rPr>
             <w:rStyle w:val="Hyperlink"/>
@@ -2318,7 +2416,7 @@
             <w:noProof/>
             <w:webHidden/>
           </w:rPr>
-          <w:instrText xml:space="preserve"> PAGEREF _Toc243609335 \h </w:instrText>
+          <w:instrText xml:space="preserve"> PAGEREF _Toc243610424 \h </w:instrText>
         </w:r>
         <w:r>
           <w:rPr>
@@ -2338,7 +2436,7 @@
             <w:noProof/>
             <w:webHidden/>
           </w:rPr>
-          <w:t>17</w:t>
+          <w:t>16</w:t>
         </w:r>
         <w:r>
           <w:rPr>
@@ -2364,7 +2462,7 @@
           <w14:ligatures w14:val="standardContextual"/>
         </w:rPr>
       </w:pPr>
-      <w:hyperlink w:anchor="_Toc243609336" w:history="1">
+      <w:hyperlink w:anchor="_Toc243610425" w:history="1">
         <w:r>
           <w:rPr>
             <w:rStyle w:val="Hyperlink"/>
@@ -2391,7 +2489,7 @@
             <w:noProof/>
             <w:webHidden/>
           </w:rPr>
-          <w:instrText xml:space="preserve"> PAGEREF _Toc243609336 \h </w:instrText>
+          <w:instrText xml:space="preserve"> PAGEREF _Toc243610425 \h </w:instrText>
         </w:r>
         <w:r>
           <w:rPr>
@@ -2411,7 +2509,7 @@
             <w:noProof/>
             <w:webHidden/>
           </w:rPr>
-          <w:t>17</w:t>
+          <w:t>16</w:t>
         </w:r>
         <w:r>
           <w:rPr>
@@ -2437,7 +2535,7 @@
           <w14:ligatures w14:val="standardContextual"/>
         </w:rPr>
       </w:pPr>
-      <w:hyperlink w:anchor="_Toc243609337" w:history="1">
+      <w:hyperlink w:anchor="_Toc243610426" w:history="1">
         <w:r>
           <w:rPr>
             <w:rStyle w:val="Hyperlink"/>
@@ -2464,7 +2562,7 @@
             <w:noProof/>
             <w:webHidden/>
           </w:rPr>
-          <w:instrText xml:space="preserve"> PAGEREF _Toc243609337 \h </w:instrText>
+          <w:instrText xml:space="preserve"> PAGEREF _Toc243610426 \h </w:instrText>
         </w:r>
         <w:r>
           <w:rPr>
@@ -2484,7 +2582,7 @@
             <w:noProof/>
             <w:webHidden/>
           </w:rPr>
-          <w:t>18</w:t>
+          <w:t>17</w:t>
         </w:r>
         <w:r>
           <w:rPr>
@@ -2510,7 +2608,7 @@
           <w14:ligatures w14:val="standardContextual"/>
         </w:rPr>
       </w:pPr>
-      <w:hyperlink w:anchor="_Toc243609338" w:history="1">
+      <w:hyperlink w:anchor="_Toc243610427" w:history="1">
         <w:r>
           <w:rPr>
             <w:rStyle w:val="Hyperlink"/>
@@ -2537,7 +2635,7 @@
             <w:noProof/>
             <w:webHidden/>
           </w:rPr>
-          <w:instrText xml:space="preserve"> PAGEREF _Toc243609338 \h </w:instrText>
+          <w:instrText xml:space="preserve"> PAGEREF _Toc243610427 \h </w:instrText>
         </w:r>
         <w:r>
           <w:rPr>
@@ -2557,7 +2655,7 @@
             <w:noProof/>
             <w:webHidden/>
           </w:rPr>
-          <w:t>18</w:t>
+          <w:t>17</w:t>
         </w:r>
         <w:r>
           <w:rPr>
@@ -2583,7 +2681,7 @@
           <w14:ligatures w14:val="standardContextual"/>
         </w:rPr>
       </w:pPr>
-      <w:hyperlink w:anchor="_Toc243609339" w:history="1">
+      <w:hyperlink w:anchor="_Toc243610428" w:history="1">
         <w:r>
           <w:rPr>
             <w:rStyle w:val="Hyperlink"/>
@@ -2610,7 +2708,7 @@
             <w:noProof/>
             <w:webHidden/>
           </w:rPr>
-          <w:instrText xml:space="preserve"> PAGEREF _Toc243609339 \h </w:instrText>
+          <w:instrText xml:space="preserve"> PAGEREF _Toc243610428 \h </w:instrText>
         </w:r>
         <w:r>
           <w:rPr>
@@ -2630,7 +2728,7 @@
             <w:noProof/>
             <w:webHidden/>
           </w:rPr>
-          <w:t>19</w:t>
+          <w:t>18</w:t>
         </w:r>
         <w:r>
           <w:rPr>
@@ -2656,7 +2754,7 @@
           <w14:ligatures w14:val="standardContextual"/>
         </w:rPr>
       </w:pPr>
-      <w:hyperlink w:anchor="_Toc243609340" w:history="1">
+      <w:hyperlink w:anchor="_Toc243610429" w:history="1">
         <w:r>
           <w:rPr>
             <w:rStyle w:val="Hyperlink"/>
@@ -2683,7 +2781,7 @@
             <w:noProof/>
             <w:webHidden/>
           </w:rPr>
-          <w:instrText xml:space="preserve"> PAGEREF _Toc243609340 \h </w:instrText>
+          <w:instrText xml:space="preserve"> PAGEREF _Toc243610429 \h </w:instrText>
         </w:r>
         <w:r>
           <w:rPr>
@@ -2703,7 +2801,7 @@
             <w:noProof/>
             <w:webHidden/>
           </w:rPr>
-          <w:t>20</w:t>
+          <w:t>19</w:t>
         </w:r>
         <w:r>
           <w:rPr>
@@ -2729,7 +2827,7 @@
           <w14:ligatures w14:val="standardContextual"/>
         </w:rPr>
       </w:pPr>
-      <w:hyperlink w:anchor="_Toc243609341" w:history="1">
+      <w:hyperlink w:anchor="_Toc243610430" w:history="1">
         <w:r>
           <w:rPr>
             <w:rStyle w:val="Hyperlink"/>
@@ -2756,7 +2854,7 @@
             <w:noProof/>
             <w:webHidden/>
           </w:rPr>
-          <w:instrText xml:space="preserve"> PAGEREF _Toc243609341 \h </w:instrText>
+          <w:instrText xml:space="preserve"> PAGEREF _Toc243610430 \h </w:instrText>
         </w:r>
         <w:r>
           <w:rPr>
@@ -2776,7 +2874,7 @@
             <w:noProof/>
             <w:webHidden/>
           </w:rPr>
-          <w:t>20</w:t>
+          <w:t>19</w:t>
         </w:r>
         <w:r>
           <w:rPr>
@@ -2802,7 +2900,7 @@
           <w14:ligatures w14:val="standardContextual"/>
         </w:rPr>
       </w:pPr>
-      <w:hyperlink w:anchor="_Toc243609342" w:history="1">
+      <w:hyperlink w:anchor="_Toc243610431" w:history="1">
         <w:r>
           <w:rPr>
             <w:rStyle w:val="Hyperlink"/>
@@ -2829,7 +2927,7 @@
             <w:noProof/>
             <w:webHidden/>
           </w:rPr>
-          <w:instrText xml:space="preserve"> PAGEREF _Toc243609342 \h </w:instrText>
+          <w:instrText xml:space="preserve"> PAGEREF _Toc243610431 \h </w:instrText>
         </w:r>
         <w:r>
           <w:rPr>
@@ -2849,7 +2947,7 @@
             <w:noProof/>
             <w:webHidden/>
           </w:rPr>
-          <w:t>21</w:t>
+          <w:t>20</w:t>
         </w:r>
         <w:r>
           <w:rPr>
@@ -2875,7 +2973,7 @@
           <w14:ligatures w14:val="standardContextual"/>
         </w:rPr>
       </w:pPr>
-      <w:hyperlink w:anchor="_Toc243609343" w:history="1">
+      <w:hyperlink w:anchor="_Toc243610432" w:history="1">
         <w:r>
           <w:rPr>
             <w:rStyle w:val="Hyperlink"/>
@@ -2902,7 +3000,7 @@
             <w:noProof/>
             <w:webHidden/>
           </w:rPr>
-          <w:instrText xml:space="preserve"> PAGEREF _Toc243609343 \h </w:instrText>
+          <w:instrText xml:space="preserve"> PAGEREF _Toc243610432 \h </w:instrText>
         </w:r>
         <w:r>
           <w:rPr>
@@ -2922,7 +3020,7 @@
             <w:noProof/>
             <w:webHidden/>
           </w:rPr>
-          <w:t>21</w:t>
+          <w:t>20</w:t>
         </w:r>
         <w:r>
           <w:rPr>
@@ -2948,7 +3046,7 @@
           <w14:ligatures w14:val="standardContextual"/>
         </w:rPr>
       </w:pPr>
-      <w:hyperlink w:anchor="_Toc243609344" w:history="1">
+      <w:hyperlink w:anchor="_Toc243610433" w:history="1">
         <w:r>
           <w:rPr>
             <w:rStyle w:val="Hyperlink"/>
@@ -2975,7 +3073,7 @@
             <w:noProof/>
             <w:webHidden/>
           </w:rPr>
-          <w:instrText xml:space="preserve"> PAGEREF _Toc243609344 \h </w:instrText>
+          <w:instrText xml:space="preserve"> PAGEREF _Toc243610433 \h </w:instrText>
         </w:r>
         <w:r>
           <w:rPr>
@@ -2995,7 +3093,7 @@
             <w:noProof/>
             <w:webHidden/>
           </w:rPr>
-          <w:t>21</w:t>
+          <w:t>20</w:t>
         </w:r>
         <w:r>
           <w:rPr>
@@ -3021,7 +3119,7 @@
           <w14:ligatures w14:val="standardContextual"/>
         </w:rPr>
       </w:pPr>
-      <w:hyperlink w:anchor="_Toc243609345" w:history="1">
+      <w:hyperlink w:anchor="_Toc243610434" w:history="1">
         <w:r>
           <w:rPr>
             <w:rStyle w:val="Hyperlink"/>
@@ -3048,7 +3146,7 @@
             <w:noProof/>
             <w:webHidden/>
           </w:rPr>
-          <w:instrText xml:space="preserve"> PAGEREF _Toc243609345 \h </w:instrText>
+          <w:instrText xml:space="preserve"> PAGEREF _Toc243610434 \h </w:instrText>
         </w:r>
         <w:r>
           <w:rPr>
@@ -3068,7 +3166,7 @@
             <w:noProof/>
             <w:webHidden/>
           </w:rPr>
-          <w:t>22</w:t>
+          <w:t>21</w:t>
         </w:r>
         <w:r>
           <w:rPr>
@@ -3094,7 +3192,7 @@
           <w14:ligatures w14:val="standardContextual"/>
         </w:rPr>
       </w:pPr>
-      <w:hyperlink w:anchor="_Toc243609346" w:history="1">
+      <w:hyperlink w:anchor="_Toc243610435" w:history="1">
         <w:r>
           <w:rPr>
             <w:rStyle w:val="Hyperlink"/>
@@ -3121,7 +3219,7 @@
             <w:noProof/>
             <w:webHidden/>
           </w:rPr>
-          <w:instrText xml:space="preserve"> PAGEREF _Toc243609346 \h </w:instrText>
+          <w:instrText xml:space="preserve"> PAGEREF _Toc243610435 \h </w:instrText>
         </w:r>
         <w:r>
           <w:rPr>
@@ -3141,7 +3239,7 @@
             <w:noProof/>
             <w:webHidden/>
           </w:rPr>
-          <w:t>22</w:t>
+          <w:t>21</w:t>
         </w:r>
         <w:r>
           <w:rPr>
@@ -3167,7 +3265,7 @@
           <w14:ligatures w14:val="standardContextual"/>
         </w:rPr>
       </w:pPr>
-      <w:hyperlink w:anchor="_Toc243609347" w:history="1">
+      <w:hyperlink w:anchor="_Toc243610436" w:history="1">
         <w:r>
           <w:rPr>
             <w:rStyle w:val="Hyperlink"/>
@@ -3194,7 +3292,7 @@
             <w:noProof/>
             <w:webHidden/>
           </w:rPr>
-          <w:instrText xml:space="preserve"> PAGEREF _Toc243609347 \h </w:instrText>
+          <w:instrText xml:space="preserve"> PAGEREF _Toc243610436 \h </w:instrText>
         </w:r>
         <w:r>
           <w:rPr>
@@ -3214,7 +3312,7 @@
             <w:noProof/>
             <w:webHidden/>
           </w:rPr>
-          <w:t>23</w:t>
+          <w:t>22</w:t>
         </w:r>
         <w:r>
           <w:rPr>
@@ -3240,7 +3338,7 @@
           <w14:ligatures w14:val="standardContextual"/>
         </w:rPr>
       </w:pPr>
-      <w:hyperlink w:anchor="_Toc243609348" w:history="1">
+      <w:hyperlink w:anchor="_Toc243610437" w:history="1">
         <w:r>
           <w:rPr>
             <w:rStyle w:val="Hyperlink"/>
@@ -3267,7 +3365,7 @@
             <w:noProof/>
             <w:webHidden/>
           </w:rPr>
-          <w:instrText xml:space="preserve"> PAGEREF _Toc243609348 \h </w:instrText>
+          <w:instrText xml:space="preserve"> PAGEREF _Toc243610437 \h </w:instrText>
         </w:r>
         <w:r>
           <w:rPr>
@@ -3287,7 +3385,7 @@
             <w:noProof/>
             <w:webHidden/>
           </w:rPr>
-          <w:t>24</w:t>
+          <w:t>23</w:t>
         </w:r>
         <w:r>
           <w:rPr>
@@ -3313,7 +3411,7 @@
           <w14:ligatures w14:val="standardContextual"/>
         </w:rPr>
       </w:pPr>
-      <w:hyperlink w:anchor="_Toc243609349" w:history="1">
+      <w:hyperlink w:anchor="_Toc243610438" w:history="1">
         <w:r>
           <w:rPr>
             <w:rStyle w:val="Hyperlink"/>
@@ -3340,7 +3438,7 @@
             <w:noProof/>
             <w:webHidden/>
           </w:rPr>
-          <w:instrText xml:space="preserve"> PAGEREF _Toc243609349 \h </w:instrText>
+          <w:instrText xml:space="preserve"> PAGEREF _Toc243610438 \h </w:instrText>
         </w:r>
         <w:r>
           <w:rPr>
@@ -3360,7 +3458,7 @@
             <w:noProof/>
             <w:webHidden/>
           </w:rPr>
-          <w:t>24</w:t>
+          <w:t>23</w:t>
         </w:r>
         <w:r>
           <w:rPr>
@@ -3386,7 +3484,7 @@
           <w14:ligatures w14:val="standardContextual"/>
         </w:rPr>
       </w:pPr>
-      <w:hyperlink w:anchor="_Toc243609350" w:history="1">
+      <w:hyperlink w:anchor="_Toc243610439" w:history="1">
         <w:r>
           <w:rPr>
             <w:rStyle w:val="Hyperlink"/>
@@ -3413,7 +3511,7 @@
             <w:noProof/>
             <w:webHidden/>
           </w:rPr>
-          <w:instrText xml:space="preserve"> PAGEREF _Toc243609350 \h </w:instrText>
+          <w:instrText xml:space="preserve"> PAGEREF _Toc243610439 \h </w:instrText>
         </w:r>
         <w:r>
           <w:rPr>
@@ -3433,7 +3531,7 @@
             <w:noProof/>
             <w:webHidden/>
           </w:rPr>
-          <w:t>26</w:t>
+          <w:t>25</w:t>
         </w:r>
         <w:r>
           <w:rPr>
@@ -3459,7 +3557,7 @@
           <w14:ligatures w14:val="standardContextual"/>
         </w:rPr>
       </w:pPr>
-      <w:hyperlink w:anchor="_Toc243609351" w:history="1">
+      <w:hyperlink w:anchor="_Toc243610440" w:history="1">
         <w:r>
           <w:rPr>
             <w:rStyle w:val="Hyperlink"/>
@@ -3486,7 +3584,7 @@
             <w:noProof/>
             <w:webHidden/>
           </w:rPr>
-          <w:instrText xml:space="preserve"> PAGEREF _Toc243609351 \h </w:instrText>
+          <w:instrText xml:space="preserve"> PAGEREF _Toc243610440 \h </w:instrText>
         </w:r>
         <w:r>
           <w:rPr>
@@ -3506,7 +3604,7 @@
             <w:noProof/>
             <w:webHidden/>
           </w:rPr>
-          <w:t>27</w:t>
+          <w:t>26</w:t>
         </w:r>
         <w:r>
           <w:rPr>
@@ -3532,7 +3630,7 @@
           <w14:ligatures w14:val="standardContextual"/>
         </w:rPr>
       </w:pPr>
-      <w:hyperlink w:anchor="_Toc243609352" w:history="1">
+      <w:hyperlink w:anchor="_Toc243610441" w:history="1">
         <w:r>
           <w:rPr>
             <w:rStyle w:val="Hyperlink"/>
@@ -3559,7 +3657,7 @@
             <w:noProof/>
             <w:webHidden/>
           </w:rPr>
-          <w:instrText xml:space="preserve"> PAGEREF _Toc243609352 \h </w:instrText>
+          <w:instrText xml:space="preserve"> PAGEREF _Toc243610441 \h </w:instrText>
         </w:r>
         <w:r>
           <w:rPr>
@@ -3579,7 +3677,7 @@
             <w:noProof/>
             <w:webHidden/>
           </w:rPr>
-          <w:t>28</w:t>
+          <w:t>27</w:t>
         </w:r>
         <w:r>
           <w:rPr>
@@ -3605,7 +3703,7 @@
           <w14:ligatures w14:val="standardContextual"/>
         </w:rPr>
       </w:pPr>
-      <w:hyperlink w:anchor="_Toc243609353" w:history="1">
+      <w:hyperlink w:anchor="_Toc243610442" w:history="1">
         <w:r>
           <w:rPr>
             <w:rStyle w:val="Hyperlink"/>
@@ -3632,7 +3730,7 @@
             <w:noProof/>
             <w:webHidden/>
           </w:rPr>
-          <w:instrText xml:space="preserve"> PAGEREF _Toc243609353 \h </w:instrText>
+          <w:instrText xml:space="preserve"> PAGEREF _Toc243610442 \h </w:instrText>
         </w:r>
         <w:r>
           <w:rPr>
@@ -3652,7 +3750,7 @@
             <w:noProof/>
             <w:webHidden/>
           </w:rPr>
-          <w:t>28</w:t>
+          <w:t>27</w:t>
         </w:r>
         <w:r>
           <w:rPr>
@@ -3678,7 +3776,7 @@
           <w14:ligatures w14:val="standardContextual"/>
         </w:rPr>
       </w:pPr>
-      <w:hyperlink w:anchor="_Toc243609354" w:history="1">
+      <w:hyperlink w:anchor="_Toc243610443" w:history="1">
         <w:r>
           <w:rPr>
             <w:rStyle w:val="Hyperlink"/>
@@ -3705,7 +3803,7 @@
             <w:noProof/>
             <w:webHidden/>
           </w:rPr>
-          <w:instrText xml:space="preserve"> PAGEREF _Toc243609354 \h </w:instrText>
+          <w:instrText xml:space="preserve"> PAGEREF _Toc243610443 \h </w:instrText>
         </w:r>
         <w:r>
           <w:rPr>
@@ -3725,7 +3823,7 @@
             <w:noProof/>
             <w:webHidden/>
           </w:rPr>
-          <w:t>28</w:t>
+          <w:t>27</w:t>
         </w:r>
         <w:r>
           <w:rPr>
@@ -3751,7 +3849,7 @@
           <w14:ligatures w14:val="standardContextual"/>
         </w:rPr>
       </w:pPr>
-      <w:hyperlink w:anchor="_Toc243609355" w:history="1">
+      <w:hyperlink w:anchor="_Toc243610444" w:history="1">
         <w:r>
           <w:rPr>
             <w:rStyle w:val="Hyperlink"/>
@@ -3778,7 +3876,7 @@
             <w:noProof/>
             <w:webHidden/>
           </w:rPr>
-          <w:instrText xml:space="preserve"> PAGEREF _Toc243609355 \h </w:instrText>
+          <w:instrText xml:space="preserve"> PAGEREF _Toc243610444 \h </w:instrText>
         </w:r>
         <w:r>
           <w:rPr>
@@ -3798,7 +3896,7 @@
             <w:noProof/>
             <w:webHidden/>
           </w:rPr>
-          <w:t>29</w:t>
+          <w:t>28</w:t>
         </w:r>
         <w:r>
           <w:rPr>
@@ -3824,7 +3922,7 @@
           <w14:ligatures w14:val="standardContextual"/>
         </w:rPr>
       </w:pPr>
-      <w:hyperlink w:anchor="_Toc243609356" w:history="1">
+      <w:hyperlink w:anchor="_Toc243610445" w:history="1">
         <w:r>
           <w:rPr>
             <w:rStyle w:val="Hyperlink"/>
@@ -3851,7 +3949,7 @@
             <w:noProof/>
             <w:webHidden/>
           </w:rPr>
-          <w:instrText xml:space="preserve"> PAGEREF _Toc243609356 \h </w:instrText>
+          <w:instrText xml:space="preserve"> PAGEREF _Toc243610445 \h </w:instrText>
         </w:r>
         <w:r>
           <w:rPr>
@@ -3871,7 +3969,7 @@
             <w:noProof/>
             <w:webHidden/>
           </w:rPr>
-          <w:t>30</w:t>
+          <w:t>29</w:t>
         </w:r>
         <w:r>
           <w:rPr>
@@ -3897,7 +3995,7 @@
           <w14:ligatures w14:val="standardContextual"/>
         </w:rPr>
       </w:pPr>
-      <w:hyperlink w:anchor="_Toc243609357" w:history="1">
+      <w:hyperlink w:anchor="_Toc243610446" w:history="1">
         <w:r>
           <w:rPr>
             <w:rStyle w:val="Hyperlink"/>
@@ -3924,7 +4022,7 @@
             <w:noProof/>
             <w:webHidden/>
           </w:rPr>
-          <w:instrText xml:space="preserve"> PAGEREF _Toc243609357 \h </w:instrText>
+          <w:instrText xml:space="preserve"> PAGEREF _Toc243610446 \h </w:instrText>
         </w:r>
         <w:r>
           <w:rPr>
@@ -3944,7 +4042,7 @@
             <w:noProof/>
             <w:webHidden/>
           </w:rPr>
-          <w:t>32</w:t>
+          <w:t>31</w:t>
         </w:r>
         <w:r>
           <w:rPr>
@@ -3970,7 +4068,7 @@
           <w14:ligatures w14:val="standardContextual"/>
         </w:rPr>
       </w:pPr>
-      <w:hyperlink w:anchor="_Toc243609358" w:history="1">
+      <w:hyperlink w:anchor="_Toc243610447" w:history="1">
         <w:r>
           <w:rPr>
             <w:rStyle w:val="Hyperlink"/>
@@ -3997,7 +4095,7 @@
             <w:noProof/>
             <w:webHidden/>
           </w:rPr>
-          <w:instrText xml:space="preserve"> PAGEREF _Toc243609358 \h </w:instrText>
+          <w:instrText xml:space="preserve"> PAGEREF _Toc243610447 \h </w:instrText>
         </w:r>
         <w:r>
           <w:rPr>
@@ -4017,7 +4115,7 @@
             <w:noProof/>
             <w:webHidden/>
           </w:rPr>
-          <w:t>32</w:t>
+          <w:t>31</w:t>
         </w:r>
         <w:r>
           <w:rPr>
@@ -4043,7 +4141,7 @@
           <w14:ligatures w14:val="standardContextual"/>
         </w:rPr>
       </w:pPr>
-      <w:hyperlink w:anchor="_Toc243609359" w:history="1">
+      <w:hyperlink w:anchor="_Toc243610448" w:history="1">
         <w:r>
           <w:rPr>
             <w:rStyle w:val="Hyperlink"/>
@@ -4070,7 +4168,7 @@
             <w:noProof/>
             <w:webHidden/>
           </w:rPr>
-          <w:instrText xml:space="preserve"> PAGEREF _Toc243609359 \h </w:instrText>
+          <w:instrText xml:space="preserve"> PAGEREF _Toc243610448 \h </w:instrText>
         </w:r>
         <w:r>
           <w:rPr>
@@ -4090,7 +4188,7 @@
             <w:noProof/>
             <w:webHidden/>
           </w:rPr>
-          <w:t>33</w:t>
+          <w:t>32</w:t>
         </w:r>
         <w:r>
           <w:rPr>
@@ -4116,7 +4214,7 @@
           <w14:ligatures w14:val="standardContextual"/>
         </w:rPr>
       </w:pPr>
-      <w:hyperlink w:anchor="_Toc243609360" w:history="1">
+      <w:hyperlink w:anchor="_Toc243610449" w:history="1">
         <w:r>
           <w:rPr>
             <w:rStyle w:val="Hyperlink"/>
@@ -4143,7 +4241,7 @@
             <w:noProof/>
             <w:webHidden/>
           </w:rPr>
-          <w:instrText xml:space="preserve"> PAGEREF _Toc243609360 \h </w:instrText>
+          <w:instrText xml:space="preserve"> PAGEREF _Toc243610449 \h </w:instrText>
         </w:r>
         <w:r>
           <w:rPr>
@@ -4163,7 +4261,7 @@
             <w:noProof/>
             <w:webHidden/>
           </w:rPr>
-          <w:t>35</w:t>
+          <w:t>34</w:t>
         </w:r>
         <w:r>
           <w:rPr>
@@ -4189,7 +4287,7 @@
           <w14:ligatures w14:val="standardContextual"/>
         </w:rPr>
       </w:pPr>
-      <w:hyperlink w:anchor="_Toc243609361" w:history="1">
+      <w:hyperlink w:anchor="_Toc243610450" w:history="1">
         <w:r>
           <w:rPr>
             <w:rStyle w:val="Hyperlink"/>
@@ -4216,7 +4314,7 @@
             <w:noProof/>
             <w:webHidden/>
           </w:rPr>
-          <w:instrText xml:space="preserve"> PAGEREF _Toc243609361 \h </w:instrText>
+          <w:instrText xml:space="preserve"> PAGEREF _Toc243610450 \h </w:instrText>
         </w:r>
         <w:r>
           <w:rPr>
@@ -4236,7 +4334,7 @@
             <w:noProof/>
             <w:webHidden/>
           </w:rPr>
-          <w:t>36</w:t>
+          <w:t>35</w:t>
         </w:r>
         <w:r>
           <w:rPr>
@@ -4262,7 +4360,7 @@
           <w14:ligatures w14:val="standardContextual"/>
         </w:rPr>
       </w:pPr>
-      <w:hyperlink w:anchor="_Toc243609362" w:history="1">
+      <w:hyperlink w:anchor="_Toc243610451" w:history="1">
         <w:r>
           <w:rPr>
             <w:rStyle w:val="Hyperlink"/>
@@ -4289,7 +4387,7 @@
             <w:noProof/>
             <w:webHidden/>
           </w:rPr>
-          <w:instrText xml:space="preserve"> PAGEREF _Toc243609362 \h </w:instrText>
+          <w:instrText xml:space="preserve"> PAGEREF _Toc243610451 \h </w:instrText>
         </w:r>
         <w:r>
           <w:rPr>
@@ -4309,7 +4407,7 @@
             <w:noProof/>
             <w:webHidden/>
           </w:rPr>
-          <w:t>37</w:t>
+          <w:t>36</w:t>
         </w:r>
         <w:r>
           <w:rPr>
@@ -4335,7 +4433,7 @@
           <w14:ligatures w14:val="standardContextual"/>
         </w:rPr>
       </w:pPr>
-      <w:hyperlink w:anchor="_Toc243609363" w:history="1">
+      <w:hyperlink w:anchor="_Toc243610452" w:history="1">
         <w:r>
           <w:rPr>
             <w:rStyle w:val="Hyperlink"/>
@@ -4362,7 +4460,7 @@
             <w:noProof/>
             <w:webHidden/>
           </w:rPr>
-          <w:instrText xml:space="preserve"> PAGEREF _Toc243609363 \h </w:instrText>
+          <w:instrText xml:space="preserve"> PAGEREF _Toc243610452 \h </w:instrText>
         </w:r>
         <w:r>
           <w:rPr>
@@ -4382,7 +4480,7 @@
             <w:noProof/>
             <w:webHidden/>
           </w:rPr>
-          <w:t>37</w:t>
+          <w:t>36</w:t>
         </w:r>
         <w:r>
           <w:rPr>
@@ -4408,7 +4506,7 @@
           <w14:ligatures w14:val="standardContextual"/>
         </w:rPr>
       </w:pPr>
-      <w:hyperlink w:anchor="_Toc243609364" w:history="1">
+      <w:hyperlink w:anchor="_Toc243610453" w:history="1">
         <w:r>
           <w:rPr>
             <w:rStyle w:val="Hyperlink"/>
@@ -4435,7 +4533,7 @@
             <w:noProof/>
             <w:webHidden/>
           </w:rPr>
-          <w:instrText xml:space="preserve"> PAGEREF _Toc243609364 \h </w:instrText>
+          <w:instrText xml:space="preserve"> PAGEREF _Toc243610453 \h </w:instrText>
         </w:r>
         <w:r>
           <w:rPr>
@@ -4455,7 +4553,7 @@
             <w:noProof/>
             <w:webHidden/>
           </w:rPr>
-          <w:t>38</w:t>
+          <w:t>36</w:t>
         </w:r>
         <w:r>
           <w:rPr>
@@ -4481,7 +4579,7 @@
           <w14:ligatures w14:val="standardContextual"/>
         </w:rPr>
       </w:pPr>
-      <w:hyperlink w:anchor="_Toc243609365" w:history="1">
+      <w:hyperlink w:anchor="_Toc243610454" w:history="1">
         <w:r>
           <w:rPr>
             <w:rStyle w:val="Hyperlink"/>
@@ -4508,7 +4606,7 @@
             <w:noProof/>
             <w:webHidden/>
           </w:rPr>
-          <w:instrText xml:space="preserve"> PAGEREF _Toc243609365 \h </w:instrText>
+          <w:instrText xml:space="preserve"> PAGEREF _Toc243610454 \h </w:instrText>
         </w:r>
         <w:r>
           <w:rPr>
@@ -4528,7 +4626,7 @@
             <w:noProof/>
             <w:webHidden/>
           </w:rPr>
-          <w:t>38</w:t>
+          <w:t>37</w:t>
         </w:r>
         <w:r>
           <w:rPr>
@@ -4554,7 +4652,7 @@
           <w14:ligatures w14:val="standardContextual"/>
         </w:rPr>
       </w:pPr>
-      <w:hyperlink w:anchor="_Toc243609366" w:history="1">
+      <w:hyperlink w:anchor="_Toc243610455" w:history="1">
         <w:r>
           <w:rPr>
             <w:rStyle w:val="Hyperlink"/>
@@ -4581,7 +4679,7 @@
             <w:noProof/>
             <w:webHidden/>
           </w:rPr>
-          <w:instrText xml:space="preserve"> PAGEREF _Toc243609366 \h </w:instrText>
+          <w:instrText xml:space="preserve"> PAGEREF _Toc243610455 \h </w:instrText>
         </w:r>
         <w:r>
           <w:rPr>
@@ -4601,7 +4699,7 @@
             <w:noProof/>
             <w:webHidden/>
           </w:rPr>
-          <w:t>39</w:t>
+          <w:t>37</w:t>
         </w:r>
         <w:r>
           <w:rPr>
@@ -4627,7 +4725,7 @@
           <w14:ligatures w14:val="standardContextual"/>
         </w:rPr>
       </w:pPr>
-      <w:hyperlink w:anchor="_Toc243609367" w:history="1">
+      <w:hyperlink w:anchor="_Toc243610456" w:history="1">
         <w:r>
           <w:rPr>
             <w:rStyle w:val="Hyperlink"/>
@@ -4654,7 +4752,7 @@
             <w:noProof/>
             <w:webHidden/>
           </w:rPr>
-          <w:instrText xml:space="preserve"> PAGEREF _Toc243609367 \h </w:instrText>
+          <w:instrText xml:space="preserve"> PAGEREF _Toc243610456 \h </w:instrText>
         </w:r>
         <w:r>
           <w:rPr>
@@ -4674,7 +4772,7 @@
             <w:noProof/>
             <w:webHidden/>
           </w:rPr>
-          <w:t>39</w:t>
+          <w:t>38</w:t>
         </w:r>
         <w:r>
           <w:rPr>
@@ -4700,7 +4798,7 @@
           <w14:ligatures w14:val="standardContextual"/>
         </w:rPr>
       </w:pPr>
-      <w:hyperlink w:anchor="_Toc243609368" w:history="1">
+      <w:hyperlink w:anchor="_Toc243610457" w:history="1">
         <w:r>
           <w:rPr>
             <w:rStyle w:val="Hyperlink"/>
@@ -4727,7 +4825,7 @@
             <w:noProof/>
             <w:webHidden/>
           </w:rPr>
-          <w:instrText xml:space="preserve"> PAGEREF _Toc243609368 \h </w:instrText>
+          <w:instrText xml:space="preserve"> PAGEREF _Toc243610457 \h </w:instrText>
         </w:r>
         <w:r>
           <w:rPr>
@@ -4747,7 +4845,7 @@
             <w:noProof/>
             <w:webHidden/>
           </w:rPr>
-          <w:t>40</w:t>
+          <w:t>38</w:t>
         </w:r>
         <w:r>
           <w:rPr>
@@ -4773,7 +4871,7 @@
           <w14:ligatures w14:val="standardContextual"/>
         </w:rPr>
       </w:pPr>
-      <w:hyperlink w:anchor="_Toc243609369" w:history="1">
+      <w:hyperlink w:anchor="_Toc243610458" w:history="1">
         <w:r>
           <w:rPr>
             <w:rStyle w:val="Hyperlink"/>
@@ -4800,7 +4898,7 @@
             <w:noProof/>
             <w:webHidden/>
           </w:rPr>
-          <w:instrText xml:space="preserve"> PAGEREF _Toc243609369 \h </w:instrText>
+          <w:instrText xml:space="preserve"> PAGEREF _Toc243610458 \h </w:instrText>
         </w:r>
         <w:r>
           <w:rPr>
@@ -4820,7 +4918,7 @@
             <w:noProof/>
             <w:webHidden/>
           </w:rPr>
-          <w:t>41</w:t>
+          <w:t>39</w:t>
         </w:r>
         <w:r>
           <w:rPr>
@@ -4846,7 +4944,7 @@
           <w14:ligatures w14:val="standardContextual"/>
         </w:rPr>
       </w:pPr>
-      <w:hyperlink w:anchor="_Toc243609370" w:history="1">
+      <w:hyperlink w:anchor="_Toc243610459" w:history="1">
         <w:r>
           <w:rPr>
             <w:rStyle w:val="Hyperlink"/>
@@ -4873,7 +4971,7 @@
             <w:noProof/>
             <w:webHidden/>
           </w:rPr>
-          <w:instrText xml:space="preserve"> PAGEREF _Toc243609370 \h </w:instrText>
+          <w:instrText xml:space="preserve"> PAGEREF _Toc243610459 \h </w:instrText>
         </w:r>
         <w:r>
           <w:rPr>
@@ -4893,7 +4991,7 @@
             <w:noProof/>
             <w:webHidden/>
           </w:rPr>
-          <w:t>42</w:t>
+          <w:t>40</w:t>
         </w:r>
         <w:r>
           <w:rPr>
@@ -4919,7 +5017,7 @@
           <w14:ligatures w14:val="standardContextual"/>
         </w:rPr>
       </w:pPr>
-      <w:hyperlink w:anchor="_Toc243609371" w:history="1">
+      <w:hyperlink w:anchor="_Toc243610460" w:history="1">
         <w:r>
           <w:rPr>
             <w:rStyle w:val="Hyperlink"/>
@@ -4946,7 +5044,7 @@
             <w:noProof/>
             <w:webHidden/>
           </w:rPr>
-          <w:instrText xml:space="preserve"> PAGEREF _Toc243609371 \h </w:instrText>
+          <w:instrText xml:space="preserve"> PAGEREF _Toc243610460 \h </w:instrText>
         </w:r>
         <w:r>
           <w:rPr>
@@ -4966,7 +5064,7 @@
             <w:noProof/>
             <w:webHidden/>
           </w:rPr>
-          <w:t>43</w:t>
+          <w:t>41</w:t>
         </w:r>
         <w:r>
           <w:rPr>
@@ -4991,7 +5089,7 @@
       <w:pPr>
         <w:pStyle w:val="Heading1"/>
       </w:pPr>
-      <w:bookmarkStart w:id="4" w:name="_Toc243609321"/>
+      <w:bookmarkStart w:id="4" w:name="_Toc243610410"/>
       <w:r>
         <w:t>DANH MỤC BẢNG</w:t>
       </w:r>
@@ -5019,7 +5117,7 @@
           <w:sz w:val="24"/>
         </w:rPr>
         <w:tab/>
-        <w:t>13</w:t>
+        <w:t>12</w:t>
       </w:r>
     </w:p>
     <w:p>
@@ -5044,7 +5142,7 @@
           <w:sz w:val="24"/>
         </w:rPr>
         <w:tab/>
-        <w:t>16</w:t>
+        <w:t>15</w:t>
       </w:r>
     </w:p>
     <w:p>
@@ -5069,7 +5167,7 @@
           <w:sz w:val="24"/>
         </w:rPr>
         <w:tab/>
-        <w:t>17</w:t>
+        <w:t>16</w:t>
       </w:r>
     </w:p>
     <w:p>
@@ -5094,7 +5192,7 @@
           <w:sz w:val="24"/>
         </w:rPr>
         <w:tab/>
-        <w:t>22</w:t>
+        <w:t>21</w:t>
       </w:r>
     </w:p>
     <w:p>
@@ -5119,7 +5217,7 @@
           <w:sz w:val="24"/>
         </w:rPr>
         <w:tab/>
-        <w:t>24</w:t>
+        <w:t>23</w:t>
       </w:r>
     </w:p>
     <w:p>
@@ -5144,7 +5242,7 @@
           <w:sz w:val="24"/>
         </w:rPr>
         <w:tab/>
-        <w:t>26</w:t>
+        <w:t>25</w:t>
       </w:r>
     </w:p>
     <w:p>
@@ -5169,7 +5267,7 @@
           <w:sz w:val="24"/>
         </w:rPr>
         <w:tab/>
-        <w:t>27</w:t>
+        <w:t>26</w:t>
       </w:r>
     </w:p>
     <w:p>
@@ -5194,7 +5292,7 @@
           <w:sz w:val="24"/>
         </w:rPr>
         <w:tab/>
-        <w:t>29</w:t>
+        <w:t>28</w:t>
       </w:r>
     </w:p>
     <w:p>
@@ -5219,7 +5317,7 @@
           <w:sz w:val="24"/>
         </w:rPr>
         <w:tab/>
-        <w:t>29</w:t>
+        <w:t>28</w:t>
       </w:r>
     </w:p>
     <w:p>
@@ -5244,7 +5342,7 @@
           <w:sz w:val="24"/>
         </w:rPr>
         <w:tab/>
-        <w:t>30</w:t>
+        <w:t>29</w:t>
       </w:r>
     </w:p>
     <w:p>
@@ -5269,7 +5367,7 @@
           <w:sz w:val="24"/>
         </w:rPr>
         <w:tab/>
-        <w:t>32</w:t>
+        <w:t>31</w:t>
       </w:r>
     </w:p>
     <w:p>
@@ -5294,7 +5392,7 @@
           <w:sz w:val="24"/>
         </w:rPr>
         <w:tab/>
-        <w:t>33</w:t>
+        <w:t>32</w:t>
       </w:r>
     </w:p>
     <w:p>
@@ -5319,7 +5417,7 @@
           <w:sz w:val="24"/>
         </w:rPr>
         <w:tab/>
-        <w:t>34</w:t>
+        <w:t>33</w:t>
       </w:r>
     </w:p>
     <w:p>
@@ -5344,7 +5442,7 @@
           <w:sz w:val="24"/>
         </w:rPr>
         <w:tab/>
-        <w:t>34</w:t>
+        <w:t>33</w:t>
       </w:r>
     </w:p>
     <w:p>
@@ -5369,7 +5467,7 @@
           <w:sz w:val="24"/>
         </w:rPr>
         <w:tab/>
-        <w:t>43</w:t>
+        <w:t>41</w:t>
       </w:r>
     </w:p>
     <w:p>
@@ -5394,7 +5492,7 @@
           <w:sz w:val="24"/>
         </w:rPr>
         <w:tab/>
-        <w:t>44</w:t>
+        <w:t>42</w:t>
       </w:r>
     </w:p>
     <w:p>
@@ -5406,7 +5504,7 @@
       <w:pPr>
         <w:pStyle w:val="Heading1"/>
       </w:pPr>
-      <w:bookmarkStart w:id="5" w:name="_Toc243609322"/>
+      <w:bookmarkStart w:id="5" w:name="_Toc243610411"/>
       <w:r>
         <w:t>DANH MỤC HÌNH ẢNH</w:t>
       </w:r>
@@ -5434,7 +5532,7 @@
           <w:sz w:val="24"/>
         </w:rPr>
         <w:tab/>
-        <w:t>19</w:t>
+        <w:t>18</w:t>
       </w:r>
     </w:p>
     <w:p>
@@ -5459,7 +5557,7 @@
           <w:sz w:val="24"/>
         </w:rPr>
         <w:tab/>
-        <w:t>20</w:t>
+        <w:t>19</w:t>
       </w:r>
     </w:p>
     <w:p>
@@ -5484,7 +5582,7 @@
           <w:sz w:val="24"/>
         </w:rPr>
         <w:tab/>
-        <w:t>21</w:t>
+        <w:t>20</w:t>
       </w:r>
     </w:p>
     <w:p>
@@ -5509,7 +5607,7 @@
           <w:sz w:val="24"/>
         </w:rPr>
         <w:tab/>
-        <w:t>26</w:t>
+        <w:t>25</w:t>
       </w:r>
     </w:p>
     <w:p>
@@ -5534,7 +5632,7 @@
           <w:sz w:val="24"/>
         </w:rPr>
         <w:tab/>
-        <w:t>27</w:t>
+        <w:t>26</w:t>
       </w:r>
     </w:p>
     <w:p>
@@ -5559,7 +5657,7 @@
           <w:sz w:val="24"/>
         </w:rPr>
         <w:tab/>
-        <w:t>31</w:t>
+        <w:t>30</w:t>
       </w:r>
     </w:p>
     <w:p>
@@ -5584,7 +5682,7 @@
           <w:sz w:val="24"/>
         </w:rPr>
         <w:tab/>
-        <w:t>32</w:t>
+        <w:t>31</w:t>
       </w:r>
     </w:p>
     <w:p>
@@ -5609,7 +5707,7 @@
           <w:sz w:val="24"/>
         </w:rPr>
         <w:tab/>
-        <w:t>36</w:t>
+        <w:t>35</w:t>
       </w:r>
     </w:p>
     <w:p>
@@ -5634,7 +5732,7 @@
           <w:sz w:val="24"/>
         </w:rPr>
         <w:tab/>
-        <w:t>36</w:t>
+        <w:t>35</w:t>
       </w:r>
     </w:p>
     <w:p>
@@ -5659,44 +5757,19 @@
           <w:sz w:val="24"/>
         </w:rPr>
         <w:tab/>
-        <w:t>37</w:t>
+        <w:t>36</w:t>
       </w:r>
     </w:p>
     <w:p>
-      <w:pPr>
-        <w:tabs>
-          <w:tab w:val="right" w:leader="dot" w:pos="9071"/>
-          <w:tab w:val="right" w:leader="dot" w:pos="9071"/>
-        </w:tabs>
-        <w:spacing w:after="60" w:line="300" w:lineRule="auto"/>
-        <w:jc w:val="left"/>
-      </w:pPr>
-      <w:r>
-        <w:rPr>
-          <w:color w:val="000000"/>
-          <w:sz w:val="24"/>
-        </w:rPr>
-        <w:t>Hình 5.1: Phân bố ba cụm quốc gia năm 2019 trên không gian 2D PCA</w:t>
-      </w:r>
-      <w:r>
-        <w:rPr>
-          <w:color w:val="000000"/>
-          <w:sz w:val="24"/>
-        </w:rPr>
-        <w:tab/>
-        <w:t>39</w:t>
+      <w:r>
+        <w:br w:type="page"/>
       </w:r>
     </w:p>
     <w:p>
-      <w:r>
-        <w:br w:type="page"/>
-      </w:r>
-    </w:p>
-    <w:p>
       <w:pPr>
         <w:pStyle w:val="Heading1"/>
       </w:pPr>
-      <w:bookmarkStart w:id="6" w:name="_Toc243609323"/>
+      <w:bookmarkStart w:id="6" w:name="_Toc243610412"/>
       <w:r>
         <w:t>CHƯƠNG 1: TỔNG QUAN ĐỀ TÀI VÀ CƠ SỞ LÝ THUYẾT</w:t>
       </w:r>
@@ -5706,7 +5779,7 @@
       <w:pPr>
         <w:pStyle w:val="Heading2"/>
       </w:pPr>
-      <w:bookmarkStart w:id="7" w:name="_Toc243609324"/>
+      <w:bookmarkStart w:id="7" w:name="_Toc243610413"/>
       <w:r>
         <w:t>1.1. Bối cảnh và lý do chọn đề tài</w:t>
       </w:r>
@@ -5746,7 +5819,7 @@
       <w:pPr>
         <w:pStyle w:val="Heading2"/>
       </w:pPr>
-      <w:bookmarkStart w:id="8" w:name="_Toc243609325"/>
+      <w:bookmarkStart w:id="8" w:name="_Toc243610414"/>
       <w:r>
         <w:t>1.2. Bài toán và câu hỏi nghiên cứu</w:t>
       </w:r>
@@ -5832,7 +5905,7 @@
       <w:pPr>
         <w:pStyle w:val="Heading2"/>
       </w:pPr>
-      <w:bookmarkStart w:id="9" w:name="_Toc243609326"/>
+      <w:bookmarkStart w:id="9" w:name="_Toc243610415"/>
       <w:r>
         <w:t>1.3. Nguồn dữ liệu</w:t>
       </w:r>
@@ -5855,7 +5928,7 @@
       <w:pPr>
         <w:pStyle w:val="Heading2"/>
       </w:pPr>
-      <w:bookmarkStart w:id="10" w:name="_Toc243609327"/>
+      <w:bookmarkStart w:id="10" w:name="_Toc243610416"/>
       <w:r>
         <w:t>1.4. Thang đo Cantril Ladder</w:t>
       </w:r>
@@ -5881,7 +5954,7 @@
       <w:pPr>
         <w:pStyle w:val="Heading2"/>
       </w:pPr>
-      <w:bookmarkStart w:id="11" w:name="_Toc243609328"/>
+      <w:bookmarkStart w:id="11" w:name="_Toc243610417"/>
       <w:r>
         <w:t>1.5. Mô hình Dystopia và Dystopia Residual</w:t>
       </w:r>
@@ -5913,7 +5986,7 @@
       <w:pPr>
         <w:pStyle w:val="Heading2"/>
       </w:pPr>
-      <w:bookmarkStart w:id="12" w:name="_Toc243609329"/>
+      <w:bookmarkStart w:id="12" w:name="_Toc243610418"/>
       <w:r>
         <w:t>1.6. Sáu biến cơ sở</w:t>
       </w:r>
@@ -6633,7 +6706,7 @@
       <w:pPr>
         <w:pStyle w:val="Heading2"/>
       </w:pPr>
-      <w:bookmarkStart w:id="13" w:name="_Toc243609330"/>
+      <w:bookmarkStart w:id="13" w:name="_Toc243610419"/>
       <w:r>
         <w:t>1.7. Quy tắc vàng của đề tài</w:t>
       </w:r>
@@ -6696,7 +6769,7 @@
       <w:pPr>
         <w:pStyle w:val="Heading2"/>
       </w:pPr>
-      <w:bookmarkStart w:id="14" w:name="_Toc243609331"/>
+      <w:bookmarkStart w:id="14" w:name="_Toc243610420"/>
       <w:r>
         <w:t>1.8. Đối chiếu 11 bước pipeline với cấu trúc báo cáo</w:t>
       </w:r>
@@ -7638,7 +7711,7 @@
       <w:pPr>
         <w:pStyle w:val="Heading1"/>
       </w:pPr>
-      <w:bookmarkStart w:id="15" w:name="_Toc243609332"/>
+      <w:bookmarkStart w:id="15" w:name="_Toc243610421"/>
       <w:r>
         <w:t>CHƯƠNG 2: THU THẬP DỮ LIỆU VÀ KHÁM PHÁ EDA</w:t>
       </w:r>
@@ -7648,7 +7721,7 @@
       <w:pPr>
         <w:pStyle w:val="Heading2"/>
       </w:pPr>
-      <w:bookmarkStart w:id="16" w:name="_Toc243609333"/>
+      <w:bookmarkStart w:id="16" w:name="_Toc243610422"/>
       <w:r>
         <w:t xml:space="preserve">2.1. </w:t>
       </w:r>
@@ -8270,7 +8343,7 @@
       <w:pPr>
         <w:pStyle w:val="Heading2"/>
       </w:pPr>
-      <w:bookmarkStart w:id="17" w:name="_Toc243609334"/>
+      <w:bookmarkStart w:id="17" w:name="_Toc243610423"/>
       <w:r>
         <w:t>2.2. Đồng nhất tên cột</w:t>
       </w:r>
@@ -8314,7 +8387,7 @@
       <w:pPr>
         <w:pStyle w:val="Heading2"/>
       </w:pPr>
-      <w:bookmarkStart w:id="18" w:name="_Toc243609335"/>
+      <w:bookmarkStart w:id="18" w:name="_Toc243610424"/>
       <w:r>
         <w:t>2.3. Xử lý giá trị khuyết của UAE năm 2018</w:t>
       </w:r>
@@ -8340,7 +8413,7 @@
       <w:pPr>
         <w:pStyle w:val="Heading2"/>
       </w:pPr>
-      <w:bookmarkStart w:id="19" w:name="_Toc243609336"/>
+      <w:bookmarkStart w:id="19" w:name="_Toc243610425"/>
       <w:r>
         <w:t>2.4. Chuẩn hóa tên quốc gia và bổ sung mã ISO-3</w:t>
       </w:r>
@@ -8372,7 +8445,7 @@
       <w:pPr>
         <w:pStyle w:val="Heading2"/>
       </w:pPr>
-      <w:bookmarkStart w:id="20" w:name="_Toc243609337"/>
+      <w:bookmarkStart w:id="20" w:name="_Toc243610426"/>
       <w:r>
         <w:t>2.5. Bảng dữ liệu trung gian</w:t>
       </w:r>
@@ -8396,7 +8469,7 @@
       <w:pPr>
         <w:pStyle w:val="Heading2"/>
       </w:pPr>
-      <w:bookmarkStart w:id="21" w:name="_Toc243609338"/>
+      <w:bookmarkStart w:id="21" w:name="_Toc243610427"/>
       <w:r>
         <w:t>2.6. Phân tích hình dạng phân phối</w:t>
       </w:r>
@@ -8500,7 +8573,7 @@
       <w:pPr>
         <w:pStyle w:val="Heading2"/>
       </w:pPr>
-      <w:bookmarkStart w:id="22" w:name="_Toc243609339"/>
+      <w:bookmarkStart w:id="22" w:name="_Toc243610428"/>
       <w:r>
         <w:t>2.7. Tương quan Pearson</w:t>
       </w:r>
@@ -8578,7 +8651,7 @@
       <w:pPr>
         <w:pStyle w:val="Heading2"/>
       </w:pPr>
-      <w:bookmarkStart w:id="23" w:name="_Toc243609340"/>
+      <w:bookmarkStart w:id="23" w:name="_Toc243610429"/>
       <w:r>
         <w:t>2.8. Nhận diện ngoại lai</w:t>
       </w:r>
@@ -8670,7 +8743,7 @@
       <w:pPr>
         <w:pStyle w:val="Heading2"/>
       </w:pPr>
-      <w:bookmarkStart w:id="24" w:name="_Toc243609341"/>
+      <w:bookmarkStart w:id="24" w:name="_Toc243610430"/>
       <w:r>
         <w:t>2.9. Kết luận</w:t>
       </w:r>
@@ -8688,7 +8761,7 @@
       <w:pPr>
         <w:pStyle w:val="Heading1"/>
       </w:pPr>
-      <w:bookmarkStart w:id="25" w:name="_Toc243609342"/>
+      <w:bookmarkStart w:id="25" w:name="_Toc243610431"/>
       <w:r>
         <w:t>CHƯƠNG 3: PHƯƠNG PHÁP LUẬN VÀ THỬ NGHIỆM MÔ HÌNH</w:t>
       </w:r>
@@ -8698,7 +8771,7 @@
       <w:pPr>
         <w:pStyle w:val="Heading2"/>
       </w:pPr>
-      <w:bookmarkStart w:id="26" w:name="_Toc243609343"/>
+      <w:bookmarkStart w:id="26" w:name="_Toc243610432"/>
       <w:r>
         <w:t>3.1. Ma trận đặc trưng</w:t>
       </w:r>
@@ -8716,7 +8789,7 @@
       <w:pPr>
         <w:pStyle w:val="Heading2"/>
       </w:pPr>
-      <w:bookmarkStart w:id="27" w:name="_Toc243609344"/>
+      <w:bookmarkStart w:id="27" w:name="_Toc243610433"/>
       <w:r>
         <w:t>3.2. So sánh ba phương án chuẩn hóa</w:t>
       </w:r>
@@ -9715,7 +9788,7 @@
       <w:pPr>
         <w:pStyle w:val="Heading2"/>
       </w:pPr>
-      <w:bookmarkStart w:id="28" w:name="_Toc243609345"/>
+      <w:bookmarkStart w:id="28" w:name="_Toc243610434"/>
       <w:r>
         <w:t>3.3. Thuật toán K-Means cài đặt từ đầu</w:t>
       </w:r>
@@ -9899,7 +9972,7 @@
       <w:pPr>
         <w:pStyle w:val="Heading2"/>
       </w:pPr>
-      <w:bookmarkStart w:id="29" w:name="_Toc243609346"/>
+      <w:bookmarkStart w:id="29" w:name="_Toc243610435"/>
       <w:r>
         <w:t>3.4. Phân cấp Ward cài đặt từ đầu</w:t>
       </w:r>
@@ -10879,7 +10952,7 @@
       <w:pPr>
         <w:pStyle w:val="Heading2"/>
       </w:pPr>
-      <w:bookmarkStart w:id="30" w:name="_Toc243609347"/>
+      <w:bookmarkStart w:id="30" w:name="_Toc243610436"/>
       <w:r>
         <w:t>3.5. DBSCAN cài đặt từ đầu</w:t>
       </w:r>
@@ -11442,7 +11515,7 @@
       <w:pPr>
         <w:pStyle w:val="Heading2"/>
       </w:pPr>
-      <w:bookmarkStart w:id="31" w:name="_Toc243609348"/>
+      <w:bookmarkStart w:id="31" w:name="_Toc243610437"/>
       <w:r>
         <w:t>3.6. Các độ đo đánh giá</w:t>
       </w:r>
@@ -11733,7 +11806,7 @@
       <w:pPr>
         <w:pStyle w:val="Heading2"/>
       </w:pPr>
-      <w:bookmarkStart w:id="32" w:name="_Toc243609349"/>
+      <w:bookmarkStart w:id="32" w:name="_Toc243610438"/>
       <w:r>
         <w:t>3.7. Khảo sát số cụm tối ưu</w:t>
       </w:r>
@@ -12406,7 +12479,7 @@
       <w:pPr>
         <w:pStyle w:val="Heading2"/>
       </w:pPr>
-      <w:bookmarkStart w:id="33" w:name="_Toc243609350"/>
+      <w:bookmarkStart w:id="33" w:name="_Toc243610439"/>
       <w:r>
         <w:t>3.8. Kiểm tra độ ổn định</w:t>
       </w:r>
@@ -14203,7 +14276,7 @@
       <w:pPr>
         <w:pStyle w:val="Heading2"/>
       </w:pPr>
-      <w:bookmarkStart w:id="34" w:name="_Toc243609351"/>
+      <w:bookmarkStart w:id="34" w:name="_Toc243610440"/>
       <w:r>
         <w:t>3.9. Quy trình thực nghiệm</w:t>
       </w:r>
@@ -14251,7 +14324,7 @@
       <w:pPr>
         <w:pStyle w:val="Heading1"/>
       </w:pPr>
-      <w:bookmarkStart w:id="35" w:name="_Toc243609352"/>
+      <w:bookmarkStart w:id="35" w:name="_Toc243610441"/>
       <w:r>
         <w:t>CHƯƠNG 4: KẾT QUẢ THỰC NGHIỆM VÀ DIỄN GIẢI TRI THỨC</w:t>
       </w:r>
@@ -14261,7 +14334,7 @@
       <w:pPr>
         <w:pStyle w:val="Heading2"/>
       </w:pPr>
-      <w:bookmarkStart w:id="36" w:name="_Toc243609353"/>
+      <w:bookmarkStart w:id="36" w:name="_Toc243610442"/>
       <w:r>
         <w:t>4.1. Chỉ số đánh giá của K-Means qua các năm</w:t>
       </w:r>
@@ -15012,7 +15085,7 @@
       <w:pPr>
         <w:pStyle w:val="Heading2"/>
       </w:pPr>
-      <w:bookmarkStart w:id="37" w:name="_Toc243609354"/>
+      <w:bookmarkStart w:id="37" w:name="_Toc243610443"/>
       <w:r>
         <w:t>4.2. Chỉ số đánh giá của Ward và so sánh với K-Means</w:t>
       </w:r>
@@ -15736,7 +15809,7 @@
       <w:pPr>
         <w:pStyle w:val="Heading2"/>
       </w:pPr>
-      <w:bookmarkStart w:id="38" w:name="_Toc243609355"/>
+      <w:bookmarkStart w:id="38" w:name="_Toc243610444"/>
       <w:r>
         <w:t>4.3. Chân dung ba cụm</w:t>
       </w:r>
@@ -17192,7 +17265,7 @@
       <w:pPr>
         <w:pStyle w:val="Heading2"/>
       </w:pPr>
-      <w:bookmarkStart w:id="39" w:name="_Toc243609356"/>
+      <w:bookmarkStart w:id="39" w:name="_Toc243610445"/>
       <w:r>
         <w:t>4.4. Hậu kiểm độc lập bằng điểm hạnh phúc</w:t>
       </w:r>
@@ -18008,7 +18081,7 @@
       <w:pPr>
         <w:pStyle w:val="Heading2"/>
       </w:pPr>
-      <w:bookmarkStart w:id="40" w:name="_Toc243609357"/>
+      <w:bookmarkStart w:id="40" w:name="_Toc243610446"/>
       <w:r>
         <w:t>4.5. Cấu hình đối chứng k = 3</w:t>
       </w:r>
@@ -19484,7 +19557,7 @@
       <w:pPr>
         <w:pStyle w:val="Heading2"/>
       </w:pPr>
-      <w:bookmarkStart w:id="41" w:name="_Toc243609358"/>
+      <w:bookmarkStart w:id="41" w:name="_Toc243610447"/>
       <w:r>
         <w:t>4.6. Ghép cụm liên năm</w:t>
       </w:r>
@@ -21022,7 +21095,7 @@
       <w:pPr>
         <w:pStyle w:val="Heading2"/>
       </w:pPr>
-      <w:bookmarkStart w:id="42" w:name="_Toc243609359"/>
+      <w:bookmarkStart w:id="42" w:name="_Toc243610448"/>
       <w:r>
         <w:t>4.7. Dịch chuyển cụm của 156 quốc gia</w:t>
       </w:r>
@@ -21606,7 +21679,7 @@
       <w:pPr>
         <w:pStyle w:val="Heading2"/>
       </w:pPr>
-      <w:bookmarkStart w:id="43" w:name="_Toc243609360"/>
+      <w:bookmarkStart w:id="43" w:name="_Toc243610449"/>
       <w:r>
         <w:t>4.8. Phân bố cụm trên không gian PCA 2D</w:t>
       </w:r>
@@ -21750,7 +21823,7 @@
       <w:pPr>
         <w:pStyle w:val="Heading2"/>
       </w:pPr>
-      <w:bookmarkStart w:id="44" w:name="_Toc243609361"/>
+      <w:bookmarkStart w:id="44" w:name="_Toc243610450"/>
       <w:r>
         <w:t>4.9. Kết luận chương 4</w:t>
       </w:r>
@@ -21786,7 +21859,7 @@
       <w:pPr>
         <w:pStyle w:val="Heading1"/>
       </w:pPr>
-      <w:bookmarkStart w:id="45" w:name="_Toc243609362"/>
+      <w:bookmarkStart w:id="45" w:name="_Toc243610451"/>
       <w:r>
         <w:t>CHƯƠNG 5: ỨNG DỤNG DEMO, KẾT LUẬN VÀ HƯỚNG PHÁT TRIỂN</w:t>
       </w:r>
@@ -21796,7 +21869,7 @@
       <w:pPr>
         <w:pStyle w:val="Heading2"/>
       </w:pPr>
-      <w:bookmarkStart w:id="46" w:name="_Toc243609363"/>
+      <w:bookmarkStart w:id="46" w:name="_Toc243610452"/>
       <w:r>
         <w:t>5.1. Kiến trúc ứng dụng demo Streamlit</w:t>
       </w:r>
@@ -21876,69 +21949,9 @@
     </w:p>
     <w:p>
       <w:pPr>
-        <w:spacing w:before="80"/>
-        <w:jc w:val="center"/>
-      </w:pPr>
-      <w:r>
-        <w:rPr>
-          <w:noProof/>
-        </w:rPr>
-        <w:drawing>
-          <wp:inline distT="0" distB="0" distL="0" distR="0" wp14:anchorId="009FE967" wp14:editId="11C9D250">
-            <wp:extent cx="5303520" cy="3503683"/>
-            <wp:effectExtent l="0" t="0" r="0" b="0"/>
-            <wp:docPr id="11" name="Picture 11"/>
-            <wp:cNvGraphicFramePr>
-              <a:graphicFrameLocks xmlns:a="http://schemas.openxmlformats.org/drawingml/2006/main" noChangeAspect="1"/>
-            </wp:cNvGraphicFramePr>
-            <a:graphic xmlns:a="http://schemas.openxmlformats.org/drawingml/2006/main">
-              <a:graphicData uri="http://schemas.openxmlformats.org/drawingml/2006/picture">
-                <pic:pic xmlns:pic="http://schemas.openxmlformats.org/drawingml/2006/picture">
-                  <pic:nvPicPr>
-                    <pic:cNvPr id="0" name="pca_clusters_2019.png"/>
-                    <pic:cNvPicPr/>
-                  </pic:nvPicPr>
-                  <pic:blipFill>
-                    <a:blip r:embed="rId19"/>
-                    <a:stretch>
-                      <a:fillRect/>
-                    </a:stretch>
-                  </pic:blipFill>
-                  <pic:spPr>
-                    <a:xfrm>
-                      <a:off x="0" y="0"/>
-                      <a:ext cx="5303520" cy="3503683"/>
-                    </a:xfrm>
-                    <a:prstGeom prst="rect">
-                      <a:avLst/>
-                    </a:prstGeom>
-                  </pic:spPr>
-                </pic:pic>
-              </a:graphicData>
-            </a:graphic>
-          </wp:inline>
-        </w:drawing>
-      </w:r>
-    </w:p>
-    <w:p>
-      <w:pPr>
-        <w:spacing w:after="160"/>
-        <w:jc w:val="center"/>
-      </w:pPr>
-      <w:r>
-        <w:rPr>
-          <w:i/>
-          <w:color w:val="000000"/>
-          <w:sz w:val="23"/>
-        </w:rPr>
-        <w:t>Hình 5.1: Phân bố ba cụm quốc gia năm 2019 trên không gian 2D PCA</w:t>
-      </w:r>
-    </w:p>
-    <w:p>
-      <w:pPr>
         <w:pStyle w:val="Heading2"/>
       </w:pPr>
-      <w:bookmarkStart w:id="47" w:name="_Toc243609364"/>
+      <w:bookmarkStart w:id="47" w:name="_Toc243610453"/>
       <w:r>
         <w:t>5.2. Kiểm thử ứng dụng</w:t>
       </w:r>
@@ -21962,7 +21975,7 @@
       <w:pPr>
         <w:pStyle w:val="Heading2"/>
       </w:pPr>
-      <w:bookmarkStart w:id="48" w:name="_Toc243609365"/>
+      <w:bookmarkStart w:id="48" w:name="_Toc243610454"/>
       <w:r>
         <w:t>5.3. Đóng góp chính của đồ án</w:t>
       </w:r>
@@ -22049,7 +22062,7 @@
       <w:pPr>
         <w:pStyle w:val="Heading2"/>
       </w:pPr>
-      <w:bookmarkStart w:id="49" w:name="_Toc243609366"/>
+      <w:bookmarkStart w:id="49" w:name="_Toc243610455"/>
       <w:r>
         <w:t>5.4. Hạn chế</w:t>
       </w:r>
@@ -22089,7 +22102,7 @@
       <w:pPr>
         <w:pStyle w:val="Heading2"/>
       </w:pPr>
-      <w:bookmarkStart w:id="50" w:name="_Toc243609367"/>
+      <w:bookmarkStart w:id="50" w:name="_Toc243610456"/>
       <w:r>
         <w:t>5.5. Hướng phát triển</w:t>
       </w:r>
@@ -22164,7 +22177,7 @@
       <w:pPr>
         <w:pStyle w:val="Heading2"/>
       </w:pPr>
-      <w:bookmarkStart w:id="51" w:name="_Toc243609368"/>
+      <w:bookmarkStart w:id="51" w:name="_Toc243610457"/>
       <w:r>
         <w:t>5.6. Kết luận</w:t>
       </w:r>
@@ -22188,7 +22201,7 @@
       <w:pPr>
         <w:pStyle w:val="Heading1"/>
       </w:pPr>
-      <w:bookmarkStart w:id="52" w:name="_Toc243609369"/>
+      <w:bookmarkStart w:id="52" w:name="_Toc243610458"/>
       <w:r>
         <w:t>TÀI LIỆU THAM KHẢO</w:t>
       </w:r>
@@ -22207,7 +22220,7 @@
           <w:color w:val="000000" w:themeColor="text1"/>
         </w:rPr>
       </w:pPr>
-      <w:hyperlink r:id="rId20" w:history="1">
+      <w:hyperlink r:id="rId19" w:history="1">
         <w:r>
           <w:rPr>
             <w:rStyle w:val="Hyperlink"/>
@@ -22231,7 +22244,7 @@
           <w:color w:val="000000" w:themeColor="text1"/>
         </w:rPr>
       </w:pPr>
-      <w:hyperlink r:id="rId21" w:history="1">
+      <w:hyperlink r:id="rId20" w:history="1">
         <w:r>
           <w:rPr>
             <w:rStyle w:val="Hyperlink"/>
@@ -22287,7 +22300,7 @@
           <w:color w:val="000000" w:themeColor="text1"/>
         </w:rPr>
       </w:pPr>
-      <w:hyperlink r:id="rId22" w:history="1">
+      <w:hyperlink r:id="rId21" w:history="1">
         <w:r>
           <w:rPr>
             <w:rStyle w:val="Hyperlink"/>
@@ -22343,7 +22356,7 @@
           <w:color w:val="000000" w:themeColor="text1"/>
         </w:rPr>
       </w:pPr>
-      <w:hyperlink r:id="rId23" w:history="1">
+      <w:hyperlink r:id="rId22" w:history="1">
         <w:r>
           <w:rPr>
             <w:rStyle w:val="Hyperlink"/>
@@ -22399,7 +22412,7 @@
           <w:color w:val="000000" w:themeColor="text1"/>
         </w:rPr>
       </w:pPr>
-      <w:hyperlink r:id="rId24" w:history="1">
+      <w:hyperlink r:id="rId23" w:history="1">
         <w:r>
           <w:rPr>
             <w:rStyle w:val="Hyperlink"/>
@@ -22455,7 +22468,7 @@
           <w:color w:val="000000" w:themeColor="text1"/>
         </w:rPr>
       </w:pPr>
-      <w:hyperlink r:id="rId25" w:history="1">
+      <w:hyperlink r:id="rId24" w:history="1">
         <w:r>
           <w:rPr>
             <w:rStyle w:val="Hyperlink"/>
@@ -22602,7 +22615,7 @@
       <w:pPr>
         <w:pStyle w:val="Heading1"/>
       </w:pPr>
-      <w:bookmarkStart w:id="53" w:name="_Toc243609370"/>
+      <w:bookmarkStart w:id="53" w:name="_Toc243610459"/>
       <w:r>
         <w:t>PHỤ LỤC A: BẢNG KHẢO SÁT SỐ CỤM NĂM 2019</w:t>
       </w:r>
@@ -23314,7 +23327,7 @@
       <w:pPr>
         <w:pStyle w:val="Heading1"/>
       </w:pPr>
-      <w:bookmarkStart w:id="54" w:name="_Toc243609371"/>
+      <w:bookmarkStart w:id="54" w:name="_Toc243610460"/>
       <w:r>
         <w:t>PHỤ LỤC B: KẾT QUẢ QUÉT THAM SỐ DBSCAN NĂM 2019</w:t>
       </w:r>
@@ -25032,8 +25045,8 @@
       </w:pPr>
     </w:p>
     <w:sectPr>
-      <w:headerReference w:type="default" r:id="rId26"/>
-      <w:footerReference w:type="default" r:id="rId27"/>
+      <w:headerReference w:type="default" r:id="rId25"/>
+      <w:footerReference w:type="default" r:id="rId26"/>
       <w:pgSz w:w="12240" w:h="15840"/>
       <w:pgMar w:top="1701" w:right="1134" w:bottom="1701" w:left="1701" w:header="720" w:footer="720" w:gutter="0"/>
       <w:pgNumType w:start="1"/>

</xml_diff>

<commit_message>
báo cáo: chụp ảnh giao diện bốn phân hệ demo streamlit và chèn hình 5.1 vào mục 5.1
</commit_message>
<xml_diff>
--- a/reports/final_report/Nhom12_BaoCao.docx
+++ b/reports/final_report/Nhom12_BaoCao.docx
@@ -243,7 +243,7 @@
       <w:pPr>
         <w:pStyle w:val="Heading1"/>
       </w:pPr>
-      <w:bookmarkStart w:id="0" w:name="_Toc243610406"/>
+      <w:bookmarkStart w:id="0" w:name="_Toc243615171"/>
       <w:r>
         <w:lastRenderedPageBreak/>
         <w:t>LỜI MỞ ĐẦU</w:t>
@@ -301,7 +301,7 @@
       <w:pPr>
         <w:pStyle w:val="Heading1"/>
       </w:pPr>
-      <w:bookmarkStart w:id="1" w:name="_Toc243610407"/>
+      <w:bookmarkStart w:id="1" w:name="_Toc243615172"/>
       <w:r>
         <w:lastRenderedPageBreak/>
         <w:t>TÓM TẮT</w:t>
@@ -342,8 +342,9 @@
       <w:pPr>
         <w:pStyle w:val="Heading1"/>
       </w:pPr>
-      <w:bookmarkStart w:id="2" w:name="_Toc243610408"/>
-      <w:r>
+      <w:bookmarkStart w:id="2" w:name="_Toc243615173"/>
+      <w:r>
+        <w:lastRenderedPageBreak/>
         <w:t>BẢNG PHÂN CÔNG NHIỆM VỤ</w:t>
       </w:r>
       <w:bookmarkEnd w:id="2"/>
@@ -1045,8 +1046,9 @@
       <w:pPr>
         <w:pStyle w:val="Heading1"/>
       </w:pPr>
-      <w:bookmarkStart w:id="3" w:name="_Toc243610409"/>
-      <w:r>
+      <w:bookmarkStart w:id="3" w:name="_Toc243615174"/>
+      <w:r>
+        <w:lastRenderedPageBreak/>
         <w:t>MỤC LỤC</w:t>
       </w:r>
       <w:bookmarkEnd w:id="3"/>
@@ -1075,7 +1077,7 @@
       <w:r>
         <w:fldChar w:fldCharType="separate"/>
       </w:r>
-      <w:hyperlink w:anchor="_Toc243610406" w:history="1">
+      <w:hyperlink w:anchor="_Toc243615171" w:history="1">
         <w:r>
           <w:rPr>
             <w:rStyle w:val="Hyperlink"/>
@@ -1102,7 +1104,7 @@
             <w:noProof/>
             <w:webHidden/>
           </w:rPr>
-          <w:instrText xml:space="preserve"> PAGEREF _Toc243610406 \h </w:instrText>
+          <w:instrText xml:space="preserve"> PAGEREF _Toc243615171 \h </w:instrText>
         </w:r>
         <w:r>
           <w:rPr>
@@ -1148,7 +1150,7 @@
           <w14:ligatures w14:val="standardContextual"/>
         </w:rPr>
       </w:pPr>
-      <w:hyperlink w:anchor="_Toc243610407" w:history="1">
+      <w:hyperlink w:anchor="_Toc243615172" w:history="1">
         <w:r>
           <w:rPr>
             <w:rStyle w:val="Hyperlink"/>
@@ -1175,7 +1177,7 @@
             <w:noProof/>
             <w:webHidden/>
           </w:rPr>
-          <w:instrText xml:space="preserve"> PAGEREF _Toc243610407 \h </w:instrText>
+          <w:instrText xml:space="preserve"> PAGEREF _Toc243615172 \h </w:instrText>
         </w:r>
         <w:r>
           <w:rPr>
@@ -1221,7 +1223,7 @@
           <w14:ligatures w14:val="standardContextual"/>
         </w:rPr>
       </w:pPr>
-      <w:hyperlink w:anchor="_Toc243610408" w:history="1">
+      <w:hyperlink w:anchor="_Toc243615173" w:history="1">
         <w:r>
           <w:rPr>
             <w:rStyle w:val="Hyperlink"/>
@@ -1248,7 +1250,7 @@
             <w:noProof/>
             <w:webHidden/>
           </w:rPr>
-          <w:instrText xml:space="preserve"> PAGEREF _Toc243610408 \h </w:instrText>
+          <w:instrText xml:space="preserve"> PAGEREF _Toc243615173 \h </w:instrText>
         </w:r>
         <w:r>
           <w:rPr>
@@ -1294,7 +1296,7 @@
           <w14:ligatures w14:val="standardContextual"/>
         </w:rPr>
       </w:pPr>
-      <w:hyperlink w:anchor="_Toc243610409" w:history="1">
+      <w:hyperlink w:anchor="_Toc243615174" w:history="1">
         <w:r>
           <w:rPr>
             <w:rStyle w:val="Hyperlink"/>
@@ -1321,7 +1323,7 @@
             <w:noProof/>
             <w:webHidden/>
           </w:rPr>
-          <w:instrText xml:space="preserve"> PAGEREF _Toc243610409 \h </w:instrText>
+          <w:instrText xml:space="preserve"> PAGEREF _Toc243615174 \h </w:instrText>
         </w:r>
         <w:r>
           <w:rPr>
@@ -1367,7 +1369,7 @@
           <w14:ligatures w14:val="standardContextual"/>
         </w:rPr>
       </w:pPr>
-      <w:hyperlink w:anchor="_Toc243610410" w:history="1">
+      <w:hyperlink w:anchor="_Toc243615175" w:history="1">
         <w:r>
           <w:rPr>
             <w:rStyle w:val="Hyperlink"/>
@@ -1394,7 +1396,7 @@
             <w:noProof/>
             <w:webHidden/>
           </w:rPr>
-          <w:instrText xml:space="preserve"> PAGEREF _Toc243610410 \h </w:instrText>
+          <w:instrText xml:space="preserve"> PAGEREF _Toc243615175 \h </w:instrText>
         </w:r>
         <w:r>
           <w:rPr>
@@ -1440,7 +1442,7 @@
           <w14:ligatures w14:val="standardContextual"/>
         </w:rPr>
       </w:pPr>
-      <w:hyperlink w:anchor="_Toc243610411" w:history="1">
+      <w:hyperlink w:anchor="_Toc243615176" w:history="1">
         <w:r>
           <w:rPr>
             <w:rStyle w:val="Hyperlink"/>
@@ -1467,7 +1469,7 @@
             <w:noProof/>
             <w:webHidden/>
           </w:rPr>
-          <w:instrText xml:space="preserve"> PAGEREF _Toc243610411 \h </w:instrText>
+          <w:instrText xml:space="preserve"> PAGEREF _Toc243615176 \h </w:instrText>
         </w:r>
         <w:r>
           <w:rPr>
@@ -1513,7 +1515,7 @@
           <w14:ligatures w14:val="standardContextual"/>
         </w:rPr>
       </w:pPr>
-      <w:hyperlink w:anchor="_Toc243610412" w:history="1">
+      <w:hyperlink w:anchor="_Toc243615177" w:history="1">
         <w:r>
           <w:rPr>
             <w:rStyle w:val="Hyperlink"/>
@@ -1540,7 +1542,7 @@
             <w:noProof/>
             <w:webHidden/>
           </w:rPr>
-          <w:instrText xml:space="preserve"> PAGEREF _Toc243610412 \h </w:instrText>
+          <w:instrText xml:space="preserve"> PAGEREF _Toc243615177 \h </w:instrText>
         </w:r>
         <w:r>
           <w:rPr>
@@ -1586,7 +1588,7 @@
           <w14:ligatures w14:val="standardContextual"/>
         </w:rPr>
       </w:pPr>
-      <w:hyperlink w:anchor="_Toc243610413" w:history="1">
+      <w:hyperlink w:anchor="_Toc243615178" w:history="1">
         <w:r>
           <w:rPr>
             <w:rStyle w:val="Hyperlink"/>
@@ -1613,7 +1615,7 @@
             <w:noProof/>
             <w:webHidden/>
           </w:rPr>
-          <w:instrText xml:space="preserve"> PAGEREF _Toc243610413 \h </w:instrText>
+          <w:instrText xml:space="preserve"> PAGEREF _Toc243615178 \h </w:instrText>
         </w:r>
         <w:r>
           <w:rPr>
@@ -1659,7 +1661,7 @@
           <w14:ligatures w14:val="standardContextual"/>
         </w:rPr>
       </w:pPr>
-      <w:hyperlink w:anchor="_Toc243610414" w:history="1">
+      <w:hyperlink w:anchor="_Toc243615179" w:history="1">
         <w:r>
           <w:rPr>
             <w:rStyle w:val="Hyperlink"/>
@@ -1686,7 +1688,7 @@
             <w:noProof/>
             <w:webHidden/>
           </w:rPr>
-          <w:instrText xml:space="preserve"> PAGEREF _Toc243610414 \h </w:instrText>
+          <w:instrText xml:space="preserve"> PAGEREF _Toc243615179 \h </w:instrText>
         </w:r>
         <w:r>
           <w:rPr>
@@ -1732,7 +1734,7 @@
           <w14:ligatures w14:val="standardContextual"/>
         </w:rPr>
       </w:pPr>
-      <w:hyperlink w:anchor="_Toc243610415" w:history="1">
+      <w:hyperlink w:anchor="_Toc243615180" w:history="1">
         <w:r>
           <w:rPr>
             <w:rStyle w:val="Hyperlink"/>
@@ -1759,7 +1761,7 @@
             <w:noProof/>
             <w:webHidden/>
           </w:rPr>
-          <w:instrText xml:space="preserve"> PAGEREF _Toc243610415 \h </w:instrText>
+          <w:instrText xml:space="preserve"> PAGEREF _Toc243615180 \h </w:instrText>
         </w:r>
         <w:r>
           <w:rPr>
@@ -1805,7 +1807,7 @@
           <w14:ligatures w14:val="standardContextual"/>
         </w:rPr>
       </w:pPr>
-      <w:hyperlink w:anchor="_Toc243610416" w:history="1">
+      <w:hyperlink w:anchor="_Toc243615181" w:history="1">
         <w:r>
           <w:rPr>
             <w:rStyle w:val="Hyperlink"/>
@@ -1832,7 +1834,7 @@
             <w:noProof/>
             <w:webHidden/>
           </w:rPr>
-          <w:instrText xml:space="preserve"> PAGEREF _Toc243610416 \h </w:instrText>
+          <w:instrText xml:space="preserve"> PAGEREF _Toc243615181 \h </w:instrText>
         </w:r>
         <w:r>
           <w:rPr>
@@ -1878,7 +1880,7 @@
           <w14:ligatures w14:val="standardContextual"/>
         </w:rPr>
       </w:pPr>
-      <w:hyperlink w:anchor="_Toc243610417" w:history="1">
+      <w:hyperlink w:anchor="_Toc243615182" w:history="1">
         <w:r>
           <w:rPr>
             <w:rStyle w:val="Hyperlink"/>
@@ -1905,7 +1907,7 @@
             <w:noProof/>
             <w:webHidden/>
           </w:rPr>
-          <w:instrText xml:space="preserve"> PAGEREF _Toc243610417 \h </w:instrText>
+          <w:instrText xml:space="preserve"> PAGEREF _Toc243615182 \h </w:instrText>
         </w:r>
         <w:r>
           <w:rPr>
@@ -1951,7 +1953,7 @@
           <w14:ligatures w14:val="standardContextual"/>
         </w:rPr>
       </w:pPr>
-      <w:hyperlink w:anchor="_Toc243610418" w:history="1">
+      <w:hyperlink w:anchor="_Toc243615183" w:history="1">
         <w:r>
           <w:rPr>
             <w:rStyle w:val="Hyperlink"/>
@@ -1978,7 +1980,7 @@
             <w:noProof/>
             <w:webHidden/>
           </w:rPr>
-          <w:instrText xml:space="preserve"> PAGEREF _Toc243610418 \h </w:instrText>
+          <w:instrText xml:space="preserve"> PAGEREF _Toc243615183 \h </w:instrText>
         </w:r>
         <w:r>
           <w:rPr>
@@ -2024,7 +2026,7 @@
           <w14:ligatures w14:val="standardContextual"/>
         </w:rPr>
       </w:pPr>
-      <w:hyperlink w:anchor="_Toc243610419" w:history="1">
+      <w:hyperlink w:anchor="_Toc243615184" w:history="1">
         <w:r>
           <w:rPr>
             <w:rStyle w:val="Hyperlink"/>
@@ -2051,7 +2053,7 @@
             <w:noProof/>
             <w:webHidden/>
           </w:rPr>
-          <w:instrText xml:space="preserve"> PAGEREF _Toc243610419 \h </w:instrText>
+          <w:instrText xml:space="preserve"> PAGEREF _Toc243615184 \h </w:instrText>
         </w:r>
         <w:r>
           <w:rPr>
@@ -2097,7 +2099,7 @@
           <w14:ligatures w14:val="standardContextual"/>
         </w:rPr>
       </w:pPr>
-      <w:hyperlink w:anchor="_Toc243610420" w:history="1">
+      <w:hyperlink w:anchor="_Toc243615185" w:history="1">
         <w:r>
           <w:rPr>
             <w:rStyle w:val="Hyperlink"/>
@@ -2124,7 +2126,7 @@
             <w:noProof/>
             <w:webHidden/>
           </w:rPr>
-          <w:instrText xml:space="preserve"> PAGEREF _Toc243610420 \h </w:instrText>
+          <w:instrText xml:space="preserve"> PAGEREF _Toc243615185 \h </w:instrText>
         </w:r>
         <w:r>
           <w:rPr>
@@ -2170,7 +2172,7 @@
           <w14:ligatures w14:val="standardContextual"/>
         </w:rPr>
       </w:pPr>
-      <w:hyperlink w:anchor="_Toc243610421" w:history="1">
+      <w:hyperlink w:anchor="_Toc243615186" w:history="1">
         <w:r>
           <w:rPr>
             <w:rStyle w:val="Hyperlink"/>
@@ -2197,7 +2199,7 @@
             <w:noProof/>
             <w:webHidden/>
           </w:rPr>
-          <w:instrText xml:space="preserve"> PAGEREF _Toc243610421 \h </w:instrText>
+          <w:instrText xml:space="preserve"> PAGEREF _Toc243615186 \h </w:instrText>
         </w:r>
         <w:r>
           <w:rPr>
@@ -2243,7 +2245,7 @@
           <w14:ligatures w14:val="standardContextual"/>
         </w:rPr>
       </w:pPr>
-      <w:hyperlink w:anchor="_Toc243610422" w:history="1">
+      <w:hyperlink w:anchor="_Toc243615187" w:history="1">
         <w:r>
           <w:rPr>
             <w:rStyle w:val="Hyperlink"/>
@@ -2270,7 +2272,7 @@
             <w:noProof/>
             <w:webHidden/>
           </w:rPr>
-          <w:instrText xml:space="preserve"> PAGEREF _Toc243610422 \h </w:instrText>
+          <w:instrText xml:space="preserve"> PAGEREF _Toc243615187 \h </w:instrText>
         </w:r>
         <w:r>
           <w:rPr>
@@ -2316,7 +2318,7 @@
           <w14:ligatures w14:val="standardContextual"/>
         </w:rPr>
       </w:pPr>
-      <w:hyperlink w:anchor="_Toc243610423" w:history="1">
+      <w:hyperlink w:anchor="_Toc243615188" w:history="1">
         <w:r>
           <w:rPr>
             <w:rStyle w:val="Hyperlink"/>
@@ -2343,7 +2345,7 @@
             <w:noProof/>
             <w:webHidden/>
           </w:rPr>
-          <w:instrText xml:space="preserve"> PAGEREF _Toc243610423 \h </w:instrText>
+          <w:instrText xml:space="preserve"> PAGEREF _Toc243615188 \h </w:instrText>
         </w:r>
         <w:r>
           <w:rPr>
@@ -2389,7 +2391,7 @@
           <w14:ligatures w14:val="standardContextual"/>
         </w:rPr>
       </w:pPr>
-      <w:hyperlink w:anchor="_Toc243610424" w:history="1">
+      <w:hyperlink w:anchor="_Toc243615189" w:history="1">
         <w:r>
           <w:rPr>
             <w:rStyle w:val="Hyperlink"/>
@@ -2416,7 +2418,7 @@
             <w:noProof/>
             <w:webHidden/>
           </w:rPr>
-          <w:instrText xml:space="preserve"> PAGEREF _Toc243610424 \h </w:instrText>
+          <w:instrText xml:space="preserve"> PAGEREF _Toc243615189 \h </w:instrText>
         </w:r>
         <w:r>
           <w:rPr>
@@ -2462,7 +2464,7 @@
           <w14:ligatures w14:val="standardContextual"/>
         </w:rPr>
       </w:pPr>
-      <w:hyperlink w:anchor="_Toc243610425" w:history="1">
+      <w:hyperlink w:anchor="_Toc243615190" w:history="1">
         <w:r>
           <w:rPr>
             <w:rStyle w:val="Hyperlink"/>
@@ -2489,7 +2491,7 @@
             <w:noProof/>
             <w:webHidden/>
           </w:rPr>
-          <w:instrText xml:space="preserve"> PAGEREF _Toc243610425 \h </w:instrText>
+          <w:instrText xml:space="preserve"> PAGEREF _Toc243615190 \h </w:instrText>
         </w:r>
         <w:r>
           <w:rPr>
@@ -2535,13 +2537,21 @@
           <w14:ligatures w14:val="standardContextual"/>
         </w:rPr>
       </w:pPr>
-      <w:hyperlink w:anchor="_Toc243610426" w:history="1">
+      <w:hyperlink w:anchor="_Toc243615191" w:history="1">
         <w:r>
           <w:rPr>
             <w:rStyle w:val="Hyperlink"/>
             <w:noProof/>
           </w:rPr>
-          <w:t>2.5. Bảng dữ liệu trung gian</w:t>
+          <w:t>2.5. Bảng dữ liệu tru</w:t>
+        </w:r>
+        <w:r>
+          <w:rPr>
+            <w:rStyle w:val="Hyperlink"/>
+            <w:noProof/>
+          </w:rPr>
+          <w:lastRenderedPageBreak/>
+          <w:t>ng gian</w:t>
         </w:r>
         <w:r>
           <w:rPr>
@@ -2562,7 +2572,7 @@
             <w:noProof/>
             <w:webHidden/>
           </w:rPr>
-          <w:instrText xml:space="preserve"> PAGEREF _Toc243610426 \h </w:instrText>
+          <w:instrText xml:space="preserve"> PAGEREF _Toc243615191 \h </w:instrText>
         </w:r>
         <w:r>
           <w:rPr>
@@ -2608,7 +2618,7 @@
           <w14:ligatures w14:val="standardContextual"/>
         </w:rPr>
       </w:pPr>
-      <w:hyperlink w:anchor="_Toc243610427" w:history="1">
+      <w:hyperlink w:anchor="_Toc243615192" w:history="1">
         <w:r>
           <w:rPr>
             <w:rStyle w:val="Hyperlink"/>
@@ -2635,7 +2645,7 @@
             <w:noProof/>
             <w:webHidden/>
           </w:rPr>
-          <w:instrText xml:space="preserve"> PAGEREF _Toc243610427 \h </w:instrText>
+          <w:instrText xml:space="preserve"> PAGEREF _Toc243615192 \h </w:instrText>
         </w:r>
         <w:r>
           <w:rPr>
@@ -2681,7 +2691,7 @@
           <w14:ligatures w14:val="standardContextual"/>
         </w:rPr>
       </w:pPr>
-      <w:hyperlink w:anchor="_Toc243610428" w:history="1">
+      <w:hyperlink w:anchor="_Toc243615193" w:history="1">
         <w:r>
           <w:rPr>
             <w:rStyle w:val="Hyperlink"/>
@@ -2708,7 +2718,7 @@
             <w:noProof/>
             <w:webHidden/>
           </w:rPr>
-          <w:instrText xml:space="preserve"> PAGEREF _Toc243610428 \h </w:instrText>
+          <w:instrText xml:space="preserve"> PAGEREF _Toc243615193 \h </w:instrText>
         </w:r>
         <w:r>
           <w:rPr>
@@ -2754,7 +2764,7 @@
           <w14:ligatures w14:val="standardContextual"/>
         </w:rPr>
       </w:pPr>
-      <w:hyperlink w:anchor="_Toc243610429" w:history="1">
+      <w:hyperlink w:anchor="_Toc243615194" w:history="1">
         <w:r>
           <w:rPr>
             <w:rStyle w:val="Hyperlink"/>
@@ -2781,7 +2791,7 @@
             <w:noProof/>
             <w:webHidden/>
           </w:rPr>
-          <w:instrText xml:space="preserve"> PAGEREF _Toc243610429 \h </w:instrText>
+          <w:instrText xml:space="preserve"> PAGEREF _Toc243615194 \h </w:instrText>
         </w:r>
         <w:r>
           <w:rPr>
@@ -2827,7 +2837,7 @@
           <w14:ligatures w14:val="standardContextual"/>
         </w:rPr>
       </w:pPr>
-      <w:hyperlink w:anchor="_Toc243610430" w:history="1">
+      <w:hyperlink w:anchor="_Toc243615195" w:history="1">
         <w:r>
           <w:rPr>
             <w:rStyle w:val="Hyperlink"/>
@@ -2854,7 +2864,7 @@
             <w:noProof/>
             <w:webHidden/>
           </w:rPr>
-          <w:instrText xml:space="preserve"> PAGEREF _Toc243610430 \h </w:instrText>
+          <w:instrText xml:space="preserve"> PAGEREF _Toc243615195 \h </w:instrText>
         </w:r>
         <w:r>
           <w:rPr>
@@ -2900,7 +2910,7 @@
           <w14:ligatures w14:val="standardContextual"/>
         </w:rPr>
       </w:pPr>
-      <w:hyperlink w:anchor="_Toc243610431" w:history="1">
+      <w:hyperlink w:anchor="_Toc243615196" w:history="1">
         <w:r>
           <w:rPr>
             <w:rStyle w:val="Hyperlink"/>
@@ -2927,7 +2937,7 @@
             <w:noProof/>
             <w:webHidden/>
           </w:rPr>
-          <w:instrText xml:space="preserve"> PAGEREF _Toc243610431 \h </w:instrText>
+          <w:instrText xml:space="preserve"> PAGEREF _Toc243615196 \h </w:instrText>
         </w:r>
         <w:r>
           <w:rPr>
@@ -2973,7 +2983,7 @@
           <w14:ligatures w14:val="standardContextual"/>
         </w:rPr>
       </w:pPr>
-      <w:hyperlink w:anchor="_Toc243610432" w:history="1">
+      <w:hyperlink w:anchor="_Toc243615197" w:history="1">
         <w:r>
           <w:rPr>
             <w:rStyle w:val="Hyperlink"/>
@@ -3000,7 +3010,7 @@
             <w:noProof/>
             <w:webHidden/>
           </w:rPr>
-          <w:instrText xml:space="preserve"> PAGEREF _Toc243610432 \h </w:instrText>
+          <w:instrText xml:space="preserve"> PAGEREF _Toc243615197 \h </w:instrText>
         </w:r>
         <w:r>
           <w:rPr>
@@ -3046,7 +3056,7 @@
           <w14:ligatures w14:val="standardContextual"/>
         </w:rPr>
       </w:pPr>
-      <w:hyperlink w:anchor="_Toc243610433" w:history="1">
+      <w:hyperlink w:anchor="_Toc243615198" w:history="1">
         <w:r>
           <w:rPr>
             <w:rStyle w:val="Hyperlink"/>
@@ -3073,7 +3083,7 @@
             <w:noProof/>
             <w:webHidden/>
           </w:rPr>
-          <w:instrText xml:space="preserve"> PAGEREF _Toc243610433 \h </w:instrText>
+          <w:instrText xml:space="preserve"> PAGEREF _Toc243615198 \h </w:instrText>
         </w:r>
         <w:r>
           <w:rPr>
@@ -3119,7 +3129,7 @@
           <w14:ligatures w14:val="standardContextual"/>
         </w:rPr>
       </w:pPr>
-      <w:hyperlink w:anchor="_Toc243610434" w:history="1">
+      <w:hyperlink w:anchor="_Toc243615199" w:history="1">
         <w:r>
           <w:rPr>
             <w:rStyle w:val="Hyperlink"/>
@@ -3146,7 +3156,7 @@
             <w:noProof/>
             <w:webHidden/>
           </w:rPr>
-          <w:instrText xml:space="preserve"> PAGEREF _Toc243610434 \h </w:instrText>
+          <w:instrText xml:space="preserve"> PAGEREF _Toc243615199 \h </w:instrText>
         </w:r>
         <w:r>
           <w:rPr>
@@ -3192,7 +3202,7 @@
           <w14:ligatures w14:val="standardContextual"/>
         </w:rPr>
       </w:pPr>
-      <w:hyperlink w:anchor="_Toc243610435" w:history="1">
+      <w:hyperlink w:anchor="_Toc243615200" w:history="1">
         <w:r>
           <w:rPr>
             <w:rStyle w:val="Hyperlink"/>
@@ -3219,7 +3229,7 @@
             <w:noProof/>
             <w:webHidden/>
           </w:rPr>
-          <w:instrText xml:space="preserve"> PAGEREF _Toc243610435 \h </w:instrText>
+          <w:instrText xml:space="preserve"> PAGEREF _Toc243615200 \h </w:instrText>
         </w:r>
         <w:r>
           <w:rPr>
@@ -3265,7 +3275,7 @@
           <w14:ligatures w14:val="standardContextual"/>
         </w:rPr>
       </w:pPr>
-      <w:hyperlink w:anchor="_Toc243610436" w:history="1">
+      <w:hyperlink w:anchor="_Toc243615201" w:history="1">
         <w:r>
           <w:rPr>
             <w:rStyle w:val="Hyperlink"/>
@@ -3292,7 +3302,7 @@
             <w:noProof/>
             <w:webHidden/>
           </w:rPr>
-          <w:instrText xml:space="preserve"> PAGEREF _Toc243610436 \h </w:instrText>
+          <w:instrText xml:space="preserve"> PAGEREF _Toc243615201 \h </w:instrText>
         </w:r>
         <w:r>
           <w:rPr>
@@ -3338,7 +3348,7 @@
           <w14:ligatures w14:val="standardContextual"/>
         </w:rPr>
       </w:pPr>
-      <w:hyperlink w:anchor="_Toc243610437" w:history="1">
+      <w:hyperlink w:anchor="_Toc243615202" w:history="1">
         <w:r>
           <w:rPr>
             <w:rStyle w:val="Hyperlink"/>
@@ -3365,7 +3375,7 @@
             <w:noProof/>
             <w:webHidden/>
           </w:rPr>
-          <w:instrText xml:space="preserve"> PAGEREF _Toc243610437 \h </w:instrText>
+          <w:instrText xml:space="preserve"> PAGEREF _Toc243615202 \h </w:instrText>
         </w:r>
         <w:r>
           <w:rPr>
@@ -3411,7 +3421,7 @@
           <w14:ligatures w14:val="standardContextual"/>
         </w:rPr>
       </w:pPr>
-      <w:hyperlink w:anchor="_Toc243610438" w:history="1">
+      <w:hyperlink w:anchor="_Toc243615203" w:history="1">
         <w:r>
           <w:rPr>
             <w:rStyle w:val="Hyperlink"/>
@@ -3438,7 +3448,7 @@
             <w:noProof/>
             <w:webHidden/>
           </w:rPr>
-          <w:instrText xml:space="preserve"> PAGEREF _Toc243610438 \h </w:instrText>
+          <w:instrText xml:space="preserve"> PAGEREF _Toc243615203 \h </w:instrText>
         </w:r>
         <w:r>
           <w:rPr>
@@ -3484,7 +3494,7 @@
           <w14:ligatures w14:val="standardContextual"/>
         </w:rPr>
       </w:pPr>
-      <w:hyperlink w:anchor="_Toc243610439" w:history="1">
+      <w:hyperlink w:anchor="_Toc243615204" w:history="1">
         <w:r>
           <w:rPr>
             <w:rStyle w:val="Hyperlink"/>
@@ -3511,7 +3521,7 @@
             <w:noProof/>
             <w:webHidden/>
           </w:rPr>
-          <w:instrText xml:space="preserve"> PAGEREF _Toc243610439 \h </w:instrText>
+          <w:instrText xml:space="preserve"> PAGEREF _Toc243615204 \h </w:instrText>
         </w:r>
         <w:r>
           <w:rPr>
@@ -3557,7 +3567,7 @@
           <w14:ligatures w14:val="standardContextual"/>
         </w:rPr>
       </w:pPr>
-      <w:hyperlink w:anchor="_Toc243610440" w:history="1">
+      <w:hyperlink w:anchor="_Toc243615205" w:history="1">
         <w:r>
           <w:rPr>
             <w:rStyle w:val="Hyperlink"/>
@@ -3584,7 +3594,7 @@
             <w:noProof/>
             <w:webHidden/>
           </w:rPr>
-          <w:instrText xml:space="preserve"> PAGEREF _Toc243610440 \h </w:instrText>
+          <w:instrText xml:space="preserve"> PAGEREF _Toc243615205 \h </w:instrText>
         </w:r>
         <w:r>
           <w:rPr>
@@ -3630,7 +3640,7 @@
           <w14:ligatures w14:val="standardContextual"/>
         </w:rPr>
       </w:pPr>
-      <w:hyperlink w:anchor="_Toc243610441" w:history="1">
+      <w:hyperlink w:anchor="_Toc243615206" w:history="1">
         <w:r>
           <w:rPr>
             <w:rStyle w:val="Hyperlink"/>
@@ -3657,7 +3667,7 @@
             <w:noProof/>
             <w:webHidden/>
           </w:rPr>
-          <w:instrText xml:space="preserve"> PAGEREF _Toc243610441 \h </w:instrText>
+          <w:instrText xml:space="preserve"> PAGEREF _Toc243615206 \h </w:instrText>
         </w:r>
         <w:r>
           <w:rPr>
@@ -3703,7 +3713,7 @@
           <w14:ligatures w14:val="standardContextual"/>
         </w:rPr>
       </w:pPr>
-      <w:hyperlink w:anchor="_Toc243610442" w:history="1">
+      <w:hyperlink w:anchor="_Toc243615207" w:history="1">
         <w:r>
           <w:rPr>
             <w:rStyle w:val="Hyperlink"/>
@@ -3730,7 +3740,7 @@
             <w:noProof/>
             <w:webHidden/>
           </w:rPr>
-          <w:instrText xml:space="preserve"> PAGEREF _Toc243610442 \h </w:instrText>
+          <w:instrText xml:space="preserve"> PAGEREF _Toc243615207 \h </w:instrText>
         </w:r>
         <w:r>
           <w:rPr>
@@ -3776,7 +3786,7 @@
           <w14:ligatures w14:val="standardContextual"/>
         </w:rPr>
       </w:pPr>
-      <w:hyperlink w:anchor="_Toc243610443" w:history="1">
+      <w:hyperlink w:anchor="_Toc243615208" w:history="1">
         <w:r>
           <w:rPr>
             <w:rStyle w:val="Hyperlink"/>
@@ -3803,7 +3813,7 @@
             <w:noProof/>
             <w:webHidden/>
           </w:rPr>
-          <w:instrText xml:space="preserve"> PAGEREF _Toc243610443 \h </w:instrText>
+          <w:instrText xml:space="preserve"> PAGEREF _Toc243615208 \h </w:instrText>
         </w:r>
         <w:r>
           <w:rPr>
@@ -3849,7 +3859,7 @@
           <w14:ligatures w14:val="standardContextual"/>
         </w:rPr>
       </w:pPr>
-      <w:hyperlink w:anchor="_Toc243610444" w:history="1">
+      <w:hyperlink w:anchor="_Toc243615209" w:history="1">
         <w:r>
           <w:rPr>
             <w:rStyle w:val="Hyperlink"/>
@@ -3876,7 +3886,7 @@
             <w:noProof/>
             <w:webHidden/>
           </w:rPr>
-          <w:instrText xml:space="preserve"> PAGEREF _Toc243610444 \h </w:instrText>
+          <w:instrText xml:space="preserve"> PAGEREF _Toc243615209 \h </w:instrText>
         </w:r>
         <w:r>
           <w:rPr>
@@ -3922,7 +3932,7 @@
           <w14:ligatures w14:val="standardContextual"/>
         </w:rPr>
       </w:pPr>
-      <w:hyperlink w:anchor="_Toc243610445" w:history="1">
+      <w:hyperlink w:anchor="_Toc243615210" w:history="1">
         <w:r>
           <w:rPr>
             <w:rStyle w:val="Hyperlink"/>
@@ -3949,7 +3959,7 @@
             <w:noProof/>
             <w:webHidden/>
           </w:rPr>
-          <w:instrText xml:space="preserve"> PAGEREF _Toc243610445 \h </w:instrText>
+          <w:instrText xml:space="preserve"> PAGEREF _Toc243615210 \h </w:instrText>
         </w:r>
         <w:r>
           <w:rPr>
@@ -3995,7 +4005,7 @@
           <w14:ligatures w14:val="standardContextual"/>
         </w:rPr>
       </w:pPr>
-      <w:hyperlink w:anchor="_Toc243610446" w:history="1">
+      <w:hyperlink w:anchor="_Toc243615211" w:history="1">
         <w:r>
           <w:rPr>
             <w:rStyle w:val="Hyperlink"/>
@@ -4022,7 +4032,7 @@
             <w:noProof/>
             <w:webHidden/>
           </w:rPr>
-          <w:instrText xml:space="preserve"> PAGEREF _Toc243610446 \h </w:instrText>
+          <w:instrText xml:space="preserve"> PAGEREF _Toc243615211 \h </w:instrText>
         </w:r>
         <w:r>
           <w:rPr>
@@ -4068,7 +4078,7 @@
           <w14:ligatures w14:val="standardContextual"/>
         </w:rPr>
       </w:pPr>
-      <w:hyperlink w:anchor="_Toc243610447" w:history="1">
+      <w:hyperlink w:anchor="_Toc243615212" w:history="1">
         <w:r>
           <w:rPr>
             <w:rStyle w:val="Hyperlink"/>
@@ -4095,7 +4105,7 @@
             <w:noProof/>
             <w:webHidden/>
           </w:rPr>
-          <w:instrText xml:space="preserve"> PAGEREF _Toc243610447 \h </w:instrText>
+          <w:instrText xml:space="preserve"> PAGEREF _Toc243615212 \h </w:instrText>
         </w:r>
         <w:r>
           <w:rPr>
@@ -4141,7 +4151,7 @@
           <w14:ligatures w14:val="standardContextual"/>
         </w:rPr>
       </w:pPr>
-      <w:hyperlink w:anchor="_Toc243610448" w:history="1">
+      <w:hyperlink w:anchor="_Toc243615213" w:history="1">
         <w:r>
           <w:rPr>
             <w:rStyle w:val="Hyperlink"/>
@@ -4168,7 +4178,7 @@
             <w:noProof/>
             <w:webHidden/>
           </w:rPr>
-          <w:instrText xml:space="preserve"> PAGEREF _Toc243610448 \h </w:instrText>
+          <w:instrText xml:space="preserve"> PAGEREF _Toc243615213 \h </w:instrText>
         </w:r>
         <w:r>
           <w:rPr>
@@ -4214,7 +4224,7 @@
           <w14:ligatures w14:val="standardContextual"/>
         </w:rPr>
       </w:pPr>
-      <w:hyperlink w:anchor="_Toc243610449" w:history="1">
+      <w:hyperlink w:anchor="_Toc243615214" w:history="1">
         <w:r>
           <w:rPr>
             <w:rStyle w:val="Hyperlink"/>
@@ -4241,7 +4251,7 @@
             <w:noProof/>
             <w:webHidden/>
           </w:rPr>
-          <w:instrText xml:space="preserve"> PAGEREF _Toc243610449 \h </w:instrText>
+          <w:instrText xml:space="preserve"> PAGEREF _Toc243615214 \h </w:instrText>
         </w:r>
         <w:r>
           <w:rPr>
@@ -4287,7 +4297,7 @@
           <w14:ligatures w14:val="standardContextual"/>
         </w:rPr>
       </w:pPr>
-      <w:hyperlink w:anchor="_Toc243610450" w:history="1">
+      <w:hyperlink w:anchor="_Toc243615215" w:history="1">
         <w:r>
           <w:rPr>
             <w:rStyle w:val="Hyperlink"/>
@@ -4314,7 +4324,7 @@
             <w:noProof/>
             <w:webHidden/>
           </w:rPr>
-          <w:instrText xml:space="preserve"> PAGEREF _Toc243610450 \h </w:instrText>
+          <w:instrText xml:space="preserve"> PAGEREF _Toc243615215 \h </w:instrText>
         </w:r>
         <w:r>
           <w:rPr>
@@ -4360,7 +4370,7 @@
           <w14:ligatures w14:val="standardContextual"/>
         </w:rPr>
       </w:pPr>
-      <w:hyperlink w:anchor="_Toc243610451" w:history="1">
+      <w:hyperlink w:anchor="_Toc243615216" w:history="1">
         <w:r>
           <w:rPr>
             <w:rStyle w:val="Hyperlink"/>
@@ -4387,7 +4397,7 @@
             <w:noProof/>
             <w:webHidden/>
           </w:rPr>
-          <w:instrText xml:space="preserve"> PAGEREF _Toc243610451 \h </w:instrText>
+          <w:instrText xml:space="preserve"> PAGEREF _Toc243615216 \h </w:instrText>
         </w:r>
         <w:r>
           <w:rPr>
@@ -4433,7 +4443,7 @@
           <w14:ligatures w14:val="standardContextual"/>
         </w:rPr>
       </w:pPr>
-      <w:hyperlink w:anchor="_Toc243610452" w:history="1">
+      <w:hyperlink w:anchor="_Toc243615217" w:history="1">
         <w:r>
           <w:rPr>
             <w:rStyle w:val="Hyperlink"/>
@@ -4460,7 +4470,7 @@
             <w:noProof/>
             <w:webHidden/>
           </w:rPr>
-          <w:instrText xml:space="preserve"> PAGEREF _Toc243610452 \h </w:instrText>
+          <w:instrText xml:space="preserve"> PAGEREF _Toc243615217 \h </w:instrText>
         </w:r>
         <w:r>
           <w:rPr>
@@ -4506,7 +4516,7 @@
           <w14:ligatures w14:val="standardContextual"/>
         </w:rPr>
       </w:pPr>
-      <w:hyperlink w:anchor="_Toc243610453" w:history="1">
+      <w:hyperlink w:anchor="_Toc243615218" w:history="1">
         <w:r>
           <w:rPr>
             <w:rStyle w:val="Hyperlink"/>
@@ -4533,7 +4543,7 @@
             <w:noProof/>
             <w:webHidden/>
           </w:rPr>
-          <w:instrText xml:space="preserve"> PAGEREF _Toc243610453 \h </w:instrText>
+          <w:instrText xml:space="preserve"> PAGEREF _Toc243615218 \h </w:instrText>
         </w:r>
         <w:r>
           <w:rPr>
@@ -4553,7 +4563,7 @@
             <w:noProof/>
             <w:webHidden/>
           </w:rPr>
-          <w:t>36</w:t>
+          <w:t>37</w:t>
         </w:r>
         <w:r>
           <w:rPr>
@@ -4579,7 +4589,7 @@
           <w14:ligatures w14:val="standardContextual"/>
         </w:rPr>
       </w:pPr>
-      <w:hyperlink w:anchor="_Toc243610454" w:history="1">
+      <w:hyperlink w:anchor="_Toc243615219" w:history="1">
         <w:r>
           <w:rPr>
             <w:rStyle w:val="Hyperlink"/>
@@ -4606,7 +4616,7 @@
             <w:noProof/>
             <w:webHidden/>
           </w:rPr>
-          <w:instrText xml:space="preserve"> PAGEREF _Toc243610454 \h </w:instrText>
+          <w:instrText xml:space="preserve"> PAGEREF _Toc243615219 \h </w:instrText>
         </w:r>
         <w:r>
           <w:rPr>
@@ -4652,7 +4662,7 @@
           <w14:ligatures w14:val="standardContextual"/>
         </w:rPr>
       </w:pPr>
-      <w:hyperlink w:anchor="_Toc243610455" w:history="1">
+      <w:hyperlink w:anchor="_Toc243615220" w:history="1">
         <w:r>
           <w:rPr>
             <w:rStyle w:val="Hyperlink"/>
@@ -4679,7 +4689,7 @@
             <w:noProof/>
             <w:webHidden/>
           </w:rPr>
-          <w:instrText xml:space="preserve"> PAGEREF _Toc243610455 \h </w:instrText>
+          <w:instrText xml:space="preserve"> PAGEREF _Toc243615220 \h </w:instrText>
         </w:r>
         <w:r>
           <w:rPr>
@@ -4699,7 +4709,7 @@
             <w:noProof/>
             <w:webHidden/>
           </w:rPr>
-          <w:t>37</w:t>
+          <w:t>38</w:t>
         </w:r>
         <w:r>
           <w:rPr>
@@ -4725,7 +4735,7 @@
           <w14:ligatures w14:val="standardContextual"/>
         </w:rPr>
       </w:pPr>
-      <w:hyperlink w:anchor="_Toc243610456" w:history="1">
+      <w:hyperlink w:anchor="_Toc243615221" w:history="1">
         <w:r>
           <w:rPr>
             <w:rStyle w:val="Hyperlink"/>
@@ -4752,7 +4762,7 @@
             <w:noProof/>
             <w:webHidden/>
           </w:rPr>
-          <w:instrText xml:space="preserve"> PAGEREF _Toc243610456 \h </w:instrText>
+          <w:instrText xml:space="preserve"> PAGEREF _Toc243615221 \h </w:instrText>
         </w:r>
         <w:r>
           <w:rPr>
@@ -4798,7 +4808,7 @@
           <w14:ligatures w14:val="standardContextual"/>
         </w:rPr>
       </w:pPr>
-      <w:hyperlink w:anchor="_Toc243610457" w:history="1">
+      <w:hyperlink w:anchor="_Toc243615222" w:history="1">
         <w:r>
           <w:rPr>
             <w:rStyle w:val="Hyperlink"/>
@@ -4825,7 +4835,7 @@
             <w:noProof/>
             <w:webHidden/>
           </w:rPr>
-          <w:instrText xml:space="preserve"> PAGEREF _Toc243610457 \h </w:instrText>
+          <w:instrText xml:space="preserve"> PAGEREF _Toc243615222 \h </w:instrText>
         </w:r>
         <w:r>
           <w:rPr>
@@ -4845,7 +4855,7 @@
             <w:noProof/>
             <w:webHidden/>
           </w:rPr>
-          <w:t>38</w:t>
+          <w:t>39</w:t>
         </w:r>
         <w:r>
           <w:rPr>
@@ -4871,7 +4881,7 @@
           <w14:ligatures w14:val="standardContextual"/>
         </w:rPr>
       </w:pPr>
-      <w:hyperlink w:anchor="_Toc243610458" w:history="1">
+      <w:hyperlink w:anchor="_Toc243615223" w:history="1">
         <w:r>
           <w:rPr>
             <w:rStyle w:val="Hyperlink"/>
@@ -4898,7 +4908,7 @@
             <w:noProof/>
             <w:webHidden/>
           </w:rPr>
-          <w:instrText xml:space="preserve"> PAGEREF _Toc243610458 \h </w:instrText>
+          <w:instrText xml:space="preserve"> PAGEREF _Toc243615223 \h </w:instrText>
         </w:r>
         <w:r>
           <w:rPr>
@@ -4918,7 +4928,7 @@
             <w:noProof/>
             <w:webHidden/>
           </w:rPr>
-          <w:t>39</w:t>
+          <w:t>40</w:t>
         </w:r>
         <w:r>
           <w:rPr>
@@ -4944,7 +4954,7 @@
           <w14:ligatures w14:val="standardContextual"/>
         </w:rPr>
       </w:pPr>
-      <w:hyperlink w:anchor="_Toc243610459" w:history="1">
+      <w:hyperlink w:anchor="_Toc243615224" w:history="1">
         <w:r>
           <w:rPr>
             <w:rStyle w:val="Hyperlink"/>
@@ -4971,7 +4981,7 @@
             <w:noProof/>
             <w:webHidden/>
           </w:rPr>
-          <w:instrText xml:space="preserve"> PAGEREF _Toc243610459 \h </w:instrText>
+          <w:instrText xml:space="preserve"> PAGEREF _Toc243615224 \h </w:instrText>
         </w:r>
         <w:r>
           <w:rPr>
@@ -4991,7 +5001,7 @@
             <w:noProof/>
             <w:webHidden/>
           </w:rPr>
-          <w:t>40</w:t>
+          <w:t>41</w:t>
         </w:r>
         <w:r>
           <w:rPr>
@@ -5017,7 +5027,7 @@
           <w14:ligatures w14:val="standardContextual"/>
         </w:rPr>
       </w:pPr>
-      <w:hyperlink w:anchor="_Toc243610460" w:history="1">
+      <w:hyperlink w:anchor="_Toc243615225" w:history="1">
         <w:r>
           <w:rPr>
             <w:rStyle w:val="Hyperlink"/>
@@ -5044,7 +5054,7 @@
             <w:noProof/>
             <w:webHidden/>
           </w:rPr>
-          <w:instrText xml:space="preserve"> PAGEREF _Toc243610460 \h </w:instrText>
+          <w:instrText xml:space="preserve"> PAGEREF _Toc243615225 \h </w:instrText>
         </w:r>
         <w:r>
           <w:rPr>
@@ -5064,7 +5074,7 @@
             <w:noProof/>
             <w:webHidden/>
           </w:rPr>
-          <w:t>41</w:t>
+          <w:t>42</w:t>
         </w:r>
         <w:r>
           <w:rPr>
@@ -5089,8 +5099,9 @@
       <w:pPr>
         <w:pStyle w:val="Heading1"/>
       </w:pPr>
-      <w:bookmarkStart w:id="4" w:name="_Toc243610410"/>
-      <w:r>
+      <w:bookmarkStart w:id="4" w:name="_Toc243615175"/>
+      <w:r>
+        <w:lastRenderedPageBreak/>
         <w:t>DANH MỤC BẢNG</w:t>
       </w:r>
       <w:bookmarkEnd w:id="4"/>
@@ -5105,17 +5116,9 @@
         <w:jc w:val="left"/>
       </w:pPr>
       <w:r>
-        <w:rPr>
-          <w:color w:val="000000"/>
-          <w:sz w:val="24"/>
-        </w:rPr>
         <w:t>Bảng 1.1: Sáu yếu tố cơ sở và tên cột tương ứng qua các năm</w:t>
       </w:r>
       <w:r>
-        <w:rPr>
-          <w:color w:val="000000"/>
-          <w:sz w:val="24"/>
-        </w:rPr>
         <w:tab/>
         <w:t>12</w:t>
       </w:r>
@@ -5130,17 +5133,9 @@
         <w:jc w:val="left"/>
       </w:pPr>
       <w:r>
-        <w:rPr>
-          <w:color w:val="000000"/>
-          <w:sz w:val="24"/>
-        </w:rPr>
         <w:t>Bảng 1.2: Ánh xạ 11 bước pipeline vào báo cáo</w:t>
       </w:r>
       <w:r>
-        <w:rPr>
-          <w:color w:val="000000"/>
-          <w:sz w:val="24"/>
-        </w:rPr>
         <w:tab/>
         <w:t>15</w:t>
       </w:r>
@@ -5155,17 +5150,9 @@
         <w:jc w:val="left"/>
       </w:pPr>
       <w:r>
-        <w:rPr>
-          <w:color w:val="000000"/>
-          <w:sz w:val="24"/>
-        </w:rPr>
         <w:t>Bảng 2.1: Cấu trúc và chất lượng dữ liệu thô theo năm</w:t>
       </w:r>
       <w:r>
-        <w:rPr>
-          <w:color w:val="000000"/>
-          <w:sz w:val="24"/>
-        </w:rPr>
         <w:tab/>
         <w:t>16</w:t>
       </w:r>
@@ -5180,17 +5167,9 @@
         <w:jc w:val="left"/>
       </w:pPr>
       <w:r>
-        <w:rPr>
-          <w:color w:val="000000"/>
-          <w:sz w:val="24"/>
-        </w:rPr>
         <w:t>Bảng 3.1: So sánh năm cấu hình gom cụm lõi (trung bình 2015–2019)</w:t>
       </w:r>
       <w:r>
-        <w:rPr>
-          <w:color w:val="000000"/>
-          <w:sz w:val="24"/>
-        </w:rPr>
         <w:tab/>
         <w:t>21</w:t>
       </w:r>
@@ -5205,17 +5184,9 @@
         <w:jc w:val="left"/>
       </w:pPr>
       <w:r>
-        <w:rPr>
-          <w:color w:val="000000"/>
-          <w:sz w:val="24"/>
-        </w:rPr>
         <w:t>Bảng 3.2: Số tổ hợp tham số DBSCAN đủ điều kiện tính chỉ số, theo năm</w:t>
       </w:r>
       <w:r>
-        <w:rPr>
-          <w:color w:val="000000"/>
-          <w:sz w:val="24"/>
-        </w:rPr>
         <w:tab/>
         <w:t>23</w:t>
       </w:r>
@@ -5230,17 +5201,9 @@
         <w:jc w:val="left"/>
       </w:pPr>
       <w:r>
-        <w:rPr>
-          <w:color w:val="000000"/>
-          <w:sz w:val="24"/>
-        </w:rPr>
         <w:t>Bảng 3.3: Số cụm tối ưu k* và Silhouette cực đại theo năm (K-Means, Z-score)</w:t>
       </w:r>
       <w:r>
-        <w:rPr>
-          <w:color w:val="000000"/>
-          <w:sz w:val="24"/>
-        </w:rPr>
         <w:tab/>
         <w:t>25</w:t>
       </w:r>
@@ -5255,17 +5218,9 @@
         <w:jc w:val="left"/>
       </w:pPr>
       <w:r>
-        <w:rPr>
-          <w:color w:val="000000"/>
-          <w:sz w:val="24"/>
-        </w:rPr>
         <w:t>Bảng 3.4: Chỉ số ARI của các cấu hình dùng Z-score (mười seed, năm năm)</w:t>
       </w:r>
       <w:r>
-        <w:rPr>
-          <w:color w:val="000000"/>
-          <w:sz w:val="24"/>
-        </w:rPr>
         <w:tab/>
         <w:t>26</w:t>
       </w:r>
@@ -5280,17 +5235,9 @@
         <w:jc w:val="left"/>
       </w:pPr>
       <w:r>
-        <w:rPr>
-          <w:color w:val="000000"/>
-          <w:sz w:val="24"/>
-        </w:rPr>
         <w:t>Bảng 4.1: Chỉ số đánh giá của K-Means/Z-score theo năm</w:t>
       </w:r>
       <w:r>
-        <w:rPr>
-          <w:color w:val="000000"/>
-          <w:sz w:val="24"/>
-        </w:rPr>
         <w:tab/>
         <w:t>28</w:t>
       </w:r>
@@ -5305,17 +5252,9 @@
         <w:jc w:val="left"/>
       </w:pPr>
       <w:r>
-        <w:rPr>
-          <w:color w:val="000000"/>
-          <w:sz w:val="24"/>
-        </w:rPr>
         <w:t>Bảng 4.2: Chỉ số đánh giá của Ward/Z-score theo năm</w:t>
       </w:r>
       <w:r>
-        <w:rPr>
-          <w:color w:val="000000"/>
-          <w:sz w:val="24"/>
-        </w:rPr>
         <w:tab/>
         <w:t>28</w:t>
       </w:r>
@@ -5330,17 +5269,9 @@
         <w:jc w:val="left"/>
       </w:pPr>
       <w:r>
-        <w:rPr>
-          <w:color w:val="000000"/>
-          <w:sz w:val="24"/>
-        </w:rPr>
         <w:t>Bảng 4.3: Số lượng quốc gia và điểm hạnh phúc trung bình theo cụm qua năm năm</w:t>
       </w:r>
       <w:r>
-        <w:rPr>
-          <w:color w:val="000000"/>
-          <w:sz w:val="24"/>
-        </w:rPr>
         <w:tab/>
         <w:t>29</w:t>
       </w:r>
@@ -5355,17 +5286,9 @@
         <w:jc w:val="left"/>
       </w:pPr>
       <w:r>
-        <w:rPr>
-          <w:color w:val="000000"/>
-          <w:sz w:val="24"/>
-        </w:rPr>
         <w:t>Bảng 4.4: Phân tích phương sai một nhân tố cho điểm hạnh phúc theo cụm K-Means</w:t>
       </w:r>
       <w:r>
-        <w:rPr>
-          <w:color w:val="000000"/>
-          <w:sz w:val="24"/>
-        </w:rPr>
         <w:tab/>
         <w:t>31</w:t>
       </w:r>
@@ -5380,17 +5303,9 @@
         <w:jc w:val="left"/>
       </w:pPr>
       <w:r>
-        <w:rPr>
-          <w:color w:val="000000"/>
-          <w:sz w:val="24"/>
-        </w:rPr>
         <w:t>Bảng 4.5: Chỉ số của cấu hình đối chứng k = 3 cho hai thuật toán qua năm năm</w:t>
       </w:r>
       <w:r>
-        <w:rPr>
-          <w:color w:val="000000"/>
-          <w:sz w:val="24"/>
-        </w:rPr>
         <w:tab/>
         <w:t>32</w:t>
       </w:r>
@@ -5405,17 +5320,9 @@
         <w:jc w:val="left"/>
       </w:pPr>
       <w:r>
-        <w:rPr>
-          <w:color w:val="000000"/>
-          <w:sz w:val="24"/>
-        </w:rPr>
         <w:t>Bảng 4.6: Kết quả ghép cụm liên năm theo khoảng cách tâm cụm</w:t>
       </w:r>
       <w:r>
-        <w:rPr>
-          <w:color w:val="000000"/>
-          <w:sz w:val="24"/>
-        </w:rPr>
         <w:tab/>
         <w:t>33</w:t>
       </w:r>
@@ -5430,17 +5337,9 @@
         <w:jc w:val="left"/>
       </w:pPr>
       <w:r>
-        <w:rPr>
-          <w:color w:val="000000"/>
-          <w:sz w:val="24"/>
-        </w:rPr>
         <w:t>Bảng 4.7: Phân bố trạng thái dịch chuyển cụm của 156 quốc gia (2015–2019)</w:t>
       </w:r>
       <w:r>
-        <w:rPr>
-          <w:color w:val="000000"/>
-          <w:sz w:val="24"/>
-        </w:rPr>
         <w:tab/>
         <w:t>33</w:t>
       </w:r>
@@ -5455,19 +5354,11 @@
         <w:jc w:val="left"/>
       </w:pPr>
       <w:r>
-        <w:rPr>
-          <w:color w:val="000000"/>
-          <w:sz w:val="24"/>
-        </w:rPr>
         <w:t>Bảng A.1: Khảo sát số cụm k từ 2 đến 9 cho năm 2019</w:t>
       </w:r>
       <w:r>
-        <w:rPr>
-          <w:color w:val="000000"/>
-          <w:sz w:val="24"/>
-        </w:rPr>
         <w:tab/>
-        <w:t>41</w:t>
+        <w:t>42</w:t>
       </w:r>
     </w:p>
     <w:p>
@@ -5480,19 +5371,11 @@
         <w:jc w:val="left"/>
       </w:pPr>
       <w:r>
-        <w:rPr>
-          <w:color w:val="000000"/>
-          <w:sz w:val="24"/>
-        </w:rPr>
         <w:t>Bảng B.1: Kết quả quét tham số DBSCAN cho năm 2019</w:t>
       </w:r>
       <w:r>
-        <w:rPr>
-          <w:color w:val="000000"/>
-          <w:sz w:val="24"/>
-        </w:rPr>
         <w:tab/>
-        <w:t>42</w:t>
+        <w:t>43</w:t>
       </w:r>
     </w:p>
     <w:p>
@@ -5504,8 +5387,9 @@
       <w:pPr>
         <w:pStyle w:val="Heading1"/>
       </w:pPr>
-      <w:bookmarkStart w:id="5" w:name="_Toc243610411"/>
-      <w:r>
+      <w:bookmarkStart w:id="5" w:name="_Toc243615176"/>
+      <w:r>
+        <w:lastRenderedPageBreak/>
         <w:t>DANH MỤC HÌNH ẢNH</w:t>
       </w:r>
       <w:bookmarkEnd w:id="5"/>
@@ -5520,17 +5404,9 @@
         <w:jc w:val="left"/>
       </w:pPr>
       <w:r>
-        <w:rPr>
-          <w:color w:val="000000"/>
-          <w:sz w:val="24"/>
-        </w:rPr>
         <w:t>Hình 2.1: Phân bố sáu yếu tố cơ sở trên toàn bộ 781 bản ghi (Histogram và KDE)</w:t>
       </w:r>
       <w:r>
-        <w:rPr>
-          <w:color w:val="000000"/>
-          <w:sz w:val="24"/>
-        </w:rPr>
         <w:tab/>
         <w:t>18</w:t>
       </w:r>
@@ -5545,17 +5421,9 @@
         <w:jc w:val="left"/>
       </w:pPr>
       <w:r>
-        <w:rPr>
-          <w:color w:val="000000"/>
-          <w:sz w:val="24"/>
-        </w:rPr>
         <w:t>Hình 2.2: Ma trận hệ số tương quan Pearson giữa sáu yếu tố cơ sở và điểm hạnh phúc</w:t>
       </w:r>
       <w:r>
-        <w:rPr>
-          <w:color w:val="000000"/>
-          <w:sz w:val="24"/>
-        </w:rPr>
         <w:tab/>
         <w:t>19</w:t>
       </w:r>
@@ -5570,17 +5438,9 @@
         <w:jc w:val="left"/>
       </w:pPr>
       <w:r>
-        <w:rPr>
-          <w:color w:val="000000"/>
-          <w:sz w:val="24"/>
-        </w:rPr>
         <w:t>Hình 2.3: Biểu đồ hộp nhận diện ngoại lai theo quy tắc 1,5 lần IQR</w:t>
       </w:r>
       <w:r>
-        <w:rPr>
-          <w:color w:val="000000"/>
-          <w:sz w:val="24"/>
-        </w:rPr>
         <w:tab/>
         <w:t>20</w:t>
       </w:r>
@@ -5595,17 +5455,9 @@
         <w:jc w:val="left"/>
       </w:pPr>
       <w:r>
-        <w:rPr>
-          <w:color w:val="000000"/>
-          <w:sz w:val="24"/>
-        </w:rPr>
         <w:t>Hình 3.1: Đường khuỷu tay Inertia và hệ số Silhouette theo số cụm k</w:t>
       </w:r>
       <w:r>
-        <w:rPr>
-          <w:color w:val="000000"/>
-          <w:sz w:val="24"/>
-        </w:rPr>
         <w:tab/>
         <w:t>25</w:t>
       </w:r>
@@ -5620,17 +5472,9 @@
         <w:jc w:val="left"/>
       </w:pPr>
       <w:r>
-        <w:rPr>
-          <w:color w:val="000000"/>
-          <w:sz w:val="24"/>
-        </w:rPr>
         <w:t>Hình 3.2: Khảo sát số cụm k từ 2 đến 9 cho năm 2019 (Inertia và Silhouette)</w:t>
       </w:r>
       <w:r>
-        <w:rPr>
-          <w:color w:val="000000"/>
-          <w:sz w:val="24"/>
-        </w:rPr>
         <w:tab/>
         <w:t>26</w:t>
       </w:r>
@@ -5645,17 +5489,9 @@
         <w:jc w:val="left"/>
       </w:pPr>
       <w:r>
-        <w:rPr>
-          <w:color w:val="000000"/>
-          <w:sz w:val="24"/>
-        </w:rPr>
         <w:t>Hình 4.1: Chân dung radar sáu yếu tố của ba cụm quốc gia (trung bình 2015–2019)</w:t>
       </w:r>
       <w:r>
-        <w:rPr>
-          <w:color w:val="000000"/>
-          <w:sz w:val="24"/>
-        </w:rPr>
         <w:tab/>
         <w:t>30</w:t>
       </w:r>
@@ -5670,17 +5506,9 @@
         <w:jc w:val="left"/>
       </w:pPr>
       <w:r>
-        <w:rPr>
-          <w:color w:val="000000"/>
-          <w:sz w:val="24"/>
-        </w:rPr>
         <w:t>Hình 4.2: Hậu kiểm độc lập, phân bố điểm hạnh phúc thực tế giữa ba cụm qua năm năm</w:t>
       </w:r>
       <w:r>
-        <w:rPr>
-          <w:color w:val="000000"/>
-          <w:sz w:val="24"/>
-        </w:rPr>
         <w:tab/>
         <w:t>31</w:t>
       </w:r>
@@ -5695,17 +5523,9 @@
         <w:jc w:val="left"/>
       </w:pPr>
       <w:r>
-        <w:rPr>
-          <w:color w:val="000000"/>
-          <w:sz w:val="24"/>
-        </w:rPr>
         <w:t>Hình 4.3: Xu hướng số lượng quốc gia trong từng cụm giai đoạn 2015–2019</w:t>
       </w:r>
       <w:r>
-        <w:rPr>
-          <w:color w:val="000000"/>
-          <w:sz w:val="24"/>
-        </w:rPr>
         <w:tab/>
         <w:t>35</w:t>
       </w:r>
@@ -5720,17 +5540,9 @@
         <w:jc w:val="left"/>
       </w:pPr>
       <w:r>
-        <w:rPr>
-          <w:color w:val="000000"/>
-          <w:sz w:val="24"/>
-        </w:rPr>
         <w:t>Hình 4.4: Lưới phân bố ba cụm trên không gian 2D PCA giai đoạn 2015–2019</w:t>
       </w:r>
       <w:r>
-        <w:rPr>
-          <w:color w:val="000000"/>
-          <w:sz w:val="24"/>
-        </w:rPr>
         <w:tab/>
         <w:t>35</w:t>
       </w:r>
@@ -5745,32 +5557,37 @@
         <w:jc w:val="left"/>
       </w:pPr>
       <w:r>
-        <w:rPr>
-          <w:color w:val="000000"/>
-          <w:sz w:val="24"/>
-        </w:rPr>
         <w:t>Hình 4.5: Chân dung radar sáu yếu tố của ba cụm quốc gia năm 2019</w:t>
       </w:r>
       <w:r>
-        <w:rPr>
-          <w:color w:val="000000"/>
-          <w:sz w:val="24"/>
-        </w:rPr>
         <w:tab/>
         <w:t>36</w:t>
       </w:r>
     </w:p>
     <w:p>
-      <w:r>
-        <w:br w:type="page"/>
+      <w:pPr>
+        <w:spacing w:before="40" w:after="40" w:line="276" w:lineRule="auto"/>
+      </w:pPr>
+      <w:r>
+        <w:t>Hình 5.1: Giao diện trực quan bốn phân hệ tương tác của ứng dụng demo Streamlit</w:t>
+      </w:r>
+      <w:r>
+        <w:tab/>
+        <w:t>38</w:t>
       </w:r>
     </w:p>
     <w:p>
+      <w:r>
+        <w:br w:type="page"/>
+      </w:r>
+    </w:p>
+    <w:p>
       <w:pPr>
         <w:pStyle w:val="Heading1"/>
       </w:pPr>
-      <w:bookmarkStart w:id="6" w:name="_Toc243610412"/>
-      <w:r>
+      <w:bookmarkStart w:id="6" w:name="_Toc243615177"/>
+      <w:r>
+        <w:lastRenderedPageBreak/>
         <w:t>CHƯƠNG 1: TỔNG QUAN ĐỀ TÀI VÀ CƠ SỞ LÝ THUYẾT</w:t>
       </w:r>
       <w:bookmarkEnd w:id="6"/>
@@ -5779,7 +5596,7 @@
       <w:pPr>
         <w:pStyle w:val="Heading2"/>
       </w:pPr>
-      <w:bookmarkStart w:id="7" w:name="_Toc243610413"/>
+      <w:bookmarkStart w:id="7" w:name="_Toc243615178"/>
       <w:r>
         <w:t>1.1. Bối cảnh và lý do chọn đề tài</w:t>
       </w:r>
@@ -5819,7 +5636,7 @@
       <w:pPr>
         <w:pStyle w:val="Heading2"/>
       </w:pPr>
-      <w:bookmarkStart w:id="8" w:name="_Toc243610414"/>
+      <w:bookmarkStart w:id="8" w:name="_Toc243615179"/>
       <w:r>
         <w:t>1.2. Bài toán và câu hỏi nghiên cứu</w:t>
       </w:r>
@@ -5880,6 +5697,7 @@
         <w:rPr>
           <w:b/>
         </w:rPr>
+        <w:lastRenderedPageBreak/>
         <w:t xml:space="preserve">3. </w:t>
       </w:r>
       <w:r>
@@ -5905,7 +5723,7 @@
       <w:pPr>
         <w:pStyle w:val="Heading2"/>
       </w:pPr>
-      <w:bookmarkStart w:id="9" w:name="_Toc243610415"/>
+      <w:bookmarkStart w:id="9" w:name="_Toc243615180"/>
       <w:r>
         <w:t>1.3. Nguồn dữ liệu</w:t>
       </w:r>
@@ -5928,7 +5746,7 @@
       <w:pPr>
         <w:pStyle w:val="Heading2"/>
       </w:pPr>
-      <w:bookmarkStart w:id="10" w:name="_Toc243610416"/>
+      <w:bookmarkStart w:id="10" w:name="_Toc243615181"/>
       <w:r>
         <w:t>1.4. Thang đo Cantril Ladder</w:t>
       </w:r>
@@ -5954,7 +5772,7 @@
       <w:pPr>
         <w:pStyle w:val="Heading2"/>
       </w:pPr>
-      <w:bookmarkStart w:id="11" w:name="_Toc243610417"/>
+      <w:bookmarkStart w:id="11" w:name="_Toc243615182"/>
       <w:r>
         <w:t>1.5. Mô hình Dystopia và Dystopia Residual</w:t>
       </w:r>
@@ -5973,6 +5791,7 @@
         <w:ind w:firstLine="720"/>
       </w:pPr>
       <w:r>
+        <w:lastRenderedPageBreak/>
         <w:t>Trong dữ liệu, ba năm 2015–2017 có sẵn cột Dystopia Residual</w:t>
       </w:r>
       <w:r>
@@ -5986,7 +5805,7 @@
       <w:pPr>
         <w:pStyle w:val="Heading2"/>
       </w:pPr>
-      <w:bookmarkStart w:id="12" w:name="_Toc243610418"/>
+      <w:bookmarkStart w:id="12" w:name="_Toc243615183"/>
       <w:r>
         <w:t>1.6. Sáu biến cơ sở</w:t>
       </w:r>
@@ -6415,6 +6234,7 @@
                 <w:color w:val="000000"/>
                 <w:sz w:val="22"/>
               </w:rPr>
+              <w:lastRenderedPageBreak/>
               <w:t>freedom</w:t>
             </w:r>
           </w:p>
@@ -6706,7 +6526,7 @@
       <w:pPr>
         <w:pStyle w:val="Heading2"/>
       </w:pPr>
-      <w:bookmarkStart w:id="13" w:name="_Toc243610419"/>
+      <w:bookmarkStart w:id="13" w:name="_Toc243615184"/>
       <w:r>
         <w:t>1.7. Quy tắc vàng của đề tài</w:t>
       </w:r>
@@ -6731,7 +6551,11 @@
         <w:ind w:firstLine="720"/>
       </w:pPr>
       <w:r>
-        <w:t>Có hai căn cứ. Thứ nhất, về mặt đại số, điểm hạnh phúc bằng tổng sáu yếu tố cộng phần dư Dystopia, nên nếu đưa vào X thì cụm sẽ bị chi phối bởi chính biến cần giải thích. Thứ hai, về mặt phương pháp, nếu dùng điểm hạnh phúc để gom cụm thì bước đối chiếu mất tính độc lập và không còn chứng minh được điều gì.</w:t>
+        <w:t xml:space="preserve">Có hai căn cứ. Thứ nhất, về mặt đại số, điểm hạnh phúc bằng tổng sáu yếu tố cộng phần dư Dystopia, nên nếu đưa vào X thì cụm sẽ bị chi phối bởi chính biến cần giải thích. </w:t>
+      </w:r>
+      <w:r>
+        <w:lastRenderedPageBreak/>
+        <w:t>Thứ hai, về mặt phương pháp, nếu dùng điểm hạnh phúc để gom cụm thì bước đối chiếu mất tính độc lập và không còn chứng minh được điều gì.</w:t>
       </w:r>
     </w:p>
     <w:p>
@@ -6769,8 +6593,9 @@
       <w:pPr>
         <w:pStyle w:val="Heading2"/>
       </w:pPr>
-      <w:bookmarkStart w:id="14" w:name="_Toc243610420"/>
-      <w:r>
+      <w:bookmarkStart w:id="14" w:name="_Toc243615185"/>
+      <w:r>
+        <w:lastRenderedPageBreak/>
         <w:t>1.8. Đối chiếu 11 bước pipeline với cấu trúc báo cáo</w:t>
       </w:r>
       <w:bookmarkEnd w:id="14"/>
@@ -7711,8 +7536,9 @@
       <w:pPr>
         <w:pStyle w:val="Heading1"/>
       </w:pPr>
-      <w:bookmarkStart w:id="15" w:name="_Toc243610421"/>
-      <w:r>
+      <w:bookmarkStart w:id="15" w:name="_Toc243615186"/>
+      <w:r>
+        <w:lastRenderedPageBreak/>
         <w:t>CHƯƠNG 2: THU THẬP DỮ LIỆU VÀ KHÁM PHÁ EDA</w:t>
       </w:r>
       <w:bookmarkEnd w:id="15"/>
@@ -7721,7 +7547,7 @@
       <w:pPr>
         <w:pStyle w:val="Heading2"/>
       </w:pPr>
-      <w:bookmarkStart w:id="16" w:name="_Toc243610422"/>
+      <w:bookmarkStart w:id="16" w:name="_Toc243615187"/>
       <w:r>
         <w:t xml:space="preserve">2.1. </w:t>
       </w:r>
@@ -8343,7 +8169,7 @@
       <w:pPr>
         <w:pStyle w:val="Heading2"/>
       </w:pPr>
-      <w:bookmarkStart w:id="17" w:name="_Toc243610423"/>
+      <w:bookmarkStart w:id="17" w:name="_Toc243615188"/>
       <w:r>
         <w:t>2.2. Đồng nhất tên cột</w:t>
       </w:r>
@@ -8374,6 +8200,7 @@
         <w:ind w:firstLine="720"/>
       </w:pPr>
       <w:r>
+        <w:lastRenderedPageBreak/>
         <w:t>Ba cột sai số khảo sát (Standard Error, Lower/Upper Confidence Interval, Whisker.high, Whisker.low) bị loại. Lý do: đây là sai số chọn mẫu và khoảng tin cậy của cuộc khảo sát, không phản ánh mức sống của quốc gia</w:t>
       </w:r>
       <w:r>
@@ -8387,7 +8214,7 @@
       <w:pPr>
         <w:pStyle w:val="Heading2"/>
       </w:pPr>
-      <w:bookmarkStart w:id="18" w:name="_Toc243610424"/>
+      <w:bookmarkStart w:id="18" w:name="_Toc243615189"/>
       <w:r>
         <w:t>2.3. Xử lý giá trị khuyết của UAE năm 2018</w:t>
       </w:r>
@@ -8413,7 +8240,7 @@
       <w:pPr>
         <w:pStyle w:val="Heading2"/>
       </w:pPr>
-      <w:bookmarkStart w:id="19" w:name="_Toc243610425"/>
+      <w:bookmarkStart w:id="19" w:name="_Toc243615190"/>
       <w:r>
         <w:t>2.4. Chuẩn hóa tên quốc gia và bổ sung mã ISO-3</w:t>
       </w:r>
@@ -8445,8 +8272,9 @@
       <w:pPr>
         <w:pStyle w:val="Heading2"/>
       </w:pPr>
-      <w:bookmarkStart w:id="20" w:name="_Toc243610426"/>
-      <w:r>
+      <w:bookmarkStart w:id="20" w:name="_Toc243615191"/>
+      <w:r>
+        <w:lastRenderedPageBreak/>
         <w:t>2.5. Bảng dữ liệu trung gian</w:t>
       </w:r>
       <w:bookmarkEnd w:id="20"/>
@@ -8469,7 +8297,7 @@
       <w:pPr>
         <w:pStyle w:val="Heading2"/>
       </w:pPr>
-      <w:bookmarkStart w:id="21" w:name="_Toc243610427"/>
+      <w:bookmarkStart w:id="21" w:name="_Toc243615192"/>
       <w:r>
         <w:t>2.6. Phân tích hình dạng phân phối</w:t>
       </w:r>
@@ -8566,14 +8394,18 @@
         <w:t>,</w:t>
       </w:r>
       <w:r>
-        <w:t xml:space="preserve"> tự do −0,524. Phân phối lệch phải của corruption_perception cho thấy đa số quốc gia có điểm thấp, chỉ một nhóm nhỏ đạt điểm cao.</w:t>
+        <w:t xml:space="preserve"> tự do −0,524. Phân phối lệch </w:t>
+      </w:r>
+      <w:r>
+        <w:lastRenderedPageBreak/>
+        <w:t>phải của corruption_perception cho thấy đa số quốc gia có điểm thấp, chỉ một nhóm nhỏ đạt điểm cao.</w:t>
       </w:r>
     </w:p>
     <w:p>
       <w:pPr>
         <w:pStyle w:val="Heading2"/>
       </w:pPr>
-      <w:bookmarkStart w:id="22" w:name="_Toc243610428"/>
+      <w:bookmarkStart w:id="22" w:name="_Toc243615193"/>
       <w:r>
         <w:t>2.7. Tương quan Pearson</w:t>
       </w:r>
@@ -8651,8 +8483,9 @@
       <w:pPr>
         <w:pStyle w:val="Heading2"/>
       </w:pPr>
-      <w:bookmarkStart w:id="23" w:name="_Toc243610429"/>
-      <w:r>
+      <w:bookmarkStart w:id="23" w:name="_Toc243615194"/>
+      <w:r>
+        <w:lastRenderedPageBreak/>
         <w:t>2.8. Nhận diện ngoại lai</w:t>
       </w:r>
       <w:bookmarkEnd w:id="23"/>
@@ -8743,7 +8576,7 @@
       <w:pPr>
         <w:pStyle w:val="Heading2"/>
       </w:pPr>
-      <w:bookmarkStart w:id="24" w:name="_Toc243610430"/>
+      <w:bookmarkStart w:id="24" w:name="_Toc243615195"/>
       <w:r>
         <w:t>2.9. Kết luận</w:t>
       </w:r>
@@ -8761,8 +8594,9 @@
       <w:pPr>
         <w:pStyle w:val="Heading1"/>
       </w:pPr>
-      <w:bookmarkStart w:id="25" w:name="_Toc243610431"/>
-      <w:r>
+      <w:bookmarkStart w:id="25" w:name="_Toc243615196"/>
+      <w:r>
+        <w:lastRenderedPageBreak/>
         <w:t>CHƯƠNG 3: PHƯƠNG PHÁP LUẬN VÀ THỬ NGHIỆM MÔ HÌNH</w:t>
       </w:r>
       <w:bookmarkEnd w:id="25"/>
@@ -8771,7 +8605,7 @@
       <w:pPr>
         <w:pStyle w:val="Heading2"/>
       </w:pPr>
-      <w:bookmarkStart w:id="26" w:name="_Toc243610432"/>
+      <w:bookmarkStart w:id="26" w:name="_Toc243615197"/>
       <w:r>
         <w:t>3.1. Ma trận đặc trưng</w:t>
       </w:r>
@@ -8789,7 +8623,7 @@
       <w:pPr>
         <w:pStyle w:val="Heading2"/>
       </w:pPr>
-      <w:bookmarkStart w:id="27" w:name="_Toc243610433"/>
+      <w:bookmarkStart w:id="27" w:name="_Toc243615198"/>
       <w:r>
         <w:t>3.2. So sánh ba phương án chuẩn hóa</w:t>
       </w:r>
@@ -9781,6 +9615,7 @@
         <w:ind w:firstLine="720"/>
       </w:pPr>
       <w:r>
+        <w:lastRenderedPageBreak/>
         <w:t>Silhouette của Min-Max (0,3288) nhỉnh hơn Raw (0,3234) và Z-score (0,3180), nhưng chênh lệch chỉ khoảng 0,01. Cột Inertia không so sánh trực tiếp được giữa các phương án chuẩn hóa vì phụ thuộc thang đo. Nhóm chọn Z-score làm cấu hình chính vì lý do diễn giải: Z-score đưa sáu trụ cột về cùng đơn vị độ lệch chuẩn, giữ được cấu trúc tương quan giữa các biến, và ổn định qua các lần khởi tạo với ARI trung bình 0,9904. Kết quả của cả ba phương án vẫn được báo cáo đầy đủ để bảo đảm tính khách quan của thực nghiệm.</w:t>
       </w:r>
     </w:p>
@@ -9788,7 +9623,7 @@
       <w:pPr>
         <w:pStyle w:val="Heading2"/>
       </w:pPr>
-      <w:bookmarkStart w:id="28" w:name="_Toc243610434"/>
+      <w:bookmarkStart w:id="28" w:name="_Toc243615199"/>
       <w:r>
         <w:t>3.3. Thuật toán K-Means cài đặt từ đầu</w:t>
       </w:r>
@@ -9972,7 +9807,7 @@
       <w:pPr>
         <w:pStyle w:val="Heading2"/>
       </w:pPr>
-      <w:bookmarkStart w:id="29" w:name="_Toc243610435"/>
+      <w:bookmarkStart w:id="29" w:name="_Toc243615200"/>
       <w:r>
         <w:t>3.4. Phân cấp Ward cài đặt từ đầu</w:t>
       </w:r>
@@ -10254,6 +10089,7 @@
               <w:sz w:val="24"/>
               <w:szCs w:val="24"/>
             </w:rPr>
+            <w:lastRenderedPageBreak/>
             <m:t>d</m:t>
           </m:r>
           <m:d>
@@ -10952,7 +10788,7 @@
       <w:pPr>
         <w:pStyle w:val="Heading2"/>
       </w:pPr>
-      <w:bookmarkStart w:id="30" w:name="_Toc243610436"/>
+      <w:bookmarkStart w:id="30" w:name="_Toc243615201"/>
       <w:r>
         <w:t>3.5. DBSCAN cài đặt từ đầu</w:t>
       </w:r>
@@ -11508,14 +11344,18 @@
         <w:t>,</w:t>
       </w:r>
       <w:r>
-        <w:t xml:space="preserve"> Silhouette đạt 0,2976 năm 2015 nhưng bằng 0 ở 2016 và 2017, âm ở 2019. Nguyên nhân là sáu đặc trưng sau chuẩn hóa có mật độ khá đồng đều, không tồn tại vùng dày đặc trưng để tách cụm. Nhóm giữ DBSCAN như phương án đối chứng để chứng minh dữ liệu quốc gia phù hợp hơn với phương pháp dựa trên khoảng cách.</w:t>
+        <w:t xml:space="preserve"> Silhouette đạt 0,2976 năm 2015 nhưng bằng 0 ở 2016 và 2017, âm ở 2019. Nguyên nhân là sáu đặc trưng sau chuẩn hóa có mật độ khá đồng đều, không tồn tại vùng dày đặc trưng để tách cụm. Nhóm giữ DBSCAN như phương án </w:t>
+      </w:r>
+      <w:r>
+        <w:lastRenderedPageBreak/>
+        <w:t>đối chứng để chứng minh dữ liệu quốc gia phù hợp hơn với phương pháp dựa trên khoảng cách.</w:t>
       </w:r>
     </w:p>
     <w:p>
       <w:pPr>
         <w:pStyle w:val="Heading2"/>
       </w:pPr>
-      <w:bookmarkStart w:id="31" w:name="_Toc243610437"/>
+      <w:bookmarkStart w:id="31" w:name="_Toc243615202"/>
       <w:r>
         <w:t>3.6. Các độ đo đánh giá</w:t>
       </w:r>
@@ -11806,7 +11646,7 @@
       <w:pPr>
         <w:pStyle w:val="Heading2"/>
       </w:pPr>
-      <w:bookmarkStart w:id="32" w:name="_Toc243610438"/>
+      <w:bookmarkStart w:id="32" w:name="_Toc243615203"/>
       <w:r>
         <w:t>3.7. Khảo sát số cụm tối ưu</w:t>
       </w:r>
@@ -11835,6 +11675,7 @@
         <w:rPr>
           <w:noProof/>
         </w:rPr>
+        <w:lastRenderedPageBreak/>
         <w:drawing>
           <wp:inline distT="0" distB="0" distL="0" distR="0" wp14:anchorId="26EE8A08" wp14:editId="28321B31">
             <wp:extent cx="5577840" cy="1970302"/>
@@ -12424,6 +12265,7 @@
         <w:rPr>
           <w:noProof/>
         </w:rPr>
+        <w:lastRenderedPageBreak/>
         <w:drawing>
           <wp:inline distT="0" distB="0" distL="0" distR="0" wp14:anchorId="2549E8D1" wp14:editId="1F754E61">
             <wp:extent cx="4937760" cy="2821577"/>
@@ -12479,7 +12321,7 @@
       <w:pPr>
         <w:pStyle w:val="Heading2"/>
       </w:pPr>
-      <w:bookmarkStart w:id="33" w:name="_Toc243610439"/>
+      <w:bookmarkStart w:id="33" w:name="_Toc243615204"/>
       <w:r>
         <w:t>3.8. Kiểm tra độ ổn định</w:t>
       </w:r>
@@ -13841,6 +13683,7 @@
                 <w:color w:val="000000"/>
                 <w:sz w:val="22"/>
               </w:rPr>
+              <w:lastRenderedPageBreak/>
               <w:t>2018</w:t>
             </w:r>
           </w:p>
@@ -14276,7 +14119,7 @@
       <w:pPr>
         <w:pStyle w:val="Heading2"/>
       </w:pPr>
-      <w:bookmarkStart w:id="34" w:name="_Toc243610440"/>
+      <w:bookmarkStart w:id="34" w:name="_Toc243615205"/>
       <w:r>
         <w:t>3.9. Quy trình thực nghiệm</w:t>
       </w:r>
@@ -14324,8 +14167,9 @@
       <w:pPr>
         <w:pStyle w:val="Heading1"/>
       </w:pPr>
-      <w:bookmarkStart w:id="35" w:name="_Toc243610441"/>
-      <w:r>
+      <w:bookmarkStart w:id="35" w:name="_Toc243615206"/>
+      <w:r>
+        <w:lastRenderedPageBreak/>
         <w:t>CHƯƠNG 4: KẾT QUẢ THỰC NGHIỆM VÀ DIỄN GIẢI TRI THỨC</w:t>
       </w:r>
       <w:bookmarkEnd w:id="35"/>
@@ -14334,7 +14178,7 @@
       <w:pPr>
         <w:pStyle w:val="Heading2"/>
       </w:pPr>
-      <w:bookmarkStart w:id="36" w:name="_Toc243610442"/>
+      <w:bookmarkStart w:id="36" w:name="_Toc243615207"/>
       <w:r>
         <w:t>4.1. Chỉ số đánh giá của K-Means qua các năm</w:t>
       </w:r>
@@ -15085,7 +14929,7 @@
       <w:pPr>
         <w:pStyle w:val="Heading2"/>
       </w:pPr>
-      <w:bookmarkStart w:id="37" w:name="_Toc243610443"/>
+      <w:bookmarkStart w:id="37" w:name="_Toc243615208"/>
       <w:r>
         <w:t>4.2. Chỉ số đánh giá của Ward và so sánh với K-Means</w:t>
       </w:r>
@@ -15809,8 +15653,9 @@
       <w:pPr>
         <w:pStyle w:val="Heading2"/>
       </w:pPr>
-      <w:bookmarkStart w:id="38" w:name="_Toc243610444"/>
-      <w:r>
+      <w:bookmarkStart w:id="38" w:name="_Toc243615209"/>
+      <w:r>
+        <w:lastRenderedPageBreak/>
         <w:t>4.3. Chân dung ba cụm</w:t>
       </w:r>
       <w:bookmarkEnd w:id="38"/>
@@ -17178,6 +17023,7 @@
         <w:spacing w:before="40" w:line="312" w:lineRule="auto"/>
       </w:pPr>
       <w:r>
+        <w:lastRenderedPageBreak/>
         <w:t xml:space="preserve">Cụm 3 </w:t>
       </w:r>
       <w:r>
@@ -17265,7 +17111,7 @@
       <w:pPr>
         <w:pStyle w:val="Heading2"/>
       </w:pPr>
-      <w:bookmarkStart w:id="39" w:name="_Toc243610445"/>
+      <w:bookmarkStart w:id="39" w:name="_Toc243615210"/>
       <w:r>
         <w:t>4.4. Hậu kiểm độc lập bằng điểm hạnh phúc</w:t>
       </w:r>
@@ -17289,6 +17135,7 @@
             <w:rPr>
               <w:rFonts w:ascii="Cambria Math" w:hAnsi="Cambria Math"/>
             </w:rPr>
+            <w:lastRenderedPageBreak/>
             <m:t>F=</m:t>
           </m:r>
           <m:f>
@@ -18074,6 +17921,7 @@
         <w:ind w:firstLine="720"/>
       </w:pPr>
       <w:r>
+        <w:lastRenderedPageBreak/>
         <w:t>Kết quả này là căn cứ để nhóm kết luận các cụm hình thành từ sáu yếu tố khách quan vẫn phản ánh đúng mức sống thực tế, dù không dùng điểm hạnh phúc trong quá trình gom cụm.</w:t>
       </w:r>
     </w:p>
@@ -18081,7 +17929,7 @@
       <w:pPr>
         <w:pStyle w:val="Heading2"/>
       </w:pPr>
-      <w:bookmarkStart w:id="40" w:name="_Toc243610446"/>
+      <w:bookmarkStart w:id="40" w:name="_Toc243615211"/>
       <w:r>
         <w:t>4.5. Cấu hình đối chứng k = 3</w:t>
       </w:r>
@@ -19557,7 +19405,7 @@
       <w:pPr>
         <w:pStyle w:val="Heading2"/>
       </w:pPr>
-      <w:bookmarkStart w:id="41" w:name="_Toc243610447"/>
+      <w:bookmarkStart w:id="41" w:name="_Toc243615212"/>
       <w:r>
         <w:t>4.6. Ghép cụm liên năm</w:t>
       </w:r>
@@ -19598,7 +19446,11 @@
         </m:sSup>
       </m:oMath>
       <w:r>
-        <w:t xml:space="preserve"> thì xét thêm chênh lệch điểm hạnh phúc trung bình</w:t>
+        <w:t xml:space="preserve"> thì xét </w:t>
+      </w:r>
+      <w:r>
+        <w:lastRenderedPageBreak/>
+        <w:t>thêm chênh lệch điểm hạnh phúc trung bình</w:t>
       </w:r>
       <w:r>
         <w:t>,</w:t>
@@ -21095,7 +20947,7 @@
       <w:pPr>
         <w:pStyle w:val="Heading2"/>
       </w:pPr>
-      <w:bookmarkStart w:id="42" w:name="_Toc243610448"/>
+      <w:bookmarkStart w:id="42" w:name="_Toc243615213"/>
       <w:r>
         <w:t>4.7. Dịch chuyển cụm của 156 quốc gia</w:t>
       </w:r>
@@ -21302,6 +21154,7 @@
                 <w:color w:val="000000"/>
                 <w:sz w:val="22"/>
               </w:rPr>
+              <w:lastRenderedPageBreak/>
               <w:t>Biến động trung gian</w:t>
             </w:r>
           </w:p>
@@ -21624,6 +21477,7 @@
         <w:rPr>
           <w:noProof/>
         </w:rPr>
+        <w:lastRenderedPageBreak/>
         <w:drawing>
           <wp:inline distT="0" distB="0" distL="0" distR="0" wp14:anchorId="6E8F5ACB" wp14:editId="0C9B139D">
             <wp:extent cx="5486400" cy="2957232"/>
@@ -21679,7 +21533,7 @@
       <w:pPr>
         <w:pStyle w:val="Heading2"/>
       </w:pPr>
-      <w:bookmarkStart w:id="43" w:name="_Toc243610449"/>
+      <w:bookmarkStart w:id="43" w:name="_Toc243615214"/>
       <w:r>
         <w:t>4.8. Phân bố cụm trên không gian PCA 2D</w:t>
       </w:r>
@@ -21768,6 +21622,7 @@
         <w:rPr>
           <w:noProof/>
         </w:rPr>
+        <w:lastRenderedPageBreak/>
         <w:drawing>
           <wp:inline distT="0" distB="0" distL="0" distR="0" wp14:anchorId="7F06D740" wp14:editId="447CBE5E">
             <wp:extent cx="3840480" cy="2199548"/>
@@ -21823,7 +21678,7 @@
       <w:pPr>
         <w:pStyle w:val="Heading2"/>
       </w:pPr>
-      <w:bookmarkStart w:id="44" w:name="_Toc243610450"/>
+      <w:bookmarkStart w:id="44" w:name="_Toc243615215"/>
       <w:r>
         <w:t>4.9. Kết luận chương 4</w:t>
       </w:r>
@@ -21859,8 +21714,9 @@
       <w:pPr>
         <w:pStyle w:val="Heading1"/>
       </w:pPr>
-      <w:bookmarkStart w:id="45" w:name="_Toc243610451"/>
-      <w:r>
+      <w:bookmarkStart w:id="45" w:name="_Toc243615216"/>
+      <w:r>
+        <w:lastRenderedPageBreak/>
         <w:t>CHƯƠNG 5: ỨNG DỤNG DEMO, KẾT LUẬN VÀ HƯỚNG PHÁT TRIỂN</w:t>
       </w:r>
       <w:bookmarkEnd w:id="45"/>
@@ -21869,7 +21725,7 @@
       <w:pPr>
         <w:pStyle w:val="Heading2"/>
       </w:pPr>
-      <w:bookmarkStart w:id="46" w:name="_Toc243610452"/>
+      <w:bookmarkStart w:id="46" w:name="_Toc243615217"/>
       <w:r>
         <w:t>5.1. Kiến trúc ứng dụng demo Streamlit</w:t>
       </w:r>
@@ -21949,9 +21805,69 @@
     </w:p>
     <w:p>
       <w:pPr>
+        <w:spacing w:before="120"/>
+        <w:jc w:val="center"/>
+      </w:pPr>
+      <w:r>
+        <w:rPr>
+          <w:noProof/>
+        </w:rPr>
+        <w:lastRenderedPageBreak/>
+        <w:drawing>
+          <wp:inline distT="0" distB="0" distL="0" distR="0" wp14:anchorId="6EE342D6" wp14:editId="1F87ECED">
+            <wp:extent cx="5580000" cy="3666525"/>
+            <wp:effectExtent l="0" t="0" r="0" b="0"/>
+            <wp:docPr id="11" name="Picture 11"/>
+            <wp:cNvGraphicFramePr>
+              <a:graphicFrameLocks xmlns:a="http://schemas.openxmlformats.org/drawingml/2006/main" noChangeAspect="1"/>
+            </wp:cNvGraphicFramePr>
+            <a:graphic xmlns:a="http://schemas.openxmlformats.org/drawingml/2006/main">
+              <a:graphicData uri="http://schemas.openxmlformats.org/drawingml/2006/picture">
+                <pic:pic xmlns:pic="http://schemas.openxmlformats.org/drawingml/2006/picture">
+                  <pic:nvPicPr>
+                    <pic:cNvPr id="0" name="demo_app_overview.png"/>
+                    <pic:cNvPicPr/>
+                  </pic:nvPicPr>
+                  <pic:blipFill>
+                    <a:blip r:embed="rId19"/>
+                    <a:stretch>
+                      <a:fillRect/>
+                    </a:stretch>
+                  </pic:blipFill>
+                  <pic:spPr>
+                    <a:xfrm>
+                      <a:off x="0" y="0"/>
+                      <a:ext cx="5580000" cy="3666525"/>
+                    </a:xfrm>
+                    <a:prstGeom prst="rect">
+                      <a:avLst/>
+                    </a:prstGeom>
+                  </pic:spPr>
+                </pic:pic>
+              </a:graphicData>
+            </a:graphic>
+          </wp:inline>
+        </w:drawing>
+      </w:r>
+    </w:p>
+    <w:p>
+      <w:pPr>
+        <w:spacing w:before="40" w:after="240"/>
+        <w:jc w:val="center"/>
+      </w:pPr>
+      <w:r>
+        <w:rPr>
+          <w:i/>
+          <w:sz w:val="22"/>
+        </w:rPr>
+        <w:t>Hình 5.1: Giao diện trực quan bốn phân hệ tương tác của ứng dụng demo Streamlit</w:t>
+      </w:r>
+    </w:p>
+    <w:p>
+      <w:pPr>
         <w:pStyle w:val="Heading2"/>
       </w:pPr>
-      <w:bookmarkStart w:id="47" w:name="_Toc243610453"/>
+      <w:bookmarkStart w:id="47" w:name="_Toc243615218"/>
       <w:r>
         <w:t>5.2. Kiểm thử ứng dụng</w:t>
       </w:r>
@@ -21975,7 +21891,7 @@
       <w:pPr>
         <w:pStyle w:val="Heading2"/>
       </w:pPr>
-      <w:bookmarkStart w:id="48" w:name="_Toc243610454"/>
+      <w:bookmarkStart w:id="48" w:name="_Toc243615219"/>
       <w:r>
         <w:t>5.3. Đóng góp chính của đồ án</w:t>
       </w:r>
@@ -22023,6 +21939,7 @@
         <w:spacing w:before="40" w:line="312" w:lineRule="auto"/>
       </w:pPr>
       <w:r>
+        <w:lastRenderedPageBreak/>
         <w:t>Thực nghiệm năm cấu hình nhân năm năm, khảo sát số cụm, quét tham số DBSCAN và kiểm tra độ ổn định qua mười seed</w:t>
       </w:r>
       <w:r>
@@ -22062,7 +21979,7 @@
       <w:pPr>
         <w:pStyle w:val="Heading2"/>
       </w:pPr>
-      <w:bookmarkStart w:id="49" w:name="_Toc243610455"/>
+      <w:bookmarkStart w:id="49" w:name="_Toc243615220"/>
       <w:r>
         <w:t>5.4. Hạn chế</w:t>
       </w:r>
@@ -22102,7 +22019,7 @@
       <w:pPr>
         <w:pStyle w:val="Heading2"/>
       </w:pPr>
-      <w:bookmarkStart w:id="50" w:name="_Toc243610456"/>
+      <w:bookmarkStart w:id="50" w:name="_Toc243615221"/>
       <w:r>
         <w:t>5.5. Hướng phát triển</w:t>
       </w:r>
@@ -22170,6 +22087,7 @@
         <w:spacing w:before="40" w:line="312" w:lineRule="auto"/>
       </w:pPr>
       <w:r>
+        <w:lastRenderedPageBreak/>
         <w:t>Đưa demo lên dashboard công khai</w:t>
       </w:r>
     </w:p>
@@ -22177,7 +22095,7 @@
       <w:pPr>
         <w:pStyle w:val="Heading2"/>
       </w:pPr>
-      <w:bookmarkStart w:id="51" w:name="_Toc243610457"/>
+      <w:bookmarkStart w:id="51" w:name="_Toc243615222"/>
       <w:r>
         <w:t>5.6. Kết luận</w:t>
       </w:r>
@@ -22201,8 +22119,9 @@
       <w:pPr>
         <w:pStyle w:val="Heading1"/>
       </w:pPr>
-      <w:bookmarkStart w:id="52" w:name="_Toc243610458"/>
-      <w:r>
+      <w:bookmarkStart w:id="52" w:name="_Toc243615223"/>
+      <w:r>
+        <w:lastRenderedPageBreak/>
         <w:t>TÀI LIỆU THAM KHẢO</w:t>
       </w:r>
       <w:bookmarkEnd w:id="52"/>
@@ -22220,7 +22139,7 @@
           <w:color w:val="000000" w:themeColor="text1"/>
         </w:rPr>
       </w:pPr>
-      <w:hyperlink r:id="rId19" w:history="1">
+      <w:hyperlink r:id="rId20" w:history="1">
         <w:r>
           <w:rPr>
             <w:rStyle w:val="Hyperlink"/>
@@ -22244,7 +22163,7 @@
           <w:color w:val="000000" w:themeColor="text1"/>
         </w:rPr>
       </w:pPr>
-      <w:hyperlink r:id="rId20" w:history="1">
+      <w:hyperlink r:id="rId21" w:history="1">
         <w:r>
           <w:rPr>
             <w:rStyle w:val="Hyperlink"/>
@@ -22300,7 +22219,7 @@
           <w:color w:val="000000" w:themeColor="text1"/>
         </w:rPr>
       </w:pPr>
-      <w:hyperlink r:id="rId21" w:history="1">
+      <w:hyperlink r:id="rId22" w:history="1">
         <w:r>
           <w:rPr>
             <w:rStyle w:val="Hyperlink"/>
@@ -22356,7 +22275,7 @@
           <w:color w:val="000000" w:themeColor="text1"/>
         </w:rPr>
       </w:pPr>
-      <w:hyperlink r:id="rId22" w:history="1">
+      <w:hyperlink r:id="rId23" w:history="1">
         <w:r>
           <w:rPr>
             <w:rStyle w:val="Hyperlink"/>
@@ -22412,7 +22331,7 @@
           <w:color w:val="000000" w:themeColor="text1"/>
         </w:rPr>
       </w:pPr>
-      <w:hyperlink r:id="rId23" w:history="1">
+      <w:hyperlink r:id="rId24" w:history="1">
         <w:r>
           <w:rPr>
             <w:rStyle w:val="Hyperlink"/>
@@ -22468,7 +22387,7 @@
           <w:color w:val="000000" w:themeColor="text1"/>
         </w:rPr>
       </w:pPr>
-      <w:hyperlink r:id="rId24" w:history="1">
+      <w:hyperlink r:id="rId25" w:history="1">
         <w:r>
           <w:rPr>
             <w:rStyle w:val="Hyperlink"/>
@@ -22615,8 +22534,9 @@
       <w:pPr>
         <w:pStyle w:val="Heading1"/>
       </w:pPr>
-      <w:bookmarkStart w:id="53" w:name="_Toc243610459"/>
-      <w:r>
+      <w:bookmarkStart w:id="53" w:name="_Toc243615224"/>
+      <w:r>
+        <w:lastRenderedPageBreak/>
         <w:t>PHỤ LỤC A: BẢNG KHẢO SÁT SỐ CỤM NĂM 2019</w:t>
       </w:r>
       <w:bookmarkEnd w:id="53"/>
@@ -23327,8 +23247,9 @@
       <w:pPr>
         <w:pStyle w:val="Heading1"/>
       </w:pPr>
-      <w:bookmarkStart w:id="54" w:name="_Toc243610460"/>
-      <w:r>
+      <w:bookmarkStart w:id="54" w:name="_Toc243615225"/>
+      <w:r>
+        <w:lastRenderedPageBreak/>
         <w:t>PHỤ LỤC B: KẾT QUẢ QUÉT THAM SỐ DBSCAN NĂM 2019</w:t>
       </w:r>
       <w:bookmarkEnd w:id="54"/>
@@ -25045,8 +24966,8 @@
       </w:pPr>
     </w:p>
     <w:sectPr>
-      <w:headerReference w:type="default" r:id="rId25"/>
-      <w:footerReference w:type="default" r:id="rId26"/>
+      <w:headerReference w:type="default" r:id="rId26"/>
+      <w:footerReference w:type="default" r:id="rId27"/>
       <w:pgSz w:w="12240" w:h="15840"/>
       <w:pgMar w:top="1701" w:right="1134" w:bottom="1701" w:left="1701" w:header="720" w:footer="720" w:gutter="0"/>
       <w:pgNumType w:start="1"/>

</xml_diff>

<commit_message>
giao diện: nâng cấp thiết kế theo phong cách bảng điều khiển học thuật tối giản, loại bỏ biểu tượng và cập nhật hình 5.1 trong báo cáo word
</commit_message>
<xml_diff>
--- a/reports/final_report/Nhom12_BaoCao.docx
+++ b/reports/final_report/Nhom12_BaoCao.docx
@@ -243,7 +243,7 @@
       <w:pPr>
         <w:pStyle w:val="Heading1"/>
       </w:pPr>
-      <w:bookmarkStart w:id="0" w:name="_Toc243615171"/>
+      <w:bookmarkStart w:id="0" w:name="_Toc243616218"/>
       <w:r>
         <w:lastRenderedPageBreak/>
         <w:t>LỜI MỞ ĐẦU</w:t>
@@ -301,7 +301,7 @@
       <w:pPr>
         <w:pStyle w:val="Heading1"/>
       </w:pPr>
-      <w:bookmarkStart w:id="1" w:name="_Toc243615172"/>
+      <w:bookmarkStart w:id="1" w:name="_Toc243616219"/>
       <w:r>
         <w:lastRenderedPageBreak/>
         <w:t>TÓM TẮT</w:t>
@@ -342,7 +342,7 @@
       <w:pPr>
         <w:pStyle w:val="Heading1"/>
       </w:pPr>
-      <w:bookmarkStart w:id="2" w:name="_Toc243615173"/>
+      <w:bookmarkStart w:id="2" w:name="_Toc243616220"/>
       <w:r>
         <w:lastRenderedPageBreak/>
         <w:t>BẢNG PHÂN CÔNG NHIỆM VỤ</w:t>
@@ -1046,7 +1046,7 @@
       <w:pPr>
         <w:pStyle w:val="Heading1"/>
       </w:pPr>
-      <w:bookmarkStart w:id="3" w:name="_Toc243615174"/>
+      <w:bookmarkStart w:id="3" w:name="_Toc243616221"/>
       <w:r>
         <w:lastRenderedPageBreak/>
         <w:t>MỤC LỤC</w:t>
@@ -1077,7 +1077,7 @@
       <w:r>
         <w:fldChar w:fldCharType="separate"/>
       </w:r>
-      <w:hyperlink w:anchor="_Toc243615171" w:history="1">
+      <w:hyperlink w:anchor="_Toc243616218" w:history="1">
         <w:r>
           <w:rPr>
             <w:rStyle w:val="Hyperlink"/>
@@ -1104,7 +1104,7 @@
             <w:noProof/>
             <w:webHidden/>
           </w:rPr>
-          <w:instrText xml:space="preserve"> PAGEREF _Toc243615171 \h </w:instrText>
+          <w:instrText xml:space="preserve"> PAGEREF _Toc243616218 \h </w:instrText>
         </w:r>
         <w:r>
           <w:rPr>
@@ -1150,7 +1150,7 @@
           <w14:ligatures w14:val="standardContextual"/>
         </w:rPr>
       </w:pPr>
-      <w:hyperlink w:anchor="_Toc243615172" w:history="1">
+      <w:hyperlink w:anchor="_Toc243616219" w:history="1">
         <w:r>
           <w:rPr>
             <w:rStyle w:val="Hyperlink"/>
@@ -1177,7 +1177,7 @@
             <w:noProof/>
             <w:webHidden/>
           </w:rPr>
-          <w:instrText xml:space="preserve"> PAGEREF _Toc243615172 \h </w:instrText>
+          <w:instrText xml:space="preserve"> PAGEREF _Toc243616219 \h </w:instrText>
         </w:r>
         <w:r>
           <w:rPr>
@@ -1223,7 +1223,7 @@
           <w14:ligatures w14:val="standardContextual"/>
         </w:rPr>
       </w:pPr>
-      <w:hyperlink w:anchor="_Toc243615173" w:history="1">
+      <w:hyperlink w:anchor="_Toc243616220" w:history="1">
         <w:r>
           <w:rPr>
             <w:rStyle w:val="Hyperlink"/>
@@ -1250,7 +1250,7 @@
             <w:noProof/>
             <w:webHidden/>
           </w:rPr>
-          <w:instrText xml:space="preserve"> PAGEREF _Toc243615173 \h </w:instrText>
+          <w:instrText xml:space="preserve"> PAGEREF _Toc243616220 \h </w:instrText>
         </w:r>
         <w:r>
           <w:rPr>
@@ -1296,7 +1296,7 @@
           <w14:ligatures w14:val="standardContextual"/>
         </w:rPr>
       </w:pPr>
-      <w:hyperlink w:anchor="_Toc243615174" w:history="1">
+      <w:hyperlink w:anchor="_Toc243616221" w:history="1">
         <w:r>
           <w:rPr>
             <w:rStyle w:val="Hyperlink"/>
@@ -1323,7 +1323,7 @@
             <w:noProof/>
             <w:webHidden/>
           </w:rPr>
-          <w:instrText xml:space="preserve"> PAGEREF _Toc243615174 \h </w:instrText>
+          <w:instrText xml:space="preserve"> PAGEREF _Toc243616221 \h </w:instrText>
         </w:r>
         <w:r>
           <w:rPr>
@@ -1369,7 +1369,7 @@
           <w14:ligatures w14:val="standardContextual"/>
         </w:rPr>
       </w:pPr>
-      <w:hyperlink w:anchor="_Toc243615175" w:history="1">
+      <w:hyperlink w:anchor="_Toc243616222" w:history="1">
         <w:r>
           <w:rPr>
             <w:rStyle w:val="Hyperlink"/>
@@ -1396,7 +1396,7 @@
             <w:noProof/>
             <w:webHidden/>
           </w:rPr>
-          <w:instrText xml:space="preserve"> PAGEREF _Toc243615175 \h </w:instrText>
+          <w:instrText xml:space="preserve"> PAGEREF _Toc243616222 \h </w:instrText>
         </w:r>
         <w:r>
           <w:rPr>
@@ -1442,7 +1442,7 @@
           <w14:ligatures w14:val="standardContextual"/>
         </w:rPr>
       </w:pPr>
-      <w:hyperlink w:anchor="_Toc243615176" w:history="1">
+      <w:hyperlink w:anchor="_Toc243616223" w:history="1">
         <w:r>
           <w:rPr>
             <w:rStyle w:val="Hyperlink"/>
@@ -1469,7 +1469,7 @@
             <w:noProof/>
             <w:webHidden/>
           </w:rPr>
-          <w:instrText xml:space="preserve"> PAGEREF _Toc243615176 \h </w:instrText>
+          <w:instrText xml:space="preserve"> PAGEREF _Toc243616223 \h </w:instrText>
         </w:r>
         <w:r>
           <w:rPr>
@@ -1515,7 +1515,7 @@
           <w14:ligatures w14:val="standardContextual"/>
         </w:rPr>
       </w:pPr>
-      <w:hyperlink w:anchor="_Toc243615177" w:history="1">
+      <w:hyperlink w:anchor="_Toc243616224" w:history="1">
         <w:r>
           <w:rPr>
             <w:rStyle w:val="Hyperlink"/>
@@ -1542,7 +1542,7 @@
             <w:noProof/>
             <w:webHidden/>
           </w:rPr>
-          <w:instrText xml:space="preserve"> PAGEREF _Toc243615177 \h </w:instrText>
+          <w:instrText xml:space="preserve"> PAGEREF _Toc243616224 \h </w:instrText>
         </w:r>
         <w:r>
           <w:rPr>
@@ -1588,7 +1588,7 @@
           <w14:ligatures w14:val="standardContextual"/>
         </w:rPr>
       </w:pPr>
-      <w:hyperlink w:anchor="_Toc243615178" w:history="1">
+      <w:hyperlink w:anchor="_Toc243616225" w:history="1">
         <w:r>
           <w:rPr>
             <w:rStyle w:val="Hyperlink"/>
@@ -1615,7 +1615,7 @@
             <w:noProof/>
             <w:webHidden/>
           </w:rPr>
-          <w:instrText xml:space="preserve"> PAGEREF _Toc243615178 \h </w:instrText>
+          <w:instrText xml:space="preserve"> PAGEREF _Toc243616225 \h </w:instrText>
         </w:r>
         <w:r>
           <w:rPr>
@@ -1661,7 +1661,7 @@
           <w14:ligatures w14:val="standardContextual"/>
         </w:rPr>
       </w:pPr>
-      <w:hyperlink w:anchor="_Toc243615179" w:history="1">
+      <w:hyperlink w:anchor="_Toc243616226" w:history="1">
         <w:r>
           <w:rPr>
             <w:rStyle w:val="Hyperlink"/>
@@ -1688,7 +1688,7 @@
             <w:noProof/>
             <w:webHidden/>
           </w:rPr>
-          <w:instrText xml:space="preserve"> PAGEREF _Toc243615179 \h </w:instrText>
+          <w:instrText xml:space="preserve"> PAGEREF _Toc243616226 \h </w:instrText>
         </w:r>
         <w:r>
           <w:rPr>
@@ -1734,7 +1734,7 @@
           <w14:ligatures w14:val="standardContextual"/>
         </w:rPr>
       </w:pPr>
-      <w:hyperlink w:anchor="_Toc243615180" w:history="1">
+      <w:hyperlink w:anchor="_Toc243616227" w:history="1">
         <w:r>
           <w:rPr>
             <w:rStyle w:val="Hyperlink"/>
@@ -1761,7 +1761,7 @@
             <w:noProof/>
             <w:webHidden/>
           </w:rPr>
-          <w:instrText xml:space="preserve"> PAGEREF _Toc243615180 \h </w:instrText>
+          <w:instrText xml:space="preserve"> PAGEREF _Toc243616227 \h </w:instrText>
         </w:r>
         <w:r>
           <w:rPr>
@@ -1807,7 +1807,7 @@
           <w14:ligatures w14:val="standardContextual"/>
         </w:rPr>
       </w:pPr>
-      <w:hyperlink w:anchor="_Toc243615181" w:history="1">
+      <w:hyperlink w:anchor="_Toc243616228" w:history="1">
         <w:r>
           <w:rPr>
             <w:rStyle w:val="Hyperlink"/>
@@ -1834,7 +1834,7 @@
             <w:noProof/>
             <w:webHidden/>
           </w:rPr>
-          <w:instrText xml:space="preserve"> PAGEREF _Toc243615181 \h </w:instrText>
+          <w:instrText xml:space="preserve"> PAGEREF _Toc243616228 \h </w:instrText>
         </w:r>
         <w:r>
           <w:rPr>
@@ -1880,7 +1880,7 @@
           <w14:ligatures w14:val="standardContextual"/>
         </w:rPr>
       </w:pPr>
-      <w:hyperlink w:anchor="_Toc243615182" w:history="1">
+      <w:hyperlink w:anchor="_Toc243616229" w:history="1">
         <w:r>
           <w:rPr>
             <w:rStyle w:val="Hyperlink"/>
@@ -1907,7 +1907,7 @@
             <w:noProof/>
             <w:webHidden/>
           </w:rPr>
-          <w:instrText xml:space="preserve"> PAGEREF _Toc243615182 \h </w:instrText>
+          <w:instrText xml:space="preserve"> PAGEREF _Toc243616229 \h </w:instrText>
         </w:r>
         <w:r>
           <w:rPr>
@@ -1953,7 +1953,7 @@
           <w14:ligatures w14:val="standardContextual"/>
         </w:rPr>
       </w:pPr>
-      <w:hyperlink w:anchor="_Toc243615183" w:history="1">
+      <w:hyperlink w:anchor="_Toc243616230" w:history="1">
         <w:r>
           <w:rPr>
             <w:rStyle w:val="Hyperlink"/>
@@ -1980,7 +1980,7 @@
             <w:noProof/>
             <w:webHidden/>
           </w:rPr>
-          <w:instrText xml:space="preserve"> PAGEREF _Toc243615183 \h </w:instrText>
+          <w:instrText xml:space="preserve"> PAGEREF _Toc243616230 \h </w:instrText>
         </w:r>
         <w:r>
           <w:rPr>
@@ -2026,7 +2026,7 @@
           <w14:ligatures w14:val="standardContextual"/>
         </w:rPr>
       </w:pPr>
-      <w:hyperlink w:anchor="_Toc243615184" w:history="1">
+      <w:hyperlink w:anchor="_Toc243616231" w:history="1">
         <w:r>
           <w:rPr>
             <w:rStyle w:val="Hyperlink"/>
@@ -2053,7 +2053,7 @@
             <w:noProof/>
             <w:webHidden/>
           </w:rPr>
-          <w:instrText xml:space="preserve"> PAGEREF _Toc243615184 \h </w:instrText>
+          <w:instrText xml:space="preserve"> PAGEREF _Toc243616231 \h </w:instrText>
         </w:r>
         <w:r>
           <w:rPr>
@@ -2099,7 +2099,7 @@
           <w14:ligatures w14:val="standardContextual"/>
         </w:rPr>
       </w:pPr>
-      <w:hyperlink w:anchor="_Toc243615185" w:history="1">
+      <w:hyperlink w:anchor="_Toc243616232" w:history="1">
         <w:r>
           <w:rPr>
             <w:rStyle w:val="Hyperlink"/>
@@ -2126,7 +2126,7 @@
             <w:noProof/>
             <w:webHidden/>
           </w:rPr>
-          <w:instrText xml:space="preserve"> PAGEREF _Toc243615185 \h </w:instrText>
+          <w:instrText xml:space="preserve"> PAGEREF _Toc243616232 \h </w:instrText>
         </w:r>
         <w:r>
           <w:rPr>
@@ -2172,7 +2172,7 @@
           <w14:ligatures w14:val="standardContextual"/>
         </w:rPr>
       </w:pPr>
-      <w:hyperlink w:anchor="_Toc243615186" w:history="1">
+      <w:hyperlink w:anchor="_Toc243616233" w:history="1">
         <w:r>
           <w:rPr>
             <w:rStyle w:val="Hyperlink"/>
@@ -2199,7 +2199,7 @@
             <w:noProof/>
             <w:webHidden/>
           </w:rPr>
-          <w:instrText xml:space="preserve"> PAGEREF _Toc243615186 \h </w:instrText>
+          <w:instrText xml:space="preserve"> PAGEREF _Toc243616233 \h </w:instrText>
         </w:r>
         <w:r>
           <w:rPr>
@@ -2245,7 +2245,7 @@
           <w14:ligatures w14:val="standardContextual"/>
         </w:rPr>
       </w:pPr>
-      <w:hyperlink w:anchor="_Toc243615187" w:history="1">
+      <w:hyperlink w:anchor="_Toc243616234" w:history="1">
         <w:r>
           <w:rPr>
             <w:rStyle w:val="Hyperlink"/>
@@ -2272,7 +2272,7 @@
             <w:noProof/>
             <w:webHidden/>
           </w:rPr>
-          <w:instrText xml:space="preserve"> PAGEREF _Toc243615187 \h </w:instrText>
+          <w:instrText xml:space="preserve"> PAGEREF _Toc243616234 \h </w:instrText>
         </w:r>
         <w:r>
           <w:rPr>
@@ -2318,7 +2318,7 @@
           <w14:ligatures w14:val="standardContextual"/>
         </w:rPr>
       </w:pPr>
-      <w:hyperlink w:anchor="_Toc243615188" w:history="1">
+      <w:hyperlink w:anchor="_Toc243616235" w:history="1">
         <w:r>
           <w:rPr>
             <w:rStyle w:val="Hyperlink"/>
@@ -2345,7 +2345,7 @@
             <w:noProof/>
             <w:webHidden/>
           </w:rPr>
-          <w:instrText xml:space="preserve"> PAGEREF _Toc243615188 \h </w:instrText>
+          <w:instrText xml:space="preserve"> PAGEREF _Toc243616235 \h </w:instrText>
         </w:r>
         <w:r>
           <w:rPr>
@@ -2391,7 +2391,7 @@
           <w14:ligatures w14:val="standardContextual"/>
         </w:rPr>
       </w:pPr>
-      <w:hyperlink w:anchor="_Toc243615189" w:history="1">
+      <w:hyperlink w:anchor="_Toc243616236" w:history="1">
         <w:r>
           <w:rPr>
             <w:rStyle w:val="Hyperlink"/>
@@ -2418,7 +2418,7 @@
             <w:noProof/>
             <w:webHidden/>
           </w:rPr>
-          <w:instrText xml:space="preserve"> PAGEREF _Toc243615189 \h </w:instrText>
+          <w:instrText xml:space="preserve"> PAGEREF _Toc243616236 \h </w:instrText>
         </w:r>
         <w:r>
           <w:rPr>
@@ -2464,7 +2464,7 @@
           <w14:ligatures w14:val="standardContextual"/>
         </w:rPr>
       </w:pPr>
-      <w:hyperlink w:anchor="_Toc243615190" w:history="1">
+      <w:hyperlink w:anchor="_Toc243616237" w:history="1">
         <w:r>
           <w:rPr>
             <w:rStyle w:val="Hyperlink"/>
@@ -2491,7 +2491,7 @@
             <w:noProof/>
             <w:webHidden/>
           </w:rPr>
-          <w:instrText xml:space="preserve"> PAGEREF _Toc243615190 \h </w:instrText>
+          <w:instrText xml:space="preserve"> PAGEREF _Toc243616237 \h </w:instrText>
         </w:r>
         <w:r>
           <w:rPr>
@@ -2537,7 +2537,7 @@
           <w14:ligatures w14:val="standardContextual"/>
         </w:rPr>
       </w:pPr>
-      <w:hyperlink w:anchor="_Toc243615191" w:history="1">
+      <w:hyperlink w:anchor="_Toc243616238" w:history="1">
         <w:r>
           <w:rPr>
             <w:rStyle w:val="Hyperlink"/>
@@ -2572,7 +2572,7 @@
             <w:noProof/>
             <w:webHidden/>
           </w:rPr>
-          <w:instrText xml:space="preserve"> PAGEREF _Toc243615191 \h </w:instrText>
+          <w:instrText xml:space="preserve"> PAGEREF _Toc243616238 \h </w:instrText>
         </w:r>
         <w:r>
           <w:rPr>
@@ -2618,7 +2618,7 @@
           <w14:ligatures w14:val="standardContextual"/>
         </w:rPr>
       </w:pPr>
-      <w:hyperlink w:anchor="_Toc243615192" w:history="1">
+      <w:hyperlink w:anchor="_Toc243616239" w:history="1">
         <w:r>
           <w:rPr>
             <w:rStyle w:val="Hyperlink"/>
@@ -2645,7 +2645,7 @@
             <w:noProof/>
             <w:webHidden/>
           </w:rPr>
-          <w:instrText xml:space="preserve"> PAGEREF _Toc243615192 \h </w:instrText>
+          <w:instrText xml:space="preserve"> PAGEREF _Toc243616239 \h </w:instrText>
         </w:r>
         <w:r>
           <w:rPr>
@@ -2691,7 +2691,7 @@
           <w14:ligatures w14:val="standardContextual"/>
         </w:rPr>
       </w:pPr>
-      <w:hyperlink w:anchor="_Toc243615193" w:history="1">
+      <w:hyperlink w:anchor="_Toc243616240" w:history="1">
         <w:r>
           <w:rPr>
             <w:rStyle w:val="Hyperlink"/>
@@ -2718,7 +2718,7 @@
             <w:noProof/>
             <w:webHidden/>
           </w:rPr>
-          <w:instrText xml:space="preserve"> PAGEREF _Toc243615193 \h </w:instrText>
+          <w:instrText xml:space="preserve"> PAGEREF _Toc243616240 \h </w:instrText>
         </w:r>
         <w:r>
           <w:rPr>
@@ -2764,7 +2764,7 @@
           <w14:ligatures w14:val="standardContextual"/>
         </w:rPr>
       </w:pPr>
-      <w:hyperlink w:anchor="_Toc243615194" w:history="1">
+      <w:hyperlink w:anchor="_Toc243616241" w:history="1">
         <w:r>
           <w:rPr>
             <w:rStyle w:val="Hyperlink"/>
@@ -2791,7 +2791,7 @@
             <w:noProof/>
             <w:webHidden/>
           </w:rPr>
-          <w:instrText xml:space="preserve"> PAGEREF _Toc243615194 \h </w:instrText>
+          <w:instrText xml:space="preserve"> PAGEREF _Toc243616241 \h </w:instrText>
         </w:r>
         <w:r>
           <w:rPr>
@@ -2837,7 +2837,7 @@
           <w14:ligatures w14:val="standardContextual"/>
         </w:rPr>
       </w:pPr>
-      <w:hyperlink w:anchor="_Toc243615195" w:history="1">
+      <w:hyperlink w:anchor="_Toc243616242" w:history="1">
         <w:r>
           <w:rPr>
             <w:rStyle w:val="Hyperlink"/>
@@ -2864,7 +2864,7 @@
             <w:noProof/>
             <w:webHidden/>
           </w:rPr>
-          <w:instrText xml:space="preserve"> PAGEREF _Toc243615195 \h </w:instrText>
+          <w:instrText xml:space="preserve"> PAGEREF _Toc243616242 \h </w:instrText>
         </w:r>
         <w:r>
           <w:rPr>
@@ -2910,7 +2910,7 @@
           <w14:ligatures w14:val="standardContextual"/>
         </w:rPr>
       </w:pPr>
-      <w:hyperlink w:anchor="_Toc243615196" w:history="1">
+      <w:hyperlink w:anchor="_Toc243616243" w:history="1">
         <w:r>
           <w:rPr>
             <w:rStyle w:val="Hyperlink"/>
@@ -2937,7 +2937,7 @@
             <w:noProof/>
             <w:webHidden/>
           </w:rPr>
-          <w:instrText xml:space="preserve"> PAGEREF _Toc243615196 \h </w:instrText>
+          <w:instrText xml:space="preserve"> PAGEREF _Toc243616243 \h </w:instrText>
         </w:r>
         <w:r>
           <w:rPr>
@@ -2983,7 +2983,7 @@
           <w14:ligatures w14:val="standardContextual"/>
         </w:rPr>
       </w:pPr>
-      <w:hyperlink w:anchor="_Toc243615197" w:history="1">
+      <w:hyperlink w:anchor="_Toc243616244" w:history="1">
         <w:r>
           <w:rPr>
             <w:rStyle w:val="Hyperlink"/>
@@ -3010,7 +3010,7 @@
             <w:noProof/>
             <w:webHidden/>
           </w:rPr>
-          <w:instrText xml:space="preserve"> PAGEREF _Toc243615197 \h </w:instrText>
+          <w:instrText xml:space="preserve"> PAGEREF _Toc243616244 \h </w:instrText>
         </w:r>
         <w:r>
           <w:rPr>
@@ -3056,7 +3056,7 @@
           <w14:ligatures w14:val="standardContextual"/>
         </w:rPr>
       </w:pPr>
-      <w:hyperlink w:anchor="_Toc243615198" w:history="1">
+      <w:hyperlink w:anchor="_Toc243616245" w:history="1">
         <w:r>
           <w:rPr>
             <w:rStyle w:val="Hyperlink"/>
@@ -3083,7 +3083,7 @@
             <w:noProof/>
             <w:webHidden/>
           </w:rPr>
-          <w:instrText xml:space="preserve"> PAGEREF _Toc243615198 \h </w:instrText>
+          <w:instrText xml:space="preserve"> PAGEREF _Toc243616245 \h </w:instrText>
         </w:r>
         <w:r>
           <w:rPr>
@@ -3129,7 +3129,7 @@
           <w14:ligatures w14:val="standardContextual"/>
         </w:rPr>
       </w:pPr>
-      <w:hyperlink w:anchor="_Toc243615199" w:history="1">
+      <w:hyperlink w:anchor="_Toc243616246" w:history="1">
         <w:r>
           <w:rPr>
             <w:rStyle w:val="Hyperlink"/>
@@ -3156,7 +3156,7 @@
             <w:noProof/>
             <w:webHidden/>
           </w:rPr>
-          <w:instrText xml:space="preserve"> PAGEREF _Toc243615199 \h </w:instrText>
+          <w:instrText xml:space="preserve"> PAGEREF _Toc243616246 \h </w:instrText>
         </w:r>
         <w:r>
           <w:rPr>
@@ -3202,7 +3202,7 @@
           <w14:ligatures w14:val="standardContextual"/>
         </w:rPr>
       </w:pPr>
-      <w:hyperlink w:anchor="_Toc243615200" w:history="1">
+      <w:hyperlink w:anchor="_Toc243616247" w:history="1">
         <w:r>
           <w:rPr>
             <w:rStyle w:val="Hyperlink"/>
@@ -3229,7 +3229,7 @@
             <w:noProof/>
             <w:webHidden/>
           </w:rPr>
-          <w:instrText xml:space="preserve"> PAGEREF _Toc243615200 \h </w:instrText>
+          <w:instrText xml:space="preserve"> PAGEREF _Toc243616247 \h </w:instrText>
         </w:r>
         <w:r>
           <w:rPr>
@@ -3275,7 +3275,7 @@
           <w14:ligatures w14:val="standardContextual"/>
         </w:rPr>
       </w:pPr>
-      <w:hyperlink w:anchor="_Toc243615201" w:history="1">
+      <w:hyperlink w:anchor="_Toc243616248" w:history="1">
         <w:r>
           <w:rPr>
             <w:rStyle w:val="Hyperlink"/>
@@ -3302,7 +3302,7 @@
             <w:noProof/>
             <w:webHidden/>
           </w:rPr>
-          <w:instrText xml:space="preserve"> PAGEREF _Toc243615201 \h </w:instrText>
+          <w:instrText xml:space="preserve"> PAGEREF _Toc243616248 \h </w:instrText>
         </w:r>
         <w:r>
           <w:rPr>
@@ -3348,7 +3348,7 @@
           <w14:ligatures w14:val="standardContextual"/>
         </w:rPr>
       </w:pPr>
-      <w:hyperlink w:anchor="_Toc243615202" w:history="1">
+      <w:hyperlink w:anchor="_Toc243616249" w:history="1">
         <w:r>
           <w:rPr>
             <w:rStyle w:val="Hyperlink"/>
@@ -3375,7 +3375,7 @@
             <w:noProof/>
             <w:webHidden/>
           </w:rPr>
-          <w:instrText xml:space="preserve"> PAGEREF _Toc243615202 \h </w:instrText>
+          <w:instrText xml:space="preserve"> PAGEREF _Toc243616249 \h </w:instrText>
         </w:r>
         <w:r>
           <w:rPr>
@@ -3421,7 +3421,7 @@
           <w14:ligatures w14:val="standardContextual"/>
         </w:rPr>
       </w:pPr>
-      <w:hyperlink w:anchor="_Toc243615203" w:history="1">
+      <w:hyperlink w:anchor="_Toc243616250" w:history="1">
         <w:r>
           <w:rPr>
             <w:rStyle w:val="Hyperlink"/>
@@ -3448,7 +3448,7 @@
             <w:noProof/>
             <w:webHidden/>
           </w:rPr>
-          <w:instrText xml:space="preserve"> PAGEREF _Toc243615203 \h </w:instrText>
+          <w:instrText xml:space="preserve"> PAGEREF _Toc243616250 \h </w:instrText>
         </w:r>
         <w:r>
           <w:rPr>
@@ -3494,7 +3494,7 @@
           <w14:ligatures w14:val="standardContextual"/>
         </w:rPr>
       </w:pPr>
-      <w:hyperlink w:anchor="_Toc243615204" w:history="1">
+      <w:hyperlink w:anchor="_Toc243616251" w:history="1">
         <w:r>
           <w:rPr>
             <w:rStyle w:val="Hyperlink"/>
@@ -3521,7 +3521,7 @@
             <w:noProof/>
             <w:webHidden/>
           </w:rPr>
-          <w:instrText xml:space="preserve"> PAGEREF _Toc243615204 \h </w:instrText>
+          <w:instrText xml:space="preserve"> PAGEREF _Toc243616251 \h </w:instrText>
         </w:r>
         <w:r>
           <w:rPr>
@@ -3567,7 +3567,7 @@
           <w14:ligatures w14:val="standardContextual"/>
         </w:rPr>
       </w:pPr>
-      <w:hyperlink w:anchor="_Toc243615205" w:history="1">
+      <w:hyperlink w:anchor="_Toc243616252" w:history="1">
         <w:r>
           <w:rPr>
             <w:rStyle w:val="Hyperlink"/>
@@ -3594,7 +3594,7 @@
             <w:noProof/>
             <w:webHidden/>
           </w:rPr>
-          <w:instrText xml:space="preserve"> PAGEREF _Toc243615205 \h </w:instrText>
+          <w:instrText xml:space="preserve"> PAGEREF _Toc243616252 \h </w:instrText>
         </w:r>
         <w:r>
           <w:rPr>
@@ -3640,7 +3640,7 @@
           <w14:ligatures w14:val="standardContextual"/>
         </w:rPr>
       </w:pPr>
-      <w:hyperlink w:anchor="_Toc243615206" w:history="1">
+      <w:hyperlink w:anchor="_Toc243616253" w:history="1">
         <w:r>
           <w:rPr>
             <w:rStyle w:val="Hyperlink"/>
@@ -3667,7 +3667,7 @@
             <w:noProof/>
             <w:webHidden/>
           </w:rPr>
-          <w:instrText xml:space="preserve"> PAGEREF _Toc243615206 \h </w:instrText>
+          <w:instrText xml:space="preserve"> PAGEREF _Toc243616253 \h </w:instrText>
         </w:r>
         <w:r>
           <w:rPr>
@@ -3713,7 +3713,7 @@
           <w14:ligatures w14:val="standardContextual"/>
         </w:rPr>
       </w:pPr>
-      <w:hyperlink w:anchor="_Toc243615207" w:history="1">
+      <w:hyperlink w:anchor="_Toc243616254" w:history="1">
         <w:r>
           <w:rPr>
             <w:rStyle w:val="Hyperlink"/>
@@ -3740,7 +3740,7 @@
             <w:noProof/>
             <w:webHidden/>
           </w:rPr>
-          <w:instrText xml:space="preserve"> PAGEREF _Toc243615207 \h </w:instrText>
+          <w:instrText xml:space="preserve"> PAGEREF _Toc243616254 \h </w:instrText>
         </w:r>
         <w:r>
           <w:rPr>
@@ -3786,7 +3786,7 @@
           <w14:ligatures w14:val="standardContextual"/>
         </w:rPr>
       </w:pPr>
-      <w:hyperlink w:anchor="_Toc243615208" w:history="1">
+      <w:hyperlink w:anchor="_Toc243616255" w:history="1">
         <w:r>
           <w:rPr>
             <w:rStyle w:val="Hyperlink"/>
@@ -3813,7 +3813,7 @@
             <w:noProof/>
             <w:webHidden/>
           </w:rPr>
-          <w:instrText xml:space="preserve"> PAGEREF _Toc243615208 \h </w:instrText>
+          <w:instrText xml:space="preserve"> PAGEREF _Toc243616255 \h </w:instrText>
         </w:r>
         <w:r>
           <w:rPr>
@@ -3859,7 +3859,7 @@
           <w14:ligatures w14:val="standardContextual"/>
         </w:rPr>
       </w:pPr>
-      <w:hyperlink w:anchor="_Toc243615209" w:history="1">
+      <w:hyperlink w:anchor="_Toc243616256" w:history="1">
         <w:r>
           <w:rPr>
             <w:rStyle w:val="Hyperlink"/>
@@ -3886,7 +3886,7 @@
             <w:noProof/>
             <w:webHidden/>
           </w:rPr>
-          <w:instrText xml:space="preserve"> PAGEREF _Toc243615209 \h </w:instrText>
+          <w:instrText xml:space="preserve"> PAGEREF _Toc243616256 \h </w:instrText>
         </w:r>
         <w:r>
           <w:rPr>
@@ -3932,7 +3932,7 @@
           <w14:ligatures w14:val="standardContextual"/>
         </w:rPr>
       </w:pPr>
-      <w:hyperlink w:anchor="_Toc243615210" w:history="1">
+      <w:hyperlink w:anchor="_Toc243616257" w:history="1">
         <w:r>
           <w:rPr>
             <w:rStyle w:val="Hyperlink"/>
@@ -3959,7 +3959,7 @@
             <w:noProof/>
             <w:webHidden/>
           </w:rPr>
-          <w:instrText xml:space="preserve"> PAGEREF _Toc243615210 \h </w:instrText>
+          <w:instrText xml:space="preserve"> PAGEREF _Toc243616257 \h </w:instrText>
         </w:r>
         <w:r>
           <w:rPr>
@@ -4005,7 +4005,7 @@
           <w14:ligatures w14:val="standardContextual"/>
         </w:rPr>
       </w:pPr>
-      <w:hyperlink w:anchor="_Toc243615211" w:history="1">
+      <w:hyperlink w:anchor="_Toc243616258" w:history="1">
         <w:r>
           <w:rPr>
             <w:rStyle w:val="Hyperlink"/>
@@ -4032,7 +4032,7 @@
             <w:noProof/>
             <w:webHidden/>
           </w:rPr>
-          <w:instrText xml:space="preserve"> PAGEREF _Toc243615211 \h </w:instrText>
+          <w:instrText xml:space="preserve"> PAGEREF _Toc243616258 \h </w:instrText>
         </w:r>
         <w:r>
           <w:rPr>
@@ -4078,7 +4078,7 @@
           <w14:ligatures w14:val="standardContextual"/>
         </w:rPr>
       </w:pPr>
-      <w:hyperlink w:anchor="_Toc243615212" w:history="1">
+      <w:hyperlink w:anchor="_Toc243616259" w:history="1">
         <w:r>
           <w:rPr>
             <w:rStyle w:val="Hyperlink"/>
@@ -4105,7 +4105,7 @@
             <w:noProof/>
             <w:webHidden/>
           </w:rPr>
-          <w:instrText xml:space="preserve"> PAGEREF _Toc243615212 \h </w:instrText>
+          <w:instrText xml:space="preserve"> PAGEREF _Toc243616259 \h </w:instrText>
         </w:r>
         <w:r>
           <w:rPr>
@@ -4151,7 +4151,7 @@
           <w14:ligatures w14:val="standardContextual"/>
         </w:rPr>
       </w:pPr>
-      <w:hyperlink w:anchor="_Toc243615213" w:history="1">
+      <w:hyperlink w:anchor="_Toc243616260" w:history="1">
         <w:r>
           <w:rPr>
             <w:rStyle w:val="Hyperlink"/>
@@ -4178,7 +4178,7 @@
             <w:noProof/>
             <w:webHidden/>
           </w:rPr>
-          <w:instrText xml:space="preserve"> PAGEREF _Toc243615213 \h </w:instrText>
+          <w:instrText xml:space="preserve"> PAGEREF _Toc243616260 \h </w:instrText>
         </w:r>
         <w:r>
           <w:rPr>
@@ -4224,7 +4224,7 @@
           <w14:ligatures w14:val="standardContextual"/>
         </w:rPr>
       </w:pPr>
-      <w:hyperlink w:anchor="_Toc243615214" w:history="1">
+      <w:hyperlink w:anchor="_Toc243616261" w:history="1">
         <w:r>
           <w:rPr>
             <w:rStyle w:val="Hyperlink"/>
@@ -4251,7 +4251,7 @@
             <w:noProof/>
             <w:webHidden/>
           </w:rPr>
-          <w:instrText xml:space="preserve"> PAGEREF _Toc243615214 \h </w:instrText>
+          <w:instrText xml:space="preserve"> PAGEREF _Toc243616261 \h </w:instrText>
         </w:r>
         <w:r>
           <w:rPr>
@@ -4297,7 +4297,7 @@
           <w14:ligatures w14:val="standardContextual"/>
         </w:rPr>
       </w:pPr>
-      <w:hyperlink w:anchor="_Toc243615215" w:history="1">
+      <w:hyperlink w:anchor="_Toc243616262" w:history="1">
         <w:r>
           <w:rPr>
             <w:rStyle w:val="Hyperlink"/>
@@ -4324,7 +4324,7 @@
             <w:noProof/>
             <w:webHidden/>
           </w:rPr>
-          <w:instrText xml:space="preserve"> PAGEREF _Toc243615215 \h </w:instrText>
+          <w:instrText xml:space="preserve"> PAGEREF _Toc243616262 \h </w:instrText>
         </w:r>
         <w:r>
           <w:rPr>
@@ -4370,7 +4370,7 @@
           <w14:ligatures w14:val="standardContextual"/>
         </w:rPr>
       </w:pPr>
-      <w:hyperlink w:anchor="_Toc243615216" w:history="1">
+      <w:hyperlink w:anchor="_Toc243616263" w:history="1">
         <w:r>
           <w:rPr>
             <w:rStyle w:val="Hyperlink"/>
@@ -4397,7 +4397,7 @@
             <w:noProof/>
             <w:webHidden/>
           </w:rPr>
-          <w:instrText xml:space="preserve"> PAGEREF _Toc243615216 \h </w:instrText>
+          <w:instrText xml:space="preserve"> PAGEREF _Toc243616263 \h </w:instrText>
         </w:r>
         <w:r>
           <w:rPr>
@@ -4443,7 +4443,7 @@
           <w14:ligatures w14:val="standardContextual"/>
         </w:rPr>
       </w:pPr>
-      <w:hyperlink w:anchor="_Toc243615217" w:history="1">
+      <w:hyperlink w:anchor="_Toc243616264" w:history="1">
         <w:r>
           <w:rPr>
             <w:rStyle w:val="Hyperlink"/>
@@ -4470,7 +4470,7 @@
             <w:noProof/>
             <w:webHidden/>
           </w:rPr>
-          <w:instrText xml:space="preserve"> PAGEREF _Toc243615217 \h </w:instrText>
+          <w:instrText xml:space="preserve"> PAGEREF _Toc243616264 \h </w:instrText>
         </w:r>
         <w:r>
           <w:rPr>
@@ -4516,7 +4516,7 @@
           <w14:ligatures w14:val="standardContextual"/>
         </w:rPr>
       </w:pPr>
-      <w:hyperlink w:anchor="_Toc243615218" w:history="1">
+      <w:hyperlink w:anchor="_Toc243616265" w:history="1">
         <w:r>
           <w:rPr>
             <w:rStyle w:val="Hyperlink"/>
@@ -4543,7 +4543,7 @@
             <w:noProof/>
             <w:webHidden/>
           </w:rPr>
-          <w:instrText xml:space="preserve"> PAGEREF _Toc243615218 \h </w:instrText>
+          <w:instrText xml:space="preserve"> PAGEREF _Toc243616265 \h </w:instrText>
         </w:r>
         <w:r>
           <w:rPr>
@@ -4589,7 +4589,7 @@
           <w14:ligatures w14:val="standardContextual"/>
         </w:rPr>
       </w:pPr>
-      <w:hyperlink w:anchor="_Toc243615219" w:history="1">
+      <w:hyperlink w:anchor="_Toc243616266" w:history="1">
         <w:r>
           <w:rPr>
             <w:rStyle w:val="Hyperlink"/>
@@ -4616,7 +4616,7 @@
             <w:noProof/>
             <w:webHidden/>
           </w:rPr>
-          <w:instrText xml:space="preserve"> PAGEREF _Toc243615219 \h </w:instrText>
+          <w:instrText xml:space="preserve"> PAGEREF _Toc243616266 \h </w:instrText>
         </w:r>
         <w:r>
           <w:rPr>
@@ -4662,7 +4662,7 @@
           <w14:ligatures w14:val="standardContextual"/>
         </w:rPr>
       </w:pPr>
-      <w:hyperlink w:anchor="_Toc243615220" w:history="1">
+      <w:hyperlink w:anchor="_Toc243616267" w:history="1">
         <w:r>
           <w:rPr>
             <w:rStyle w:val="Hyperlink"/>
@@ -4689,7 +4689,7 @@
             <w:noProof/>
             <w:webHidden/>
           </w:rPr>
-          <w:instrText xml:space="preserve"> PAGEREF _Toc243615220 \h </w:instrText>
+          <w:instrText xml:space="preserve"> PAGEREF _Toc243616267 \h </w:instrText>
         </w:r>
         <w:r>
           <w:rPr>
@@ -4735,7 +4735,7 @@
           <w14:ligatures w14:val="standardContextual"/>
         </w:rPr>
       </w:pPr>
-      <w:hyperlink w:anchor="_Toc243615221" w:history="1">
+      <w:hyperlink w:anchor="_Toc243616268" w:history="1">
         <w:r>
           <w:rPr>
             <w:rStyle w:val="Hyperlink"/>
@@ -4762,7 +4762,7 @@
             <w:noProof/>
             <w:webHidden/>
           </w:rPr>
-          <w:instrText xml:space="preserve"> PAGEREF _Toc243615221 \h </w:instrText>
+          <w:instrText xml:space="preserve"> PAGEREF _Toc243616268 \h </w:instrText>
         </w:r>
         <w:r>
           <w:rPr>
@@ -4808,7 +4808,7 @@
           <w14:ligatures w14:val="standardContextual"/>
         </w:rPr>
       </w:pPr>
-      <w:hyperlink w:anchor="_Toc243615222" w:history="1">
+      <w:hyperlink w:anchor="_Toc243616269" w:history="1">
         <w:r>
           <w:rPr>
             <w:rStyle w:val="Hyperlink"/>
@@ -4835,7 +4835,7 @@
             <w:noProof/>
             <w:webHidden/>
           </w:rPr>
-          <w:instrText xml:space="preserve"> PAGEREF _Toc243615222 \h </w:instrText>
+          <w:instrText xml:space="preserve"> PAGEREF _Toc243616269 \h </w:instrText>
         </w:r>
         <w:r>
           <w:rPr>
@@ -4881,7 +4881,7 @@
           <w14:ligatures w14:val="standardContextual"/>
         </w:rPr>
       </w:pPr>
-      <w:hyperlink w:anchor="_Toc243615223" w:history="1">
+      <w:hyperlink w:anchor="_Toc243616270" w:history="1">
         <w:r>
           <w:rPr>
             <w:rStyle w:val="Hyperlink"/>
@@ -4908,7 +4908,7 @@
             <w:noProof/>
             <w:webHidden/>
           </w:rPr>
-          <w:instrText xml:space="preserve"> PAGEREF _Toc243615223 \h </w:instrText>
+          <w:instrText xml:space="preserve"> PAGEREF _Toc243616270 \h </w:instrText>
         </w:r>
         <w:r>
           <w:rPr>
@@ -4954,7 +4954,7 @@
           <w14:ligatures w14:val="standardContextual"/>
         </w:rPr>
       </w:pPr>
-      <w:hyperlink w:anchor="_Toc243615224" w:history="1">
+      <w:hyperlink w:anchor="_Toc243616271" w:history="1">
         <w:r>
           <w:rPr>
             <w:rStyle w:val="Hyperlink"/>
@@ -4981,7 +4981,7 @@
             <w:noProof/>
             <w:webHidden/>
           </w:rPr>
-          <w:instrText xml:space="preserve"> PAGEREF _Toc243615224 \h </w:instrText>
+          <w:instrText xml:space="preserve"> PAGEREF _Toc243616271 \h </w:instrText>
         </w:r>
         <w:r>
           <w:rPr>
@@ -5027,7 +5027,7 @@
           <w14:ligatures w14:val="standardContextual"/>
         </w:rPr>
       </w:pPr>
-      <w:hyperlink w:anchor="_Toc243615225" w:history="1">
+      <w:hyperlink w:anchor="_Toc243616272" w:history="1">
         <w:r>
           <w:rPr>
             <w:rStyle w:val="Hyperlink"/>
@@ -5054,7 +5054,7 @@
             <w:noProof/>
             <w:webHidden/>
           </w:rPr>
-          <w:instrText xml:space="preserve"> PAGEREF _Toc243615225 \h </w:instrText>
+          <w:instrText xml:space="preserve"> PAGEREF _Toc243616272 \h </w:instrText>
         </w:r>
         <w:r>
           <w:rPr>
@@ -5099,7 +5099,7 @@
       <w:pPr>
         <w:pStyle w:val="Heading1"/>
       </w:pPr>
-      <w:bookmarkStart w:id="4" w:name="_Toc243615175"/>
+      <w:bookmarkStart w:id="4" w:name="_Toc243616222"/>
       <w:r>
         <w:lastRenderedPageBreak/>
         <w:t>DANH MỤC BẢNG</w:t>
@@ -5387,7 +5387,7 @@
       <w:pPr>
         <w:pStyle w:val="Heading1"/>
       </w:pPr>
-      <w:bookmarkStart w:id="5" w:name="_Toc243615176"/>
+      <w:bookmarkStart w:id="5" w:name="_Toc243616223"/>
       <w:r>
         <w:lastRenderedPageBreak/>
         <w:t>DANH MỤC HÌNH ẢNH</w:t>
@@ -5585,7 +5585,7 @@
       <w:pPr>
         <w:pStyle w:val="Heading1"/>
       </w:pPr>
-      <w:bookmarkStart w:id="6" w:name="_Toc243615177"/>
+      <w:bookmarkStart w:id="6" w:name="_Toc243616224"/>
       <w:r>
         <w:lastRenderedPageBreak/>
         <w:t>CHƯƠNG 1: TỔNG QUAN ĐỀ TÀI VÀ CƠ SỞ LÝ THUYẾT</w:t>
@@ -5596,7 +5596,7 @@
       <w:pPr>
         <w:pStyle w:val="Heading2"/>
       </w:pPr>
-      <w:bookmarkStart w:id="7" w:name="_Toc243615178"/>
+      <w:bookmarkStart w:id="7" w:name="_Toc243616225"/>
       <w:r>
         <w:t>1.1. Bối cảnh và lý do chọn đề tài</w:t>
       </w:r>
@@ -5636,7 +5636,7 @@
       <w:pPr>
         <w:pStyle w:val="Heading2"/>
       </w:pPr>
-      <w:bookmarkStart w:id="8" w:name="_Toc243615179"/>
+      <w:bookmarkStart w:id="8" w:name="_Toc243616226"/>
       <w:r>
         <w:t>1.2. Bài toán và câu hỏi nghiên cứu</w:t>
       </w:r>
@@ -5723,7 +5723,7 @@
       <w:pPr>
         <w:pStyle w:val="Heading2"/>
       </w:pPr>
-      <w:bookmarkStart w:id="9" w:name="_Toc243615180"/>
+      <w:bookmarkStart w:id="9" w:name="_Toc243616227"/>
       <w:r>
         <w:t>1.3. Nguồn dữ liệu</w:t>
       </w:r>
@@ -5746,7 +5746,7 @@
       <w:pPr>
         <w:pStyle w:val="Heading2"/>
       </w:pPr>
-      <w:bookmarkStart w:id="10" w:name="_Toc243615181"/>
+      <w:bookmarkStart w:id="10" w:name="_Toc243616228"/>
       <w:r>
         <w:t>1.4. Thang đo Cantril Ladder</w:t>
       </w:r>
@@ -5772,7 +5772,7 @@
       <w:pPr>
         <w:pStyle w:val="Heading2"/>
       </w:pPr>
-      <w:bookmarkStart w:id="11" w:name="_Toc243615182"/>
+      <w:bookmarkStart w:id="11" w:name="_Toc243616229"/>
       <w:r>
         <w:t>1.5. Mô hình Dystopia và Dystopia Residual</w:t>
       </w:r>
@@ -5805,7 +5805,7 @@
       <w:pPr>
         <w:pStyle w:val="Heading2"/>
       </w:pPr>
-      <w:bookmarkStart w:id="12" w:name="_Toc243615183"/>
+      <w:bookmarkStart w:id="12" w:name="_Toc243616230"/>
       <w:r>
         <w:t>1.6. Sáu biến cơ sở</w:t>
       </w:r>
@@ -6526,7 +6526,7 @@
       <w:pPr>
         <w:pStyle w:val="Heading2"/>
       </w:pPr>
-      <w:bookmarkStart w:id="13" w:name="_Toc243615184"/>
+      <w:bookmarkStart w:id="13" w:name="_Toc243616231"/>
       <w:r>
         <w:t>1.7. Quy tắc vàng của đề tài</w:t>
       </w:r>
@@ -6593,7 +6593,7 @@
       <w:pPr>
         <w:pStyle w:val="Heading2"/>
       </w:pPr>
-      <w:bookmarkStart w:id="14" w:name="_Toc243615185"/>
+      <w:bookmarkStart w:id="14" w:name="_Toc243616232"/>
       <w:r>
         <w:lastRenderedPageBreak/>
         <w:t>1.8. Đối chiếu 11 bước pipeline với cấu trúc báo cáo</w:t>
@@ -7536,7 +7536,7 @@
       <w:pPr>
         <w:pStyle w:val="Heading1"/>
       </w:pPr>
-      <w:bookmarkStart w:id="15" w:name="_Toc243615186"/>
+      <w:bookmarkStart w:id="15" w:name="_Toc243616233"/>
       <w:r>
         <w:lastRenderedPageBreak/>
         <w:t>CHƯƠNG 2: THU THẬP DỮ LIỆU VÀ KHÁM PHÁ EDA</w:t>
@@ -7547,7 +7547,7 @@
       <w:pPr>
         <w:pStyle w:val="Heading2"/>
       </w:pPr>
-      <w:bookmarkStart w:id="16" w:name="_Toc243615187"/>
+      <w:bookmarkStart w:id="16" w:name="_Toc243616234"/>
       <w:r>
         <w:t xml:space="preserve">2.1. </w:t>
       </w:r>
@@ -8169,7 +8169,7 @@
       <w:pPr>
         <w:pStyle w:val="Heading2"/>
       </w:pPr>
-      <w:bookmarkStart w:id="17" w:name="_Toc243615188"/>
+      <w:bookmarkStart w:id="17" w:name="_Toc243616235"/>
       <w:r>
         <w:t>2.2. Đồng nhất tên cột</w:t>
       </w:r>
@@ -8214,7 +8214,7 @@
       <w:pPr>
         <w:pStyle w:val="Heading2"/>
       </w:pPr>
-      <w:bookmarkStart w:id="18" w:name="_Toc243615189"/>
+      <w:bookmarkStart w:id="18" w:name="_Toc243616236"/>
       <w:r>
         <w:t>2.3. Xử lý giá trị khuyết của UAE năm 2018</w:t>
       </w:r>
@@ -8240,7 +8240,7 @@
       <w:pPr>
         <w:pStyle w:val="Heading2"/>
       </w:pPr>
-      <w:bookmarkStart w:id="19" w:name="_Toc243615190"/>
+      <w:bookmarkStart w:id="19" w:name="_Toc243616237"/>
       <w:r>
         <w:t>2.4. Chuẩn hóa tên quốc gia và bổ sung mã ISO-3</w:t>
       </w:r>
@@ -8272,7 +8272,7 @@
       <w:pPr>
         <w:pStyle w:val="Heading2"/>
       </w:pPr>
-      <w:bookmarkStart w:id="20" w:name="_Toc243615191"/>
+      <w:bookmarkStart w:id="20" w:name="_Toc243616238"/>
       <w:r>
         <w:lastRenderedPageBreak/>
         <w:t>2.5. Bảng dữ liệu trung gian</w:t>
@@ -8297,7 +8297,7 @@
       <w:pPr>
         <w:pStyle w:val="Heading2"/>
       </w:pPr>
-      <w:bookmarkStart w:id="21" w:name="_Toc243615192"/>
+      <w:bookmarkStart w:id="21" w:name="_Toc243616239"/>
       <w:r>
         <w:t>2.6. Phân tích hình dạng phân phối</w:t>
       </w:r>
@@ -8405,7 +8405,7 @@
       <w:pPr>
         <w:pStyle w:val="Heading2"/>
       </w:pPr>
-      <w:bookmarkStart w:id="22" w:name="_Toc243615193"/>
+      <w:bookmarkStart w:id="22" w:name="_Toc243616240"/>
       <w:r>
         <w:t>2.7. Tương quan Pearson</w:t>
       </w:r>
@@ -8483,7 +8483,7 @@
       <w:pPr>
         <w:pStyle w:val="Heading2"/>
       </w:pPr>
-      <w:bookmarkStart w:id="23" w:name="_Toc243615194"/>
+      <w:bookmarkStart w:id="23" w:name="_Toc243616241"/>
       <w:r>
         <w:lastRenderedPageBreak/>
         <w:t>2.8. Nhận diện ngoại lai</w:t>
@@ -8576,7 +8576,7 @@
       <w:pPr>
         <w:pStyle w:val="Heading2"/>
       </w:pPr>
-      <w:bookmarkStart w:id="24" w:name="_Toc243615195"/>
+      <w:bookmarkStart w:id="24" w:name="_Toc243616242"/>
       <w:r>
         <w:t>2.9. Kết luận</w:t>
       </w:r>
@@ -8594,7 +8594,7 @@
       <w:pPr>
         <w:pStyle w:val="Heading1"/>
       </w:pPr>
-      <w:bookmarkStart w:id="25" w:name="_Toc243615196"/>
+      <w:bookmarkStart w:id="25" w:name="_Toc243616243"/>
       <w:r>
         <w:lastRenderedPageBreak/>
         <w:t>CHƯƠNG 3: PHƯƠNG PHÁP LUẬN VÀ THỬ NGHIỆM MÔ HÌNH</w:t>
@@ -8605,7 +8605,7 @@
       <w:pPr>
         <w:pStyle w:val="Heading2"/>
       </w:pPr>
-      <w:bookmarkStart w:id="26" w:name="_Toc243615197"/>
+      <w:bookmarkStart w:id="26" w:name="_Toc243616244"/>
       <w:r>
         <w:t>3.1. Ma trận đặc trưng</w:t>
       </w:r>
@@ -8623,7 +8623,7 @@
       <w:pPr>
         <w:pStyle w:val="Heading2"/>
       </w:pPr>
-      <w:bookmarkStart w:id="27" w:name="_Toc243615198"/>
+      <w:bookmarkStart w:id="27" w:name="_Toc243616245"/>
       <w:r>
         <w:t>3.2. So sánh ba phương án chuẩn hóa</w:t>
       </w:r>
@@ -9623,7 +9623,7 @@
       <w:pPr>
         <w:pStyle w:val="Heading2"/>
       </w:pPr>
-      <w:bookmarkStart w:id="28" w:name="_Toc243615199"/>
+      <w:bookmarkStart w:id="28" w:name="_Toc243616246"/>
       <w:r>
         <w:t>3.3. Thuật toán K-Means cài đặt từ đầu</w:t>
       </w:r>
@@ -9807,7 +9807,7 @@
       <w:pPr>
         <w:pStyle w:val="Heading2"/>
       </w:pPr>
-      <w:bookmarkStart w:id="29" w:name="_Toc243615200"/>
+      <w:bookmarkStart w:id="29" w:name="_Toc243616247"/>
       <w:r>
         <w:t>3.4. Phân cấp Ward cài đặt từ đầu</w:t>
       </w:r>
@@ -10788,7 +10788,7 @@
       <w:pPr>
         <w:pStyle w:val="Heading2"/>
       </w:pPr>
-      <w:bookmarkStart w:id="30" w:name="_Toc243615201"/>
+      <w:bookmarkStart w:id="30" w:name="_Toc243616248"/>
       <w:r>
         <w:t>3.5. DBSCAN cài đặt từ đầu</w:t>
       </w:r>
@@ -11355,7 +11355,7 @@
       <w:pPr>
         <w:pStyle w:val="Heading2"/>
       </w:pPr>
-      <w:bookmarkStart w:id="31" w:name="_Toc243615202"/>
+      <w:bookmarkStart w:id="31" w:name="_Toc243616249"/>
       <w:r>
         <w:t>3.6. Các độ đo đánh giá</w:t>
       </w:r>
@@ -11646,7 +11646,7 @@
       <w:pPr>
         <w:pStyle w:val="Heading2"/>
       </w:pPr>
-      <w:bookmarkStart w:id="32" w:name="_Toc243615203"/>
+      <w:bookmarkStart w:id="32" w:name="_Toc243616250"/>
       <w:r>
         <w:t>3.7. Khảo sát số cụm tối ưu</w:t>
       </w:r>
@@ -12321,7 +12321,7 @@
       <w:pPr>
         <w:pStyle w:val="Heading2"/>
       </w:pPr>
-      <w:bookmarkStart w:id="33" w:name="_Toc243615204"/>
+      <w:bookmarkStart w:id="33" w:name="_Toc243616251"/>
       <w:r>
         <w:t>3.8. Kiểm tra độ ổn định</w:t>
       </w:r>
@@ -14119,7 +14119,7 @@
       <w:pPr>
         <w:pStyle w:val="Heading2"/>
       </w:pPr>
-      <w:bookmarkStart w:id="34" w:name="_Toc243615205"/>
+      <w:bookmarkStart w:id="34" w:name="_Toc243616252"/>
       <w:r>
         <w:t>3.9. Quy trình thực nghiệm</w:t>
       </w:r>
@@ -14167,7 +14167,7 @@
       <w:pPr>
         <w:pStyle w:val="Heading1"/>
       </w:pPr>
-      <w:bookmarkStart w:id="35" w:name="_Toc243615206"/>
+      <w:bookmarkStart w:id="35" w:name="_Toc243616253"/>
       <w:r>
         <w:lastRenderedPageBreak/>
         <w:t>CHƯƠNG 4: KẾT QUẢ THỰC NGHIỆM VÀ DIỄN GIẢI TRI THỨC</w:t>
@@ -14178,7 +14178,7 @@
       <w:pPr>
         <w:pStyle w:val="Heading2"/>
       </w:pPr>
-      <w:bookmarkStart w:id="36" w:name="_Toc243615207"/>
+      <w:bookmarkStart w:id="36" w:name="_Toc243616254"/>
       <w:r>
         <w:t>4.1. Chỉ số đánh giá của K-Means qua các năm</w:t>
       </w:r>
@@ -14929,7 +14929,7 @@
       <w:pPr>
         <w:pStyle w:val="Heading2"/>
       </w:pPr>
-      <w:bookmarkStart w:id="37" w:name="_Toc243615208"/>
+      <w:bookmarkStart w:id="37" w:name="_Toc243616255"/>
       <w:r>
         <w:t>4.2. Chỉ số đánh giá của Ward và so sánh với K-Means</w:t>
       </w:r>
@@ -15653,7 +15653,7 @@
       <w:pPr>
         <w:pStyle w:val="Heading2"/>
       </w:pPr>
-      <w:bookmarkStart w:id="38" w:name="_Toc243615209"/>
+      <w:bookmarkStart w:id="38" w:name="_Toc243616256"/>
       <w:r>
         <w:lastRenderedPageBreak/>
         <w:t>4.3. Chân dung ba cụm</w:t>
@@ -17111,7 +17111,7 @@
       <w:pPr>
         <w:pStyle w:val="Heading2"/>
       </w:pPr>
-      <w:bookmarkStart w:id="39" w:name="_Toc243615210"/>
+      <w:bookmarkStart w:id="39" w:name="_Toc243616257"/>
       <w:r>
         <w:t>4.4. Hậu kiểm độc lập bằng điểm hạnh phúc</w:t>
       </w:r>
@@ -17929,7 +17929,7 @@
       <w:pPr>
         <w:pStyle w:val="Heading2"/>
       </w:pPr>
-      <w:bookmarkStart w:id="40" w:name="_Toc243615211"/>
+      <w:bookmarkStart w:id="40" w:name="_Toc243616258"/>
       <w:r>
         <w:t>4.5. Cấu hình đối chứng k = 3</w:t>
       </w:r>
@@ -19405,7 +19405,7 @@
       <w:pPr>
         <w:pStyle w:val="Heading2"/>
       </w:pPr>
-      <w:bookmarkStart w:id="41" w:name="_Toc243615212"/>
+      <w:bookmarkStart w:id="41" w:name="_Toc243616259"/>
       <w:r>
         <w:t>4.6. Ghép cụm liên năm</w:t>
       </w:r>
@@ -20947,7 +20947,7 @@
       <w:pPr>
         <w:pStyle w:val="Heading2"/>
       </w:pPr>
-      <w:bookmarkStart w:id="42" w:name="_Toc243615213"/>
+      <w:bookmarkStart w:id="42" w:name="_Toc243616260"/>
       <w:r>
         <w:t>4.7. Dịch chuyển cụm của 156 quốc gia</w:t>
       </w:r>
@@ -21533,7 +21533,7 @@
       <w:pPr>
         <w:pStyle w:val="Heading2"/>
       </w:pPr>
-      <w:bookmarkStart w:id="43" w:name="_Toc243615214"/>
+      <w:bookmarkStart w:id="43" w:name="_Toc243616261"/>
       <w:r>
         <w:t>4.8. Phân bố cụm trên không gian PCA 2D</w:t>
       </w:r>
@@ -21678,7 +21678,7 @@
       <w:pPr>
         <w:pStyle w:val="Heading2"/>
       </w:pPr>
-      <w:bookmarkStart w:id="44" w:name="_Toc243615215"/>
+      <w:bookmarkStart w:id="44" w:name="_Toc243616262"/>
       <w:r>
         <w:t>4.9. Kết luận chương 4</w:t>
       </w:r>
@@ -21714,7 +21714,7 @@
       <w:pPr>
         <w:pStyle w:val="Heading1"/>
       </w:pPr>
-      <w:bookmarkStart w:id="45" w:name="_Toc243615216"/>
+      <w:bookmarkStart w:id="45" w:name="_Toc243616263"/>
       <w:r>
         <w:lastRenderedPageBreak/>
         <w:t>CHƯƠNG 5: ỨNG DỤNG DEMO, KẾT LUẬN VÀ HƯỚNG PHÁT TRIỂN</w:t>
@@ -21725,7 +21725,7 @@
       <w:pPr>
         <w:pStyle w:val="Heading2"/>
       </w:pPr>
-      <w:bookmarkStart w:id="46" w:name="_Toc243615217"/>
+      <w:bookmarkStart w:id="46" w:name="_Toc243616264"/>
       <w:r>
         <w:t>5.1. Kiến trúc ứng dụng demo Streamlit</w:t>
       </w:r>
@@ -21867,7 +21867,7 @@
       <w:pPr>
         <w:pStyle w:val="Heading2"/>
       </w:pPr>
-      <w:bookmarkStart w:id="47" w:name="_Toc243615218"/>
+      <w:bookmarkStart w:id="47" w:name="_Toc243616265"/>
       <w:r>
         <w:t>5.2. Kiểm thử ứng dụng</w:t>
       </w:r>
@@ -21891,7 +21891,7 @@
       <w:pPr>
         <w:pStyle w:val="Heading2"/>
       </w:pPr>
-      <w:bookmarkStart w:id="48" w:name="_Toc243615219"/>
+      <w:bookmarkStart w:id="48" w:name="_Toc243616266"/>
       <w:r>
         <w:t>5.3. Đóng góp chính của đồ án</w:t>
       </w:r>
@@ -21979,7 +21979,7 @@
       <w:pPr>
         <w:pStyle w:val="Heading2"/>
       </w:pPr>
-      <w:bookmarkStart w:id="49" w:name="_Toc243615220"/>
+      <w:bookmarkStart w:id="49" w:name="_Toc243616267"/>
       <w:r>
         <w:t>5.4. Hạn chế</w:t>
       </w:r>
@@ -22019,7 +22019,7 @@
       <w:pPr>
         <w:pStyle w:val="Heading2"/>
       </w:pPr>
-      <w:bookmarkStart w:id="50" w:name="_Toc243615221"/>
+      <w:bookmarkStart w:id="50" w:name="_Toc243616268"/>
       <w:r>
         <w:t>5.5. Hướng phát triển</w:t>
       </w:r>
@@ -22095,7 +22095,7 @@
       <w:pPr>
         <w:pStyle w:val="Heading2"/>
       </w:pPr>
-      <w:bookmarkStart w:id="51" w:name="_Toc243615222"/>
+      <w:bookmarkStart w:id="51" w:name="_Toc243616269"/>
       <w:r>
         <w:t>5.6. Kết luận</w:t>
       </w:r>
@@ -22119,7 +22119,7 @@
       <w:pPr>
         <w:pStyle w:val="Heading1"/>
       </w:pPr>
-      <w:bookmarkStart w:id="52" w:name="_Toc243615223"/>
+      <w:bookmarkStart w:id="52" w:name="_Toc243616270"/>
       <w:r>
         <w:lastRenderedPageBreak/>
         <w:t>TÀI LIỆU THAM KHẢO</w:t>
@@ -22534,7 +22534,7 @@
       <w:pPr>
         <w:pStyle w:val="Heading1"/>
       </w:pPr>
-      <w:bookmarkStart w:id="53" w:name="_Toc243615224"/>
+      <w:bookmarkStart w:id="53" w:name="_Toc243616271"/>
       <w:r>
         <w:lastRenderedPageBreak/>
         <w:t>PHỤ LỤC A: BẢNG KHẢO SÁT SỐ CỤM NĂM 2019</w:t>
@@ -23247,7 +23247,7 @@
       <w:pPr>
         <w:pStyle w:val="Heading1"/>
       </w:pPr>
-      <w:bookmarkStart w:id="54" w:name="_Toc243615225"/>
+      <w:bookmarkStart w:id="54" w:name="_Toc243616272"/>
       <w:r>
         <w:lastRenderedPageBreak/>
         <w:t>PHỤ LỤC B: KẾT QUẢ QUÉT THAM SỐ DBSCAN NĂM 2019</w:t>

</xml_diff>

<commit_message>
báo cáo: hoàn thiện bộ slide 17 trang có hiệu ứng chuyển cảnh và cập nhật tài liệu word pdf mốc m4
</commit_message>
<xml_diff>
--- a/reports/final_report/Nhom12_BaoCao.docx
+++ b/reports/final_report/Nhom12_BaoCao.docx
@@ -35,20 +35,6 @@
         <w:spacing w:after="120" w:line="288" w:lineRule="auto"/>
         <w:jc w:val="center"/>
       </w:pPr>
-      <w:r>
-        <w:rPr>
-          <w:b/>
-          <w:color w:val="000000"/>
-          <w:sz w:val="28"/>
-        </w:rPr>
-        <w:t>BỘ MÔN KHOA HỌC DỮ LIỆU</w:t>
-      </w:r>
-    </w:p>
-    <w:p>
-      <w:pPr>
-        <w:spacing w:after="120" w:line="288" w:lineRule="auto"/>
-        <w:jc w:val="center"/>
-      </w:pPr>
     </w:p>
     <w:p>
       <w:pPr>
@@ -81,6 +67,48 @@
         <w:spacing w:after="120" w:line="288" w:lineRule="auto"/>
         <w:jc w:val="center"/>
       </w:pPr>
+      <w:r>
+        <w:rPr>
+          <w:noProof/>
+        </w:rPr>
+        <w:drawing>
+          <wp:inline distT="0" distB="0" distL="0" distR="0" wp14:anchorId="3A2DDCE0" wp14:editId="40B341BE">
+            <wp:extent cx="2143125" cy="1865376"/>
+            <wp:effectExtent l="0" t="0" r="0" b="1905"/>
+            <wp:docPr id="12" name="Picture 1" descr="HUIT"/>
+            <wp:cNvGraphicFramePr>
+              <a:graphicFrameLocks xmlns:a="http://schemas.openxmlformats.org/drawingml/2006/main" noChangeAspect="1"/>
+            </wp:cNvGraphicFramePr>
+            <a:graphic xmlns:a="http://schemas.openxmlformats.org/drawingml/2006/main">
+              <a:graphicData uri="http://schemas.openxmlformats.org/drawingml/2006/picture">
+                <pic:pic xmlns:pic="http://schemas.openxmlformats.org/drawingml/2006/picture">
+                  <pic:nvPicPr>
+                    <pic:cNvPr id="12" name="Picture 12" descr="HUIT"/>
+                    <pic:cNvPicPr>
+                      <a:picLocks noChangeAspect="1"/>
+                    </pic:cNvPicPr>
+                  </pic:nvPicPr>
+                  <pic:blipFill>
+                    <a:blip r:embed="rId8"/>
+                    <a:stretch>
+                      <a:fillRect/>
+                    </a:stretch>
+                  </pic:blipFill>
+                  <pic:spPr>
+                    <a:xfrm>
+                      <a:off x="0" y="0"/>
+                      <a:ext cx="2149236" cy="1870695"/>
+                    </a:xfrm>
+                    <a:prstGeom prst="rect">
+                      <a:avLst/>
+                    </a:prstGeom>
+                  </pic:spPr>
+                </pic:pic>
+              </a:graphicData>
+            </a:graphic>
+          </wp:inline>
+        </w:drawing>
+      </w:r>
     </w:p>
     <w:p>
       <w:pPr>
@@ -209,16 +237,18 @@
         <w:rPr>
           <w:b/>
           <w:color w:val="000000"/>
+          <w:sz w:val="44"/>
+          <w:szCs w:val="44"/>
         </w:rPr>
         <w:sectPr>
-          <w:headerReference w:type="default" r:id="rId8"/>
+          <w:headerReference w:type="default" r:id="rId9"/>
           <w:pgSz w:w="12240" w:h="15840"/>
           <w:pgMar w:top="1701" w:right="1134" w:bottom="1701" w:left="1701" w:header="720" w:footer="720" w:gutter="0"/>
-          <w:pgBorders w:offsetFrom="page">
-            <w:top w:val="single" w:sz="24" w:space="24" w:color="auto"/>
-            <w:left w:val="single" w:sz="24" w:space="24" w:color="auto"/>
-            <w:bottom w:val="single" w:sz="24" w:space="24" w:color="auto"/>
-            <w:right w:val="single" w:sz="24" w:space="24" w:color="auto"/>
+          <w:pgBorders w:display="firstPage" w:offsetFrom="page">
+            <w:top w:val="twistedLines1" w:sz="31" w:space="24" w:color="548DD4" w:themeColor="text2" w:themeTint="99"/>
+            <w:left w:val="twistedLines1" w:sz="31" w:space="24" w:color="548DD4" w:themeColor="text2" w:themeTint="99"/>
+            <w:bottom w:val="twistedLines1" w:sz="31" w:space="24" w:color="548DD4" w:themeColor="text2" w:themeTint="99"/>
+            <w:right w:val="twistedLines1" w:sz="31" w:space="24" w:color="548DD4" w:themeColor="text2" w:themeTint="99"/>
           </w:pgBorders>
           <w:cols w:space="720"/>
           <w:docGrid w:linePitch="360"/>
@@ -228,6 +258,8 @@
         <w:rPr>
           <w:b/>
           <w:color w:val="000000"/>
+          <w:sz w:val="44"/>
+          <w:szCs w:val="44"/>
         </w:rPr>
         <w:t>TP. Hồ Chí Minh, Năm 202</w:t>
       </w:r>
@@ -235,6 +267,8 @@
         <w:rPr>
           <w:b/>
           <w:color w:val="000000"/>
+          <w:sz w:val="44"/>
+          <w:szCs w:val="44"/>
         </w:rPr>
         <w:t>6</w:t>
       </w:r>
@@ -327,7 +361,19 @@
         <w:ind w:firstLine="720"/>
       </w:pPr>
       <w:r>
-        <w:t>Nhóm chạy năm thí nghiệm độc lập, mỗi năm gom cụm riêng trên ma trận sáu đặc trưng đã chuẩn hóa Z-score. Số cụm tối ưu theo Silhouette là k* = 3 ở cả năm năm, với Silhouette trong khoảng 0,293–0,344 và Davies–Bouldin 1,00–1,07. Ba cụm có chân dung kinh tế – xã hội tách biệt và khi hậu kiểm bằng điểm hạnh phúc thực tế thì phân hóa rõ: phân tích phương sai một nhân tố cho F từ 107,09 đến 159,18. Bảng theo dõi dịch chuyển của 156 quốc gia cho thấy 142 quốc gia giữ nguyên cụm cả năm năm, 4 quốc gia thăng hạng và 2 quốc gia tụt hạng.</w:t>
+        <w:t xml:space="preserve">Nhóm chạy năm thí nghiệm độc lập, mỗi năm gom cụm riêng trên ma trận sáu đặc trưng đã chuẩn hóa Z-score. Số cụm tối ưu theo Silhouette là k* = 3 ở cả </w:t>
+      </w:r>
+      <w:r>
+        <w:t>5 năm</w:t>
+      </w:r>
+      <w:r>
+        <w:t xml:space="preserve">, với Silhouette trong khoảng 0,293–0,344 và Davies–Bouldin 1,00–1,07. Ba cụm có chân dung kinh tế – xã hội tách biệt và khi hậu kiểm bằng điểm hạnh phúc thực tế thì phân hóa rõ: phân tích phương sai một nhân tố cho F từ 107,09 đến 159,18. Bảng theo dõi dịch chuyển của 156 quốc gia cho thấy 142 quốc gia giữ nguyên cụm cả </w:t>
+      </w:r>
+      <w:r>
+        <w:t>5 năm</w:t>
+      </w:r>
+      <w:r>
+        <w:t>, 4 quốc gia thăng hạng và 2 quốc gia tụt hạng.</w:t>
       </w:r>
     </w:p>
     <w:p>
@@ -2146,7 +2192,7 @@
             <w:noProof/>
             <w:webHidden/>
           </w:rPr>
-          <w:t>14</w:t>
+          <w:t>13</w:t>
         </w:r>
         <w:r>
           <w:rPr>
@@ -2219,7 +2265,7 @@
             <w:noProof/>
             <w:webHidden/>
           </w:rPr>
-          <w:t>15</w:t>
+          <w:t>14</w:t>
         </w:r>
         <w:r>
           <w:rPr>
@@ -2292,7 +2338,7 @@
             <w:noProof/>
             <w:webHidden/>
           </w:rPr>
-          <w:t>15</w:t>
+          <w:t>14</w:t>
         </w:r>
         <w:r>
           <w:rPr>
@@ -2365,7 +2411,7 @@
             <w:noProof/>
             <w:webHidden/>
           </w:rPr>
-          <w:t>15</w:t>
+          <w:t>14</w:t>
         </w:r>
         <w:r>
           <w:rPr>
@@ -2438,7 +2484,7 @@
             <w:noProof/>
             <w:webHidden/>
           </w:rPr>
-          <w:t>16</w:t>
+          <w:t>15</w:t>
         </w:r>
         <w:r>
           <w:rPr>
@@ -2511,7 +2557,7 @@
             <w:noProof/>
             <w:webHidden/>
           </w:rPr>
-          <w:t>16</w:t>
+          <w:t>15</w:t>
         </w:r>
         <w:r>
           <w:rPr>
@@ -2543,15 +2589,7 @@
             <w:rStyle w:val="Hyperlink"/>
             <w:noProof/>
           </w:rPr>
-          <w:t>2.5. Bảng dữ liệu tru</w:t>
-        </w:r>
-        <w:r>
-          <w:rPr>
-            <w:rStyle w:val="Hyperlink"/>
-            <w:noProof/>
-          </w:rPr>
-          <w:lastRenderedPageBreak/>
-          <w:t>ng gian</w:t>
+          <w:t>2.5. Bảng dữ liệu trung gian</w:t>
         </w:r>
         <w:r>
           <w:rPr>
@@ -2592,7 +2630,7 @@
             <w:noProof/>
             <w:webHidden/>
           </w:rPr>
-          <w:t>17</w:t>
+          <w:t>16</w:t>
         </w:r>
         <w:r>
           <w:rPr>
@@ -2665,7 +2703,7 @@
             <w:noProof/>
             <w:webHidden/>
           </w:rPr>
-          <w:t>17</w:t>
+          <w:t>16</w:t>
         </w:r>
         <w:r>
           <w:rPr>
@@ -2738,7 +2776,7 @@
             <w:noProof/>
             <w:webHidden/>
           </w:rPr>
-          <w:t>18</w:t>
+          <w:t>17</w:t>
         </w:r>
         <w:r>
           <w:rPr>
@@ -2811,7 +2849,7 @@
             <w:noProof/>
             <w:webHidden/>
           </w:rPr>
-          <w:t>19</w:t>
+          <w:t>18</w:t>
         </w:r>
         <w:r>
           <w:rPr>
@@ -2884,7 +2922,7 @@
             <w:noProof/>
             <w:webHidden/>
           </w:rPr>
-          <w:t>19</w:t>
+          <w:t>18</w:t>
         </w:r>
         <w:r>
           <w:rPr>
@@ -2957,7 +2995,7 @@
             <w:noProof/>
             <w:webHidden/>
           </w:rPr>
-          <w:t>20</w:t>
+          <w:t>19</w:t>
         </w:r>
         <w:r>
           <w:rPr>
@@ -3030,7 +3068,7 @@
             <w:noProof/>
             <w:webHidden/>
           </w:rPr>
-          <w:t>20</w:t>
+          <w:t>19</w:t>
         </w:r>
         <w:r>
           <w:rPr>
@@ -3103,7 +3141,7 @@
             <w:noProof/>
             <w:webHidden/>
           </w:rPr>
-          <w:t>20</w:t>
+          <w:t>19</w:t>
         </w:r>
         <w:r>
           <w:rPr>
@@ -3176,7 +3214,7 @@
             <w:noProof/>
             <w:webHidden/>
           </w:rPr>
-          <w:t>21</w:t>
+          <w:t>20</w:t>
         </w:r>
         <w:r>
           <w:rPr>
@@ -3249,7 +3287,7 @@
             <w:noProof/>
             <w:webHidden/>
           </w:rPr>
-          <w:t>21</w:t>
+          <w:t>20</w:t>
         </w:r>
         <w:r>
           <w:rPr>
@@ -3322,7 +3360,7 @@
             <w:noProof/>
             <w:webHidden/>
           </w:rPr>
-          <w:t>22</w:t>
+          <w:t>21</w:t>
         </w:r>
         <w:r>
           <w:rPr>
@@ -3395,7 +3433,7 @@
             <w:noProof/>
             <w:webHidden/>
           </w:rPr>
-          <w:t>23</w:t>
+          <w:t>22</w:t>
         </w:r>
         <w:r>
           <w:rPr>
@@ -3468,7 +3506,7 @@
             <w:noProof/>
             <w:webHidden/>
           </w:rPr>
-          <w:t>23</w:t>
+          <w:t>22</w:t>
         </w:r>
         <w:r>
           <w:rPr>
@@ -3541,7 +3579,7 @@
             <w:noProof/>
             <w:webHidden/>
           </w:rPr>
-          <w:t>25</w:t>
+          <w:t>24</w:t>
         </w:r>
         <w:r>
           <w:rPr>
@@ -3614,7 +3652,7 @@
             <w:noProof/>
             <w:webHidden/>
           </w:rPr>
-          <w:t>26</w:t>
+          <w:t>25</w:t>
         </w:r>
         <w:r>
           <w:rPr>
@@ -3687,7 +3725,7 @@
             <w:noProof/>
             <w:webHidden/>
           </w:rPr>
-          <w:t>27</w:t>
+          <w:t>26</w:t>
         </w:r>
         <w:r>
           <w:rPr>
@@ -3760,7 +3798,7 @@
             <w:noProof/>
             <w:webHidden/>
           </w:rPr>
-          <w:t>27</w:t>
+          <w:t>26</w:t>
         </w:r>
         <w:r>
           <w:rPr>
@@ -3833,7 +3871,7 @@
             <w:noProof/>
             <w:webHidden/>
           </w:rPr>
-          <w:t>27</w:t>
+          <w:t>26</w:t>
         </w:r>
         <w:r>
           <w:rPr>
@@ -3906,7 +3944,7 @@
             <w:noProof/>
             <w:webHidden/>
           </w:rPr>
-          <w:t>28</w:t>
+          <w:t>27</w:t>
         </w:r>
         <w:r>
           <w:rPr>
@@ -3979,7 +4017,7 @@
             <w:noProof/>
             <w:webHidden/>
           </w:rPr>
-          <w:t>29</w:t>
+          <w:t>28</w:t>
         </w:r>
         <w:r>
           <w:rPr>
@@ -4052,7 +4090,7 @@
             <w:noProof/>
             <w:webHidden/>
           </w:rPr>
-          <w:t>31</w:t>
+          <w:t>30</w:t>
         </w:r>
         <w:r>
           <w:rPr>
@@ -4125,7 +4163,7 @@
             <w:noProof/>
             <w:webHidden/>
           </w:rPr>
-          <w:t>31</w:t>
+          <w:t>30</w:t>
         </w:r>
         <w:r>
           <w:rPr>
@@ -4198,7 +4236,7 @@
             <w:noProof/>
             <w:webHidden/>
           </w:rPr>
-          <w:t>32</w:t>
+          <w:t>31</w:t>
         </w:r>
         <w:r>
           <w:rPr>
@@ -4271,7 +4309,7 @@
             <w:noProof/>
             <w:webHidden/>
           </w:rPr>
-          <w:t>34</w:t>
+          <w:t>33</w:t>
         </w:r>
         <w:r>
           <w:rPr>
@@ -4344,7 +4382,7 @@
             <w:noProof/>
             <w:webHidden/>
           </w:rPr>
-          <w:t>35</w:t>
+          <w:t>34</w:t>
         </w:r>
         <w:r>
           <w:rPr>
@@ -4417,7 +4455,7 @@
             <w:noProof/>
             <w:webHidden/>
           </w:rPr>
-          <w:t>36</w:t>
+          <w:t>35</w:t>
         </w:r>
         <w:r>
           <w:rPr>
@@ -4490,7 +4528,7 @@
             <w:noProof/>
             <w:webHidden/>
           </w:rPr>
-          <w:t>36</w:t>
+          <w:t>35</w:t>
         </w:r>
         <w:r>
           <w:rPr>
@@ -4563,7 +4601,7 @@
             <w:noProof/>
             <w:webHidden/>
           </w:rPr>
-          <w:t>37</w:t>
+          <w:t>36</w:t>
         </w:r>
         <w:r>
           <w:rPr>
@@ -4636,7 +4674,7 @@
             <w:noProof/>
             <w:webHidden/>
           </w:rPr>
-          <w:t>37</w:t>
+          <w:t>36</w:t>
         </w:r>
         <w:r>
           <w:rPr>
@@ -4709,7 +4747,7 @@
             <w:noProof/>
             <w:webHidden/>
           </w:rPr>
-          <w:t>38</w:t>
+          <w:t>37</w:t>
         </w:r>
         <w:r>
           <w:rPr>
@@ -4782,7 +4820,7 @@
             <w:noProof/>
             <w:webHidden/>
           </w:rPr>
-          <w:t>38</w:t>
+          <w:t>37</w:t>
         </w:r>
         <w:r>
           <w:rPr>
@@ -4855,7 +4893,7 @@
             <w:noProof/>
             <w:webHidden/>
           </w:rPr>
-          <w:t>39</w:t>
+          <w:t>38</w:t>
         </w:r>
         <w:r>
           <w:rPr>
@@ -4928,7 +4966,7 @@
             <w:noProof/>
             <w:webHidden/>
           </w:rPr>
-          <w:t>40</w:t>
+          <w:t>39</w:t>
         </w:r>
         <w:r>
           <w:rPr>
@@ -5001,7 +5039,7 @@
             <w:noProof/>
             <w:webHidden/>
           </w:rPr>
-          <w:t>41</w:t>
+          <w:t>40</w:t>
         </w:r>
         <w:r>
           <w:rPr>
@@ -5074,7 +5112,7 @@
             <w:noProof/>
             <w:webHidden/>
           </w:rPr>
-          <w:t>42</w:t>
+          <w:t>41</w:t>
         </w:r>
         <w:r>
           <w:rPr>
@@ -5218,7 +5256,13 @@
         <w:jc w:val="left"/>
       </w:pPr>
       <w:r>
-        <w:t>Bảng 3.4: Chỉ số ARI của các cấu hình dùng Z-score (mười seed, năm năm)</w:t>
+        <w:t xml:space="preserve">Bảng 3.4: Chỉ số ARI của các cấu hình dùng Z-score (mười seed, </w:t>
+      </w:r>
+      <w:r>
+        <w:t>5 năm</w:t>
+      </w:r>
+      <w:r>
+        <w:t>)</w:t>
       </w:r>
       <w:r>
         <w:tab/>
@@ -5269,7 +5313,10 @@
         <w:jc w:val="left"/>
       </w:pPr>
       <w:r>
-        <w:t>Bảng 4.3: Số lượng quốc gia và điểm hạnh phúc trung bình theo cụm qua năm năm</w:t>
+        <w:t xml:space="preserve">Bảng 4.3: Số lượng quốc gia và điểm hạnh phúc trung bình theo cụm qua </w:t>
+      </w:r>
+      <w:r>
+        <w:t>5 năm</w:t>
       </w:r>
       <w:r>
         <w:tab/>
@@ -5303,7 +5350,10 @@
         <w:jc w:val="left"/>
       </w:pPr>
       <w:r>
-        <w:t>Bảng 4.5: Chỉ số của cấu hình đối chứng k = 3 cho hai thuật toán qua năm năm</w:t>
+        <w:t xml:space="preserve">Bảng 4.5: Chỉ số của cấu hình đối chứng k = 3 cho hai thuật toán qua </w:t>
+      </w:r>
+      <w:r>
+        <w:t>5 năm</w:t>
       </w:r>
       <w:r>
         <w:tab/>
@@ -5506,7 +5556,10 @@
         <w:jc w:val="left"/>
       </w:pPr>
       <w:r>
-        <w:t>Hình 4.2: Hậu kiểm độc lập, phân bố điểm hạnh phúc thực tế giữa ba cụm qua năm năm</w:t>
+        <w:t xml:space="preserve">Hình 4.2: Hậu kiểm độc lập, phân bố điểm hạnh phúc thực tế giữa ba cụm qua </w:t>
+      </w:r>
+      <w:r>
+        <w:t>5 năm</w:t>
       </w:r>
       <w:r>
         <w:tab/>
@@ -5989,12 +6042,21 @@
               <w:spacing w:after="0"/>
               <w:jc w:val="left"/>
             </w:pPr>
-            <w:r>
-              <w:rPr>
-                <w:color w:val="000000"/>
-                <w:sz w:val="22"/>
-              </w:rPr>
-              <w:t>Economy..GDP.per.Capita.</w:t>
+            <w:proofErr w:type="gramStart"/>
+            <w:r>
+              <w:rPr>
+                <w:color w:val="000000"/>
+                <w:sz w:val="22"/>
+              </w:rPr>
+              <w:t>Economy..</w:t>
+            </w:r>
+            <w:proofErr w:type="gramEnd"/>
+            <w:r>
+              <w:rPr>
+                <w:color w:val="000000"/>
+                <w:sz w:val="22"/>
+              </w:rPr>
+              <w:t>GDP.per.Capita.</w:t>
             </w:r>
           </w:p>
         </w:tc>
@@ -6173,12 +6235,21 @@
               <w:spacing w:after="0"/>
               <w:jc w:val="left"/>
             </w:pPr>
-            <w:r>
-              <w:rPr>
-                <w:color w:val="000000"/>
-                <w:sz w:val="22"/>
-              </w:rPr>
-              <w:t>Health..Life.Expectancy.</w:t>
+            <w:proofErr w:type="gramStart"/>
+            <w:r>
+              <w:rPr>
+                <w:color w:val="000000"/>
+                <w:sz w:val="22"/>
+              </w:rPr>
+              <w:t>Health..</w:t>
+            </w:r>
+            <w:proofErr w:type="gramEnd"/>
+            <w:r>
+              <w:rPr>
+                <w:color w:val="000000"/>
+                <w:sz w:val="22"/>
+              </w:rPr>
+              <w:t>Life.Expectancy.</w:t>
             </w:r>
           </w:p>
         </w:tc>
@@ -6450,12 +6521,21 @@
               <w:spacing w:after="0"/>
               <w:jc w:val="left"/>
             </w:pPr>
-            <w:r>
-              <w:rPr>
-                <w:color w:val="000000"/>
-                <w:sz w:val="22"/>
-              </w:rPr>
-              <w:t>Trust..Government.Corruption.</w:t>
+            <w:proofErr w:type="gramStart"/>
+            <w:r>
+              <w:rPr>
+                <w:color w:val="000000"/>
+                <w:sz w:val="22"/>
+              </w:rPr>
+              <w:t>Trust..</w:t>
+            </w:r>
+            <w:proofErr w:type="gramEnd"/>
+            <w:r>
+              <w:rPr>
+                <w:color w:val="000000"/>
+                <w:sz w:val="22"/>
+              </w:rPr>
+              <w:t>Government.Corruption.</w:t>
             </w:r>
           </w:p>
         </w:tc>
@@ -6585,17 +6665,11 @@
       </w:r>
     </w:p>
     <w:p>
-      <w:r>
-        <w:br w:type="page"/>
-      </w:r>
-    </w:p>
-    <w:p>
       <w:pPr>
         <w:pStyle w:val="Heading2"/>
       </w:pPr>
       <w:bookmarkStart w:id="14" w:name="_Toc243616232"/>
       <w:r>
-        <w:lastRenderedPageBreak/>
         <w:t>1.8. Đối chiếu 11 bước pipeline với cấu trúc báo cáo</w:t>
       </w:r>
       <w:bookmarkEnd w:id="14"/>
@@ -8186,13 +8260,29 @@
         <w:t>,</w:t>
       </w:r>
       <w:r>
-        <w:t xml:space="preserve"> Economy, Economy..GDP.per.Capita. và GDP per capita đều về gdp_per_capita</w:t>
+        <w:t xml:space="preserve"> Economy, </w:t>
+      </w:r>
+      <w:proofErr w:type="gramStart"/>
+      <w:r>
+        <w:t>Economy..</w:t>
+      </w:r>
+      <w:proofErr w:type="gramEnd"/>
+      <w:r>
+        <w:t>GDP.per.Capita. và GDP per capita đều về gdp_per_capita</w:t>
       </w:r>
       <w:r>
         <w:t>,</w:t>
       </w:r>
       <w:r>
-        <w:t xml:space="preserve"> Family và Social support đều về social_support. Hàm standardize_columns áp từ điển này cho từng tệp trước khi ghép.</w:t>
+        <w:t xml:space="preserve"> Family và </w:t>
+      </w:r>
+      <w:proofErr w:type="gramStart"/>
+      <w:r>
+        <w:t>Social</w:t>
+      </w:r>
+      <w:proofErr w:type="gramEnd"/>
+      <w:r>
+        <w:t xml:space="preserve"> support đều về social_support. Hàm standardize_columns áp từ điển này cho từng tệp trước khi ghép.</w:t>
       </w:r>
     </w:p>
     <w:p>
@@ -8201,7 +8291,15 @@
       </w:pPr>
       <w:r>
         <w:lastRenderedPageBreak/>
-        <w:t>Ba cột sai số khảo sát (Standard Error, Lower/Upper Confidence Interval, Whisker.high, Whisker.low) bị loại. Lý do: đây là sai số chọn mẫu và khoảng tin cậy của cuộc khảo sát, không phản ánh mức sống của quốc gia</w:t>
+        <w:t xml:space="preserve">Ba cột sai số khảo sát (Standard Error, Lower/Upper Confidence Interval, Whisker.high, Whisker.low) bị loại. Lý </w:t>
+      </w:r>
+      <w:proofErr w:type="gramStart"/>
+      <w:r>
+        <w:t>do</w:t>
+      </w:r>
+      <w:proofErr w:type="gramEnd"/>
+      <w:r>
+        <w:t>: đây là sai số chọn mẫu và khoảng tin cậy của cuộc khảo sát, không phản ánh mức sống của quốc gia</w:t>
       </w:r>
       <w:r>
         <w:t>,</w:t>
@@ -8225,7 +8323,13 @@
         <w:ind w:firstLine="720"/>
       </w:pPr>
       <w:r>
-        <w:t>Tệp 2018 có đúng một giá trị khuyết trong toàn bộ năm năm: chỉ số Perceptions of corruption của United Arab Emirates. Nhóm không điền giá trị thiếu vì hai lý do. Thứ nhất, điền bằng trung bình sẽ tạo ra một giá trị giả cho một quốc gia, làm sai lệch kết quả gom cụm và không thể giải trình. Thứ hai, không thể bỏ cả cột corruption_perception chỉ vì một dòng, vì cột này là một trong sáu trụ cột và ảnh hưởng đến 155 quốc gia còn lại của năm 2018.</w:t>
+        <w:t xml:space="preserve">Tệp 2018 có đúng một giá trị khuyết trong toàn bộ </w:t>
+      </w:r>
+      <w:r>
+        <w:t>5 năm</w:t>
+      </w:r>
+      <w:r>
+        <w:t>: chỉ số Perceptions of corruption của United Arab Emirates. Nhóm không điền giá trị thiếu vì hai lý do. Thứ nhất, điền bằng trung bình sẽ tạo ra một giá trị giả cho một quốc gia, làm sai lệch kết quả gom cụm và không thể giải trình. Thứ hai, không thể bỏ cả cột corruption_perception chỉ vì một dòng, vì cột này là một trong sáu trụ cột và ảnh hưởng đến 155 quốc gia còn lại của năm 2018.</w:t>
       </w:r>
     </w:p>
     <w:p>
@@ -8265,7 +8369,13 @@
         <w:t>,</w:t>
       </w:r>
       <w:r>
-        <w:t xml:space="preserve"> bảng có 164 quốc gia duy nhất xuyên năm năm và 162 mã ISO-3 phân biệt. Mã ISO-3 là điều kiện cần để vẽ bản đồ Choropleth trong ứng dụng demo ở Chương 5.</w:t>
+        <w:t xml:space="preserve"> bảng có 164 quốc gia duy nhất xuyên </w:t>
+      </w:r>
+      <w:r>
+        <w:t>5 năm</w:t>
+      </w:r>
+      <w:r>
+        <w:t xml:space="preserve"> và 162 mã ISO-3 phân biệt. Mã ISO-3 là điều kiện cần để vẽ bản đồ Choropleth trong ứng dụng demo ở Chương 5.</w:t>
       </w:r>
     </w:p>
     <w:p>
@@ -8336,7 +8446,7 @@
                     <pic:cNvPicPr/>
                   </pic:nvPicPr>
                   <pic:blipFill>
-                    <a:blip r:embed="rId9"/>
+                    <a:blip r:embed="rId10"/>
                     <a:stretch>
                       <a:fillRect/>
                     </a:stretch>
@@ -8436,7 +8546,7 @@
                     <pic:cNvPicPr/>
                   </pic:nvPicPr>
                   <pic:blipFill>
-                    <a:blip r:embed="rId10"/>
+                    <a:blip r:embed="rId11"/>
                     <a:stretch>
                       <a:fillRect/>
                     </a:stretch>
@@ -8523,7 +8633,7 @@
                     <pic:cNvPicPr/>
                   </pic:nvPicPr>
                   <pic:blipFill>
-                    <a:blip r:embed="rId11"/>
+                    <a:blip r:embed="rId12"/>
                     <a:stretch>
                       <a:fillRect/>
                     </a:stretch>
@@ -10819,7 +10929,13 @@
         <w:ind w:firstLine="720"/>
       </w:pPr>
       <w:r>
-        <w:t>Nhóm quét toàn bộ lưới eps thuộc {0,6; 0,8; 1,0; 1,2} và min_samples thuộc {3; 4; 5}, tổng 60 cấu hình cho năm năm. Bảng 3.2 ghi số tổ hợp tạo được ít nhất hai cụm, tức đủ điều kiện tính chỉ số nội bộ.</w:t>
+        <w:t xml:space="preserve">Nhóm quét toàn bộ lưới eps thuộc {0,6; 0,8; 1,0; 1,2} và min_samples thuộc {3; 4; 5}, tổng 60 cấu hình cho </w:t>
+      </w:r>
+      <w:r>
+        <w:t>5 năm</w:t>
+      </w:r>
+      <w:r>
+        <w:t>. Bảng 3.2 ghi số tổ hợp tạo được ít nhất hai cụm, tức đủ điều kiện tính chỉ số nội bộ.</w:t>
       </w:r>
     </w:p>
     <w:p>
@@ -11692,7 +11808,7 @@
                     <pic:cNvPicPr/>
                   </pic:nvPicPr>
                   <pic:blipFill>
-                    <a:blip r:embed="rId12"/>
+                    <a:blip r:embed="rId13"/>
                     <a:stretch>
                       <a:fillRect/>
                     </a:stretch>
@@ -12250,7 +12366,19 @@
         <w:rPr>
           <w:i/>
         </w:rPr>
-        <w:t xml:space="preserve"> = 3 ở cả năm năm, Silhouette cực đại tăng từ 0,2931 năm 2015 lên 0,3436 năm 2019. Vì k</w:t>
+        <w:t xml:space="preserve"> = 3 ở cả </w:t>
+      </w:r>
+      <w:r>
+        <w:rPr>
+          <w:i/>
+        </w:rPr>
+        <w:t>5 năm</w:t>
+      </w:r>
+      <w:r>
+        <w:rPr>
+          <w:i/>
+        </w:rPr>
+        <w:t>, Silhouette cực đại tăng từ 0,2931 năm 2015 lên 0,3436 năm 2019. Vì k</w:t>
       </w:r>
       <w:r>
         <w:t xml:space="preserve"> đồng thuận, nhóm giữ thêm cấu hình k = 3 làm đối chứng xuyên năm để phục vụ so sánh giữa các năm.</w:t>
@@ -12282,7 +12410,7 @@
                     <pic:cNvPicPr/>
                   </pic:nvPicPr>
                   <pic:blipFill>
-                    <a:blip r:embed="rId13"/>
+                    <a:blip r:embed="rId14"/>
                     <a:stretch>
                       <a:fillRect/>
                     </a:stretch>
@@ -12346,7 +12474,23 @@
           <w:color w:val="000000"/>
           <w:sz w:val="23"/>
         </w:rPr>
-        <w:t>Bảng 3.4: Chỉ số ARI của các cấu hình dùng Z-score (mười seed, năm năm)</w:t>
+        <w:t xml:space="preserve">Bảng 3.4: Chỉ số ARI của các cấu hình dùng Z-score (mười seed, </w:t>
+      </w:r>
+      <w:r>
+        <w:rPr>
+          <w:i/>
+          <w:color w:val="000000"/>
+          <w:sz w:val="23"/>
+        </w:rPr>
+        <w:t>5 năm</w:t>
+      </w:r>
+      <w:r>
+        <w:rPr>
+          <w:i/>
+          <w:color w:val="000000"/>
+          <w:sz w:val="23"/>
+        </w:rPr>
+        <w:t>)</w:t>
       </w:r>
     </w:p>
     <w:tbl>
@@ -14160,7 +14304,13 @@
         <w:t>,</w:t>
       </w:r>
       <w:r>
-        <w:t xml:space="preserve"> và hậu kiểm bằng điểm hạnh phúc. Tổng cộng năm cấu hình lõi nhân năm năm là 25 dòng kết quả, cộng với 60 dòng quét DBSCAN và 25 dòng độ ổn định ARI. Toàn bộ kết quả lưu tại reports/tables/.</w:t>
+        <w:t xml:space="preserve"> và hậu kiểm bằng điểm hạnh phúc. Tổng cộng năm cấu hình lõi nhân </w:t>
+      </w:r>
+      <w:r>
+        <w:t>5 năm</w:t>
+      </w:r>
+      <w:r>
+        <w:t xml:space="preserve"> là 25 dòng kết quả, cộng với 60 dòng quét DBSCAN và 25 dòng độ ổn định ARI. Toàn bộ kết quả lưu tại reports/tables/.</w:t>
       </w:r>
     </w:p>
     <w:p>
@@ -14922,7 +15072,13 @@
         <w:ind w:firstLine="720"/>
       </w:pPr>
       <w:r>
-        <w:t>Silhouette tăng đều từ 0,2931 lên 0,3436 qua năm năm, Davies–Bouldin giảm từ 1,2166 xuống 1,0703 và Calinski–Harabasz tăng từ 74,95 lên 86,02. Xu hướng này cho thấy cấu trúc ba cụm ngày càng tách biệt hơn ở các năm cuối giai đoạn.</w:t>
+        <w:t xml:space="preserve">Silhouette tăng đều từ 0,2931 lên 0,3436 qua </w:t>
+      </w:r>
+      <w:r>
+        <w:t>5 năm</w:t>
+      </w:r>
+      <w:r>
+        <w:t>, Davies–Bouldin giảm từ 1,2166 xuống 1,0703 và Calinski–Harabasz tăng từ 74,95 lên 86,02. Xu hướng này cho thấy cấu trúc ba cụm ngày càng tách biệt hơn ở các năm cuối giai đoạn.</w:t>
       </w:r>
     </w:p>
     <w:p>
@@ -15640,7 +15796,13 @@
         <w:ind w:firstLine="720"/>
       </w:pPr>
       <w:r>
-        <w:t>Ward có Silhouette thấp hơn K-Means ở cả năm năm (0,2541 đến 0,3104 so với 0,2931 đến 0,3436) và thời gian chạy lớn hơn (0,77 đến 1,42 giây so với 0,08 đến 0,39 giây). Cả hai thuật toán đều đồng thuận chọn ba cụm ở mọi năm</w:t>
+        <w:t xml:space="preserve">Ward có Silhouette thấp hơn K-Means ở cả </w:t>
+      </w:r>
+      <w:r>
+        <w:t>5 năm</w:t>
+      </w:r>
+      <w:r>
+        <w:t xml:space="preserve"> (0,2541 đến 0,3104 so với 0,2931 đến 0,3436) và thời gian chạy lớn hơn (0,77 đến 1,42 giây so với 0,08 đến 0,39 giây). Cả hai thuật toán đều đồng thuận chọn ba cụm ở mọi năm</w:t>
       </w:r>
       <w:r>
         <w:t>,</w:t>
@@ -15685,21 +15847,21 @@
           <w:color w:val="000000"/>
           <w:sz w:val="23"/>
         </w:rPr>
-        <w:t>Bảng 4.3: Số lượng quốc gia và điểm hạnh phúc trung bình theo cụm qua năm năm</w:t>
+        <w:t xml:space="preserve">Bảng 4.3: Số lượng quốc gia và điểm hạnh phúc trung bình theo cụm qua </w:t>
+      </w:r>
+      <w:r>
+        <w:rPr>
+          <w:i/>
+          <w:color w:val="000000"/>
+          <w:sz w:val="23"/>
+        </w:rPr>
+        <w:t>5 năm</w:t>
       </w:r>
     </w:p>
     <w:tbl>
       <w:tblPr>
+        <w:tblStyle w:val="TableGrid"/>
         <w:tblW w:w="0" w:type="auto"/>
-        <w:jc w:val="center"/>
-        <w:tblBorders>
-          <w:top w:val="single" w:sz="4" w:space="0" w:color="7F8C8D"/>
-          <w:left w:val="single" w:sz="4" w:space="0" w:color="7F8C8D"/>
-          <w:bottom w:val="single" w:sz="4" w:space="0" w:color="7F8C8D"/>
-          <w:right w:val="single" w:sz="4" w:space="0" w:color="7F8C8D"/>
-          <w:insideH w:val="single" w:sz="4" w:space="0" w:color="7F8C8D"/>
-          <w:insideV w:val="single" w:sz="4" w:space="0" w:color="7F8C8D"/>
-        </w:tblBorders>
         <w:tblLook w:val="04A0" w:firstRow="1" w:lastRow="0" w:firstColumn="1" w:lastColumn="0" w:noHBand="0" w:noVBand="1"/>
       </w:tblPr>
       <w:tblGrid>
@@ -15709,14 +15871,9 @@
         <w:gridCol w:w="2368"/>
       </w:tblGrid>
       <w:tr>
-        <w:trPr>
-          <w:tblHeader/>
-          <w:jc w:val="center"/>
-        </w:trPr>
         <w:tc>
           <w:tcPr>
             <w:tcW w:w="2351" w:type="dxa"/>
-            <w:shd w:val="clear" w:color="auto" w:fill="EAECEE"/>
           </w:tcPr>
           <w:p>
             <w:pPr>
@@ -15736,7 +15893,6 @@
         <w:tc>
           <w:tcPr>
             <w:tcW w:w="2351" w:type="dxa"/>
-            <w:shd w:val="clear" w:color="auto" w:fill="EAECEE"/>
           </w:tcPr>
           <w:p>
             <w:pPr>
@@ -15756,7 +15912,6 @@
         <w:tc>
           <w:tcPr>
             <w:tcW w:w="2351" w:type="dxa"/>
-            <w:shd w:val="clear" w:color="auto" w:fill="EAECEE"/>
           </w:tcPr>
           <w:p>
             <w:pPr>
@@ -15776,7 +15931,6 @@
         <w:tc>
           <w:tcPr>
             <w:tcW w:w="2351" w:type="dxa"/>
-            <w:shd w:val="clear" w:color="auto" w:fill="EAECEE"/>
           </w:tcPr>
           <w:p>
             <w:pPr>
@@ -15795,9 +15949,6 @@
         </w:tc>
       </w:tr>
       <w:tr>
-        <w:trPr>
-          <w:jc w:val="center"/>
-        </w:trPr>
         <w:tc>
           <w:tcPr>
             <w:tcW w:w="2351" w:type="dxa"/>
@@ -15872,9 +16023,6 @@
         </w:tc>
       </w:tr>
       <w:tr>
-        <w:trPr>
-          <w:jc w:val="center"/>
-        </w:trPr>
         <w:tc>
           <w:tcPr>
             <w:tcW w:w="2351" w:type="dxa"/>
@@ -15949,9 +16097,6 @@
         </w:tc>
       </w:tr>
       <w:tr>
-        <w:trPr>
-          <w:jc w:val="center"/>
-        </w:trPr>
         <w:tc>
           <w:tcPr>
             <w:tcW w:w="2351" w:type="dxa"/>
@@ -16026,9 +16171,6 @@
         </w:tc>
       </w:tr>
       <w:tr>
-        <w:trPr>
-          <w:jc w:val="center"/>
-        </w:trPr>
         <w:tc>
           <w:tcPr>
             <w:tcW w:w="2351" w:type="dxa"/>
@@ -16103,9 +16245,6 @@
         </w:tc>
       </w:tr>
       <w:tr>
-        <w:trPr>
-          <w:jc w:val="center"/>
-        </w:trPr>
         <w:tc>
           <w:tcPr>
             <w:tcW w:w="2351" w:type="dxa"/>
@@ -16180,9 +16319,6 @@
         </w:tc>
       </w:tr>
       <w:tr>
-        <w:trPr>
-          <w:jc w:val="center"/>
-        </w:trPr>
         <w:tc>
           <w:tcPr>
             <w:tcW w:w="2351" w:type="dxa"/>
@@ -16257,9 +16393,6 @@
         </w:tc>
       </w:tr>
       <w:tr>
-        <w:trPr>
-          <w:jc w:val="center"/>
-        </w:trPr>
         <w:tc>
           <w:tcPr>
             <w:tcW w:w="2351" w:type="dxa"/>
@@ -16334,9 +16467,6 @@
         </w:tc>
       </w:tr>
       <w:tr>
-        <w:trPr>
-          <w:jc w:val="center"/>
-        </w:trPr>
         <w:tc>
           <w:tcPr>
             <w:tcW w:w="2351" w:type="dxa"/>
@@ -16411,9 +16541,6 @@
         </w:tc>
       </w:tr>
       <w:tr>
-        <w:trPr>
-          <w:jc w:val="center"/>
-        </w:trPr>
         <w:tc>
           <w:tcPr>
             <w:tcW w:w="2351" w:type="dxa"/>
@@ -16488,9 +16615,6 @@
         </w:tc>
       </w:tr>
       <w:tr>
-        <w:trPr>
-          <w:jc w:val="center"/>
-        </w:trPr>
         <w:tc>
           <w:tcPr>
             <w:tcW w:w="2351" w:type="dxa"/>
@@ -16565,9 +16689,6 @@
         </w:tc>
       </w:tr>
       <w:tr>
-        <w:trPr>
-          <w:jc w:val="center"/>
-        </w:trPr>
         <w:tc>
           <w:tcPr>
             <w:tcW w:w="2351" w:type="dxa"/>
@@ -16642,9 +16763,6 @@
         </w:tc>
       </w:tr>
       <w:tr>
-        <w:trPr>
-          <w:jc w:val="center"/>
-        </w:trPr>
         <w:tc>
           <w:tcPr>
             <w:tcW w:w="2351" w:type="dxa"/>
@@ -16719,9 +16837,6 @@
         </w:tc>
       </w:tr>
       <w:tr>
-        <w:trPr>
-          <w:jc w:val="center"/>
-        </w:trPr>
         <w:tc>
           <w:tcPr>
             <w:tcW w:w="2351" w:type="dxa"/>
@@ -16796,9 +16911,6 @@
         </w:tc>
       </w:tr>
       <w:tr>
-        <w:trPr>
-          <w:jc w:val="center"/>
-        </w:trPr>
         <w:tc>
           <w:tcPr>
             <w:tcW w:w="2351" w:type="dxa"/>
@@ -16873,9 +16985,6 @@
         </w:tc>
       </w:tr>
       <w:tr>
-        <w:trPr>
-          <w:jc w:val="center"/>
-        </w:trPr>
         <w:tc>
           <w:tcPr>
             <w:tcW w:w="2351" w:type="dxa"/>
@@ -17064,7 +17173,7 @@
                     <pic:cNvPicPr/>
                   </pic:nvPicPr>
                   <pic:blipFill>
-                    <a:blip r:embed="rId14"/>
+                    <a:blip r:embed="rId15"/>
                     <a:stretch>
                       <a:fillRect/>
                     </a:stretch>
@@ -17865,7 +17974,7 @@
                     <pic:cNvPicPr/>
                   </pic:nvPicPr>
                   <pic:blipFill>
-                    <a:blip r:embed="rId15"/>
+                    <a:blip r:embed="rId16"/>
                     <a:stretch>
                       <a:fillRect/>
                     </a:stretch>
@@ -17940,7 +18049,13 @@
         <w:ind w:firstLine="720"/>
       </w:pPr>
       <w:r>
-        <w:t>Vì k* = 3 ở cả năm năm, cấu hình đối chứng k = 3 trùng với cấu hình tối ưu. Bảng 4.5 tổng hợp chỉ số của hai thuật toán theo năm.</w:t>
+        <w:t xml:space="preserve">Vì k* = 3 ở cả </w:t>
+      </w:r>
+      <w:r>
+        <w:t>5 năm</w:t>
+      </w:r>
+      <w:r>
+        <w:t>, cấu hình đối chứng k = 3 trùng với cấu hình tối ưu. Bảng 4.5 tổng hợp chỉ số của hai thuật toán theo năm.</w:t>
       </w:r>
     </w:p>
     <w:p>
@@ -17954,7 +18069,15 @@
           <w:color w:val="000000"/>
           <w:sz w:val="23"/>
         </w:rPr>
-        <w:t>Bảng 4.5: Chỉ số của cấu hình đối chứng k = 3 cho hai thuật toán qua năm năm</w:t>
+        <w:t xml:space="preserve">Bảng 4.5: Chỉ số của cấu hình đối chứng k = 3 cho hai thuật toán qua </w:t>
+      </w:r>
+      <w:r>
+        <w:rPr>
+          <w:i/>
+          <w:color w:val="000000"/>
+          <w:sz w:val="23"/>
+        </w:rPr>
+        <w:t>5 năm</w:t>
       </w:r>
     </w:p>
     <w:tbl>
@@ -19398,7 +19521,13 @@
         <w:ind w:firstLine="720"/>
       </w:pPr>
       <w:r>
-        <w:t>ARI giữa cấu hình k* và k = 3 bằng 1,0000 ở cả 10 trường hợp (hai thuật toán nhân năm năm). Đây là kiểm tra tính nhất quán, không phải so sánh hai giá trị k khác nhau.</w:t>
+        <w:t xml:space="preserve">ARI giữa cấu hình k* và k = 3 bằng 1,0000 ở cả 10 trường hợp (hai thuật toán nhân </w:t>
+      </w:r>
+      <w:r>
+        <w:t>5 năm</w:t>
+      </w:r>
+      <w:r>
+        <w:t>). Đây là kiểm tra tính nhất quán, không phải so sánh hai giá trị k khác nhau.</w:t>
       </w:r>
     </w:p>
     <w:p>
@@ -19446,11 +19575,7 @@
         </m:sSup>
       </m:oMath>
       <w:r>
-        <w:t xml:space="preserve"> thì xét </w:t>
-      </w:r>
-      <w:r>
-        <w:lastRenderedPageBreak/>
-        <w:t>thêm chênh lệch điểm hạnh phúc trung bình</w:t>
+        <w:t xml:space="preserve"> thì xét thêm chênh lệch điểm hạnh phúc trung bình</w:t>
       </w:r>
       <w:r>
         <w:t>,</w:t>
@@ -19470,6 +19595,7 @@
           <w:color w:val="000000"/>
           <w:sz w:val="23"/>
         </w:rPr>
+        <w:lastRenderedPageBreak/>
         <w:t>Bảng 4.6: Kết quả ghép cụm liên năm theo khoảng cách tâm cụm</w:t>
       </w:r>
     </w:p>
@@ -20958,7 +21084,13 @@
         <w:ind w:firstLine="720"/>
       </w:pPr>
       <w:r>
-        <w:t>Bảng theo dõi dịch chuyển (data/processed/country_cluster_shift.csv) ghi nhãn cụm của 156 quốc gia qua năm năm.</w:t>
+        <w:t xml:space="preserve">Bảng theo dõi dịch chuyển (data/processed/country_cluster_shift.csv) ghi nhãn cụm của 156 quốc gia qua </w:t>
+      </w:r>
+      <w:r>
+        <w:t>5 năm</w:t>
+      </w:r>
+      <w:r>
+        <w:t>.</w:t>
       </w:r>
     </w:p>
     <w:p>
@@ -21134,7 +21266,14 @@
                 <w:color w:val="000000"/>
                 <w:sz w:val="22"/>
               </w:rPr>
-              <w:t>Việt Nam giữ cụm trung bình cả năm năm</w:t>
+              <w:t xml:space="preserve">Việt Nam giữ cụm trung bình cả </w:t>
+            </w:r>
+            <w:r>
+              <w:rPr>
+                <w:color w:val="000000"/>
+                <w:sz w:val="22"/>
+              </w:rPr>
+              <w:t>5 năm</w:t>
             </w:r>
           </w:p>
         </w:tc>
@@ -21154,7 +21293,6 @@
                 <w:color w:val="000000"/>
                 <w:sz w:val="22"/>
               </w:rPr>
-              <w:lastRenderedPageBreak/>
               <w:t>Biến động trung gian</w:t>
             </w:r>
           </w:p>
@@ -21283,7 +21421,15 @@
                 <w:color w:val="000000"/>
                 <w:sz w:val="22"/>
               </w:rPr>
-              <w:t>Botswana, Georgia, Indonesia, Myanmar</w:t>
+              <w:t xml:space="preserve">Botswana, Georgia, </w:t>
+            </w:r>
+            <w:r>
+              <w:rPr>
+                <w:color w:val="000000"/>
+                <w:sz w:val="22"/>
+              </w:rPr>
+              <w:lastRenderedPageBreak/>
+              <w:t>Indonesia, Myanmar</w:t>
             </w:r>
           </w:p>
         </w:tc>
@@ -21303,6 +21449,7 @@
                 <w:color w:val="000000"/>
                 <w:sz w:val="22"/>
               </w:rPr>
+              <w:lastRenderedPageBreak/>
               <w:t>Suy giảm nhóm</w:t>
             </w:r>
           </w:p>
@@ -21494,7 +21641,7 @@
                     <pic:cNvPicPr/>
                   </pic:nvPicPr>
                   <pic:blipFill>
-                    <a:blip r:embed="rId16"/>
+                    <a:blip r:embed="rId17"/>
                     <a:stretch>
                       <a:fillRect/>
                     </a:stretch>
@@ -21564,7 +21711,7 @@
                     <pic:cNvPicPr/>
                   </pic:nvPicPr>
                   <pic:blipFill>
-                    <a:blip r:embed="rId17"/>
+                    <a:blip r:embed="rId18"/>
                     <a:stretch>
                       <a:fillRect/>
                     </a:stretch>
@@ -21639,7 +21786,7 @@
                     <pic:cNvPicPr/>
                   </pic:nvPicPr>
                   <pic:blipFill>
-                    <a:blip r:embed="rId18"/>
+                    <a:blip r:embed="rId19"/>
                     <a:stretch>
                       <a:fillRect/>
                     </a:stretch>
@@ -21680,7 +21827,7 @@
       </w:pPr>
       <w:bookmarkStart w:id="44" w:name="_Toc243616262"/>
       <w:r>
-        <w:t>4.9. Kết luận chương 4</w:t>
+        <w:t>4.9. Kết luận</w:t>
       </w:r>
       <w:bookmarkEnd w:id="44"/>
     </w:p>
@@ -21736,7 +21883,15 @@
         <w:ind w:firstLine="425"/>
       </w:pPr>
       <w:r>
-        <w:t>Ứng dụng app/app.py đọc trực tiếp dữ liệu đã sinh ở các mốc M1 đến M3 và gồm bốn tab tương tác. Mọi hàm nạp dữ liệu được bọc @st.cache_data để không phải đọc lại đĩa khi người dùng đổi lựa chọn.</w:t>
+        <w:t>Ứng dụng app/app.py đọc trực tiếp dữ liệu đã sinh ở các mốc M1 đến M3 và gồm bốn tab tương tác. Mọi hàm nạp dữ liệu được bọc @</w:t>
+      </w:r>
+      <w:proofErr w:type="gramStart"/>
+      <w:r>
+        <w:t>st.cache</w:t>
+      </w:r>
+      <w:proofErr w:type="gramEnd"/>
+      <w:r>
+        <w:t>_data để không phải đọc lại đĩa khi người dùng đổi lựa chọn.</w:t>
       </w:r>
     </w:p>
     <w:p>
@@ -21829,7 +21984,7 @@
                     <pic:cNvPicPr/>
                   </pic:nvPicPr>
                   <pic:blipFill>
-                    <a:blip r:embed="rId19"/>
+                    <a:blip r:embed="rId20"/>
                     <a:stretch>
                       <a:fillRect/>
                     </a:stretch>
@@ -21878,7 +22033,23 @@
         <w:ind w:firstLine="720"/>
       </w:pPr>
       <w:r>
-        <w:t>Ứng dụng được kiểm thử tự động bằng streamlit.testing.v1.AppTest trong scripts/audit_m4_app_and_slides.py. Kết quả: chạy toàn bộ app không phát sinh ngoại lệ</w:t>
+        <w:t xml:space="preserve">Ứng dụng được kiểm thử tự động bằng </w:t>
+      </w:r>
+      <w:proofErr w:type="gramStart"/>
+      <w:r>
+        <w:t>streamlit.testing</w:t>
+      </w:r>
+      <w:proofErr w:type="gramEnd"/>
+      <w:r>
+        <w:t>.v</w:t>
+      </w:r>
+      <w:proofErr w:type="gramStart"/>
+      <w:r>
+        <w:t>1.AppTest</w:t>
+      </w:r>
+      <w:proofErr w:type="gramEnd"/>
+      <w:r>
+        <w:t xml:space="preserve"> trong scripts/audit_m4_app_and_slides.py. Kết quả: chạy toàn bộ app không phát sinh ngoại lệ</w:t>
       </w:r>
       <w:r>
         <w:t>,</w:t>
@@ -21907,7 +22078,13 @@
         <w:spacing w:before="40" w:line="312" w:lineRule="auto"/>
       </w:pPr>
       <w:r>
-        <w:t xml:space="preserve">Xây dựng pipeline dữ liệu năm năm chạy lại được từ đầu, </w:t>
+        <w:t xml:space="preserve">Xây dựng pipeline dữ liệu </w:t>
+      </w:r>
+      <w:r>
+        <w:t>5 năm</w:t>
+      </w:r>
+      <w:r>
+        <w:t xml:space="preserve"> chạy lại được từ đầu, </w:t>
       </w:r>
       <w:r>
         <w:t>S</w:t>
@@ -21940,7 +22117,13 @@
       </w:pPr>
       <w:r>
         <w:lastRenderedPageBreak/>
-        <w:t>Thực nghiệm năm cấu hình nhân năm năm, khảo sát số cụm, quét tham số DBSCAN và kiểm tra độ ổn định qua mười seed</w:t>
+        <w:t xml:space="preserve">Thực nghiệm năm cấu hình nhân </w:t>
+      </w:r>
+      <w:r>
+        <w:t>5 năm</w:t>
+      </w:r>
+      <w:r>
+        <w:t>, khảo sát số cụm, quét tham số DBSCAN và kiểm tra độ ổn định qua mười seed</w:t>
       </w:r>
       <w:r>
         <w:t>,</w:t>
@@ -21959,7 +22142,13 @@
         <w:spacing w:before="40" w:line="312" w:lineRule="auto"/>
       </w:pPr>
       <w:r>
-        <w:t>Xây dựng thuật toán ghép cụm liên năm và bảng dịch chuyển của 156 quốc gia qua năm năm.</w:t>
+        <w:t xml:space="preserve">Xây dựng thuật toán ghép cụm liên năm và bảng dịch chuyển của 156 quốc gia qua </w:t>
+      </w:r>
+      <w:r>
+        <w:t>5 năm</w:t>
+      </w:r>
+      <w:r>
+        <w:t>.</w:t>
       </w:r>
     </w:p>
     <w:p>
@@ -22106,13 +22295,25 @@
         <w:ind w:firstLine="720"/>
       </w:pPr>
       <w:r>
-        <w:t>Trên dữ liệu 2015–2019 và sáu yếu tố cơ sở, ba cụm là cấu hình tối ưu đồng thuận ở cả năm năm. K-Means với Z-score cho Silhouette 0,293–0,344, Davies–Bouldin 1,00–1,07 và Calinski–Harabasz 74,95–86,02</w:t>
+        <w:t xml:space="preserve">Trên dữ liệu 2015–2019 và sáu yếu tố cơ sở, ba cụm là cấu hình tối ưu đồng thuận ở cả </w:t>
+      </w:r>
+      <w:r>
+        <w:t>5 năm</w:t>
+      </w:r>
+      <w:r>
+        <w:t>. K-Means với Z-score cho Silhouette 0,293–0,344, Davies–Bouldin 1,00–1,07 và Calinski–Harabasz 74,95–86,02</w:t>
       </w:r>
       <w:r>
         <w:t>,</w:t>
       </w:r>
       <w:r>
-        <w:t xml:space="preserve"> kết quả ổn định qua mười seed với ARI thấp nhất 0,9763. Ba cụm tương ứng với các nhóm phát triển toàn diện, đang phát triển và khó khăn, phân hóa rõ rệt khi hậu kiểm bằng điểm hạnh phúc với F từ 107,09 đến 159,18. Bảng dịch chuyển cho thấy 142 trong 156 quốc gia giữ nguyên cụm cả năm năm.</w:t>
+        <w:t xml:space="preserve"> kết quả ổn định qua mười seed với ARI thấp nhất 0,9763. Ba cụm tương ứng với các nhóm phát triển toàn diện, đang phát triển và khó khăn, phân hóa rõ rệt khi hậu kiểm bằng điểm hạnh phúc với F từ 107,09 đến 159,18. Bảng dịch chuyển cho thấy 142 trong 156 quốc gia giữ nguyên cụm cả </w:t>
+      </w:r>
+      <w:r>
+        <w:t>5 năm</w:t>
+      </w:r>
+      <w:r>
+        <w:t>.</w:t>
       </w:r>
     </w:p>
     <w:p>
@@ -22139,7 +22340,7 @@
           <w:color w:val="000000" w:themeColor="text1"/>
         </w:rPr>
       </w:pPr>
-      <w:hyperlink r:id="rId20" w:history="1">
+      <w:hyperlink r:id="rId21" w:history="1">
         <w:r>
           <w:rPr>
             <w:rStyle w:val="Hyperlink"/>
@@ -22163,7 +22364,7 @@
           <w:color w:val="000000" w:themeColor="text1"/>
         </w:rPr>
       </w:pPr>
-      <w:hyperlink r:id="rId21" w:history="1">
+      <w:hyperlink r:id="rId22" w:history="1">
         <w:r>
           <w:rPr>
             <w:rStyle w:val="Hyperlink"/>
@@ -22202,7 +22403,25 @@
             <w:color w:val="000000" w:themeColor="text1"/>
             <w:u w:val="none"/>
           </w:rPr>
-          <w:t xml:space="preserve"> Kaggle, 2019. [Online Dataset].(Mô tả chi tiết tại repo: data/Aboutdataset.md).</w:t>
+          <w:t xml:space="preserve"> Kaggle, 2019. [Online Dataset</w:t>
+        </w:r>
+        <w:proofErr w:type="gramStart"/>
+        <w:r>
+          <w:rPr>
+            <w:rStyle w:val="Hyperlink"/>
+            <w:color w:val="000000" w:themeColor="text1"/>
+            <w:u w:val="none"/>
+          </w:rPr>
+          <w:t>].(</w:t>
+        </w:r>
+        <w:proofErr w:type="gramEnd"/>
+        <w:r>
+          <w:rPr>
+            <w:rStyle w:val="Hyperlink"/>
+            <w:color w:val="000000" w:themeColor="text1"/>
+            <w:u w:val="none"/>
+          </w:rPr>
+          <w:t>Mô tả chi tiết tại repo: data/Aboutdataset.md).</w:t>
         </w:r>
       </w:hyperlink>
     </w:p>
@@ -22219,7 +22438,7 @@
           <w:color w:val="000000" w:themeColor="text1"/>
         </w:rPr>
       </w:pPr>
-      <w:hyperlink r:id="rId22" w:history="1">
+      <w:hyperlink r:id="rId23" w:history="1">
         <w:r>
           <w:rPr>
             <w:rStyle w:val="Hyperlink"/>
@@ -22275,7 +22494,7 @@
           <w:color w:val="000000" w:themeColor="text1"/>
         </w:rPr>
       </w:pPr>
-      <w:hyperlink r:id="rId23" w:history="1">
+      <w:hyperlink r:id="rId24" w:history="1">
         <w:r>
           <w:rPr>
             <w:rStyle w:val="Hyperlink"/>
@@ -22331,7 +22550,7 @@
           <w:color w:val="000000" w:themeColor="text1"/>
         </w:rPr>
       </w:pPr>
-      <w:hyperlink r:id="rId24" w:history="1">
+      <w:hyperlink r:id="rId25" w:history="1">
         <w:r>
           <w:rPr>
             <w:rStyle w:val="Hyperlink"/>
@@ -22387,7 +22606,7 @@
           <w:color w:val="000000" w:themeColor="text1"/>
         </w:rPr>
       </w:pPr>
-      <w:hyperlink r:id="rId25" w:history="1">
+      <w:hyperlink r:id="rId26" w:history="1">
         <w:r>
           <w:rPr>
             <w:rStyle w:val="Hyperlink"/>
@@ -24966,8 +25185,8 @@
       </w:pPr>
     </w:p>
     <w:sectPr>
-      <w:headerReference w:type="default" r:id="rId26"/>
-      <w:footerReference w:type="default" r:id="rId27"/>
+      <w:headerReference w:type="default" r:id="rId27"/>
+      <w:footerReference w:type="default" r:id="rId28"/>
       <w:pgSz w:w="12240" w:h="15840"/>
       <w:pgMar w:top="1701" w:right="1134" w:bottom="1701" w:left="1701" w:header="720" w:footer="720" w:gutter="0"/>
       <w:pgNumType w:start="1"/>

</xml_diff>

<commit_message>
slide: căn chỉnh toàn bộ hình ảnh và bảng số liệu nằm gọn trong khung thẻ các slide 5 7 8 9 10 12
</commit_message>
<xml_diff>
--- a/reports/final_report/Nhom12_BaoCao.docx
+++ b/reports/final_report/Nhom12_BaoCao.docx
@@ -277,7 +277,7 @@
       <w:pPr>
         <w:pStyle w:val="Heading1"/>
       </w:pPr>
-      <w:bookmarkStart w:id="0" w:name="_Toc243616218"/>
+      <w:bookmarkStart w:id="0" w:name="_Toc243675257"/>
       <w:r>
         <w:lastRenderedPageBreak/>
         <w:t>LỜI MỞ ĐẦU</w:t>
@@ -335,7 +335,7 @@
       <w:pPr>
         <w:pStyle w:val="Heading1"/>
       </w:pPr>
-      <w:bookmarkStart w:id="1" w:name="_Toc243616219"/>
+      <w:bookmarkStart w:id="1" w:name="_Toc243675258"/>
       <w:r>
         <w:lastRenderedPageBreak/>
         <w:t>TÓM TẮT</w:t>
@@ -388,7 +388,7 @@
       <w:pPr>
         <w:pStyle w:val="Heading1"/>
       </w:pPr>
-      <w:bookmarkStart w:id="2" w:name="_Toc243616220"/>
+      <w:bookmarkStart w:id="2" w:name="_Toc243675259"/>
       <w:r>
         <w:lastRenderedPageBreak/>
         <w:t>BẢNG PHÂN CÔNG NHIỆM VỤ</w:t>
@@ -1092,7 +1092,7 @@
       <w:pPr>
         <w:pStyle w:val="Heading1"/>
       </w:pPr>
-      <w:bookmarkStart w:id="3" w:name="_Toc243616221"/>
+      <w:bookmarkStart w:id="3" w:name="_Toc243675260"/>
       <w:r>
         <w:lastRenderedPageBreak/>
         <w:t>MỤC LỤC</w:t>
@@ -1123,7 +1123,7 @@
       <w:r>
         <w:fldChar w:fldCharType="separate"/>
       </w:r>
-      <w:hyperlink w:anchor="_Toc243616218" w:history="1">
+      <w:hyperlink w:anchor="_Toc243675257" w:history="1">
         <w:r>
           <w:rPr>
             <w:rStyle w:val="Hyperlink"/>
@@ -1150,7 +1150,7 @@
             <w:noProof/>
             <w:webHidden/>
           </w:rPr>
-          <w:instrText xml:space="preserve"> PAGEREF _Toc243616218 \h </w:instrText>
+          <w:instrText xml:space="preserve"> PAGEREF _Toc243675257 \h </w:instrText>
         </w:r>
         <w:r>
           <w:rPr>
@@ -1196,7 +1196,7 @@
           <w14:ligatures w14:val="standardContextual"/>
         </w:rPr>
       </w:pPr>
-      <w:hyperlink w:anchor="_Toc243616219" w:history="1">
+      <w:hyperlink w:anchor="_Toc243675258" w:history="1">
         <w:r>
           <w:rPr>
             <w:rStyle w:val="Hyperlink"/>
@@ -1223,7 +1223,7 @@
             <w:noProof/>
             <w:webHidden/>
           </w:rPr>
-          <w:instrText xml:space="preserve"> PAGEREF _Toc243616219 \h </w:instrText>
+          <w:instrText xml:space="preserve"> PAGEREF _Toc243675258 \h </w:instrText>
         </w:r>
         <w:r>
           <w:rPr>
@@ -1269,7 +1269,7 @@
           <w14:ligatures w14:val="standardContextual"/>
         </w:rPr>
       </w:pPr>
-      <w:hyperlink w:anchor="_Toc243616220" w:history="1">
+      <w:hyperlink w:anchor="_Toc243675259" w:history="1">
         <w:r>
           <w:rPr>
             <w:rStyle w:val="Hyperlink"/>
@@ -1296,7 +1296,7 @@
             <w:noProof/>
             <w:webHidden/>
           </w:rPr>
-          <w:instrText xml:space="preserve"> PAGEREF _Toc243616220 \h </w:instrText>
+          <w:instrText xml:space="preserve"> PAGEREF _Toc243675259 \h </w:instrText>
         </w:r>
         <w:r>
           <w:rPr>
@@ -1342,7 +1342,7 @@
           <w14:ligatures w14:val="standardContextual"/>
         </w:rPr>
       </w:pPr>
-      <w:hyperlink w:anchor="_Toc243616221" w:history="1">
+      <w:hyperlink w:anchor="_Toc243675260" w:history="1">
         <w:r>
           <w:rPr>
             <w:rStyle w:val="Hyperlink"/>
@@ -1369,7 +1369,7 @@
             <w:noProof/>
             <w:webHidden/>
           </w:rPr>
-          <w:instrText xml:space="preserve"> PAGEREF _Toc243616221 \h </w:instrText>
+          <w:instrText xml:space="preserve"> PAGEREF _Toc243675260 \h </w:instrText>
         </w:r>
         <w:r>
           <w:rPr>
@@ -1415,7 +1415,7 @@
           <w14:ligatures w14:val="standardContextual"/>
         </w:rPr>
       </w:pPr>
-      <w:hyperlink w:anchor="_Toc243616222" w:history="1">
+      <w:hyperlink w:anchor="_Toc243675261" w:history="1">
         <w:r>
           <w:rPr>
             <w:rStyle w:val="Hyperlink"/>
@@ -1442,7 +1442,7 @@
             <w:noProof/>
             <w:webHidden/>
           </w:rPr>
-          <w:instrText xml:space="preserve"> PAGEREF _Toc243616222 \h </w:instrText>
+          <w:instrText xml:space="preserve"> PAGEREF _Toc243675261 \h </w:instrText>
         </w:r>
         <w:r>
           <w:rPr>
@@ -1488,7 +1488,7 @@
           <w14:ligatures w14:val="standardContextual"/>
         </w:rPr>
       </w:pPr>
-      <w:hyperlink w:anchor="_Toc243616223" w:history="1">
+      <w:hyperlink w:anchor="_Toc243675262" w:history="1">
         <w:r>
           <w:rPr>
             <w:rStyle w:val="Hyperlink"/>
@@ -1515,7 +1515,7 @@
             <w:noProof/>
             <w:webHidden/>
           </w:rPr>
-          <w:instrText xml:space="preserve"> PAGEREF _Toc243616223 \h </w:instrText>
+          <w:instrText xml:space="preserve"> PAGEREF _Toc243675262 \h </w:instrText>
         </w:r>
         <w:r>
           <w:rPr>
@@ -1561,7 +1561,7 @@
           <w14:ligatures w14:val="standardContextual"/>
         </w:rPr>
       </w:pPr>
-      <w:hyperlink w:anchor="_Toc243616224" w:history="1">
+      <w:hyperlink w:anchor="_Toc243675263" w:history="1">
         <w:r>
           <w:rPr>
             <w:rStyle w:val="Hyperlink"/>
@@ -1588,7 +1588,7 @@
             <w:noProof/>
             <w:webHidden/>
           </w:rPr>
-          <w:instrText xml:space="preserve"> PAGEREF _Toc243616224 \h </w:instrText>
+          <w:instrText xml:space="preserve"> PAGEREF _Toc243675263 \h </w:instrText>
         </w:r>
         <w:r>
           <w:rPr>
@@ -1634,7 +1634,7 @@
           <w14:ligatures w14:val="standardContextual"/>
         </w:rPr>
       </w:pPr>
-      <w:hyperlink w:anchor="_Toc243616225" w:history="1">
+      <w:hyperlink w:anchor="_Toc243675264" w:history="1">
         <w:r>
           <w:rPr>
             <w:rStyle w:val="Hyperlink"/>
@@ -1661,7 +1661,7 @@
             <w:noProof/>
             <w:webHidden/>
           </w:rPr>
-          <w:instrText xml:space="preserve"> PAGEREF _Toc243616225 \h </w:instrText>
+          <w:instrText xml:space="preserve"> PAGEREF _Toc243675264 \h </w:instrText>
         </w:r>
         <w:r>
           <w:rPr>
@@ -1707,7 +1707,7 @@
           <w14:ligatures w14:val="standardContextual"/>
         </w:rPr>
       </w:pPr>
-      <w:hyperlink w:anchor="_Toc243616226" w:history="1">
+      <w:hyperlink w:anchor="_Toc243675265" w:history="1">
         <w:r>
           <w:rPr>
             <w:rStyle w:val="Hyperlink"/>
@@ -1734,7 +1734,7 @@
             <w:noProof/>
             <w:webHidden/>
           </w:rPr>
-          <w:instrText xml:space="preserve"> PAGEREF _Toc243616226 \h </w:instrText>
+          <w:instrText xml:space="preserve"> PAGEREF _Toc243675265 \h </w:instrText>
         </w:r>
         <w:r>
           <w:rPr>
@@ -1780,7 +1780,7 @@
           <w14:ligatures w14:val="standardContextual"/>
         </w:rPr>
       </w:pPr>
-      <w:hyperlink w:anchor="_Toc243616227" w:history="1">
+      <w:hyperlink w:anchor="_Toc243675266" w:history="1">
         <w:r>
           <w:rPr>
             <w:rStyle w:val="Hyperlink"/>
@@ -1807,7 +1807,7 @@
             <w:noProof/>
             <w:webHidden/>
           </w:rPr>
-          <w:instrText xml:space="preserve"> PAGEREF _Toc243616227 \h </w:instrText>
+          <w:instrText xml:space="preserve"> PAGEREF _Toc243675266 \h </w:instrText>
         </w:r>
         <w:r>
           <w:rPr>
@@ -1853,7 +1853,7 @@
           <w14:ligatures w14:val="standardContextual"/>
         </w:rPr>
       </w:pPr>
-      <w:hyperlink w:anchor="_Toc243616228" w:history="1">
+      <w:hyperlink w:anchor="_Toc243675267" w:history="1">
         <w:r>
           <w:rPr>
             <w:rStyle w:val="Hyperlink"/>
@@ -1880,7 +1880,7 @@
             <w:noProof/>
             <w:webHidden/>
           </w:rPr>
-          <w:instrText xml:space="preserve"> PAGEREF _Toc243616228 \h </w:instrText>
+          <w:instrText xml:space="preserve"> PAGEREF _Toc243675267 \h </w:instrText>
         </w:r>
         <w:r>
           <w:rPr>
@@ -1926,7 +1926,7 @@
           <w14:ligatures w14:val="standardContextual"/>
         </w:rPr>
       </w:pPr>
-      <w:hyperlink w:anchor="_Toc243616229" w:history="1">
+      <w:hyperlink w:anchor="_Toc243675268" w:history="1">
         <w:r>
           <w:rPr>
             <w:rStyle w:val="Hyperlink"/>
@@ -1953,7 +1953,7 @@
             <w:noProof/>
             <w:webHidden/>
           </w:rPr>
-          <w:instrText xml:space="preserve"> PAGEREF _Toc243616229 \h </w:instrText>
+          <w:instrText xml:space="preserve"> PAGEREF _Toc243675268 \h </w:instrText>
         </w:r>
         <w:r>
           <w:rPr>
@@ -1999,7 +1999,7 @@
           <w14:ligatures w14:val="standardContextual"/>
         </w:rPr>
       </w:pPr>
-      <w:hyperlink w:anchor="_Toc243616230" w:history="1">
+      <w:hyperlink w:anchor="_Toc243675269" w:history="1">
         <w:r>
           <w:rPr>
             <w:rStyle w:val="Hyperlink"/>
@@ -2026,7 +2026,7 @@
             <w:noProof/>
             <w:webHidden/>
           </w:rPr>
-          <w:instrText xml:space="preserve"> PAGEREF _Toc243616230 \h </w:instrText>
+          <w:instrText xml:space="preserve"> PAGEREF _Toc243675269 \h </w:instrText>
         </w:r>
         <w:r>
           <w:rPr>
@@ -2072,7 +2072,7 @@
           <w14:ligatures w14:val="standardContextual"/>
         </w:rPr>
       </w:pPr>
-      <w:hyperlink w:anchor="_Toc243616231" w:history="1">
+      <w:hyperlink w:anchor="_Toc243675270" w:history="1">
         <w:r>
           <w:rPr>
             <w:rStyle w:val="Hyperlink"/>
@@ -2099,7 +2099,7 @@
             <w:noProof/>
             <w:webHidden/>
           </w:rPr>
-          <w:instrText xml:space="preserve"> PAGEREF _Toc243616231 \h </w:instrText>
+          <w:instrText xml:space="preserve"> PAGEREF _Toc243675270 \h </w:instrText>
         </w:r>
         <w:r>
           <w:rPr>
@@ -2145,7 +2145,7 @@
           <w14:ligatures w14:val="standardContextual"/>
         </w:rPr>
       </w:pPr>
-      <w:hyperlink w:anchor="_Toc243616232" w:history="1">
+      <w:hyperlink w:anchor="_Toc243675271" w:history="1">
         <w:r>
           <w:rPr>
             <w:rStyle w:val="Hyperlink"/>
@@ -2172,7 +2172,7 @@
             <w:noProof/>
             <w:webHidden/>
           </w:rPr>
-          <w:instrText xml:space="preserve"> PAGEREF _Toc243616232 \h </w:instrText>
+          <w:instrText xml:space="preserve"> PAGEREF _Toc243675271 \h </w:instrText>
         </w:r>
         <w:r>
           <w:rPr>
@@ -2218,7 +2218,7 @@
           <w14:ligatures w14:val="standardContextual"/>
         </w:rPr>
       </w:pPr>
-      <w:hyperlink w:anchor="_Toc243616233" w:history="1">
+      <w:hyperlink w:anchor="_Toc243675272" w:history="1">
         <w:r>
           <w:rPr>
             <w:rStyle w:val="Hyperlink"/>
@@ -2245,7 +2245,7 @@
             <w:noProof/>
             <w:webHidden/>
           </w:rPr>
-          <w:instrText xml:space="preserve"> PAGEREF _Toc243616233 \h </w:instrText>
+          <w:instrText xml:space="preserve"> PAGEREF _Toc243675272 \h </w:instrText>
         </w:r>
         <w:r>
           <w:rPr>
@@ -2291,7 +2291,7 @@
           <w14:ligatures w14:val="standardContextual"/>
         </w:rPr>
       </w:pPr>
-      <w:hyperlink w:anchor="_Toc243616234" w:history="1">
+      <w:hyperlink w:anchor="_Toc243675273" w:history="1">
         <w:r>
           <w:rPr>
             <w:rStyle w:val="Hyperlink"/>
@@ -2318,7 +2318,7 @@
             <w:noProof/>
             <w:webHidden/>
           </w:rPr>
-          <w:instrText xml:space="preserve"> PAGEREF _Toc243616234 \h </w:instrText>
+          <w:instrText xml:space="preserve"> PAGEREF _Toc243675273 \h </w:instrText>
         </w:r>
         <w:r>
           <w:rPr>
@@ -2364,7 +2364,7 @@
           <w14:ligatures w14:val="standardContextual"/>
         </w:rPr>
       </w:pPr>
-      <w:hyperlink w:anchor="_Toc243616235" w:history="1">
+      <w:hyperlink w:anchor="_Toc243675274" w:history="1">
         <w:r>
           <w:rPr>
             <w:rStyle w:val="Hyperlink"/>
@@ -2391,7 +2391,7 @@
             <w:noProof/>
             <w:webHidden/>
           </w:rPr>
-          <w:instrText xml:space="preserve"> PAGEREF _Toc243616235 \h </w:instrText>
+          <w:instrText xml:space="preserve"> PAGEREF _Toc243675274 \h </w:instrText>
         </w:r>
         <w:r>
           <w:rPr>
@@ -2437,7 +2437,7 @@
           <w14:ligatures w14:val="standardContextual"/>
         </w:rPr>
       </w:pPr>
-      <w:hyperlink w:anchor="_Toc243616236" w:history="1">
+      <w:hyperlink w:anchor="_Toc243675275" w:history="1">
         <w:r>
           <w:rPr>
             <w:rStyle w:val="Hyperlink"/>
@@ -2464,7 +2464,7 @@
             <w:noProof/>
             <w:webHidden/>
           </w:rPr>
-          <w:instrText xml:space="preserve"> PAGEREF _Toc243616236 \h </w:instrText>
+          <w:instrText xml:space="preserve"> PAGEREF _Toc243675275 \h </w:instrText>
         </w:r>
         <w:r>
           <w:rPr>
@@ -2510,7 +2510,7 @@
           <w14:ligatures w14:val="standardContextual"/>
         </w:rPr>
       </w:pPr>
-      <w:hyperlink w:anchor="_Toc243616237" w:history="1">
+      <w:hyperlink w:anchor="_Toc243675276" w:history="1">
         <w:r>
           <w:rPr>
             <w:rStyle w:val="Hyperlink"/>
@@ -2537,7 +2537,7 @@
             <w:noProof/>
             <w:webHidden/>
           </w:rPr>
-          <w:instrText xml:space="preserve"> PAGEREF _Toc243616237 \h </w:instrText>
+          <w:instrText xml:space="preserve"> PAGEREF _Toc243675276 \h </w:instrText>
         </w:r>
         <w:r>
           <w:rPr>
@@ -2583,7 +2583,7 @@
           <w14:ligatures w14:val="standardContextual"/>
         </w:rPr>
       </w:pPr>
-      <w:hyperlink w:anchor="_Toc243616238" w:history="1">
+      <w:hyperlink w:anchor="_Toc243675277" w:history="1">
         <w:r>
           <w:rPr>
             <w:rStyle w:val="Hyperlink"/>
@@ -2610,7 +2610,7 @@
             <w:noProof/>
             <w:webHidden/>
           </w:rPr>
-          <w:instrText xml:space="preserve"> PAGEREF _Toc243616238 \h </w:instrText>
+          <w:instrText xml:space="preserve"> PAGEREF _Toc243675277 \h </w:instrText>
         </w:r>
         <w:r>
           <w:rPr>
@@ -2656,7 +2656,7 @@
           <w14:ligatures w14:val="standardContextual"/>
         </w:rPr>
       </w:pPr>
-      <w:hyperlink w:anchor="_Toc243616239" w:history="1">
+      <w:hyperlink w:anchor="_Toc243675278" w:history="1">
         <w:r>
           <w:rPr>
             <w:rStyle w:val="Hyperlink"/>
@@ -2683,7 +2683,7 @@
             <w:noProof/>
             <w:webHidden/>
           </w:rPr>
-          <w:instrText xml:space="preserve"> PAGEREF _Toc243616239 \h </w:instrText>
+          <w:instrText xml:space="preserve"> PAGEREF _Toc243675278 \h </w:instrText>
         </w:r>
         <w:r>
           <w:rPr>
@@ -2729,7 +2729,7 @@
           <w14:ligatures w14:val="standardContextual"/>
         </w:rPr>
       </w:pPr>
-      <w:hyperlink w:anchor="_Toc243616240" w:history="1">
+      <w:hyperlink w:anchor="_Toc243675279" w:history="1">
         <w:r>
           <w:rPr>
             <w:rStyle w:val="Hyperlink"/>
@@ -2756,7 +2756,7 @@
             <w:noProof/>
             <w:webHidden/>
           </w:rPr>
-          <w:instrText xml:space="preserve"> PAGEREF _Toc243616240 \h </w:instrText>
+          <w:instrText xml:space="preserve"> PAGEREF _Toc243675279 \h </w:instrText>
         </w:r>
         <w:r>
           <w:rPr>
@@ -2802,7 +2802,7 @@
           <w14:ligatures w14:val="standardContextual"/>
         </w:rPr>
       </w:pPr>
-      <w:hyperlink w:anchor="_Toc243616241" w:history="1">
+      <w:hyperlink w:anchor="_Toc243675280" w:history="1">
         <w:r>
           <w:rPr>
             <w:rStyle w:val="Hyperlink"/>
@@ -2829,7 +2829,7 @@
             <w:noProof/>
             <w:webHidden/>
           </w:rPr>
-          <w:instrText xml:space="preserve"> PAGEREF _Toc243616241 \h </w:instrText>
+          <w:instrText xml:space="preserve"> PAGEREF _Toc243675280 \h </w:instrText>
         </w:r>
         <w:r>
           <w:rPr>
@@ -2875,7 +2875,7 @@
           <w14:ligatures w14:val="standardContextual"/>
         </w:rPr>
       </w:pPr>
-      <w:hyperlink w:anchor="_Toc243616242" w:history="1">
+      <w:hyperlink w:anchor="_Toc243675281" w:history="1">
         <w:r>
           <w:rPr>
             <w:rStyle w:val="Hyperlink"/>
@@ -2902,7 +2902,7 @@
             <w:noProof/>
             <w:webHidden/>
           </w:rPr>
-          <w:instrText xml:space="preserve"> PAGEREF _Toc243616242 \h </w:instrText>
+          <w:instrText xml:space="preserve"> PAGEREF _Toc243675281 \h </w:instrText>
         </w:r>
         <w:r>
           <w:rPr>
@@ -2948,7 +2948,7 @@
           <w14:ligatures w14:val="standardContextual"/>
         </w:rPr>
       </w:pPr>
-      <w:hyperlink w:anchor="_Toc243616243" w:history="1">
+      <w:hyperlink w:anchor="_Toc243675282" w:history="1">
         <w:r>
           <w:rPr>
             <w:rStyle w:val="Hyperlink"/>
@@ -2975,7 +2975,7 @@
             <w:noProof/>
             <w:webHidden/>
           </w:rPr>
-          <w:instrText xml:space="preserve"> PAGEREF _Toc243616243 \h </w:instrText>
+          <w:instrText xml:space="preserve"> PAGEREF _Toc243675282 \h </w:instrText>
         </w:r>
         <w:r>
           <w:rPr>
@@ -3021,7 +3021,7 @@
           <w14:ligatures w14:val="standardContextual"/>
         </w:rPr>
       </w:pPr>
-      <w:hyperlink w:anchor="_Toc243616244" w:history="1">
+      <w:hyperlink w:anchor="_Toc243675283" w:history="1">
         <w:r>
           <w:rPr>
             <w:rStyle w:val="Hyperlink"/>
@@ -3048,7 +3048,7 @@
             <w:noProof/>
             <w:webHidden/>
           </w:rPr>
-          <w:instrText xml:space="preserve"> PAGEREF _Toc243616244 \h </w:instrText>
+          <w:instrText xml:space="preserve"> PAGEREF _Toc243675283 \h </w:instrText>
         </w:r>
         <w:r>
           <w:rPr>
@@ -3094,7 +3094,7 @@
           <w14:ligatures w14:val="standardContextual"/>
         </w:rPr>
       </w:pPr>
-      <w:hyperlink w:anchor="_Toc243616245" w:history="1">
+      <w:hyperlink w:anchor="_Toc243675284" w:history="1">
         <w:r>
           <w:rPr>
             <w:rStyle w:val="Hyperlink"/>
@@ -3121,7 +3121,7 @@
             <w:noProof/>
             <w:webHidden/>
           </w:rPr>
-          <w:instrText xml:space="preserve"> PAGEREF _Toc243616245 \h </w:instrText>
+          <w:instrText xml:space="preserve"> PAGEREF _Toc243675284 \h </w:instrText>
         </w:r>
         <w:r>
           <w:rPr>
@@ -3167,7 +3167,7 @@
           <w14:ligatures w14:val="standardContextual"/>
         </w:rPr>
       </w:pPr>
-      <w:hyperlink w:anchor="_Toc243616246" w:history="1">
+      <w:hyperlink w:anchor="_Toc243675285" w:history="1">
         <w:r>
           <w:rPr>
             <w:rStyle w:val="Hyperlink"/>
@@ -3194,7 +3194,7 @@
             <w:noProof/>
             <w:webHidden/>
           </w:rPr>
-          <w:instrText xml:space="preserve"> PAGEREF _Toc243616246 \h </w:instrText>
+          <w:instrText xml:space="preserve"> PAGEREF _Toc243675285 \h </w:instrText>
         </w:r>
         <w:r>
           <w:rPr>
@@ -3240,7 +3240,7 @@
           <w14:ligatures w14:val="standardContextual"/>
         </w:rPr>
       </w:pPr>
-      <w:hyperlink w:anchor="_Toc243616247" w:history="1">
+      <w:hyperlink w:anchor="_Toc243675286" w:history="1">
         <w:r>
           <w:rPr>
             <w:rStyle w:val="Hyperlink"/>
@@ -3267,7 +3267,7 @@
             <w:noProof/>
             <w:webHidden/>
           </w:rPr>
-          <w:instrText xml:space="preserve"> PAGEREF _Toc243616247 \h </w:instrText>
+          <w:instrText xml:space="preserve"> PAGEREF _Toc243675286 \h </w:instrText>
         </w:r>
         <w:r>
           <w:rPr>
@@ -3313,7 +3313,7 @@
           <w14:ligatures w14:val="standardContextual"/>
         </w:rPr>
       </w:pPr>
-      <w:hyperlink w:anchor="_Toc243616248" w:history="1">
+      <w:hyperlink w:anchor="_Toc243675287" w:history="1">
         <w:r>
           <w:rPr>
             <w:rStyle w:val="Hyperlink"/>
@@ -3340,7 +3340,7 @@
             <w:noProof/>
             <w:webHidden/>
           </w:rPr>
-          <w:instrText xml:space="preserve"> PAGEREF _Toc243616248 \h </w:instrText>
+          <w:instrText xml:space="preserve"> PAGEREF _Toc243675287 \h </w:instrText>
         </w:r>
         <w:r>
           <w:rPr>
@@ -3386,7 +3386,7 @@
           <w14:ligatures w14:val="standardContextual"/>
         </w:rPr>
       </w:pPr>
-      <w:hyperlink w:anchor="_Toc243616249" w:history="1">
+      <w:hyperlink w:anchor="_Toc243675288" w:history="1">
         <w:r>
           <w:rPr>
             <w:rStyle w:val="Hyperlink"/>
@@ -3413,7 +3413,7 @@
             <w:noProof/>
             <w:webHidden/>
           </w:rPr>
-          <w:instrText xml:space="preserve"> PAGEREF _Toc243616249 \h </w:instrText>
+          <w:instrText xml:space="preserve"> PAGEREF _Toc243675288 \h </w:instrText>
         </w:r>
         <w:r>
           <w:rPr>
@@ -3459,7 +3459,7 @@
           <w14:ligatures w14:val="standardContextual"/>
         </w:rPr>
       </w:pPr>
-      <w:hyperlink w:anchor="_Toc243616250" w:history="1">
+      <w:hyperlink w:anchor="_Toc243675289" w:history="1">
         <w:r>
           <w:rPr>
             <w:rStyle w:val="Hyperlink"/>
@@ -3486,7 +3486,7 @@
             <w:noProof/>
             <w:webHidden/>
           </w:rPr>
-          <w:instrText xml:space="preserve"> PAGEREF _Toc243616250 \h </w:instrText>
+          <w:instrText xml:space="preserve"> PAGEREF _Toc243675289 \h </w:instrText>
         </w:r>
         <w:r>
           <w:rPr>
@@ -3532,7 +3532,7 @@
           <w14:ligatures w14:val="standardContextual"/>
         </w:rPr>
       </w:pPr>
-      <w:hyperlink w:anchor="_Toc243616251" w:history="1">
+      <w:hyperlink w:anchor="_Toc243675290" w:history="1">
         <w:r>
           <w:rPr>
             <w:rStyle w:val="Hyperlink"/>
@@ -3559,7 +3559,7 @@
             <w:noProof/>
             <w:webHidden/>
           </w:rPr>
-          <w:instrText xml:space="preserve"> PAGEREF _Toc243616251 \h </w:instrText>
+          <w:instrText xml:space="preserve"> PAGEREF _Toc243675290 \h </w:instrText>
         </w:r>
         <w:r>
           <w:rPr>
@@ -3605,7 +3605,7 @@
           <w14:ligatures w14:val="standardContextual"/>
         </w:rPr>
       </w:pPr>
-      <w:hyperlink w:anchor="_Toc243616252" w:history="1">
+      <w:hyperlink w:anchor="_Toc243675291" w:history="1">
         <w:r>
           <w:rPr>
             <w:rStyle w:val="Hyperlink"/>
@@ -3632,7 +3632,7 @@
             <w:noProof/>
             <w:webHidden/>
           </w:rPr>
-          <w:instrText xml:space="preserve"> PAGEREF _Toc243616252 \h </w:instrText>
+          <w:instrText xml:space="preserve"> PAGEREF _Toc243675291 \h </w:instrText>
         </w:r>
         <w:r>
           <w:rPr>
@@ -3678,7 +3678,7 @@
           <w14:ligatures w14:val="standardContextual"/>
         </w:rPr>
       </w:pPr>
-      <w:hyperlink w:anchor="_Toc243616253" w:history="1">
+      <w:hyperlink w:anchor="_Toc243675292" w:history="1">
         <w:r>
           <w:rPr>
             <w:rStyle w:val="Hyperlink"/>
@@ -3705,7 +3705,7 @@
             <w:noProof/>
             <w:webHidden/>
           </w:rPr>
-          <w:instrText xml:space="preserve"> PAGEREF _Toc243616253 \h </w:instrText>
+          <w:instrText xml:space="preserve"> PAGEREF _Toc243675292 \h </w:instrText>
         </w:r>
         <w:r>
           <w:rPr>
@@ -3751,7 +3751,7 @@
           <w14:ligatures w14:val="standardContextual"/>
         </w:rPr>
       </w:pPr>
-      <w:hyperlink w:anchor="_Toc243616254" w:history="1">
+      <w:hyperlink w:anchor="_Toc243675293" w:history="1">
         <w:r>
           <w:rPr>
             <w:rStyle w:val="Hyperlink"/>
@@ -3778,7 +3778,7 @@
             <w:noProof/>
             <w:webHidden/>
           </w:rPr>
-          <w:instrText xml:space="preserve"> PAGEREF _Toc243616254 \h </w:instrText>
+          <w:instrText xml:space="preserve"> PAGEREF _Toc243675293 \h </w:instrText>
         </w:r>
         <w:r>
           <w:rPr>
@@ -3824,7 +3824,7 @@
           <w14:ligatures w14:val="standardContextual"/>
         </w:rPr>
       </w:pPr>
-      <w:hyperlink w:anchor="_Toc243616255" w:history="1">
+      <w:hyperlink w:anchor="_Toc243675294" w:history="1">
         <w:r>
           <w:rPr>
             <w:rStyle w:val="Hyperlink"/>
@@ -3851,7 +3851,7 @@
             <w:noProof/>
             <w:webHidden/>
           </w:rPr>
-          <w:instrText xml:space="preserve"> PAGEREF _Toc243616255 \h </w:instrText>
+          <w:instrText xml:space="preserve"> PAGEREF _Toc243675294 \h </w:instrText>
         </w:r>
         <w:r>
           <w:rPr>
@@ -3897,7 +3897,7 @@
           <w14:ligatures w14:val="standardContextual"/>
         </w:rPr>
       </w:pPr>
-      <w:hyperlink w:anchor="_Toc243616256" w:history="1">
+      <w:hyperlink w:anchor="_Toc243675295" w:history="1">
         <w:r>
           <w:rPr>
             <w:rStyle w:val="Hyperlink"/>
@@ -3924,7 +3924,7 @@
             <w:noProof/>
             <w:webHidden/>
           </w:rPr>
-          <w:instrText xml:space="preserve"> PAGEREF _Toc243616256 \h </w:instrText>
+          <w:instrText xml:space="preserve"> PAGEREF _Toc243675295 \h </w:instrText>
         </w:r>
         <w:r>
           <w:rPr>
@@ -3970,7 +3970,7 @@
           <w14:ligatures w14:val="standardContextual"/>
         </w:rPr>
       </w:pPr>
-      <w:hyperlink w:anchor="_Toc243616257" w:history="1">
+      <w:hyperlink w:anchor="_Toc243675296" w:history="1">
         <w:r>
           <w:rPr>
             <w:rStyle w:val="Hyperlink"/>
@@ -3997,7 +3997,7 @@
             <w:noProof/>
             <w:webHidden/>
           </w:rPr>
-          <w:instrText xml:space="preserve"> PAGEREF _Toc243616257 \h </w:instrText>
+          <w:instrText xml:space="preserve"> PAGEREF _Toc243675296 \h </w:instrText>
         </w:r>
         <w:r>
           <w:rPr>
@@ -4043,7 +4043,7 @@
           <w14:ligatures w14:val="standardContextual"/>
         </w:rPr>
       </w:pPr>
-      <w:hyperlink w:anchor="_Toc243616258" w:history="1">
+      <w:hyperlink w:anchor="_Toc243675297" w:history="1">
         <w:r>
           <w:rPr>
             <w:rStyle w:val="Hyperlink"/>
@@ -4070,7 +4070,7 @@
             <w:noProof/>
             <w:webHidden/>
           </w:rPr>
-          <w:instrText xml:space="preserve"> PAGEREF _Toc243616258 \h </w:instrText>
+          <w:instrText xml:space="preserve"> PAGEREF _Toc243675297 \h </w:instrText>
         </w:r>
         <w:r>
           <w:rPr>
@@ -4116,7 +4116,7 @@
           <w14:ligatures w14:val="standardContextual"/>
         </w:rPr>
       </w:pPr>
-      <w:hyperlink w:anchor="_Toc243616259" w:history="1">
+      <w:hyperlink w:anchor="_Toc243675298" w:history="1">
         <w:r>
           <w:rPr>
             <w:rStyle w:val="Hyperlink"/>
@@ -4143,7 +4143,7 @@
             <w:noProof/>
             <w:webHidden/>
           </w:rPr>
-          <w:instrText xml:space="preserve"> PAGEREF _Toc243616259 \h </w:instrText>
+          <w:instrText xml:space="preserve"> PAGEREF _Toc243675298 \h </w:instrText>
         </w:r>
         <w:r>
           <w:rPr>
@@ -4189,7 +4189,7 @@
           <w14:ligatures w14:val="standardContextual"/>
         </w:rPr>
       </w:pPr>
-      <w:hyperlink w:anchor="_Toc243616260" w:history="1">
+      <w:hyperlink w:anchor="_Toc243675299" w:history="1">
         <w:r>
           <w:rPr>
             <w:rStyle w:val="Hyperlink"/>
@@ -4216,7 +4216,7 @@
             <w:noProof/>
             <w:webHidden/>
           </w:rPr>
-          <w:instrText xml:space="preserve"> PAGEREF _Toc243616260 \h </w:instrText>
+          <w:instrText xml:space="preserve"> PAGEREF _Toc243675299 \h </w:instrText>
         </w:r>
         <w:r>
           <w:rPr>
@@ -4262,7 +4262,7 @@
           <w14:ligatures w14:val="standardContextual"/>
         </w:rPr>
       </w:pPr>
-      <w:hyperlink w:anchor="_Toc243616261" w:history="1">
+      <w:hyperlink w:anchor="_Toc243675300" w:history="1">
         <w:r>
           <w:rPr>
             <w:rStyle w:val="Hyperlink"/>
@@ -4289,7 +4289,7 @@
             <w:noProof/>
             <w:webHidden/>
           </w:rPr>
-          <w:instrText xml:space="preserve"> PAGEREF _Toc243616261 \h </w:instrText>
+          <w:instrText xml:space="preserve"> PAGEREF _Toc243675300 \h </w:instrText>
         </w:r>
         <w:r>
           <w:rPr>
@@ -4335,13 +4335,13 @@
           <w14:ligatures w14:val="standardContextual"/>
         </w:rPr>
       </w:pPr>
-      <w:hyperlink w:anchor="_Toc243616262" w:history="1">
+      <w:hyperlink w:anchor="_Toc243675301" w:history="1">
         <w:r>
           <w:rPr>
             <w:rStyle w:val="Hyperlink"/>
             <w:noProof/>
           </w:rPr>
-          <w:t>4.9. Kết luận chương 4</w:t>
+          <w:t>4.9. Kết luận</w:t>
         </w:r>
         <w:r>
           <w:rPr>
@@ -4362,7 +4362,7 @@
             <w:noProof/>
             <w:webHidden/>
           </w:rPr>
-          <w:instrText xml:space="preserve"> PAGEREF _Toc243616262 \h </w:instrText>
+          <w:instrText xml:space="preserve"> PAGEREF _Toc243675301 \h </w:instrText>
         </w:r>
         <w:r>
           <w:rPr>
@@ -4408,7 +4408,7 @@
           <w14:ligatures w14:val="standardContextual"/>
         </w:rPr>
       </w:pPr>
-      <w:hyperlink w:anchor="_Toc243616263" w:history="1">
+      <w:hyperlink w:anchor="_Toc243675302" w:history="1">
         <w:r>
           <w:rPr>
             <w:rStyle w:val="Hyperlink"/>
@@ -4435,7 +4435,7 @@
             <w:noProof/>
             <w:webHidden/>
           </w:rPr>
-          <w:instrText xml:space="preserve"> PAGEREF _Toc243616263 \h </w:instrText>
+          <w:instrText xml:space="preserve"> PAGEREF _Toc243675302 \h </w:instrText>
         </w:r>
         <w:r>
           <w:rPr>
@@ -4481,7 +4481,7 @@
           <w14:ligatures w14:val="standardContextual"/>
         </w:rPr>
       </w:pPr>
-      <w:hyperlink w:anchor="_Toc243616264" w:history="1">
+      <w:hyperlink w:anchor="_Toc243675303" w:history="1">
         <w:r>
           <w:rPr>
             <w:rStyle w:val="Hyperlink"/>
@@ -4508,7 +4508,7 @@
             <w:noProof/>
             <w:webHidden/>
           </w:rPr>
-          <w:instrText xml:space="preserve"> PAGEREF _Toc243616264 \h </w:instrText>
+          <w:instrText xml:space="preserve"> PAGEREF _Toc243675303 \h </w:instrText>
         </w:r>
         <w:r>
           <w:rPr>
@@ -4554,7 +4554,7 @@
           <w14:ligatures w14:val="standardContextual"/>
         </w:rPr>
       </w:pPr>
-      <w:hyperlink w:anchor="_Toc243616265" w:history="1">
+      <w:hyperlink w:anchor="_Toc243675304" w:history="1">
         <w:r>
           <w:rPr>
             <w:rStyle w:val="Hyperlink"/>
@@ -4581,7 +4581,7 @@
             <w:noProof/>
             <w:webHidden/>
           </w:rPr>
-          <w:instrText xml:space="preserve"> PAGEREF _Toc243616265 \h </w:instrText>
+          <w:instrText xml:space="preserve"> PAGEREF _Toc243675304 \h </w:instrText>
         </w:r>
         <w:r>
           <w:rPr>
@@ -4627,7 +4627,7 @@
           <w14:ligatures w14:val="standardContextual"/>
         </w:rPr>
       </w:pPr>
-      <w:hyperlink w:anchor="_Toc243616266" w:history="1">
+      <w:hyperlink w:anchor="_Toc243675305" w:history="1">
         <w:r>
           <w:rPr>
             <w:rStyle w:val="Hyperlink"/>
@@ -4654,7 +4654,7 @@
             <w:noProof/>
             <w:webHidden/>
           </w:rPr>
-          <w:instrText xml:space="preserve"> PAGEREF _Toc243616266 \h </w:instrText>
+          <w:instrText xml:space="preserve"> PAGEREF _Toc243675305 \h </w:instrText>
         </w:r>
         <w:r>
           <w:rPr>
@@ -4700,7 +4700,7 @@
           <w14:ligatures w14:val="standardContextual"/>
         </w:rPr>
       </w:pPr>
-      <w:hyperlink w:anchor="_Toc243616267" w:history="1">
+      <w:hyperlink w:anchor="_Toc243675306" w:history="1">
         <w:r>
           <w:rPr>
             <w:rStyle w:val="Hyperlink"/>
@@ -4727,7 +4727,7 @@
             <w:noProof/>
             <w:webHidden/>
           </w:rPr>
-          <w:instrText xml:space="preserve"> PAGEREF _Toc243616267 \h </w:instrText>
+          <w:instrText xml:space="preserve"> PAGEREF _Toc243675306 \h </w:instrText>
         </w:r>
         <w:r>
           <w:rPr>
@@ -4773,7 +4773,7 @@
           <w14:ligatures w14:val="standardContextual"/>
         </w:rPr>
       </w:pPr>
-      <w:hyperlink w:anchor="_Toc243616268" w:history="1">
+      <w:hyperlink w:anchor="_Toc243675307" w:history="1">
         <w:r>
           <w:rPr>
             <w:rStyle w:val="Hyperlink"/>
@@ -4800,7 +4800,7 @@
             <w:noProof/>
             <w:webHidden/>
           </w:rPr>
-          <w:instrText xml:space="preserve"> PAGEREF _Toc243616268 \h </w:instrText>
+          <w:instrText xml:space="preserve"> PAGEREF _Toc243675307 \h </w:instrText>
         </w:r>
         <w:r>
           <w:rPr>
@@ -4846,7 +4846,7 @@
           <w14:ligatures w14:val="standardContextual"/>
         </w:rPr>
       </w:pPr>
-      <w:hyperlink w:anchor="_Toc243616269" w:history="1">
+      <w:hyperlink w:anchor="_Toc243675308" w:history="1">
         <w:r>
           <w:rPr>
             <w:rStyle w:val="Hyperlink"/>
@@ -4873,7 +4873,7 @@
             <w:noProof/>
             <w:webHidden/>
           </w:rPr>
-          <w:instrText xml:space="preserve"> PAGEREF _Toc243616269 \h </w:instrText>
+          <w:instrText xml:space="preserve"> PAGEREF _Toc243675308 \h </w:instrText>
         </w:r>
         <w:r>
           <w:rPr>
@@ -4919,7 +4919,7 @@
           <w14:ligatures w14:val="standardContextual"/>
         </w:rPr>
       </w:pPr>
-      <w:hyperlink w:anchor="_Toc243616270" w:history="1">
+      <w:hyperlink w:anchor="_Toc243675309" w:history="1">
         <w:r>
           <w:rPr>
             <w:rStyle w:val="Hyperlink"/>
@@ -4946,7 +4946,7 @@
             <w:noProof/>
             <w:webHidden/>
           </w:rPr>
-          <w:instrText xml:space="preserve"> PAGEREF _Toc243616270 \h </w:instrText>
+          <w:instrText xml:space="preserve"> PAGEREF _Toc243675309 \h </w:instrText>
         </w:r>
         <w:r>
           <w:rPr>
@@ -4992,7 +4992,7 @@
           <w14:ligatures w14:val="standardContextual"/>
         </w:rPr>
       </w:pPr>
-      <w:hyperlink w:anchor="_Toc243616271" w:history="1">
+      <w:hyperlink w:anchor="_Toc243675310" w:history="1">
         <w:r>
           <w:rPr>
             <w:rStyle w:val="Hyperlink"/>
@@ -5019,7 +5019,7 @@
             <w:noProof/>
             <w:webHidden/>
           </w:rPr>
-          <w:instrText xml:space="preserve"> PAGEREF _Toc243616271 \h </w:instrText>
+          <w:instrText xml:space="preserve"> PAGEREF _Toc243675310 \h </w:instrText>
         </w:r>
         <w:r>
           <w:rPr>
@@ -5065,7 +5065,7 @@
           <w14:ligatures w14:val="standardContextual"/>
         </w:rPr>
       </w:pPr>
-      <w:hyperlink w:anchor="_Toc243616272" w:history="1">
+      <w:hyperlink w:anchor="_Toc243675311" w:history="1">
         <w:r>
           <w:rPr>
             <w:rStyle w:val="Hyperlink"/>
@@ -5092,7 +5092,7 @@
             <w:noProof/>
             <w:webHidden/>
           </w:rPr>
-          <w:instrText xml:space="preserve"> PAGEREF _Toc243616272 \h </w:instrText>
+          <w:instrText xml:space="preserve"> PAGEREF _Toc243675311 \h </w:instrText>
         </w:r>
         <w:r>
           <w:rPr>
@@ -5137,7 +5137,7 @@
       <w:pPr>
         <w:pStyle w:val="Heading1"/>
       </w:pPr>
-      <w:bookmarkStart w:id="4" w:name="_Toc243616222"/>
+      <w:bookmarkStart w:id="4" w:name="_Toc243675261"/>
       <w:r>
         <w:lastRenderedPageBreak/>
         <w:t>DANH MỤC BẢNG</w:t>
@@ -5437,7 +5437,7 @@
       <w:pPr>
         <w:pStyle w:val="Heading1"/>
       </w:pPr>
-      <w:bookmarkStart w:id="5" w:name="_Toc243616223"/>
+      <w:bookmarkStart w:id="5" w:name="_Toc243675262"/>
       <w:r>
         <w:lastRenderedPageBreak/>
         <w:t>DANH MỤC HÌNH ẢNH</w:t>
@@ -5638,7 +5638,7 @@
       <w:pPr>
         <w:pStyle w:val="Heading1"/>
       </w:pPr>
-      <w:bookmarkStart w:id="6" w:name="_Toc243616224"/>
+      <w:bookmarkStart w:id="6" w:name="_Toc243675263"/>
       <w:r>
         <w:lastRenderedPageBreak/>
         <w:t>CHƯƠNG 1: TỔNG QUAN ĐỀ TÀI VÀ CƠ SỞ LÝ THUYẾT</w:t>
@@ -5649,7 +5649,7 @@
       <w:pPr>
         <w:pStyle w:val="Heading2"/>
       </w:pPr>
-      <w:bookmarkStart w:id="7" w:name="_Toc243616225"/>
+      <w:bookmarkStart w:id="7" w:name="_Toc243675264"/>
       <w:r>
         <w:t>1.1. Bối cảnh và lý do chọn đề tài</w:t>
       </w:r>
@@ -5689,7 +5689,7 @@
       <w:pPr>
         <w:pStyle w:val="Heading2"/>
       </w:pPr>
-      <w:bookmarkStart w:id="8" w:name="_Toc243616226"/>
+      <w:bookmarkStart w:id="8" w:name="_Toc243675265"/>
       <w:r>
         <w:t>1.2. Bài toán và câu hỏi nghiên cứu</w:t>
       </w:r>
@@ -5776,7 +5776,7 @@
       <w:pPr>
         <w:pStyle w:val="Heading2"/>
       </w:pPr>
-      <w:bookmarkStart w:id="9" w:name="_Toc243616227"/>
+      <w:bookmarkStart w:id="9" w:name="_Toc243675266"/>
       <w:r>
         <w:t>1.3. Nguồn dữ liệu</w:t>
       </w:r>
@@ -5799,7 +5799,7 @@
       <w:pPr>
         <w:pStyle w:val="Heading2"/>
       </w:pPr>
-      <w:bookmarkStart w:id="10" w:name="_Toc243616228"/>
+      <w:bookmarkStart w:id="10" w:name="_Toc243675267"/>
       <w:r>
         <w:t>1.4. Thang đo Cantril Ladder</w:t>
       </w:r>
@@ -5825,7 +5825,7 @@
       <w:pPr>
         <w:pStyle w:val="Heading2"/>
       </w:pPr>
-      <w:bookmarkStart w:id="11" w:name="_Toc243616229"/>
+      <w:bookmarkStart w:id="11" w:name="_Toc243675268"/>
       <w:r>
         <w:t>1.5. Mô hình Dystopia và Dystopia Residual</w:t>
       </w:r>
@@ -5858,7 +5858,7 @@
       <w:pPr>
         <w:pStyle w:val="Heading2"/>
       </w:pPr>
-      <w:bookmarkStart w:id="12" w:name="_Toc243616230"/>
+      <w:bookmarkStart w:id="12" w:name="_Toc243675269"/>
       <w:r>
         <w:t>1.6. Sáu biến cơ sở</w:t>
       </w:r>
@@ -6606,7 +6606,7 @@
       <w:pPr>
         <w:pStyle w:val="Heading2"/>
       </w:pPr>
-      <w:bookmarkStart w:id="13" w:name="_Toc243616231"/>
+      <w:bookmarkStart w:id="13" w:name="_Toc243675270"/>
       <w:r>
         <w:t>1.7. Quy tắc vàng của đề tài</w:t>
       </w:r>
@@ -6668,7 +6668,7 @@
       <w:pPr>
         <w:pStyle w:val="Heading2"/>
       </w:pPr>
-      <w:bookmarkStart w:id="14" w:name="_Toc243616232"/>
+      <w:bookmarkStart w:id="14" w:name="_Toc243675271"/>
       <w:r>
         <w:t>1.8. Đối chiếu 11 bước pipeline với cấu trúc báo cáo</w:t>
       </w:r>
@@ -7610,7 +7610,7 @@
       <w:pPr>
         <w:pStyle w:val="Heading1"/>
       </w:pPr>
-      <w:bookmarkStart w:id="15" w:name="_Toc243616233"/>
+      <w:bookmarkStart w:id="15" w:name="_Toc243675272"/>
       <w:r>
         <w:lastRenderedPageBreak/>
         <w:t>CHƯƠNG 2: THU THẬP DỮ LIỆU VÀ KHÁM PHÁ EDA</w:t>
@@ -7621,7 +7621,7 @@
       <w:pPr>
         <w:pStyle w:val="Heading2"/>
       </w:pPr>
-      <w:bookmarkStart w:id="16" w:name="_Toc243616234"/>
+      <w:bookmarkStart w:id="16" w:name="_Toc243675273"/>
       <w:r>
         <w:t xml:space="preserve">2.1. </w:t>
       </w:r>
@@ -8243,7 +8243,7 @@
       <w:pPr>
         <w:pStyle w:val="Heading2"/>
       </w:pPr>
-      <w:bookmarkStart w:id="17" w:name="_Toc243616235"/>
+      <w:bookmarkStart w:id="17" w:name="_Toc243675274"/>
       <w:r>
         <w:t>2.2. Đồng nhất tên cột</w:t>
       </w:r>
@@ -8312,7 +8312,7 @@
       <w:pPr>
         <w:pStyle w:val="Heading2"/>
       </w:pPr>
-      <w:bookmarkStart w:id="18" w:name="_Toc243616236"/>
+      <w:bookmarkStart w:id="18" w:name="_Toc243675275"/>
       <w:r>
         <w:t>2.3. Xử lý giá trị khuyết của UAE năm 2018</w:t>
       </w:r>
@@ -8344,7 +8344,7 @@
       <w:pPr>
         <w:pStyle w:val="Heading2"/>
       </w:pPr>
-      <w:bookmarkStart w:id="19" w:name="_Toc243616237"/>
+      <w:bookmarkStart w:id="19" w:name="_Toc243675276"/>
       <w:r>
         <w:t>2.4. Chuẩn hóa tên quốc gia và bổ sung mã ISO-3</w:t>
       </w:r>
@@ -8382,7 +8382,7 @@
       <w:pPr>
         <w:pStyle w:val="Heading2"/>
       </w:pPr>
-      <w:bookmarkStart w:id="20" w:name="_Toc243616238"/>
+      <w:bookmarkStart w:id="20" w:name="_Toc243675277"/>
       <w:r>
         <w:lastRenderedPageBreak/>
         <w:t>2.5. Bảng dữ liệu trung gian</w:t>
@@ -8407,7 +8407,7 @@
       <w:pPr>
         <w:pStyle w:val="Heading2"/>
       </w:pPr>
-      <w:bookmarkStart w:id="21" w:name="_Toc243616239"/>
+      <w:bookmarkStart w:id="21" w:name="_Toc243675278"/>
       <w:r>
         <w:t>2.6. Phân tích hình dạng phân phối</w:t>
       </w:r>
@@ -8515,7 +8515,7 @@
       <w:pPr>
         <w:pStyle w:val="Heading2"/>
       </w:pPr>
-      <w:bookmarkStart w:id="22" w:name="_Toc243616240"/>
+      <w:bookmarkStart w:id="22" w:name="_Toc243675279"/>
       <w:r>
         <w:t>2.7. Tương quan Pearson</w:t>
       </w:r>
@@ -8593,7 +8593,7 @@
       <w:pPr>
         <w:pStyle w:val="Heading2"/>
       </w:pPr>
-      <w:bookmarkStart w:id="23" w:name="_Toc243616241"/>
+      <w:bookmarkStart w:id="23" w:name="_Toc243675280"/>
       <w:r>
         <w:lastRenderedPageBreak/>
         <w:t>2.8. Nhận diện ngoại lai</w:t>
@@ -8686,7 +8686,7 @@
       <w:pPr>
         <w:pStyle w:val="Heading2"/>
       </w:pPr>
-      <w:bookmarkStart w:id="24" w:name="_Toc243616242"/>
+      <w:bookmarkStart w:id="24" w:name="_Toc243675281"/>
       <w:r>
         <w:t>2.9. Kết luận</w:t>
       </w:r>
@@ -8704,7 +8704,7 @@
       <w:pPr>
         <w:pStyle w:val="Heading1"/>
       </w:pPr>
-      <w:bookmarkStart w:id="25" w:name="_Toc243616243"/>
+      <w:bookmarkStart w:id="25" w:name="_Toc243675282"/>
       <w:r>
         <w:lastRenderedPageBreak/>
         <w:t>CHƯƠNG 3: PHƯƠNG PHÁP LUẬN VÀ THỬ NGHIỆM MÔ HÌNH</w:t>
@@ -8715,7 +8715,7 @@
       <w:pPr>
         <w:pStyle w:val="Heading2"/>
       </w:pPr>
-      <w:bookmarkStart w:id="26" w:name="_Toc243616244"/>
+      <w:bookmarkStart w:id="26" w:name="_Toc243675283"/>
       <w:r>
         <w:t>3.1. Ma trận đặc trưng</w:t>
       </w:r>
@@ -8733,7 +8733,7 @@
       <w:pPr>
         <w:pStyle w:val="Heading2"/>
       </w:pPr>
-      <w:bookmarkStart w:id="27" w:name="_Toc243616245"/>
+      <w:bookmarkStart w:id="27" w:name="_Toc243675284"/>
       <w:r>
         <w:t>3.2. So sánh ba phương án chuẩn hóa</w:t>
       </w:r>
@@ -9733,7 +9733,7 @@
       <w:pPr>
         <w:pStyle w:val="Heading2"/>
       </w:pPr>
-      <w:bookmarkStart w:id="28" w:name="_Toc243616246"/>
+      <w:bookmarkStart w:id="28" w:name="_Toc243675285"/>
       <w:r>
         <w:t>3.3. Thuật toán K-Means cài đặt từ đầu</w:t>
       </w:r>
@@ -9917,7 +9917,7 @@
       <w:pPr>
         <w:pStyle w:val="Heading2"/>
       </w:pPr>
-      <w:bookmarkStart w:id="29" w:name="_Toc243616247"/>
+      <w:bookmarkStart w:id="29" w:name="_Toc243675286"/>
       <w:r>
         <w:t>3.4. Phân cấp Ward cài đặt từ đầu</w:t>
       </w:r>
@@ -10898,7 +10898,7 @@
       <w:pPr>
         <w:pStyle w:val="Heading2"/>
       </w:pPr>
-      <w:bookmarkStart w:id="30" w:name="_Toc243616248"/>
+      <w:bookmarkStart w:id="30" w:name="_Toc243675287"/>
       <w:r>
         <w:t>3.5. DBSCAN cài đặt từ đầu</w:t>
       </w:r>
@@ -11471,7 +11471,7 @@
       <w:pPr>
         <w:pStyle w:val="Heading2"/>
       </w:pPr>
-      <w:bookmarkStart w:id="31" w:name="_Toc243616249"/>
+      <w:bookmarkStart w:id="31" w:name="_Toc243675288"/>
       <w:r>
         <w:t>3.6. Các độ đo đánh giá</w:t>
       </w:r>
@@ -11762,7 +11762,7 @@
       <w:pPr>
         <w:pStyle w:val="Heading2"/>
       </w:pPr>
-      <w:bookmarkStart w:id="32" w:name="_Toc243616250"/>
+      <w:bookmarkStart w:id="32" w:name="_Toc243675289"/>
       <w:r>
         <w:t>3.7. Khảo sát số cụm tối ưu</w:t>
       </w:r>
@@ -12449,7 +12449,7 @@
       <w:pPr>
         <w:pStyle w:val="Heading2"/>
       </w:pPr>
-      <w:bookmarkStart w:id="33" w:name="_Toc243616251"/>
+      <w:bookmarkStart w:id="33" w:name="_Toc243675290"/>
       <w:r>
         <w:t>3.8. Kiểm tra độ ổn định</w:t>
       </w:r>
@@ -14263,7 +14263,7 @@
       <w:pPr>
         <w:pStyle w:val="Heading2"/>
       </w:pPr>
-      <w:bookmarkStart w:id="34" w:name="_Toc243616252"/>
+      <w:bookmarkStart w:id="34" w:name="_Toc243675291"/>
       <w:r>
         <w:t>3.9. Quy trình thực nghiệm</w:t>
       </w:r>
@@ -14317,7 +14317,7 @@
       <w:pPr>
         <w:pStyle w:val="Heading1"/>
       </w:pPr>
-      <w:bookmarkStart w:id="35" w:name="_Toc243616253"/>
+      <w:bookmarkStart w:id="35" w:name="_Toc243675292"/>
       <w:r>
         <w:lastRenderedPageBreak/>
         <w:t>CHƯƠNG 4: KẾT QUẢ THỰC NGHIỆM VÀ DIỄN GIẢI TRI THỨC</w:t>
@@ -14328,7 +14328,7 @@
       <w:pPr>
         <w:pStyle w:val="Heading2"/>
       </w:pPr>
-      <w:bookmarkStart w:id="36" w:name="_Toc243616254"/>
+      <w:bookmarkStart w:id="36" w:name="_Toc243675293"/>
       <w:r>
         <w:t>4.1. Chỉ số đánh giá của K-Means qua các năm</w:t>
       </w:r>
@@ -15085,7 +15085,7 @@
       <w:pPr>
         <w:pStyle w:val="Heading2"/>
       </w:pPr>
-      <w:bookmarkStart w:id="37" w:name="_Toc243616255"/>
+      <w:bookmarkStart w:id="37" w:name="_Toc243675294"/>
       <w:r>
         <w:t>4.2. Chỉ số đánh giá của Ward và so sánh với K-Means</w:t>
       </w:r>
@@ -15815,7 +15815,7 @@
       <w:pPr>
         <w:pStyle w:val="Heading2"/>
       </w:pPr>
-      <w:bookmarkStart w:id="38" w:name="_Toc243616256"/>
+      <w:bookmarkStart w:id="38" w:name="_Toc243675295"/>
       <w:r>
         <w:lastRenderedPageBreak/>
         <w:t>4.3. Chân dung ba cụm</w:t>
@@ -17220,7 +17220,7 @@
       <w:pPr>
         <w:pStyle w:val="Heading2"/>
       </w:pPr>
-      <w:bookmarkStart w:id="39" w:name="_Toc243616257"/>
+      <w:bookmarkStart w:id="39" w:name="_Toc243675296"/>
       <w:r>
         <w:t>4.4. Hậu kiểm độc lập bằng điểm hạnh phúc</w:t>
       </w:r>
@@ -18038,7 +18038,7 @@
       <w:pPr>
         <w:pStyle w:val="Heading2"/>
       </w:pPr>
-      <w:bookmarkStart w:id="40" w:name="_Toc243616258"/>
+      <w:bookmarkStart w:id="40" w:name="_Toc243675297"/>
       <w:r>
         <w:t>4.5. Cấu hình đối chứng k = 3</w:t>
       </w:r>
@@ -19534,7 +19534,7 @@
       <w:pPr>
         <w:pStyle w:val="Heading2"/>
       </w:pPr>
-      <w:bookmarkStart w:id="41" w:name="_Toc243616259"/>
+      <w:bookmarkStart w:id="41" w:name="_Toc243675298"/>
       <w:r>
         <w:t>4.6. Ghép cụm liên năm</w:t>
       </w:r>
@@ -21073,7 +21073,7 @@
       <w:pPr>
         <w:pStyle w:val="Heading2"/>
       </w:pPr>
-      <w:bookmarkStart w:id="42" w:name="_Toc243616260"/>
+      <w:bookmarkStart w:id="42" w:name="_Toc243675299"/>
       <w:r>
         <w:t>4.7. Dịch chuyển cụm của 156 quốc gia</w:t>
       </w:r>
@@ -21680,7 +21680,7 @@
       <w:pPr>
         <w:pStyle w:val="Heading2"/>
       </w:pPr>
-      <w:bookmarkStart w:id="43" w:name="_Toc243616261"/>
+      <w:bookmarkStart w:id="43" w:name="_Toc243675300"/>
       <w:r>
         <w:t>4.8. Phân bố cụm trên không gian PCA 2D</w:t>
       </w:r>
@@ -21825,7 +21825,7 @@
       <w:pPr>
         <w:pStyle w:val="Heading2"/>
       </w:pPr>
-      <w:bookmarkStart w:id="44" w:name="_Toc243616262"/>
+      <w:bookmarkStart w:id="44" w:name="_Toc243675301"/>
       <w:r>
         <w:t>4.9. Kết luận</w:t>
       </w:r>
@@ -21861,7 +21861,7 @@
       <w:pPr>
         <w:pStyle w:val="Heading1"/>
       </w:pPr>
-      <w:bookmarkStart w:id="45" w:name="_Toc243616263"/>
+      <w:bookmarkStart w:id="45" w:name="_Toc243675302"/>
       <w:r>
         <w:lastRenderedPageBreak/>
         <w:t>CHƯƠNG 5: ỨNG DỤNG DEMO, KẾT LUẬN VÀ HƯỚNG PHÁT TRIỂN</w:t>
@@ -21872,7 +21872,7 @@
       <w:pPr>
         <w:pStyle w:val="Heading2"/>
       </w:pPr>
-      <w:bookmarkStart w:id="46" w:name="_Toc243616264"/>
+      <w:bookmarkStart w:id="46" w:name="_Toc243675303"/>
       <w:r>
         <w:t>5.1. Kiến trúc ứng dụng demo Streamlit</w:t>
       </w:r>
@@ -22022,7 +22022,7 @@
       <w:pPr>
         <w:pStyle w:val="Heading2"/>
       </w:pPr>
-      <w:bookmarkStart w:id="47" w:name="_Toc243616265"/>
+      <w:bookmarkStart w:id="47" w:name="_Toc243675304"/>
       <w:r>
         <w:t>5.2. Kiểm thử ứng dụng</w:t>
       </w:r>
@@ -22062,7 +22062,7 @@
       <w:pPr>
         <w:pStyle w:val="Heading2"/>
       </w:pPr>
-      <w:bookmarkStart w:id="48" w:name="_Toc243616266"/>
+      <w:bookmarkStart w:id="48" w:name="_Toc243675305"/>
       <w:r>
         <w:t>5.3. Đóng góp chính của đồ án</w:t>
       </w:r>
@@ -22168,7 +22168,7 @@
       <w:pPr>
         <w:pStyle w:val="Heading2"/>
       </w:pPr>
-      <w:bookmarkStart w:id="49" w:name="_Toc243616267"/>
+      <w:bookmarkStart w:id="49" w:name="_Toc243675306"/>
       <w:r>
         <w:t>5.4. Hạn chế</w:t>
       </w:r>
@@ -22208,7 +22208,7 @@
       <w:pPr>
         <w:pStyle w:val="Heading2"/>
       </w:pPr>
-      <w:bookmarkStart w:id="50" w:name="_Toc243616268"/>
+      <w:bookmarkStart w:id="50" w:name="_Toc243675307"/>
       <w:r>
         <w:t>5.5. Hướng phát triển</w:t>
       </w:r>
@@ -22284,7 +22284,7 @@
       <w:pPr>
         <w:pStyle w:val="Heading2"/>
       </w:pPr>
-      <w:bookmarkStart w:id="51" w:name="_Toc243616269"/>
+      <w:bookmarkStart w:id="51" w:name="_Toc243675308"/>
       <w:r>
         <w:t>5.6. Kết luận</w:t>
       </w:r>
@@ -22320,7 +22320,7 @@
       <w:pPr>
         <w:pStyle w:val="Heading1"/>
       </w:pPr>
-      <w:bookmarkStart w:id="52" w:name="_Toc243616270"/>
+      <w:bookmarkStart w:id="52" w:name="_Toc243675309"/>
       <w:r>
         <w:lastRenderedPageBreak/>
         <w:t>TÀI LIỆU THAM KHẢO</w:t>
@@ -22753,7 +22753,7 @@
       <w:pPr>
         <w:pStyle w:val="Heading1"/>
       </w:pPr>
-      <w:bookmarkStart w:id="53" w:name="_Toc243616271"/>
+      <w:bookmarkStart w:id="53" w:name="_Toc243675310"/>
       <w:r>
         <w:lastRenderedPageBreak/>
         <w:t>PHỤ LỤC A: BẢNG KHẢO SÁT SỐ CỤM NĂM 2019</w:t>
@@ -23466,7 +23466,7 @@
       <w:pPr>
         <w:pStyle w:val="Heading1"/>
       </w:pPr>
-      <w:bookmarkStart w:id="54" w:name="_Toc243616272"/>
+      <w:bookmarkStart w:id="54" w:name="_Toc243675311"/>
       <w:r>
         <w:lastRenderedPageBreak/>
         <w:t>PHỤ LỤC B: KẾT QUẢ QUÉT THAM SỐ DBSCAN NĂM 2019</w:t>

</xml_diff>

<commit_message>
báo cáo: cập nhật bản chỉnh sửa báo cáo Word, bản PDF và slide thuyết trình
</commit_message>
<xml_diff>
--- a/reports/final_report/Nhom12_BaoCao.docx
+++ b/reports/final_report/Nhom12_BaoCao.docx
@@ -8892,16 +8892,8 @@
     </w:p>
     <w:tbl>
       <w:tblPr>
+        <w:tblStyle w:val="TableGrid"/>
         <w:tblW w:w="0" w:type="auto"/>
-        <w:jc w:val="center"/>
-        <w:tblBorders>
-          <w:top w:val="single" w:sz="4" w:space="0" w:color="7F8C8D"/>
-          <w:left w:val="single" w:sz="4" w:space="0" w:color="7F8C8D"/>
-          <w:bottom w:val="single" w:sz="4" w:space="0" w:color="7F8C8D"/>
-          <w:right w:val="single" w:sz="4" w:space="0" w:color="7F8C8D"/>
-          <w:insideH w:val="single" w:sz="4" w:space="0" w:color="7F8C8D"/>
-          <w:insideV w:val="single" w:sz="4" w:space="0" w:color="7F8C8D"/>
-        </w:tblBorders>
         <w:tblLook w:val="04A0" w:firstRow="1" w:lastRow="0" w:firstColumn="1" w:lastColumn="0" w:noHBand="0" w:noVBand="1"/>
       </w:tblPr>
       <w:tblGrid>
@@ -8914,14 +8906,9 @@
         <w:gridCol w:w="1344"/>
       </w:tblGrid>
       <w:tr>
-        <w:trPr>
-          <w:tblHeader/>
-          <w:jc w:val="center"/>
-        </w:trPr>
         <w:tc>
           <w:tcPr>
             <w:tcW w:w="1344" w:type="dxa"/>
-            <w:shd w:val="clear" w:color="auto" w:fill="EAECEE"/>
           </w:tcPr>
           <w:p>
             <w:pPr>
@@ -8941,7 +8928,6 @@
         <w:tc>
           <w:tcPr>
             <w:tcW w:w="1344" w:type="dxa"/>
-            <w:shd w:val="clear" w:color="auto" w:fill="EAECEE"/>
           </w:tcPr>
           <w:p>
             <w:pPr>
@@ -8961,7 +8947,6 @@
         <w:tc>
           <w:tcPr>
             <w:tcW w:w="1344" w:type="dxa"/>
-            <w:shd w:val="clear" w:color="auto" w:fill="EAECEE"/>
           </w:tcPr>
           <w:p>
             <w:pPr>
@@ -8981,7 +8966,6 @@
         <w:tc>
           <w:tcPr>
             <w:tcW w:w="1344" w:type="dxa"/>
-            <w:shd w:val="clear" w:color="auto" w:fill="EAECEE"/>
           </w:tcPr>
           <w:p>
             <w:pPr>
@@ -9001,7 +8985,6 @@
         <w:tc>
           <w:tcPr>
             <w:tcW w:w="1344" w:type="dxa"/>
-            <w:shd w:val="clear" w:color="auto" w:fill="EAECEE"/>
           </w:tcPr>
           <w:p>
             <w:pPr>
@@ -9021,7 +9004,6 @@
         <w:tc>
           <w:tcPr>
             <w:tcW w:w="1344" w:type="dxa"/>
-            <w:shd w:val="clear" w:color="auto" w:fill="EAECEE"/>
           </w:tcPr>
           <w:p>
             <w:pPr>
@@ -9041,7 +9023,6 @@
         <w:tc>
           <w:tcPr>
             <w:tcW w:w="1344" w:type="dxa"/>
-            <w:shd w:val="clear" w:color="auto" w:fill="EAECEE"/>
           </w:tcPr>
           <w:p>
             <w:pPr>
@@ -9060,9 +9041,6 @@
         </w:tc>
       </w:tr>
       <w:tr>
-        <w:trPr>
-          <w:jc w:val="center"/>
-        </w:trPr>
         <w:tc>
           <w:tcPr>
             <w:tcW w:w="1344" w:type="dxa"/>
@@ -9191,9 +9169,6 @@
         </w:tc>
       </w:tr>
       <w:tr>
-        <w:trPr>
-          <w:jc w:val="center"/>
-        </w:trPr>
         <w:tc>
           <w:tcPr>
             <w:tcW w:w="1344" w:type="dxa"/>
@@ -9322,9 +9297,6 @@
         </w:tc>
       </w:tr>
       <w:tr>
-        <w:trPr>
-          <w:jc w:val="center"/>
-        </w:trPr>
         <w:tc>
           <w:tcPr>
             <w:tcW w:w="1344" w:type="dxa"/>
@@ -9453,9 +9425,6 @@
         </w:tc>
       </w:tr>
       <w:tr>
-        <w:trPr>
-          <w:jc w:val="center"/>
-        </w:trPr>
         <w:tc>
           <w:tcPr>
             <w:tcW w:w="1344" w:type="dxa"/>
@@ -9584,9 +9553,6 @@
         </w:tc>
       </w:tr>
       <w:tr>
-        <w:trPr>
-          <w:jc w:val="center"/>
-        </w:trPr>
         <w:tc>
           <w:tcPr>
             <w:tcW w:w="1344" w:type="dxa"/>
@@ -10954,16 +10920,8 @@
     </w:p>
     <w:tbl>
       <w:tblPr>
+        <w:tblStyle w:val="TableGrid"/>
         <w:tblW w:w="0" w:type="auto"/>
-        <w:jc w:val="center"/>
-        <w:tblBorders>
-          <w:top w:val="single" w:sz="4" w:space="0" w:color="7F8C8D"/>
-          <w:left w:val="single" w:sz="4" w:space="0" w:color="7F8C8D"/>
-          <w:bottom w:val="single" w:sz="4" w:space="0" w:color="7F8C8D"/>
-          <w:right w:val="single" w:sz="4" w:space="0" w:color="7F8C8D"/>
-          <w:insideH w:val="single" w:sz="4" w:space="0" w:color="7F8C8D"/>
-          <w:insideV w:val="single" w:sz="4" w:space="0" w:color="7F8C8D"/>
-        </w:tblBorders>
         <w:tblLook w:val="04A0" w:firstRow="1" w:lastRow="0" w:firstColumn="1" w:lastColumn="0" w:noHBand="0" w:noVBand="1"/>
       </w:tblPr>
       <w:tblGrid>
@@ -10973,14 +10931,9 @@
         <w:gridCol w:w="2351"/>
       </w:tblGrid>
       <w:tr>
-        <w:trPr>
-          <w:tblHeader/>
-          <w:jc w:val="center"/>
-        </w:trPr>
         <w:tc>
           <w:tcPr>
             <w:tcW w:w="2351" w:type="dxa"/>
-            <w:shd w:val="clear" w:color="auto" w:fill="EAECEE"/>
           </w:tcPr>
           <w:p>
             <w:pPr>
@@ -11000,7 +10953,6 @@
         <w:tc>
           <w:tcPr>
             <w:tcW w:w="2351" w:type="dxa"/>
-            <w:shd w:val="clear" w:color="auto" w:fill="EAECEE"/>
           </w:tcPr>
           <w:p>
             <w:pPr>
@@ -11020,7 +10972,6 @@
         <w:tc>
           <w:tcPr>
             <w:tcW w:w="2351" w:type="dxa"/>
-            <w:shd w:val="clear" w:color="auto" w:fill="EAECEE"/>
           </w:tcPr>
           <w:p>
             <w:pPr>
@@ -11040,7 +10991,6 @@
         <w:tc>
           <w:tcPr>
             <w:tcW w:w="2351" w:type="dxa"/>
-            <w:shd w:val="clear" w:color="auto" w:fill="EAECEE"/>
           </w:tcPr>
           <w:p>
             <w:pPr>
@@ -11059,9 +11009,6 @@
         </w:tc>
       </w:tr>
       <w:tr>
-        <w:trPr>
-          <w:jc w:val="center"/>
-        </w:trPr>
         <w:tc>
           <w:tcPr>
             <w:tcW w:w="2351" w:type="dxa"/>
@@ -11136,9 +11083,6 @@
         </w:tc>
       </w:tr>
       <w:tr>
-        <w:trPr>
-          <w:jc w:val="center"/>
-        </w:trPr>
         <w:tc>
           <w:tcPr>
             <w:tcW w:w="2351" w:type="dxa"/>
@@ -11213,9 +11157,6 @@
         </w:tc>
       </w:tr>
       <w:tr>
-        <w:trPr>
-          <w:jc w:val="center"/>
-        </w:trPr>
         <w:tc>
           <w:tcPr>
             <w:tcW w:w="2351" w:type="dxa"/>
@@ -11290,9 +11231,6 @@
         </w:tc>
       </w:tr>
       <w:tr>
-        <w:trPr>
-          <w:jc w:val="center"/>
-        </w:trPr>
         <w:tc>
           <w:tcPr>
             <w:tcW w:w="2351" w:type="dxa"/>
@@ -11367,9 +11305,6 @@
         </w:tc>
       </w:tr>
       <w:tr>
-        <w:trPr>
-          <w:jc w:val="center"/>
-        </w:trPr>
         <w:tc>
           <w:tcPr>
             <w:tcW w:w="2351" w:type="dxa"/>
@@ -11860,16 +11795,8 @@
     </w:p>
     <w:tbl>
       <w:tblPr>
+        <w:tblStyle w:val="TableGrid"/>
         <w:tblW w:w="0" w:type="auto"/>
-        <w:jc w:val="center"/>
-        <w:tblBorders>
-          <w:top w:val="single" w:sz="4" w:space="0" w:color="7F8C8D"/>
-          <w:left w:val="single" w:sz="4" w:space="0" w:color="7F8C8D"/>
-          <w:bottom w:val="single" w:sz="4" w:space="0" w:color="7F8C8D"/>
-          <w:right w:val="single" w:sz="4" w:space="0" w:color="7F8C8D"/>
-          <w:insideH w:val="single" w:sz="4" w:space="0" w:color="7F8C8D"/>
-          <w:insideV w:val="single" w:sz="4" w:space="0" w:color="7F8C8D"/>
-        </w:tblBorders>
         <w:tblLook w:val="04A0" w:firstRow="1" w:lastRow="0" w:firstColumn="1" w:lastColumn="0" w:noHBand="0" w:noVBand="1"/>
       </w:tblPr>
       <w:tblGrid>
@@ -11879,14 +11806,9 @@
         <w:gridCol w:w="2351"/>
       </w:tblGrid>
       <w:tr>
-        <w:trPr>
-          <w:tblHeader/>
-          <w:jc w:val="center"/>
-        </w:trPr>
         <w:tc>
           <w:tcPr>
             <w:tcW w:w="2351" w:type="dxa"/>
-            <w:shd w:val="clear" w:color="auto" w:fill="EAECEE"/>
           </w:tcPr>
           <w:p>
             <w:pPr>
@@ -11906,7 +11828,6 @@
         <w:tc>
           <w:tcPr>
             <w:tcW w:w="2351" w:type="dxa"/>
-            <w:shd w:val="clear" w:color="auto" w:fill="EAECEE"/>
           </w:tcPr>
           <w:p>
             <w:pPr>
@@ -11926,7 +11847,6 @@
         <w:tc>
           <w:tcPr>
             <w:tcW w:w="2351" w:type="dxa"/>
-            <w:shd w:val="clear" w:color="auto" w:fill="EAECEE"/>
           </w:tcPr>
           <w:p>
             <w:pPr>
@@ -11946,7 +11866,6 @@
         <w:tc>
           <w:tcPr>
             <w:tcW w:w="2351" w:type="dxa"/>
-            <w:shd w:val="clear" w:color="auto" w:fill="EAECEE"/>
           </w:tcPr>
           <w:p>
             <w:pPr>
@@ -11965,9 +11884,6 @@
         </w:tc>
       </w:tr>
       <w:tr>
-        <w:trPr>
-          <w:jc w:val="center"/>
-        </w:trPr>
         <w:tc>
           <w:tcPr>
             <w:tcW w:w="2351" w:type="dxa"/>
@@ -12042,9 +11958,6 @@
         </w:tc>
       </w:tr>
       <w:tr>
-        <w:trPr>
-          <w:jc w:val="center"/>
-        </w:trPr>
         <w:tc>
           <w:tcPr>
             <w:tcW w:w="2351" w:type="dxa"/>
@@ -12119,9 +12032,6 @@
         </w:tc>
       </w:tr>
       <w:tr>
-        <w:trPr>
-          <w:jc w:val="center"/>
-        </w:trPr>
         <w:tc>
           <w:tcPr>
             <w:tcW w:w="2351" w:type="dxa"/>
@@ -12196,9 +12106,6 @@
         </w:tc>
       </w:tr>
       <w:tr>
-        <w:trPr>
-          <w:jc w:val="center"/>
-        </w:trPr>
         <w:tc>
           <w:tcPr>
             <w:tcW w:w="2351" w:type="dxa"/>
@@ -12273,9 +12180,6 @@
         </w:tc>
       </w:tr>
       <w:tr>
-        <w:trPr>
-          <w:jc w:val="center"/>
-        </w:trPr>
         <w:tc>
           <w:tcPr>
             <w:tcW w:w="2351" w:type="dxa"/>
@@ -14350,16 +14254,8 @@
     </w:p>
     <w:tbl>
       <w:tblPr>
+        <w:tblStyle w:val="TableGrid"/>
         <w:tblW w:w="0" w:type="auto"/>
-        <w:jc w:val="center"/>
-        <w:tblBorders>
-          <w:top w:val="single" w:sz="4" w:space="0" w:color="7F8C8D"/>
-          <w:left w:val="single" w:sz="4" w:space="0" w:color="7F8C8D"/>
-          <w:bottom w:val="single" w:sz="4" w:space="0" w:color="7F8C8D"/>
-          <w:right w:val="single" w:sz="4" w:space="0" w:color="7F8C8D"/>
-          <w:insideH w:val="single" w:sz="4" w:space="0" w:color="7F8C8D"/>
-          <w:insideV w:val="single" w:sz="4" w:space="0" w:color="7F8C8D"/>
-        </w:tblBorders>
         <w:tblLook w:val="04A0" w:firstRow="1" w:lastRow="0" w:firstColumn="1" w:lastColumn="0" w:noHBand="0" w:noVBand="1"/>
       </w:tblPr>
       <w:tblGrid>
@@ -14371,14 +14267,9 @@
         <w:gridCol w:w="1805"/>
       </w:tblGrid>
       <w:tr>
-        <w:trPr>
-          <w:tblHeader/>
-          <w:jc w:val="center"/>
-        </w:trPr>
         <w:tc>
           <w:tcPr>
             <w:tcW w:w="1567" w:type="dxa"/>
-            <w:shd w:val="clear" w:color="auto" w:fill="EAECEE"/>
           </w:tcPr>
           <w:p>
             <w:pPr>
@@ -14398,7 +14289,6 @@
         <w:tc>
           <w:tcPr>
             <w:tcW w:w="1567" w:type="dxa"/>
-            <w:shd w:val="clear" w:color="auto" w:fill="EAECEE"/>
           </w:tcPr>
           <w:p>
             <w:pPr>
@@ -14418,7 +14308,6 @@
         <w:tc>
           <w:tcPr>
             <w:tcW w:w="1567" w:type="dxa"/>
-            <w:shd w:val="clear" w:color="auto" w:fill="EAECEE"/>
           </w:tcPr>
           <w:p>
             <w:pPr>
@@ -14438,7 +14327,6 @@
         <w:tc>
           <w:tcPr>
             <w:tcW w:w="1567" w:type="dxa"/>
-            <w:shd w:val="clear" w:color="auto" w:fill="EAECEE"/>
           </w:tcPr>
           <w:p>
             <w:pPr>
@@ -14458,7 +14346,6 @@
         <w:tc>
           <w:tcPr>
             <w:tcW w:w="1567" w:type="dxa"/>
-            <w:shd w:val="clear" w:color="auto" w:fill="EAECEE"/>
           </w:tcPr>
           <w:p>
             <w:pPr>
@@ -14478,7 +14365,6 @@
         <w:tc>
           <w:tcPr>
             <w:tcW w:w="1567" w:type="dxa"/>
-            <w:shd w:val="clear" w:color="auto" w:fill="EAECEE"/>
           </w:tcPr>
           <w:p>
             <w:pPr>
@@ -14497,9 +14383,6 @@
         </w:tc>
       </w:tr>
       <w:tr>
-        <w:trPr>
-          <w:jc w:val="center"/>
-        </w:trPr>
         <w:tc>
           <w:tcPr>
             <w:tcW w:w="1567" w:type="dxa"/>
@@ -14610,9 +14493,6 @@
         </w:tc>
       </w:tr>
       <w:tr>
-        <w:trPr>
-          <w:jc w:val="center"/>
-        </w:trPr>
         <w:tc>
           <w:tcPr>
             <w:tcW w:w="1567" w:type="dxa"/>
@@ -14723,9 +14603,6 @@
         </w:tc>
       </w:tr>
       <w:tr>
-        <w:trPr>
-          <w:jc w:val="center"/>
-        </w:trPr>
         <w:tc>
           <w:tcPr>
             <w:tcW w:w="1567" w:type="dxa"/>
@@ -14836,9 +14713,6 @@
         </w:tc>
       </w:tr>
       <w:tr>
-        <w:trPr>
-          <w:jc w:val="center"/>
-        </w:trPr>
         <w:tc>
           <w:tcPr>
             <w:tcW w:w="1567" w:type="dxa"/>
@@ -14949,9 +14823,6 @@
         </w:tc>
       </w:tr>
       <w:tr>
-        <w:trPr>
-          <w:jc w:val="center"/>
-        </w:trPr>
         <w:tc>
           <w:tcPr>
             <w:tcW w:w="1567" w:type="dxa"/>

</xml_diff>